<commit_message>
User Persona Definition (#418)
</commit_message>
<xml_diff>
--- a/UI UX Design Document.docx
+++ b/UI UX Design Document.docx
@@ -5,11 +5,2091 @@
     <w:p>
       <w:pPr>
         <w:spacing w:line="276" w:lineRule="auto"/>
-      </w:pPr>
+        <w:rPr>
+          <w:b/>
+          <w:bCs/>
+          <w:sz w:val="28"/>
+          <w:szCs w:val="28"/>
+        </w:rPr>
+      </w:pPr>
+      <w:r>
+        <w:rPr>
+          <w:b/>
+          <w:bCs/>
+          <w:sz w:val="28"/>
+          <w:szCs w:val="28"/>
+        </w:rPr>
+        <w:t xml:space="preserve">UI UX Design </w:t>
+      </w:r>
+      <w:r>
+        <w:rPr>
+          <w:b/>
+          <w:bCs/>
+          <w:sz w:val="28"/>
+          <w:szCs w:val="28"/>
+        </w:rPr>
+        <w:t>Specification Document</w:t>
+      </w:r>
     </w:p>
+    <w:p>
+      <w:r>
+        <w:t>The User Interface (UI) and User Experience (UX) design phase is one of the important phases in KriGo platform development. While the previous chapters cover such topics as business analysis, system architecture, and API specification, the focus of the current chapter will be the layer of interaction between users, rental agencies, and system administrators. UI/UX design implies transforming functional requirements into effective and consistent interfaces that can help the users and meet the goals of the platform.</w:t>
+      </w:r>
+    </w:p>
+    <w:p>
+      <w:r>
+        <w:t>The issues of usability and accessibility are very important for designing a vehicle rental marketplace since users should easily find necessary vehicles and compare them, rent a particular one, make changes to the booking, etc. Also, rental agency workers need effective systems for managing their fleet, making reservations, managing branches and other things, and administrators need to have an appropriate dashboard for monitoring the activity on the platform. Thus, the main aspects considered in UI/UX design include simplicity, clarity, responsiveness and task-oriented interfaces.</w:t>
+      </w:r>
+    </w:p>
+    <w:p>
+      <w:r>
+        <w:t>The user-centered design approach is applied in the design phase which implies taking into account such factors as personas, scenarios and workflows identified in the process of requirements analysis. Special attention is paid to information architecture, navigation system, visual hierarchy, consistency of interface elements and accessibility.</w:t>
+      </w:r>
+    </w:p>
+    <w:p>
+      <w:r>
+        <w:t>The interfaces should be responsive to ensure an appropriate experience in using them in desktop and mobile environments.</w:t>
+      </w:r>
+    </w:p>
+    <w:p>
+      <w:r>
+        <w:t>As for the visual design of the platform, it includes a modern professional style based on clean layouts, consistent typography, harmonized color palettes, icons, and reusable interface elements. This design system helps in improving usability and brand identification and supports future interface scalability and maintenance.</w:t>
+      </w:r>
+    </w:p>
+    <w:p>
+      <w:r>
+        <w:t>The UI/UX design documentation includes the following sections:</w:t>
+      </w:r>
+    </w:p>
+    <w:p>
+      <w:pPr>
+        <w:pStyle w:val="ListParagraph"/>
+        <w:numPr>
+          <w:ilvl w:val="0"/>
+          <w:numId w:val="148"/>
+        </w:numPr>
+      </w:pPr>
+      <w:r>
+        <w:t>User Experience Design. It covers user personas, user journeys, information architecture and interaction flows.</w:t>
+      </w:r>
+    </w:p>
+    <w:p>
+      <w:pPr>
+        <w:pStyle w:val="ListParagraph"/>
+        <w:numPr>
+          <w:ilvl w:val="0"/>
+          <w:numId w:val="148"/>
+        </w:numPr>
+      </w:pPr>
+      <w:r>
+        <w:t>User Interface Design. In this section, the visual design system, typography, color palette, layout and reusable interface elements are described.</w:t>
+      </w:r>
+    </w:p>
+    <w:p>
+      <w:pPr>
+        <w:pStyle w:val="ListParagraph"/>
+        <w:numPr>
+          <w:ilvl w:val="0"/>
+          <w:numId w:val="148"/>
+        </w:numPr>
+      </w:pPr>
+      <w:r>
+        <w:t>Wireframes and Low-Fidelity Prototypes. This section contains the initial structural designs of the application screens.</w:t>
+      </w:r>
+    </w:p>
+    <w:p>
+      <w:pPr>
+        <w:pStyle w:val="ListParagraph"/>
+        <w:numPr>
+          <w:ilvl w:val="0"/>
+          <w:numId w:val="148"/>
+        </w:numPr>
+      </w:pPr>
+      <w:r>
+        <w:t>High-Fidelity Interface Prototypes. This section presents the visual mockups of customer, agency and administrator interfaces.</w:t>
+      </w:r>
+    </w:p>
+    <w:p>
+      <w:pPr>
+        <w:pStyle w:val="ListParagraph"/>
+        <w:numPr>
+          <w:ilvl w:val="0"/>
+          <w:numId w:val="148"/>
+        </w:numPr>
+      </w:pPr>
+      <w:r>
+        <w:t>Responsive Design Strategy. It describes how the interfaces should be adapted to mobile, tablet and desktop environment.</w:t>
+      </w:r>
+    </w:p>
+    <w:p>
+      <w:pPr>
+        <w:pStyle w:val="ListParagraph"/>
+        <w:numPr>
+          <w:ilvl w:val="0"/>
+          <w:numId w:val="148"/>
+        </w:numPr>
+      </w:pPr>
+      <w:r>
+        <w:t>Usability and Accessibility Guidelines. These guidelines cover usability principles and accessibility requirements for the platform.</w:t>
+      </w:r>
+    </w:p>
+    <w:p/>
+    <w:p>
+      <w:r>
+        <w:t>Thus, the described sections include all the aspects of designing the user interface and user experience of KriGo platform.</w:t>
+      </w:r>
+    </w:p>
+    <w:p>
+      <w:pPr>
+        <w:spacing w:line="278" w:lineRule="auto"/>
+      </w:pPr>
+      <w:r>
+        <w:br w:type="page"/>
+      </w:r>
+    </w:p>
+    <w:p/>
+    <w:p>
+      <w:pPr>
+        <w:spacing w:line="278" w:lineRule="auto"/>
+      </w:pPr>
+      <w:r>
+        <w:br w:type="page"/>
+      </w:r>
+    </w:p>
+    <w:p>
+      <w:r>
+        <w:lastRenderedPageBreak/>
+        <w:t>Tables</w:t>
+      </w:r>
+    </w:p>
+    <w:p/>
+    <w:p>
+      <w:pPr>
+        <w:spacing w:line="278" w:lineRule="auto"/>
+      </w:pPr>
+      <w:r>
+        <w:br w:type="page"/>
+      </w:r>
+    </w:p>
+    <w:p>
+      <w:r>
+        <w:lastRenderedPageBreak/>
+        <w:t>Figures</w:t>
+      </w:r>
+    </w:p>
+    <w:p/>
+    <w:p>
+      <w:pPr>
+        <w:sectPr>
+          <w:pgSz w:w="11906" w:h="16838" w:code="9"/>
+          <w:pgMar w:top="1411" w:right="850" w:bottom="1411" w:left="1699" w:header="720" w:footer="720" w:gutter="0"/>
+          <w:cols w:space="720"/>
+          <w:docGrid w:linePitch="360"/>
+        </w:sectPr>
+      </w:pPr>
+    </w:p>
+    <w:p>
+      <w:pPr>
+        <w:pStyle w:val="Heading2"/>
+      </w:pPr>
+      <w:r>
+        <w:lastRenderedPageBreak/>
+        <w:t>UX Research &amp; Planning</w:t>
+      </w:r>
+    </w:p>
+    <w:p>
+      <w:r>
+        <w:t>The UX Research and Planning stage serves as a basis for creating an intuitive, efficient, and user-oriented vehicle rental portal. Before any interface elements and visual designs are created, it is important to understand the features, needs, behavior, and pain points of the target users of the platform. This evidence-based practice ensures that design choices are made based on real needs of users and not guesses, making the platform more usable, accessible, and satisfactory for users.</w:t>
+      </w:r>
+    </w:p>
+    <w:p>
+      <w:r>
+        <w:t>As for KriGo platform, the user experience research is focused on three main groups of users: customers, representatives of car rental agencies and administrators of the platform. Each of these user types interacts with the system in its own way and has different aims, responsibilities, and expectations. Therefore, by understanding the difference between these user types at an early design stage, the developers will be able to create an application that would satisfy the needs of each type while remaining consistent in the entire system.</w:t>
+      </w:r>
+    </w:p>
+    <w:p>
+      <w:r>
+        <w:t>This UX Research and Planning section consists of the following parts:</w:t>
+      </w:r>
+    </w:p>
+    <w:p>
+      <w:pPr>
+        <w:pStyle w:val="ListParagraph"/>
+        <w:numPr>
+          <w:ilvl w:val="0"/>
+          <w:numId w:val="149"/>
+        </w:numPr>
+      </w:pPr>
+      <w:r>
+        <w:t>User Persona Definition</w:t>
+      </w:r>
+    </w:p>
+    <w:p>
+      <w:pPr>
+        <w:pStyle w:val="ListParagraph"/>
+        <w:numPr>
+          <w:ilvl w:val="0"/>
+          <w:numId w:val="149"/>
+        </w:numPr>
+      </w:pPr>
+      <w:r>
+        <w:t>User Journey Mapping</w:t>
+      </w:r>
+    </w:p>
+    <w:p>
+      <w:pPr>
+        <w:pStyle w:val="ListParagraph"/>
+        <w:numPr>
+          <w:ilvl w:val="0"/>
+          <w:numId w:val="149"/>
+        </w:numPr>
+      </w:pPr>
+      <w:r>
+        <w:t>Information Architecture</w:t>
+      </w:r>
+    </w:p>
+    <w:p>
+      <w:pPr>
+        <w:spacing w:line="278" w:lineRule="auto"/>
+      </w:pPr>
+      <w:r>
+        <w:br w:type="page"/>
+      </w:r>
+    </w:p>
+    <w:p>
+      <w:pPr>
+        <w:pStyle w:val="Heading3"/>
+      </w:pPr>
+      <w:r>
+        <w:lastRenderedPageBreak/>
+        <w:t>User Persona Definition</w:t>
+      </w:r>
+    </w:p>
+    <w:p>
+      <w:r>
+        <w:t>User personas are fictitious but realistic descriptions of the main users of the KriGo platform. They are based on functional requirements, business needs, and user behaviors that are recognized in the system analysis stage. Personas do not describe any particular individuals; rather, they describe the common traits, goals, motivations, and obstacles faced by various user types.</w:t>
+      </w:r>
+    </w:p>
+    <w:p>
+      <w:r>
+        <w:t>The main purpose of using user personas is to make sure that interface design choices will correspond to the needs of users at all stages of development. With the help of personae, designers will be able to create effective workflows, identify important functionalities and minimize the problems associated with usability. Moreover, personae serve as the reference throughout the process of wireframing, prototyping, and usability testing, thus ensuring correspondence between the needs of business and users.</w:t>
+      </w:r>
+    </w:p>
+    <w:p>
+      <w:r>
+        <w:rPr>
+          <w:noProof/>
+        </w:rPr>
+        <mc:AlternateContent>
+          <mc:Choice Requires="wps">
+            <w:drawing>
+              <wp:anchor distT="0" distB="0" distL="114300" distR="114300" simplePos="0" relativeHeight="251660288" behindDoc="0" locked="0" layoutInCell="1" allowOverlap="1" wp14:anchorId="69303397" wp14:editId="19052A21">
+                <wp:simplePos x="0" y="0"/>
+                <wp:positionH relativeFrom="column">
+                  <wp:posOffset>3175</wp:posOffset>
+                </wp:positionH>
+                <wp:positionV relativeFrom="paragraph">
+                  <wp:posOffset>4070985</wp:posOffset>
+                </wp:positionV>
+                <wp:extent cx="5928360" cy="635"/>
+                <wp:effectExtent l="0" t="0" r="0" b="0"/>
+                <wp:wrapSquare wrapText="bothSides"/>
+                <wp:docPr id="606382854" name="Text Box 1"/>
+                <wp:cNvGraphicFramePr/>
+                <a:graphic xmlns:a="http://schemas.openxmlformats.org/drawingml/2006/main">
+                  <a:graphicData uri="http://schemas.microsoft.com/office/word/2010/wordprocessingShape">
+                    <wps:wsp>
+                      <wps:cNvSpPr txBox="1"/>
+                      <wps:spPr>
+                        <a:xfrm>
+                          <a:off x="0" y="0"/>
+                          <a:ext cx="5928360" cy="635"/>
+                        </a:xfrm>
+                        <a:prstGeom prst="rect">
+                          <a:avLst/>
+                        </a:prstGeom>
+                        <a:solidFill>
+                          <a:prstClr val="white"/>
+                        </a:solidFill>
+                        <a:ln>
+                          <a:noFill/>
+                        </a:ln>
+                      </wps:spPr>
+                      <wps:txbx>
+                        <w:txbxContent>
+                          <w:p>
+                            <w:pPr>
+                              <w:pStyle w:val="Caption"/>
+                              <w:rPr>
+                                <w:noProof/>
+                              </w:rPr>
+                            </w:pPr>
+                            <w:r>
+                              <w:t xml:space="preserve">Figure </w:t>
+                            </w:r>
+                            <w:r>
+                              <w:fldChar w:fldCharType="begin"/>
+                            </w:r>
+                            <w:r>
+                              <w:instrText xml:space="preserve"> SEQ Figure \* ARABIC </w:instrText>
+                            </w:r>
+                            <w:r>
+                              <w:fldChar w:fldCharType="separate"/>
+                            </w:r>
+                            <w:r>
+                              <w:rPr>
+                                <w:noProof/>
+                              </w:rPr>
+                              <w:t>1</w:t>
+                            </w:r>
+                            <w:r>
+                              <w:fldChar w:fldCharType="end"/>
+                            </w:r>
+                            <w:r>
+                              <w:t xml:space="preserve"> - User Persona Design</w:t>
+                            </w:r>
+                          </w:p>
+                        </w:txbxContent>
+                      </wps:txbx>
+                      <wps:bodyPr rot="0" spcFirstLastPara="0" vertOverflow="overflow" horzOverflow="overflow" vert="horz" wrap="square" lIns="0" tIns="0" rIns="0" bIns="0" numCol="1" spcCol="0" rtlCol="0" fromWordArt="0" anchor="t" anchorCtr="0" forceAA="0" compatLnSpc="1">
+                        <a:prstTxWarp prst="textNoShape">
+                          <a:avLst/>
+                        </a:prstTxWarp>
+                        <a:spAutoFit/>
+                      </wps:bodyPr>
+                    </wps:wsp>
+                  </a:graphicData>
+                </a:graphic>
+              </wp:anchor>
+            </w:drawing>
+          </mc:Choice>
+          <mc:Fallback>
+            <w:pict>
+              <v:shapetype w14:anchorId="69303397" id="_x0000_t202" coordsize="21600,21600" o:spt="202" path="m,l,21600r21600,l21600,xe">
+                <v:stroke joinstyle="miter"/>
+                <v:path gradientshapeok="t" o:connecttype="rect"/>
+              </v:shapetype>
+              <v:shape id="Text Box 1" o:spid="_x0000_s1026" type="#_x0000_t202" style="position:absolute;margin-left:.25pt;margin-top:320.55pt;width:466.8pt;height:.05pt;z-index:251660288;visibility:visible;mso-wrap-style:square;mso-wrap-distance-left:9pt;mso-wrap-distance-top:0;mso-wrap-distance-right:9pt;mso-wrap-distance-bottom:0;mso-position-horizontal:absolute;mso-position-horizontal-relative:text;mso-position-vertical:absolute;mso-position-vertical-relative:text;v-text-anchor:top" o:gfxdata="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" stroked="f">
+                <v:textbox style="mso-fit-shape-to-text:t" inset="0,0,0,0">
+                  <w:txbxContent>
+                    <w:p>
+                      <w:pPr>
+                        <w:pStyle w:val="Caption"/>
+                        <w:rPr>
+                          <w:noProof/>
+                        </w:rPr>
+                      </w:pPr>
+                      <w:r>
+                        <w:t xml:space="preserve">Figure </w:t>
+                      </w:r>
+                      <w:r>
+                        <w:fldChar w:fldCharType="begin"/>
+                      </w:r>
+                      <w:r>
+                        <w:instrText xml:space="preserve"> SEQ Figure \* ARABIC </w:instrText>
+                      </w:r>
+                      <w:r>
+                        <w:fldChar w:fldCharType="separate"/>
+                      </w:r>
+                      <w:r>
+                        <w:rPr>
+                          <w:noProof/>
+                        </w:rPr>
+                        <w:t>1</w:t>
+                      </w:r>
+                      <w:r>
+                        <w:fldChar w:fldCharType="end"/>
+                      </w:r>
+                      <w:r>
+                        <w:t xml:space="preserve"> - User Persona Design</w:t>
+                      </w:r>
+                    </w:p>
+                  </w:txbxContent>
+                </v:textbox>
+                <w10:wrap type="square"/>
+              </v:shape>
+            </w:pict>
+          </mc:Fallback>
+        </mc:AlternateContent>
+      </w:r>
+      <w:r>
+        <w:rPr>
+          <w:noProof/>
+        </w:rPr>
+        <w:drawing>
+          <wp:anchor distT="0" distB="0" distL="114300" distR="114300" simplePos="0" relativeHeight="251658240" behindDoc="0" locked="0" layoutInCell="1" allowOverlap="1" wp14:anchorId="32674C31" wp14:editId="391F26B9">
+            <wp:simplePos x="0" y="0"/>
+            <wp:positionH relativeFrom="column">
+              <wp:posOffset>3175</wp:posOffset>
+            </wp:positionH>
+            <wp:positionV relativeFrom="paragraph">
+              <wp:posOffset>295275</wp:posOffset>
+            </wp:positionV>
+            <wp:extent cx="5928360" cy="3710940"/>
+            <wp:effectExtent l="0" t="0" r="0" b="3810"/>
+            <wp:wrapSquare wrapText="bothSides"/>
+            <wp:docPr id="1097457692" name="Picture 1"/>
+            <wp:cNvGraphicFramePr>
+              <a:graphicFrameLocks xmlns:a="http://schemas.openxmlformats.org/drawingml/2006/main" noChangeAspect="1"/>
+            </wp:cNvGraphicFramePr>
+            <a:graphic xmlns:a="http://schemas.openxmlformats.org/drawingml/2006/main">
+              <a:graphicData uri="http://schemas.openxmlformats.org/drawingml/2006/picture">
+                <pic:pic xmlns:pic="http://schemas.openxmlformats.org/drawingml/2006/picture">
+                  <pic:nvPicPr>
+                    <pic:cNvPr id="0" name="Picture 1"/>
+                    <pic:cNvPicPr>
+                      <a:picLocks noChangeAspect="1" noChangeArrowheads="1"/>
+                    </pic:cNvPicPr>
+                  </pic:nvPicPr>
+                  <pic:blipFill>
+                    <a:blip r:embed="rId8" cstate="print">
+                      <a:extLst>
+                        <a:ext uri="{28A0092B-C50C-407E-A947-70E740481C1C}">
+                          <a14:useLocalDpi xmlns:a14="http://schemas.microsoft.com/office/drawing/2010/main" val="0"/>
+                        </a:ext>
+                      </a:extLst>
+                    </a:blip>
+                    <a:srcRect/>
+                    <a:stretch>
+                      <a:fillRect/>
+                    </a:stretch>
+                  </pic:blipFill>
+                  <pic:spPr bwMode="auto">
+                    <a:xfrm>
+                      <a:off x="0" y="0"/>
+                      <a:ext cx="5928360" cy="3710940"/>
+                    </a:xfrm>
+                    <a:prstGeom prst="rect">
+                      <a:avLst/>
+                    </a:prstGeom>
+                    <a:noFill/>
+                    <a:ln>
+                      <a:noFill/>
+                    </a:ln>
+                  </pic:spPr>
+                </pic:pic>
+              </a:graphicData>
+            </a:graphic>
+          </wp:anchor>
+        </w:drawing>
+      </w:r>
+    </w:p>
+    <w:p>
+      <w:pPr>
+        <w:spacing w:line="278" w:lineRule="auto"/>
+      </w:pPr>
+      <w:r>
+        <w:br w:type="page"/>
+      </w:r>
+    </w:p>
+    <w:p>
+      <w:pPr>
+        <w:pStyle w:val="Heading4"/>
+      </w:pPr>
+      <w:r>
+        <w:lastRenderedPageBreak/>
+        <w:t>Customer Persona</w:t>
+      </w:r>
+    </w:p>
+    <w:p>
+      <w:pPr>
+        <w:pStyle w:val="Caption"/>
+        <w:keepNext/>
+        <w:jc w:val="left"/>
+        <w:rPr>
+          <w:i w:val="0"/>
+          <w:iCs w:val="0"/>
+          <w:color w:val="auto"/>
+          <w:sz w:val="24"/>
+          <w:szCs w:val="24"/>
+        </w:rPr>
+      </w:pPr>
+      <w:r>
+        <w:rPr>
+          <w:i w:val="0"/>
+          <w:iCs w:val="0"/>
+          <w:color w:val="auto"/>
+          <w:sz w:val="24"/>
+          <w:szCs w:val="24"/>
+        </w:rPr>
+        <w:t>Lina Benamar is an influential travel and lifestyle blogger aged 27 years who travels extensively across the Algerian nation for the purpose of creating digital content on the various social media platforms and collaborating with tourism and lifestyle brands. Since the mode of transportation greatly affects the quality of the content she creates, she often buys herself modern and visually appealing cars which make the travel experience much more pleasant and professional.</w:t>
+      </w:r>
+    </w:p>
+    <w:p>
+      <w:pPr>
+        <w:pStyle w:val="Caption"/>
+        <w:keepNext/>
+        <w:jc w:val="left"/>
+        <w:rPr>
+          <w:i w:val="0"/>
+          <w:iCs w:val="0"/>
+          <w:color w:val="auto"/>
+          <w:sz w:val="24"/>
+          <w:szCs w:val="24"/>
+        </w:rPr>
+      </w:pPr>
+      <w:r>
+        <w:rPr>
+          <w:i w:val="0"/>
+          <w:iCs w:val="0"/>
+          <w:color w:val="auto"/>
+          <w:sz w:val="24"/>
+          <w:szCs w:val="24"/>
+        </w:rPr>
+        <w:t>Before embarking on a new journey, Benamar logs into the KriGo website using her smartphone and finds the most suitable and high-quality vehicles located near her intended destination. She then proceeds to consider the model of the car, rental price, customer reviews, and agency reviews before making her choice according to her travel agenda and content needs. With a payment being processed via the secure payment system, she gets the necessary details about the reservation.</w:t>
+      </w:r>
+    </w:p>
+    <w:p>
+      <w:pPr>
+        <w:pStyle w:val="Caption"/>
+        <w:keepNext/>
+        <w:jc w:val="left"/>
+        <w:rPr>
+          <w:i w:val="0"/>
+          <w:iCs w:val="0"/>
+          <w:color w:val="auto"/>
+          <w:sz w:val="24"/>
+          <w:szCs w:val="24"/>
+        </w:rPr>
+      </w:pPr>
+      <w:r>
+        <w:rPr>
+          <w:i w:val="0"/>
+          <w:iCs w:val="0"/>
+          <w:color w:val="auto"/>
+          <w:sz w:val="24"/>
+          <w:szCs w:val="24"/>
+        </w:rPr>
+        <w:t>During the time of the rental, Benamar uses the app to track her reservation status, communicate with the rental agency and change the booking according to any updates to her travel plans. Once she returns the car, she gives her feedback about the vehicle and the experience of renting it. She also posts some of the travel content on her social media accounts and indirectly promotes the destination and the rental experience.</w:t>
+      </w:r>
+    </w:p>
+    <w:p/>
+    <w:p>
+      <w:pPr>
+        <w:pStyle w:val="Caption"/>
+        <w:keepNext/>
+        <w:jc w:val="left"/>
+      </w:pPr>
+      <w:r>
+        <w:t xml:space="preserve">Table </w:t>
+      </w:r>
+      <w:r>
+        <w:fldChar w:fldCharType="begin"/>
+      </w:r>
+      <w:r>
+        <w:instrText xml:space="preserve"> SEQ Table \* ARABIC </w:instrText>
+      </w:r>
+      <w:r>
+        <w:fldChar w:fldCharType="separate"/>
+      </w:r>
+      <w:r>
+        <w:rPr>
+          <w:noProof/>
+        </w:rPr>
+        <w:t>1</w:t>
+      </w:r>
+      <w:r>
+        <w:fldChar w:fldCharType="end"/>
+      </w:r>
+      <w:r>
+        <w:t xml:space="preserve"> - </w:t>
+      </w:r>
+      <w:r>
+        <w:t>Customer Persona</w:t>
+      </w:r>
+    </w:p>
+    <w:tbl>
+      <w:tblPr>
+        <w:tblStyle w:val="PlainTable1"/>
+        <w:tblW w:w="0" w:type="auto"/>
+        <w:tblCellMar>
+          <w:top w:w="72" w:type="dxa"/>
+          <w:bottom w:w="72" w:type="dxa"/>
+        </w:tblCellMar>
+        <w:tblLook w:val="04A0" w:firstRow="1" w:lastRow="0" w:firstColumn="1" w:lastColumn="0" w:noHBand="0" w:noVBand="1"/>
+      </w:tblPr>
+      <w:tblGrid>
+        <w:gridCol w:w="2695"/>
+        <w:gridCol w:w="6652"/>
+      </w:tblGrid>
+      <w:tr>
+        <w:trPr>
+          <w:cnfStyle w:val="100000000000" w:firstRow="1" w:lastRow="0" w:firstColumn="0" w:lastColumn="0" w:oddVBand="0" w:evenVBand="0" w:oddHBand="0" w:evenHBand="0" w:firstRowFirstColumn="0" w:firstRowLastColumn="0" w:lastRowFirstColumn="0" w:lastRowLastColumn="0"/>
+        </w:trPr>
+        <w:tc>
+          <w:tcPr>
+            <w:cnfStyle w:val="001000000000" w:firstRow="0" w:lastRow="0" w:firstColumn="1" w:lastColumn="0" w:oddVBand="0" w:evenVBand="0" w:oddHBand="0" w:evenHBand="0" w:firstRowFirstColumn="0" w:firstRowLastColumn="0" w:lastRowFirstColumn="0" w:lastRowLastColumn="0"/>
+            <w:tcW w:w="2695" w:type="dxa"/>
+            <w:vAlign w:val="center"/>
+            <w:hideMark/>
+          </w:tcPr>
+          <w:p>
+            <w:r>
+              <w:t>Attribute</w:t>
+            </w:r>
+          </w:p>
+        </w:tc>
+        <w:tc>
+          <w:tcPr>
+            <w:tcW w:w="6652" w:type="dxa"/>
+            <w:vAlign w:val="center"/>
+            <w:hideMark/>
+          </w:tcPr>
+          <w:p>
+            <w:pPr>
+              <w:cnfStyle w:val="100000000000" w:firstRow="1" w:lastRow="0" w:firstColumn="0" w:lastColumn="0" w:oddVBand="0" w:evenVBand="0" w:oddHBand="0" w:evenHBand="0" w:firstRowFirstColumn="0" w:firstRowLastColumn="0" w:lastRowFirstColumn="0" w:lastRowLastColumn="0"/>
+            </w:pPr>
+            <w:r>
+              <w:t>Description</w:t>
+            </w:r>
+          </w:p>
+        </w:tc>
+      </w:tr>
+      <w:tr>
+        <w:trPr>
+          <w:cnfStyle w:val="000000100000" w:firstRow="0" w:lastRow="0" w:firstColumn="0" w:lastColumn="0" w:oddVBand="0" w:evenVBand="0" w:oddHBand="1" w:evenHBand="0" w:firstRowFirstColumn="0" w:firstRowLastColumn="0" w:lastRowFirstColumn="0" w:lastRowLastColumn="0"/>
+        </w:trPr>
+        <w:tc>
+          <w:tcPr>
+            <w:cnfStyle w:val="001000000000" w:firstRow="0" w:lastRow="0" w:firstColumn="1" w:lastColumn="0" w:oddVBand="0" w:evenVBand="0" w:oddHBand="0" w:evenHBand="0" w:firstRowFirstColumn="0" w:firstRowLastColumn="0" w:lastRowFirstColumn="0" w:lastRowLastColumn="0"/>
+            <w:tcW w:w="2695" w:type="dxa"/>
+            <w:vAlign w:val="center"/>
+            <w:hideMark/>
+          </w:tcPr>
+          <w:p>
+            <w:pPr>
+              <w:rPr>
+                <w:b w:val="0"/>
+                <w:bCs w:val="0"/>
+              </w:rPr>
+            </w:pPr>
+            <w:r>
+              <w:rPr>
+                <w:b w:val="0"/>
+                <w:bCs w:val="0"/>
+              </w:rPr>
+              <w:t>Persona Name</w:t>
+            </w:r>
+          </w:p>
+        </w:tc>
+        <w:tc>
+          <w:tcPr>
+            <w:tcW w:w="6652" w:type="dxa"/>
+            <w:vAlign w:val="center"/>
+            <w:hideMark/>
+          </w:tcPr>
+          <w:p>
+            <w:pPr>
+              <w:cnfStyle w:val="000000100000" w:firstRow="0" w:lastRow="0" w:firstColumn="0" w:lastColumn="0" w:oddVBand="0" w:evenVBand="0" w:oddHBand="1" w:evenHBand="0" w:firstRowFirstColumn="0" w:firstRowLastColumn="0" w:lastRowFirstColumn="0" w:lastRowLastColumn="0"/>
+            </w:pPr>
+            <w:r>
+              <w:t>Lina Benamar</w:t>
+            </w:r>
+          </w:p>
+        </w:tc>
+      </w:tr>
+      <w:tr>
+        <w:tc>
+          <w:tcPr>
+            <w:cnfStyle w:val="001000000000" w:firstRow="0" w:lastRow="0" w:firstColumn="1" w:lastColumn="0" w:oddVBand="0" w:evenVBand="0" w:oddHBand="0" w:evenHBand="0" w:firstRowFirstColumn="0" w:firstRowLastColumn="0" w:lastRowFirstColumn="0" w:lastRowLastColumn="0"/>
+            <w:tcW w:w="2695" w:type="dxa"/>
+            <w:vAlign w:val="center"/>
+            <w:hideMark/>
+          </w:tcPr>
+          <w:p>
+            <w:pPr>
+              <w:rPr>
+                <w:b w:val="0"/>
+                <w:bCs w:val="0"/>
+              </w:rPr>
+            </w:pPr>
+            <w:r>
+              <w:rPr>
+                <w:b w:val="0"/>
+                <w:bCs w:val="0"/>
+              </w:rPr>
+              <w:t>Age</w:t>
+            </w:r>
+          </w:p>
+        </w:tc>
+        <w:tc>
+          <w:tcPr>
+            <w:tcW w:w="6652" w:type="dxa"/>
+            <w:vAlign w:val="center"/>
+            <w:hideMark/>
+          </w:tcPr>
+          <w:p>
+            <w:pPr>
+              <w:cnfStyle w:val="000000000000" w:firstRow="0" w:lastRow="0" w:firstColumn="0" w:lastColumn="0" w:oddVBand="0" w:evenVBand="0" w:oddHBand="0" w:evenHBand="0" w:firstRowFirstColumn="0" w:firstRowLastColumn="0" w:lastRowFirstColumn="0" w:lastRowLastColumn="0"/>
+            </w:pPr>
+            <w:r>
+              <w:t>27 Years</w:t>
+            </w:r>
+          </w:p>
+        </w:tc>
+      </w:tr>
+      <w:tr>
+        <w:trPr>
+          <w:cnfStyle w:val="000000100000" w:firstRow="0" w:lastRow="0" w:firstColumn="0" w:lastColumn="0" w:oddVBand="0" w:evenVBand="0" w:oddHBand="1" w:evenHBand="0" w:firstRowFirstColumn="0" w:firstRowLastColumn="0" w:lastRowFirstColumn="0" w:lastRowLastColumn="0"/>
+        </w:trPr>
+        <w:tc>
+          <w:tcPr>
+            <w:cnfStyle w:val="001000000000" w:firstRow="0" w:lastRow="0" w:firstColumn="1" w:lastColumn="0" w:oddVBand="0" w:evenVBand="0" w:oddHBand="0" w:evenHBand="0" w:firstRowFirstColumn="0" w:firstRowLastColumn="0" w:lastRowFirstColumn="0" w:lastRowLastColumn="0"/>
+            <w:tcW w:w="2695" w:type="dxa"/>
+            <w:vAlign w:val="center"/>
+            <w:hideMark/>
+          </w:tcPr>
+          <w:p>
+            <w:pPr>
+              <w:rPr>
+                <w:b w:val="0"/>
+                <w:bCs w:val="0"/>
+              </w:rPr>
+            </w:pPr>
+            <w:r>
+              <w:rPr>
+                <w:b w:val="0"/>
+                <w:bCs w:val="0"/>
+              </w:rPr>
+              <w:t>Occupation</w:t>
+            </w:r>
+          </w:p>
+        </w:tc>
+        <w:tc>
+          <w:tcPr>
+            <w:tcW w:w="6652" w:type="dxa"/>
+            <w:vAlign w:val="center"/>
+            <w:hideMark/>
+          </w:tcPr>
+          <w:p>
+            <w:pPr>
+              <w:cnfStyle w:val="000000100000" w:firstRow="0" w:lastRow="0" w:firstColumn="0" w:lastColumn="0" w:oddVBand="0" w:evenVBand="0" w:oddHBand="1" w:evenHBand="0" w:firstRowFirstColumn="0" w:firstRowLastColumn="0" w:lastRowFirstColumn="0" w:lastRowLastColumn="0"/>
+            </w:pPr>
+            <w:r>
+              <w:t>Travel and Lifestyle Influencer</w:t>
+            </w:r>
+          </w:p>
+        </w:tc>
+      </w:tr>
+      <w:tr>
+        <w:tc>
+          <w:tcPr>
+            <w:cnfStyle w:val="001000000000" w:firstRow="0" w:lastRow="0" w:firstColumn="1" w:lastColumn="0" w:oddVBand="0" w:evenVBand="0" w:oddHBand="0" w:evenHBand="0" w:firstRowFirstColumn="0" w:firstRowLastColumn="0" w:lastRowFirstColumn="0" w:lastRowLastColumn="0"/>
+            <w:tcW w:w="2695" w:type="dxa"/>
+            <w:vAlign w:val="center"/>
+            <w:hideMark/>
+          </w:tcPr>
+          <w:p>
+            <w:pPr>
+              <w:rPr>
+                <w:b w:val="0"/>
+                <w:bCs w:val="0"/>
+              </w:rPr>
+            </w:pPr>
+            <w:r>
+              <w:rPr>
+                <w:b w:val="0"/>
+                <w:bCs w:val="0"/>
+              </w:rPr>
+              <w:t>Technical Proficiency</w:t>
+            </w:r>
+          </w:p>
+        </w:tc>
+        <w:tc>
+          <w:tcPr>
+            <w:tcW w:w="6652" w:type="dxa"/>
+            <w:vAlign w:val="center"/>
+            <w:hideMark/>
+          </w:tcPr>
+          <w:p>
+            <w:pPr>
+              <w:cnfStyle w:val="000000000000" w:firstRow="0" w:lastRow="0" w:firstColumn="0" w:lastColumn="0" w:oddVBand="0" w:evenVBand="0" w:oddHBand="0" w:evenHBand="0" w:firstRowFirstColumn="0" w:firstRowLastColumn="0" w:lastRowFirstColumn="0" w:lastRowLastColumn="0"/>
+            </w:pPr>
+            <w:r>
+              <w:t>High</w:t>
+            </w:r>
+          </w:p>
+        </w:tc>
+      </w:tr>
+      <w:tr>
+        <w:trPr>
+          <w:cnfStyle w:val="000000100000" w:firstRow="0" w:lastRow="0" w:firstColumn="0" w:lastColumn="0" w:oddVBand="0" w:evenVBand="0" w:oddHBand="1" w:evenHBand="0" w:firstRowFirstColumn="0" w:firstRowLastColumn="0" w:lastRowFirstColumn="0" w:lastRowLastColumn="0"/>
+        </w:trPr>
+        <w:tc>
+          <w:tcPr>
+            <w:cnfStyle w:val="001000000000" w:firstRow="0" w:lastRow="0" w:firstColumn="1" w:lastColumn="0" w:oddVBand="0" w:evenVBand="0" w:oddHBand="0" w:evenHBand="0" w:firstRowFirstColumn="0" w:firstRowLastColumn="0" w:lastRowFirstColumn="0" w:lastRowLastColumn="0"/>
+            <w:tcW w:w="2695" w:type="dxa"/>
+            <w:vAlign w:val="center"/>
+            <w:hideMark/>
+          </w:tcPr>
+          <w:p>
+            <w:pPr>
+              <w:rPr>
+                <w:b w:val="0"/>
+                <w:bCs w:val="0"/>
+              </w:rPr>
+            </w:pPr>
+            <w:r>
+              <w:rPr>
+                <w:b w:val="0"/>
+                <w:bCs w:val="0"/>
+              </w:rPr>
+              <w:t>Primary Device</w:t>
+            </w:r>
+          </w:p>
+        </w:tc>
+        <w:tc>
+          <w:tcPr>
+            <w:tcW w:w="6652" w:type="dxa"/>
+            <w:vAlign w:val="center"/>
+            <w:hideMark/>
+          </w:tcPr>
+          <w:p>
+            <w:pPr>
+              <w:cnfStyle w:val="000000100000" w:firstRow="0" w:lastRow="0" w:firstColumn="0" w:lastColumn="0" w:oddVBand="0" w:evenVBand="0" w:oddHBand="1" w:evenHBand="0" w:firstRowFirstColumn="0" w:firstRowLastColumn="0" w:lastRowFirstColumn="0" w:lastRowLastColumn="0"/>
+            </w:pPr>
+            <w:r>
+              <w:t>Smartphone</w:t>
+            </w:r>
+          </w:p>
+        </w:tc>
+      </w:tr>
+      <w:tr>
+        <w:tc>
+          <w:tcPr>
+            <w:cnfStyle w:val="001000000000" w:firstRow="0" w:lastRow="0" w:firstColumn="1" w:lastColumn="0" w:oddVBand="0" w:evenVBand="0" w:oddHBand="0" w:evenHBand="0" w:firstRowFirstColumn="0" w:firstRowLastColumn="0" w:lastRowFirstColumn="0" w:lastRowLastColumn="0"/>
+            <w:tcW w:w="2695" w:type="dxa"/>
+            <w:vAlign w:val="center"/>
+            <w:hideMark/>
+          </w:tcPr>
+          <w:p>
+            <w:pPr>
+              <w:rPr>
+                <w:b w:val="0"/>
+                <w:bCs w:val="0"/>
+              </w:rPr>
+            </w:pPr>
+            <w:r>
+              <w:rPr>
+                <w:b w:val="0"/>
+                <w:bCs w:val="0"/>
+              </w:rPr>
+              <w:t>Goals</w:t>
+            </w:r>
+          </w:p>
+        </w:tc>
+        <w:tc>
+          <w:tcPr>
+            <w:tcW w:w="6652" w:type="dxa"/>
+            <w:vAlign w:val="center"/>
+            <w:hideMark/>
+          </w:tcPr>
+          <w:p>
+            <w:pPr>
+              <w:cnfStyle w:val="000000000000" w:firstRow="0" w:lastRow="0" w:firstColumn="0" w:lastColumn="0" w:oddVBand="0" w:evenVBand="0" w:oddHBand="0" w:evenHBand="0" w:firstRowFirstColumn="0" w:firstRowLastColumn="0" w:lastRowFirstColumn="0" w:lastRowLastColumn="0"/>
+            </w:pPr>
+            <w:r>
+              <w:t>Rent stylish and reliable vehicles for travel, content creation, and collaborations with brands while completing reservations quickly and securely.</w:t>
+            </w:r>
+          </w:p>
+        </w:tc>
+      </w:tr>
+      <w:tr>
+        <w:trPr>
+          <w:cnfStyle w:val="000000100000" w:firstRow="0" w:lastRow="0" w:firstColumn="0" w:lastColumn="0" w:oddVBand="0" w:evenVBand="0" w:oddHBand="1" w:evenHBand="0" w:firstRowFirstColumn="0" w:firstRowLastColumn="0" w:lastRowFirstColumn="0" w:lastRowLastColumn="0"/>
+        </w:trPr>
+        <w:tc>
+          <w:tcPr>
+            <w:cnfStyle w:val="001000000000" w:firstRow="0" w:lastRow="0" w:firstColumn="1" w:lastColumn="0" w:oddVBand="0" w:evenVBand="0" w:oddHBand="0" w:evenHBand="0" w:firstRowFirstColumn="0" w:firstRowLastColumn="0" w:lastRowFirstColumn="0" w:lastRowLastColumn="0"/>
+            <w:tcW w:w="2695" w:type="dxa"/>
+            <w:vAlign w:val="center"/>
+            <w:hideMark/>
+          </w:tcPr>
+          <w:p>
+            <w:pPr>
+              <w:rPr>
+                <w:b w:val="0"/>
+                <w:bCs w:val="0"/>
+              </w:rPr>
+            </w:pPr>
+            <w:r>
+              <w:rPr>
+                <w:b w:val="0"/>
+                <w:bCs w:val="0"/>
+              </w:rPr>
+              <w:t>Motivations</w:t>
+            </w:r>
+          </w:p>
+        </w:tc>
+        <w:tc>
+          <w:tcPr>
+            <w:tcW w:w="6652" w:type="dxa"/>
+            <w:vAlign w:val="center"/>
+            <w:hideMark/>
+          </w:tcPr>
+          <w:p>
+            <w:pPr>
+              <w:cnfStyle w:val="000000100000" w:firstRow="0" w:lastRow="0" w:firstColumn="0" w:lastColumn="0" w:oddVBand="0" w:evenVBand="0" w:oddHBand="1" w:evenHBand="0" w:firstRowFirstColumn="0" w:firstRowLastColumn="0" w:lastRowFirstColumn="0" w:lastRowLastColumn="0"/>
+            </w:pPr>
+            <w:r>
+              <w:t>High-quality travel experiences, aesthetic vehicles, convenience, transparent pricing, and seamless digital services.</w:t>
+            </w:r>
+          </w:p>
+        </w:tc>
+      </w:tr>
+      <w:tr>
+        <w:tc>
+          <w:tcPr>
+            <w:cnfStyle w:val="001000000000" w:firstRow="0" w:lastRow="0" w:firstColumn="1" w:lastColumn="0" w:oddVBand="0" w:evenVBand="0" w:oddHBand="0" w:evenHBand="0" w:firstRowFirstColumn="0" w:firstRowLastColumn="0" w:lastRowFirstColumn="0" w:lastRowLastColumn="0"/>
+            <w:tcW w:w="2695" w:type="dxa"/>
+            <w:vAlign w:val="center"/>
+            <w:hideMark/>
+          </w:tcPr>
+          <w:p>
+            <w:pPr>
+              <w:rPr>
+                <w:b w:val="0"/>
+                <w:bCs w:val="0"/>
+              </w:rPr>
+            </w:pPr>
+            <w:r>
+              <w:rPr>
+                <w:b w:val="0"/>
+                <w:bCs w:val="0"/>
+              </w:rPr>
+              <w:t>Pain Points</w:t>
+            </w:r>
+          </w:p>
+        </w:tc>
+        <w:tc>
+          <w:tcPr>
+            <w:tcW w:w="6652" w:type="dxa"/>
+            <w:vAlign w:val="center"/>
+            <w:hideMark/>
+          </w:tcPr>
+          <w:p>
+            <w:pPr>
+              <w:cnfStyle w:val="000000000000" w:firstRow="0" w:lastRow="0" w:firstColumn="0" w:lastColumn="0" w:oddVBand="0" w:evenVBand="0" w:oddHBand="0" w:evenHBand="0" w:firstRowFirstColumn="0" w:firstRowLastColumn="0" w:lastRowFirstColumn="0" w:lastRowLastColumn="0"/>
+            </w:pPr>
+            <w:r>
+              <w:t>Limited availability of premium vehicles, complicated booking procedures, hidden fees, delayed reservation confirmations, and inconsistent vehicle quality.</w:t>
+            </w:r>
+          </w:p>
+        </w:tc>
+      </w:tr>
+      <w:tr>
+        <w:trPr>
+          <w:cnfStyle w:val="000000100000" w:firstRow="0" w:lastRow="0" w:firstColumn="0" w:lastColumn="0" w:oddVBand="0" w:evenVBand="0" w:oddHBand="1" w:evenHBand="0" w:firstRowFirstColumn="0" w:firstRowLastColumn="0" w:lastRowFirstColumn="0" w:lastRowLastColumn="0"/>
+        </w:trPr>
+        <w:tc>
+          <w:tcPr>
+            <w:cnfStyle w:val="001000000000" w:firstRow="0" w:lastRow="0" w:firstColumn="1" w:lastColumn="0" w:oddVBand="0" w:evenVBand="0" w:oddHBand="0" w:evenHBand="0" w:firstRowFirstColumn="0" w:firstRowLastColumn="0" w:lastRowFirstColumn="0" w:lastRowLastColumn="0"/>
+            <w:tcW w:w="2695" w:type="dxa"/>
+            <w:vAlign w:val="center"/>
+            <w:hideMark/>
+          </w:tcPr>
+          <w:p>
+            <w:pPr>
+              <w:rPr>
+                <w:b w:val="0"/>
+                <w:bCs w:val="0"/>
+              </w:rPr>
+            </w:pPr>
+            <w:r>
+              <w:rPr>
+                <w:b w:val="0"/>
+                <w:bCs w:val="0"/>
+              </w:rPr>
+              <w:t>System Usage</w:t>
+            </w:r>
+          </w:p>
+        </w:tc>
+        <w:tc>
+          <w:tcPr>
+            <w:tcW w:w="6652" w:type="dxa"/>
+            <w:vAlign w:val="center"/>
+            <w:hideMark/>
+          </w:tcPr>
+          <w:p>
+            <w:pPr>
+              <w:cnfStyle w:val="000000100000" w:firstRow="0" w:lastRow="0" w:firstColumn="0" w:lastColumn="0" w:oddVBand="0" w:evenVBand="0" w:oddHBand="1" w:evenHBand="0" w:firstRowFirstColumn="0" w:firstRowLastColumn="0" w:lastRowFirstColumn="0" w:lastRowLastColumn="0"/>
+            </w:pPr>
+            <w:r>
+              <w:t>Search for premium vehicles, compare rental options, make reservations, complete online payments, manage bookings, and share reviews based on rental experiences.</w:t>
+            </w:r>
+          </w:p>
+        </w:tc>
+      </w:tr>
+    </w:tbl>
+    <w:p/>
+    <w:p>
+      <w:pPr>
+        <w:spacing w:line="278" w:lineRule="auto"/>
+      </w:pPr>
+      <w:r>
+        <w:br w:type="page"/>
+      </w:r>
+    </w:p>
+    <w:p>
+      <w:pPr>
+        <w:pStyle w:val="Heading4"/>
+      </w:pPr>
+      <w:r>
+        <w:lastRenderedPageBreak/>
+        <w:t>Rental Agency Manager Persona</w:t>
+      </w:r>
+    </w:p>
+    <w:p>
+      <w:pPr>
+        <w:spacing w:after="0"/>
+        <w:cnfStyle w:val="101000000000" w:firstRow="1" w:lastRow="0" w:firstColumn="1" w:lastColumn="0" w:oddVBand="0" w:evenVBand="0" w:oddHBand="0" w:evenHBand="0" w:firstRowFirstColumn="0" w:firstRowLastColumn="0" w:lastRowFirstColumn="0" w:lastRowLastColumn="0"/>
+      </w:pPr>
+      <w:r>
+        <w:t xml:space="preserve">Administering a mid-sized car rental company with several branches is what </w:t>
+      </w:r>
+      <w:r>
+        <w:t>Mohammed Ouali</w:t>
+      </w:r>
+    </w:p>
+    <w:p>
+      <w:r>
+        <w:t>does every day. H</w:t>
+      </w:r>
+      <w:r>
+        <w:t>is</w:t>
+      </w:r>
+      <w:r>
+        <w:t xml:space="preserve"> responsibilities include monitoring the availability of cars, making sure there are reservations, allocating employees, and conducting organizational performance analysis. In order to simplify her work, she does not rely on spreadsheets and workflows anymore but uses the KriGo management dashboard to manage all operations.</w:t>
+      </w:r>
+    </w:p>
+    <w:p>
+      <w:r>
+        <w:t xml:space="preserve">Every morning, he reviews newly received reservations, checks whether vehicles are available and the status of the ongoing renting process. After the acquisition of new vehicles, </w:t>
+      </w:r>
+      <w:r>
+        <w:t>Mohammed</w:t>
+      </w:r>
+      <w:r>
+        <w:t xml:space="preserve"> adds them to the fleet, makes photos and provides all information about them, as well as assigns these cars to the correct branch. Moreover, he gets business reports, which contain such metrics as reservations, earnings, and fleet usage.</w:t>
+      </w:r>
+    </w:p>
+    <w:p>
+      <w:pPr>
+        <w:pStyle w:val="Caption"/>
+        <w:keepNext/>
+      </w:pPr>
+    </w:p>
+    <w:p>
+      <w:pPr>
+        <w:pStyle w:val="Caption"/>
+        <w:keepNext/>
+        <w:jc w:val="left"/>
+      </w:pPr>
+      <w:r>
+        <w:t xml:space="preserve">Table </w:t>
+      </w:r>
+      <w:r>
+        <w:fldChar w:fldCharType="begin"/>
+      </w:r>
+      <w:r>
+        <w:instrText xml:space="preserve"> SEQ Table \* ARABIC </w:instrText>
+      </w:r>
+      <w:r>
+        <w:fldChar w:fldCharType="separate"/>
+      </w:r>
+      <w:r>
+        <w:rPr>
+          <w:noProof/>
+        </w:rPr>
+        <w:t>2</w:t>
+      </w:r>
+      <w:r>
+        <w:fldChar w:fldCharType="end"/>
+      </w:r>
+      <w:r>
+        <w:t xml:space="preserve"> - </w:t>
+      </w:r>
+      <w:r>
+        <w:t>Rental Agency Manager Persona</w:t>
+      </w:r>
+    </w:p>
+    <w:tbl>
+      <w:tblPr>
+        <w:tblStyle w:val="PlainTable1"/>
+        <w:tblW w:w="0" w:type="auto"/>
+        <w:tblCellMar>
+          <w:top w:w="72" w:type="dxa"/>
+          <w:bottom w:w="72" w:type="dxa"/>
+        </w:tblCellMar>
+        <w:tblLook w:val="04A0" w:firstRow="1" w:lastRow="0" w:firstColumn="1" w:lastColumn="0" w:noHBand="0" w:noVBand="1"/>
+      </w:tblPr>
+      <w:tblGrid>
+        <w:gridCol w:w="2515"/>
+        <w:gridCol w:w="6832"/>
+      </w:tblGrid>
+      <w:tr>
+        <w:trPr>
+          <w:cnfStyle w:val="100000000000" w:firstRow="1" w:lastRow="0" w:firstColumn="0" w:lastColumn="0" w:oddVBand="0" w:evenVBand="0" w:oddHBand="0" w:evenHBand="0" w:firstRowFirstColumn="0" w:firstRowLastColumn="0" w:lastRowFirstColumn="0" w:lastRowLastColumn="0"/>
+        </w:trPr>
+        <w:tc>
+          <w:tcPr>
+            <w:cnfStyle w:val="001000000000" w:firstRow="0" w:lastRow="0" w:firstColumn="1" w:lastColumn="0" w:oddVBand="0" w:evenVBand="0" w:oddHBand="0" w:evenHBand="0" w:firstRowFirstColumn="0" w:firstRowLastColumn="0" w:lastRowFirstColumn="0" w:lastRowLastColumn="0"/>
+            <w:tcW w:w="2515" w:type="dxa"/>
+            <w:vAlign w:val="center"/>
+            <w:hideMark/>
+          </w:tcPr>
+          <w:p>
+            <w:r>
+              <w:t>Attribute</w:t>
+            </w:r>
+          </w:p>
+        </w:tc>
+        <w:tc>
+          <w:tcPr>
+            <w:tcW w:w="6832" w:type="dxa"/>
+            <w:vAlign w:val="center"/>
+            <w:hideMark/>
+          </w:tcPr>
+          <w:p>
+            <w:pPr>
+              <w:cnfStyle w:val="100000000000" w:firstRow="1" w:lastRow="0" w:firstColumn="0" w:lastColumn="0" w:oddVBand="0" w:evenVBand="0" w:oddHBand="0" w:evenHBand="0" w:firstRowFirstColumn="0" w:firstRowLastColumn="0" w:lastRowFirstColumn="0" w:lastRowLastColumn="0"/>
+            </w:pPr>
+            <w:r>
+              <w:t>Description</w:t>
+            </w:r>
+          </w:p>
+        </w:tc>
+      </w:tr>
+      <w:tr>
+        <w:trPr>
+          <w:cnfStyle w:val="000000100000" w:firstRow="0" w:lastRow="0" w:firstColumn="0" w:lastColumn="0" w:oddVBand="0" w:evenVBand="0" w:oddHBand="1" w:evenHBand="0" w:firstRowFirstColumn="0" w:firstRowLastColumn="0" w:lastRowFirstColumn="0" w:lastRowLastColumn="0"/>
+        </w:trPr>
+        <w:tc>
+          <w:tcPr>
+            <w:cnfStyle w:val="001000000000" w:firstRow="0" w:lastRow="0" w:firstColumn="1" w:lastColumn="0" w:oddVBand="0" w:evenVBand="0" w:oddHBand="0" w:evenHBand="0" w:firstRowFirstColumn="0" w:firstRowLastColumn="0" w:lastRowFirstColumn="0" w:lastRowLastColumn="0"/>
+            <w:tcW w:w="2515" w:type="dxa"/>
+            <w:vAlign w:val="center"/>
+            <w:hideMark/>
+          </w:tcPr>
+          <w:p>
+            <w:pPr>
+              <w:rPr>
+                <w:b w:val="0"/>
+                <w:bCs w:val="0"/>
+              </w:rPr>
+            </w:pPr>
+            <w:r>
+              <w:rPr>
+                <w:b w:val="0"/>
+                <w:bCs w:val="0"/>
+              </w:rPr>
+              <w:t>Persona Name</w:t>
+            </w:r>
+          </w:p>
+        </w:tc>
+        <w:tc>
+          <w:tcPr>
+            <w:tcW w:w="6832" w:type="dxa"/>
+            <w:vAlign w:val="center"/>
+            <w:hideMark/>
+          </w:tcPr>
+          <w:p>
+            <w:pPr>
+              <w:cnfStyle w:val="000000100000" w:firstRow="0" w:lastRow="0" w:firstColumn="0" w:lastColumn="0" w:oddVBand="0" w:evenVBand="0" w:oddHBand="1" w:evenHBand="0" w:firstRowFirstColumn="0" w:firstRowLastColumn="0" w:lastRowFirstColumn="0" w:lastRowLastColumn="0"/>
+            </w:pPr>
+            <w:r>
+              <w:t>Mohammed Ouali</w:t>
+            </w:r>
+          </w:p>
+        </w:tc>
+      </w:tr>
+      <w:tr>
+        <w:tc>
+          <w:tcPr>
+            <w:cnfStyle w:val="001000000000" w:firstRow="0" w:lastRow="0" w:firstColumn="1" w:lastColumn="0" w:oddVBand="0" w:evenVBand="0" w:oddHBand="0" w:evenHBand="0" w:firstRowFirstColumn="0" w:firstRowLastColumn="0" w:lastRowFirstColumn="0" w:lastRowLastColumn="0"/>
+            <w:tcW w:w="2515" w:type="dxa"/>
+            <w:vAlign w:val="center"/>
+            <w:hideMark/>
+          </w:tcPr>
+          <w:p>
+            <w:pPr>
+              <w:rPr>
+                <w:b w:val="0"/>
+                <w:bCs w:val="0"/>
+              </w:rPr>
+            </w:pPr>
+            <w:r>
+              <w:rPr>
+                <w:b w:val="0"/>
+                <w:bCs w:val="0"/>
+              </w:rPr>
+              <w:t>Age</w:t>
+            </w:r>
+          </w:p>
+        </w:tc>
+        <w:tc>
+          <w:tcPr>
+            <w:tcW w:w="6832" w:type="dxa"/>
+            <w:vAlign w:val="center"/>
+            <w:hideMark/>
+          </w:tcPr>
+          <w:p>
+            <w:pPr>
+              <w:cnfStyle w:val="000000000000" w:firstRow="0" w:lastRow="0" w:firstColumn="0" w:lastColumn="0" w:oddVBand="0" w:evenVBand="0" w:oddHBand="0" w:evenHBand="0" w:firstRowFirstColumn="0" w:firstRowLastColumn="0" w:lastRowFirstColumn="0" w:lastRowLastColumn="0"/>
+            </w:pPr>
+            <w:r>
+              <w:t>38 Years</w:t>
+            </w:r>
+          </w:p>
+        </w:tc>
+      </w:tr>
+      <w:tr>
+        <w:trPr>
+          <w:cnfStyle w:val="000000100000" w:firstRow="0" w:lastRow="0" w:firstColumn="0" w:lastColumn="0" w:oddVBand="0" w:evenVBand="0" w:oddHBand="1" w:evenHBand="0" w:firstRowFirstColumn="0" w:firstRowLastColumn="0" w:lastRowFirstColumn="0" w:lastRowLastColumn="0"/>
+        </w:trPr>
+        <w:tc>
+          <w:tcPr>
+            <w:cnfStyle w:val="001000000000" w:firstRow="0" w:lastRow="0" w:firstColumn="1" w:lastColumn="0" w:oddVBand="0" w:evenVBand="0" w:oddHBand="0" w:evenHBand="0" w:firstRowFirstColumn="0" w:firstRowLastColumn="0" w:lastRowFirstColumn="0" w:lastRowLastColumn="0"/>
+            <w:tcW w:w="2515" w:type="dxa"/>
+            <w:vAlign w:val="center"/>
+            <w:hideMark/>
+          </w:tcPr>
+          <w:p>
+            <w:pPr>
+              <w:rPr>
+                <w:b w:val="0"/>
+                <w:bCs w:val="0"/>
+              </w:rPr>
+            </w:pPr>
+            <w:r>
+              <w:rPr>
+                <w:b w:val="0"/>
+                <w:bCs w:val="0"/>
+              </w:rPr>
+              <w:t>Occupation</w:t>
+            </w:r>
+          </w:p>
+        </w:tc>
+        <w:tc>
+          <w:tcPr>
+            <w:tcW w:w="6832" w:type="dxa"/>
+            <w:vAlign w:val="center"/>
+            <w:hideMark/>
+          </w:tcPr>
+          <w:p>
+            <w:pPr>
+              <w:cnfStyle w:val="000000100000" w:firstRow="0" w:lastRow="0" w:firstColumn="0" w:lastColumn="0" w:oddVBand="0" w:evenVBand="0" w:oddHBand="1" w:evenHBand="0" w:firstRowFirstColumn="0" w:firstRowLastColumn="0" w:lastRowFirstColumn="0" w:lastRowLastColumn="0"/>
+            </w:pPr>
+            <w:r>
+              <w:t>Rental Agency Manager</w:t>
+            </w:r>
+          </w:p>
+        </w:tc>
+      </w:tr>
+      <w:tr>
+        <w:tc>
+          <w:tcPr>
+            <w:cnfStyle w:val="001000000000" w:firstRow="0" w:lastRow="0" w:firstColumn="1" w:lastColumn="0" w:oddVBand="0" w:evenVBand="0" w:oddHBand="0" w:evenHBand="0" w:firstRowFirstColumn="0" w:firstRowLastColumn="0" w:lastRowFirstColumn="0" w:lastRowLastColumn="0"/>
+            <w:tcW w:w="2515" w:type="dxa"/>
+            <w:vAlign w:val="center"/>
+            <w:hideMark/>
+          </w:tcPr>
+          <w:p>
+            <w:pPr>
+              <w:rPr>
+                <w:b w:val="0"/>
+                <w:bCs w:val="0"/>
+              </w:rPr>
+            </w:pPr>
+            <w:r>
+              <w:rPr>
+                <w:b w:val="0"/>
+                <w:bCs w:val="0"/>
+              </w:rPr>
+              <w:t>Technical Proficiency</w:t>
+            </w:r>
+          </w:p>
+        </w:tc>
+        <w:tc>
+          <w:tcPr>
+            <w:tcW w:w="6832" w:type="dxa"/>
+            <w:vAlign w:val="center"/>
+            <w:hideMark/>
+          </w:tcPr>
+          <w:p>
+            <w:pPr>
+              <w:cnfStyle w:val="000000000000" w:firstRow="0" w:lastRow="0" w:firstColumn="0" w:lastColumn="0" w:oddVBand="0" w:evenVBand="0" w:oddHBand="0" w:evenHBand="0" w:firstRowFirstColumn="0" w:firstRowLastColumn="0" w:lastRowFirstColumn="0" w:lastRowLastColumn="0"/>
+            </w:pPr>
+            <w:r>
+              <w:t>Intermediate</w:t>
+            </w:r>
+          </w:p>
+        </w:tc>
+      </w:tr>
+      <w:tr>
+        <w:trPr>
+          <w:cnfStyle w:val="000000100000" w:firstRow="0" w:lastRow="0" w:firstColumn="0" w:lastColumn="0" w:oddVBand="0" w:evenVBand="0" w:oddHBand="1" w:evenHBand="0" w:firstRowFirstColumn="0" w:firstRowLastColumn="0" w:lastRowFirstColumn="0" w:lastRowLastColumn="0"/>
+        </w:trPr>
+        <w:tc>
+          <w:tcPr>
+            <w:cnfStyle w:val="001000000000" w:firstRow="0" w:lastRow="0" w:firstColumn="1" w:lastColumn="0" w:oddVBand="0" w:evenVBand="0" w:oddHBand="0" w:evenHBand="0" w:firstRowFirstColumn="0" w:firstRowLastColumn="0" w:lastRowFirstColumn="0" w:lastRowLastColumn="0"/>
+            <w:tcW w:w="2515" w:type="dxa"/>
+            <w:vAlign w:val="center"/>
+            <w:hideMark/>
+          </w:tcPr>
+          <w:p>
+            <w:pPr>
+              <w:rPr>
+                <w:b w:val="0"/>
+                <w:bCs w:val="0"/>
+              </w:rPr>
+            </w:pPr>
+            <w:r>
+              <w:rPr>
+                <w:b w:val="0"/>
+                <w:bCs w:val="0"/>
+              </w:rPr>
+              <w:t>Primary Device</w:t>
+            </w:r>
+          </w:p>
+        </w:tc>
+        <w:tc>
+          <w:tcPr>
+            <w:tcW w:w="6832" w:type="dxa"/>
+            <w:vAlign w:val="center"/>
+            <w:hideMark/>
+          </w:tcPr>
+          <w:p>
+            <w:pPr>
+              <w:cnfStyle w:val="000000100000" w:firstRow="0" w:lastRow="0" w:firstColumn="0" w:lastColumn="0" w:oddVBand="0" w:evenVBand="0" w:oddHBand="1" w:evenHBand="0" w:firstRowFirstColumn="0" w:firstRowLastColumn="0" w:lastRowFirstColumn="0" w:lastRowLastColumn="0"/>
+            </w:pPr>
+            <w:r>
+              <w:t>Desktop Computer</w:t>
+            </w:r>
+          </w:p>
+        </w:tc>
+      </w:tr>
+      <w:tr>
+        <w:tc>
+          <w:tcPr>
+            <w:cnfStyle w:val="001000000000" w:firstRow="0" w:lastRow="0" w:firstColumn="1" w:lastColumn="0" w:oddVBand="0" w:evenVBand="0" w:oddHBand="0" w:evenHBand="0" w:firstRowFirstColumn="0" w:firstRowLastColumn="0" w:lastRowFirstColumn="0" w:lastRowLastColumn="0"/>
+            <w:tcW w:w="2515" w:type="dxa"/>
+            <w:vAlign w:val="center"/>
+            <w:hideMark/>
+          </w:tcPr>
+          <w:p>
+            <w:pPr>
+              <w:rPr>
+                <w:b w:val="0"/>
+                <w:bCs w:val="0"/>
+              </w:rPr>
+            </w:pPr>
+            <w:r>
+              <w:rPr>
+                <w:b w:val="0"/>
+                <w:bCs w:val="0"/>
+              </w:rPr>
+              <w:t>Goals</w:t>
+            </w:r>
+          </w:p>
+        </w:tc>
+        <w:tc>
+          <w:tcPr>
+            <w:tcW w:w="6832" w:type="dxa"/>
+            <w:vAlign w:val="center"/>
+            <w:hideMark/>
+          </w:tcPr>
+          <w:p>
+            <w:pPr>
+              <w:cnfStyle w:val="000000000000" w:firstRow="0" w:lastRow="0" w:firstColumn="0" w:lastColumn="0" w:oddVBand="0" w:evenVBand="0" w:oddHBand="0" w:evenHBand="0" w:firstRowFirstColumn="0" w:firstRowLastColumn="0" w:lastRowFirstColumn="0" w:lastRowLastColumn="0"/>
+            </w:pPr>
+            <w:r>
+              <w:t>Manage fleet inventory, monitor reservations, supervise employees, analyze business performance, and maximize vehicle utilization.</w:t>
+            </w:r>
+          </w:p>
+        </w:tc>
+      </w:tr>
+      <w:tr>
+        <w:trPr>
+          <w:cnfStyle w:val="000000100000" w:firstRow="0" w:lastRow="0" w:firstColumn="0" w:lastColumn="0" w:oddVBand="0" w:evenVBand="0" w:oddHBand="1" w:evenHBand="0" w:firstRowFirstColumn="0" w:firstRowLastColumn="0" w:lastRowFirstColumn="0" w:lastRowLastColumn="0"/>
+        </w:trPr>
+        <w:tc>
+          <w:tcPr>
+            <w:cnfStyle w:val="001000000000" w:firstRow="0" w:lastRow="0" w:firstColumn="1" w:lastColumn="0" w:oddVBand="0" w:evenVBand="0" w:oddHBand="0" w:evenHBand="0" w:firstRowFirstColumn="0" w:firstRowLastColumn="0" w:lastRowFirstColumn="0" w:lastRowLastColumn="0"/>
+            <w:tcW w:w="2515" w:type="dxa"/>
+            <w:vAlign w:val="center"/>
+            <w:hideMark/>
+          </w:tcPr>
+          <w:p>
+            <w:pPr>
+              <w:rPr>
+                <w:b w:val="0"/>
+                <w:bCs w:val="0"/>
+              </w:rPr>
+            </w:pPr>
+            <w:r>
+              <w:rPr>
+                <w:b w:val="0"/>
+                <w:bCs w:val="0"/>
+              </w:rPr>
+              <w:t>Motivations</w:t>
+            </w:r>
+          </w:p>
+        </w:tc>
+        <w:tc>
+          <w:tcPr>
+            <w:tcW w:w="6832" w:type="dxa"/>
+            <w:vAlign w:val="center"/>
+            <w:hideMark/>
+          </w:tcPr>
+          <w:p>
+            <w:pPr>
+              <w:cnfStyle w:val="000000100000" w:firstRow="0" w:lastRow="0" w:firstColumn="0" w:lastColumn="0" w:oddVBand="0" w:evenVBand="0" w:oddHBand="1" w:evenHBand="0" w:firstRowFirstColumn="0" w:firstRowLastColumn="0" w:lastRowFirstColumn="0" w:lastRowLastColumn="0"/>
+            </w:pPr>
+            <w:r>
+              <w:t>Operational efficiency, business growth, simplified management, and accurate reporting.</w:t>
+            </w:r>
+          </w:p>
+        </w:tc>
+      </w:tr>
+      <w:tr>
+        <w:tc>
+          <w:tcPr>
+            <w:cnfStyle w:val="001000000000" w:firstRow="0" w:lastRow="0" w:firstColumn="1" w:lastColumn="0" w:oddVBand="0" w:evenVBand="0" w:oddHBand="0" w:evenHBand="0" w:firstRowFirstColumn="0" w:firstRowLastColumn="0" w:lastRowFirstColumn="0" w:lastRowLastColumn="0"/>
+            <w:tcW w:w="2515" w:type="dxa"/>
+            <w:vAlign w:val="center"/>
+            <w:hideMark/>
+          </w:tcPr>
+          <w:p>
+            <w:pPr>
+              <w:rPr>
+                <w:b w:val="0"/>
+                <w:bCs w:val="0"/>
+              </w:rPr>
+            </w:pPr>
+            <w:r>
+              <w:rPr>
+                <w:b w:val="0"/>
+                <w:bCs w:val="0"/>
+              </w:rPr>
+              <w:t>Pain Points</w:t>
+            </w:r>
+          </w:p>
+        </w:tc>
+        <w:tc>
+          <w:tcPr>
+            <w:tcW w:w="6832" w:type="dxa"/>
+            <w:vAlign w:val="center"/>
+            <w:hideMark/>
+          </w:tcPr>
+          <w:p>
+            <w:pPr>
+              <w:cnfStyle w:val="000000000000" w:firstRow="0" w:lastRow="0" w:firstColumn="0" w:lastColumn="0" w:oddVBand="0" w:evenVBand="0" w:oddHBand="0" w:evenHBand="0" w:firstRowFirstColumn="0" w:firstRowLastColumn="0" w:lastRowFirstColumn="0" w:lastRowLastColumn="0"/>
+            </w:pPr>
+            <w:r>
+              <w:t>Manual fleet tracking, fragmented reservation information, inefficient reporting, and administrative overhead.</w:t>
+            </w:r>
+          </w:p>
+        </w:tc>
+      </w:tr>
+      <w:tr>
+        <w:trPr>
+          <w:cnfStyle w:val="000000100000" w:firstRow="0" w:lastRow="0" w:firstColumn="0" w:lastColumn="0" w:oddVBand="0" w:evenVBand="0" w:oddHBand="1" w:evenHBand="0" w:firstRowFirstColumn="0" w:firstRowLastColumn="0" w:lastRowFirstColumn="0" w:lastRowLastColumn="0"/>
+        </w:trPr>
+        <w:tc>
+          <w:tcPr>
+            <w:cnfStyle w:val="001000000000" w:firstRow="0" w:lastRow="0" w:firstColumn="1" w:lastColumn="0" w:oddVBand="0" w:evenVBand="0" w:oddHBand="0" w:evenHBand="0" w:firstRowFirstColumn="0" w:firstRowLastColumn="0" w:lastRowFirstColumn="0" w:lastRowLastColumn="0"/>
+            <w:tcW w:w="2515" w:type="dxa"/>
+            <w:vAlign w:val="center"/>
+            <w:hideMark/>
+          </w:tcPr>
+          <w:p>
+            <w:pPr>
+              <w:rPr>
+                <w:b w:val="0"/>
+                <w:bCs w:val="0"/>
+              </w:rPr>
+            </w:pPr>
+            <w:r>
+              <w:rPr>
+                <w:b w:val="0"/>
+                <w:bCs w:val="0"/>
+              </w:rPr>
+              <w:t>System Usage</w:t>
+            </w:r>
+          </w:p>
+        </w:tc>
+        <w:tc>
+          <w:tcPr>
+            <w:tcW w:w="6832" w:type="dxa"/>
+            <w:vAlign w:val="center"/>
+            <w:hideMark/>
+          </w:tcPr>
+          <w:p>
+            <w:pPr>
+              <w:cnfStyle w:val="000000100000" w:firstRow="0" w:lastRow="0" w:firstColumn="0" w:lastColumn="0" w:oddVBand="0" w:evenVBand="0" w:oddHBand="1" w:evenHBand="0" w:firstRowFirstColumn="0" w:firstRowLastColumn="0" w:lastRowFirstColumn="0" w:lastRowLastColumn="0"/>
+            </w:pPr>
+            <w:r>
+              <w:t>Fleet management, branch management, employee management, reporting, and reservation administration.</w:t>
+            </w:r>
+          </w:p>
+        </w:tc>
+      </w:tr>
+    </w:tbl>
+    <w:p/>
+    <w:p>
+      <w:pPr>
+        <w:spacing w:line="278" w:lineRule="auto"/>
+        <w:rPr>
+          <w:rFonts w:eastAsiaTheme="majorEastAsia" w:cstheme="majorBidi"/>
+          <w:b/>
+          <w:iCs/>
+          <w:color w:val="000000" w:themeColor="text1"/>
+        </w:rPr>
+      </w:pPr>
+      <w:r>
+        <w:br w:type="page"/>
+      </w:r>
+    </w:p>
+    <w:p>
+      <w:pPr>
+        <w:pStyle w:val="Heading4"/>
+      </w:pPr>
+      <w:r>
+        <w:lastRenderedPageBreak/>
+        <w:t>Platform Administrator Persona</w:t>
+      </w:r>
+    </w:p>
+    <w:p>
+      <w:r>
+        <w:t xml:space="preserve">It falls to </w:t>
+      </w:r>
+      <w:r>
+        <w:t>Youcef Boucine</w:t>
+      </w:r>
+      <w:r>
+        <w:t xml:space="preserve"> </w:t>
+      </w:r>
+      <w:r>
+        <w:t>to manage the operation of the entire KriGo platform. In other words, he is responsible for making sure that all activities on the platform are in accordance with organization policies and provide a secure and trustworthy environment for both clients and rental agencies.</w:t>
+      </w:r>
+    </w:p>
+    <w:p>
+      <w:r>
+        <w:t>Every day at the beginning of h</w:t>
+      </w:r>
+      <w:r>
+        <w:t>is</w:t>
+      </w:r>
+      <w:r>
+        <w:t xml:space="preserve"> working shift, </w:t>
+      </w:r>
+      <w:r>
+        <w:t>Youcef</w:t>
+      </w:r>
+      <w:r>
+        <w:t xml:space="preserve"> logs into the administrative dashboard in order to process applications for agency verification, study new user registrations, and analyze the reports concerning the disputes and inappropriate contents. Upon the submission of its registration documents by any rental agency, </w:t>
+      </w:r>
+      <w:r>
+        <w:t>Youcef</w:t>
+      </w:r>
+      <w:r>
+        <w:t xml:space="preserve"> checks all of the information very carefully before granting the agency the permission to operate on the platform.</w:t>
+      </w:r>
+    </w:p>
+    <w:p>
+      <w:r>
+        <w:t xml:space="preserve">During her working day, </w:t>
+      </w:r>
+      <w:r>
+        <w:t>Youcef</w:t>
+      </w:r>
+      <w:r>
+        <w:t xml:space="preserve"> monitors statistics of the platform, deals with the customers' complaints, settles down the disputes between the customers and rental agencies, and deletes the inappropriate contents. he also analyzes system reports for the purposes of discovering the cases of unusual activity and providing the platform security.</w:t>
+      </w:r>
+    </w:p>
+    <w:p>
+      <w:pPr>
+        <w:pStyle w:val="Caption"/>
+        <w:keepNext/>
+      </w:pPr>
+    </w:p>
+    <w:p>
+      <w:pPr>
+        <w:pStyle w:val="Caption"/>
+        <w:keepNext/>
+        <w:jc w:val="left"/>
+      </w:pPr>
+      <w:r>
+        <w:t xml:space="preserve">Table </w:t>
+      </w:r>
+      <w:r>
+        <w:fldChar w:fldCharType="begin"/>
+      </w:r>
+      <w:r>
+        <w:instrText xml:space="preserve"> SEQ Table \* ARABIC </w:instrText>
+      </w:r>
+      <w:r>
+        <w:fldChar w:fldCharType="separate"/>
+      </w:r>
+      <w:r>
+        <w:rPr>
+          <w:noProof/>
+        </w:rPr>
+        <w:t>3</w:t>
+      </w:r>
+      <w:r>
+        <w:fldChar w:fldCharType="end"/>
+      </w:r>
+      <w:r>
+        <w:t xml:space="preserve"> - </w:t>
+      </w:r>
+      <w:r>
+        <w:t>Platform Administrator Persona</w:t>
+      </w:r>
+    </w:p>
+    <w:tbl>
+      <w:tblPr>
+        <w:tblStyle w:val="PlainTable1"/>
+        <w:tblW w:w="0" w:type="auto"/>
+        <w:tblCellMar>
+          <w:top w:w="72" w:type="dxa"/>
+          <w:bottom w:w="72" w:type="dxa"/>
+        </w:tblCellMar>
+        <w:tblLook w:val="04A0" w:firstRow="1" w:lastRow="0" w:firstColumn="1" w:lastColumn="0" w:noHBand="0" w:noVBand="1"/>
+      </w:tblPr>
+      <w:tblGrid>
+        <w:gridCol w:w="2695"/>
+        <w:gridCol w:w="6652"/>
+      </w:tblGrid>
+      <w:tr>
+        <w:trPr>
+          <w:cnfStyle w:val="100000000000" w:firstRow="1" w:lastRow="0" w:firstColumn="0" w:lastColumn="0" w:oddVBand="0" w:evenVBand="0" w:oddHBand="0" w:evenHBand="0" w:firstRowFirstColumn="0" w:firstRowLastColumn="0" w:lastRowFirstColumn="0" w:lastRowLastColumn="0"/>
+        </w:trPr>
+        <w:tc>
+          <w:tcPr>
+            <w:cnfStyle w:val="001000000000" w:firstRow="0" w:lastRow="0" w:firstColumn="1" w:lastColumn="0" w:oddVBand="0" w:evenVBand="0" w:oddHBand="0" w:evenHBand="0" w:firstRowFirstColumn="0" w:firstRowLastColumn="0" w:lastRowFirstColumn="0" w:lastRowLastColumn="0"/>
+            <w:tcW w:w="2695" w:type="dxa"/>
+            <w:vAlign w:val="center"/>
+            <w:hideMark/>
+          </w:tcPr>
+          <w:p>
+            <w:r>
+              <w:t>Attribute</w:t>
+            </w:r>
+          </w:p>
+        </w:tc>
+        <w:tc>
+          <w:tcPr>
+            <w:tcW w:w="6652" w:type="dxa"/>
+            <w:vAlign w:val="center"/>
+            <w:hideMark/>
+          </w:tcPr>
+          <w:p>
+            <w:pPr>
+              <w:cnfStyle w:val="100000000000" w:firstRow="1" w:lastRow="0" w:firstColumn="0" w:lastColumn="0" w:oddVBand="0" w:evenVBand="0" w:oddHBand="0" w:evenHBand="0" w:firstRowFirstColumn="0" w:firstRowLastColumn="0" w:lastRowFirstColumn="0" w:lastRowLastColumn="0"/>
+            </w:pPr>
+            <w:r>
+              <w:t>Description</w:t>
+            </w:r>
+          </w:p>
+        </w:tc>
+      </w:tr>
+      <w:tr>
+        <w:trPr>
+          <w:cnfStyle w:val="000000100000" w:firstRow="0" w:lastRow="0" w:firstColumn="0" w:lastColumn="0" w:oddVBand="0" w:evenVBand="0" w:oddHBand="1" w:evenHBand="0" w:firstRowFirstColumn="0" w:firstRowLastColumn="0" w:lastRowFirstColumn="0" w:lastRowLastColumn="0"/>
+        </w:trPr>
+        <w:tc>
+          <w:tcPr>
+            <w:cnfStyle w:val="001000000000" w:firstRow="0" w:lastRow="0" w:firstColumn="1" w:lastColumn="0" w:oddVBand="0" w:evenVBand="0" w:oddHBand="0" w:evenHBand="0" w:firstRowFirstColumn="0" w:firstRowLastColumn="0" w:lastRowFirstColumn="0" w:lastRowLastColumn="0"/>
+            <w:tcW w:w="2695" w:type="dxa"/>
+            <w:vAlign w:val="center"/>
+            <w:hideMark/>
+          </w:tcPr>
+          <w:p>
+            <w:pPr>
+              <w:rPr>
+                <w:b w:val="0"/>
+                <w:bCs w:val="0"/>
+              </w:rPr>
+            </w:pPr>
+            <w:r>
+              <w:rPr>
+                <w:b w:val="0"/>
+                <w:bCs w:val="0"/>
+              </w:rPr>
+              <w:t>Persona Name</w:t>
+            </w:r>
+          </w:p>
+        </w:tc>
+        <w:tc>
+          <w:tcPr>
+            <w:tcW w:w="6652" w:type="dxa"/>
+            <w:vAlign w:val="center"/>
+            <w:hideMark/>
+          </w:tcPr>
+          <w:p>
+            <w:pPr>
+              <w:cnfStyle w:val="000000100000" w:firstRow="0" w:lastRow="0" w:firstColumn="0" w:lastColumn="0" w:oddVBand="0" w:evenVBand="0" w:oddHBand="1" w:evenHBand="0" w:firstRowFirstColumn="0" w:firstRowLastColumn="0" w:lastRowFirstColumn="0" w:lastRowLastColumn="0"/>
+            </w:pPr>
+            <w:r>
+              <w:t>Youcef Boucine</w:t>
+            </w:r>
+          </w:p>
+        </w:tc>
+      </w:tr>
+      <w:tr>
+        <w:tc>
+          <w:tcPr>
+            <w:cnfStyle w:val="001000000000" w:firstRow="0" w:lastRow="0" w:firstColumn="1" w:lastColumn="0" w:oddVBand="0" w:evenVBand="0" w:oddHBand="0" w:evenHBand="0" w:firstRowFirstColumn="0" w:firstRowLastColumn="0" w:lastRowFirstColumn="0" w:lastRowLastColumn="0"/>
+            <w:tcW w:w="2695" w:type="dxa"/>
+            <w:vAlign w:val="center"/>
+            <w:hideMark/>
+          </w:tcPr>
+          <w:p>
+            <w:pPr>
+              <w:rPr>
+                <w:b w:val="0"/>
+                <w:bCs w:val="0"/>
+              </w:rPr>
+            </w:pPr>
+            <w:r>
+              <w:rPr>
+                <w:b w:val="0"/>
+                <w:bCs w:val="0"/>
+              </w:rPr>
+              <w:t>Age</w:t>
+            </w:r>
+          </w:p>
+        </w:tc>
+        <w:tc>
+          <w:tcPr>
+            <w:tcW w:w="6652" w:type="dxa"/>
+            <w:vAlign w:val="center"/>
+            <w:hideMark/>
+          </w:tcPr>
+          <w:p>
+            <w:pPr>
+              <w:cnfStyle w:val="000000000000" w:firstRow="0" w:lastRow="0" w:firstColumn="0" w:lastColumn="0" w:oddVBand="0" w:evenVBand="0" w:oddHBand="0" w:evenHBand="0" w:firstRowFirstColumn="0" w:firstRowLastColumn="0" w:lastRowFirstColumn="0" w:lastRowLastColumn="0"/>
+            </w:pPr>
+            <w:r>
+              <w:t>26</w:t>
+            </w:r>
+            <w:r>
+              <w:t xml:space="preserve"> Years</w:t>
+            </w:r>
+          </w:p>
+        </w:tc>
+      </w:tr>
+      <w:tr>
+        <w:trPr>
+          <w:cnfStyle w:val="000000100000" w:firstRow="0" w:lastRow="0" w:firstColumn="0" w:lastColumn="0" w:oddVBand="0" w:evenVBand="0" w:oddHBand="1" w:evenHBand="0" w:firstRowFirstColumn="0" w:firstRowLastColumn="0" w:lastRowFirstColumn="0" w:lastRowLastColumn="0"/>
+        </w:trPr>
+        <w:tc>
+          <w:tcPr>
+            <w:cnfStyle w:val="001000000000" w:firstRow="0" w:lastRow="0" w:firstColumn="1" w:lastColumn="0" w:oddVBand="0" w:evenVBand="0" w:oddHBand="0" w:evenHBand="0" w:firstRowFirstColumn="0" w:firstRowLastColumn="0" w:lastRowFirstColumn="0" w:lastRowLastColumn="0"/>
+            <w:tcW w:w="2695" w:type="dxa"/>
+            <w:vAlign w:val="center"/>
+            <w:hideMark/>
+          </w:tcPr>
+          <w:p>
+            <w:pPr>
+              <w:rPr>
+                <w:b w:val="0"/>
+                <w:bCs w:val="0"/>
+              </w:rPr>
+            </w:pPr>
+            <w:r>
+              <w:rPr>
+                <w:b w:val="0"/>
+                <w:bCs w:val="0"/>
+              </w:rPr>
+              <w:t>Occupation</w:t>
+            </w:r>
+          </w:p>
+        </w:tc>
+        <w:tc>
+          <w:tcPr>
+            <w:tcW w:w="6652" w:type="dxa"/>
+            <w:vAlign w:val="center"/>
+            <w:hideMark/>
+          </w:tcPr>
+          <w:p>
+            <w:pPr>
+              <w:cnfStyle w:val="000000100000" w:firstRow="0" w:lastRow="0" w:firstColumn="0" w:lastColumn="0" w:oddVBand="0" w:evenVBand="0" w:oddHBand="1" w:evenHBand="0" w:firstRowFirstColumn="0" w:firstRowLastColumn="0" w:lastRowFirstColumn="0" w:lastRowLastColumn="0"/>
+            </w:pPr>
+            <w:r>
+              <w:t>System Administrator</w:t>
+            </w:r>
+          </w:p>
+        </w:tc>
+      </w:tr>
+      <w:tr>
+        <w:tc>
+          <w:tcPr>
+            <w:cnfStyle w:val="001000000000" w:firstRow="0" w:lastRow="0" w:firstColumn="1" w:lastColumn="0" w:oddVBand="0" w:evenVBand="0" w:oddHBand="0" w:evenHBand="0" w:firstRowFirstColumn="0" w:firstRowLastColumn="0" w:lastRowFirstColumn="0" w:lastRowLastColumn="0"/>
+            <w:tcW w:w="2695" w:type="dxa"/>
+            <w:vAlign w:val="center"/>
+            <w:hideMark/>
+          </w:tcPr>
+          <w:p>
+            <w:pPr>
+              <w:rPr>
+                <w:b w:val="0"/>
+                <w:bCs w:val="0"/>
+              </w:rPr>
+            </w:pPr>
+            <w:r>
+              <w:rPr>
+                <w:b w:val="0"/>
+                <w:bCs w:val="0"/>
+              </w:rPr>
+              <w:t>Technical Proficiency</w:t>
+            </w:r>
+          </w:p>
+        </w:tc>
+        <w:tc>
+          <w:tcPr>
+            <w:tcW w:w="6652" w:type="dxa"/>
+            <w:vAlign w:val="center"/>
+            <w:hideMark/>
+          </w:tcPr>
+          <w:p>
+            <w:pPr>
+              <w:cnfStyle w:val="000000000000" w:firstRow="0" w:lastRow="0" w:firstColumn="0" w:lastColumn="0" w:oddVBand="0" w:evenVBand="0" w:oddHBand="0" w:evenHBand="0" w:firstRowFirstColumn="0" w:firstRowLastColumn="0" w:lastRowFirstColumn="0" w:lastRowLastColumn="0"/>
+            </w:pPr>
+            <w:r>
+              <w:t>Expert</w:t>
+            </w:r>
+          </w:p>
+        </w:tc>
+      </w:tr>
+      <w:tr>
+        <w:trPr>
+          <w:cnfStyle w:val="000000100000" w:firstRow="0" w:lastRow="0" w:firstColumn="0" w:lastColumn="0" w:oddVBand="0" w:evenVBand="0" w:oddHBand="1" w:evenHBand="0" w:firstRowFirstColumn="0" w:firstRowLastColumn="0" w:lastRowFirstColumn="0" w:lastRowLastColumn="0"/>
+        </w:trPr>
+        <w:tc>
+          <w:tcPr>
+            <w:cnfStyle w:val="001000000000" w:firstRow="0" w:lastRow="0" w:firstColumn="1" w:lastColumn="0" w:oddVBand="0" w:evenVBand="0" w:oddHBand="0" w:evenHBand="0" w:firstRowFirstColumn="0" w:firstRowLastColumn="0" w:lastRowFirstColumn="0" w:lastRowLastColumn="0"/>
+            <w:tcW w:w="2695" w:type="dxa"/>
+            <w:vAlign w:val="center"/>
+            <w:hideMark/>
+          </w:tcPr>
+          <w:p>
+            <w:pPr>
+              <w:rPr>
+                <w:b w:val="0"/>
+                <w:bCs w:val="0"/>
+              </w:rPr>
+            </w:pPr>
+            <w:r>
+              <w:rPr>
+                <w:b w:val="0"/>
+                <w:bCs w:val="0"/>
+              </w:rPr>
+              <w:t>Primary Device</w:t>
+            </w:r>
+          </w:p>
+        </w:tc>
+        <w:tc>
+          <w:tcPr>
+            <w:tcW w:w="6652" w:type="dxa"/>
+            <w:vAlign w:val="center"/>
+            <w:hideMark/>
+          </w:tcPr>
+          <w:p>
+            <w:pPr>
+              <w:cnfStyle w:val="000000100000" w:firstRow="0" w:lastRow="0" w:firstColumn="0" w:lastColumn="0" w:oddVBand="0" w:evenVBand="0" w:oddHBand="1" w:evenHBand="0" w:firstRowFirstColumn="0" w:firstRowLastColumn="0" w:lastRowFirstColumn="0" w:lastRowLastColumn="0"/>
+            </w:pPr>
+            <w:r>
+              <w:t>Desktop Computer</w:t>
+            </w:r>
+          </w:p>
+        </w:tc>
+      </w:tr>
+      <w:tr>
+        <w:tc>
+          <w:tcPr>
+            <w:cnfStyle w:val="001000000000" w:firstRow="0" w:lastRow="0" w:firstColumn="1" w:lastColumn="0" w:oddVBand="0" w:evenVBand="0" w:oddHBand="0" w:evenHBand="0" w:firstRowFirstColumn="0" w:firstRowLastColumn="0" w:lastRowFirstColumn="0" w:lastRowLastColumn="0"/>
+            <w:tcW w:w="2695" w:type="dxa"/>
+            <w:vAlign w:val="center"/>
+            <w:hideMark/>
+          </w:tcPr>
+          <w:p>
+            <w:pPr>
+              <w:rPr>
+                <w:b w:val="0"/>
+                <w:bCs w:val="0"/>
+              </w:rPr>
+            </w:pPr>
+            <w:r>
+              <w:rPr>
+                <w:b w:val="0"/>
+                <w:bCs w:val="0"/>
+              </w:rPr>
+              <w:t>Goals</w:t>
+            </w:r>
+          </w:p>
+        </w:tc>
+        <w:tc>
+          <w:tcPr>
+            <w:tcW w:w="6652" w:type="dxa"/>
+            <w:vAlign w:val="center"/>
+            <w:hideMark/>
+          </w:tcPr>
+          <w:p>
+            <w:pPr>
+              <w:cnfStyle w:val="000000000000" w:firstRow="0" w:lastRow="0" w:firstColumn="0" w:lastColumn="0" w:oddVBand="0" w:evenVBand="0" w:oddHBand="0" w:evenHBand="0" w:firstRowFirstColumn="0" w:firstRowLastColumn="0" w:lastRowFirstColumn="0" w:lastRowLastColumn="0"/>
+            </w:pPr>
+            <w:r>
+              <w:t>Monitor platform operations, manage users and agencies, verify registrations, moderate content, and maintain platform security.</w:t>
+            </w:r>
+          </w:p>
+        </w:tc>
+      </w:tr>
+      <w:tr>
+        <w:trPr>
+          <w:cnfStyle w:val="000000100000" w:firstRow="0" w:lastRow="0" w:firstColumn="0" w:lastColumn="0" w:oddVBand="0" w:evenVBand="0" w:oddHBand="1" w:evenHBand="0" w:firstRowFirstColumn="0" w:firstRowLastColumn="0" w:lastRowFirstColumn="0" w:lastRowLastColumn="0"/>
+        </w:trPr>
+        <w:tc>
+          <w:tcPr>
+            <w:cnfStyle w:val="001000000000" w:firstRow="0" w:lastRow="0" w:firstColumn="1" w:lastColumn="0" w:oddVBand="0" w:evenVBand="0" w:oddHBand="0" w:evenHBand="0" w:firstRowFirstColumn="0" w:firstRowLastColumn="0" w:lastRowFirstColumn="0" w:lastRowLastColumn="0"/>
+            <w:tcW w:w="2695" w:type="dxa"/>
+            <w:vAlign w:val="center"/>
+            <w:hideMark/>
+          </w:tcPr>
+          <w:p>
+            <w:pPr>
+              <w:rPr>
+                <w:b w:val="0"/>
+                <w:bCs w:val="0"/>
+              </w:rPr>
+            </w:pPr>
+            <w:r>
+              <w:rPr>
+                <w:b w:val="0"/>
+                <w:bCs w:val="0"/>
+              </w:rPr>
+              <w:t>Motivations</w:t>
+            </w:r>
+          </w:p>
+        </w:tc>
+        <w:tc>
+          <w:tcPr>
+            <w:tcW w:w="6652" w:type="dxa"/>
+            <w:vAlign w:val="center"/>
+            <w:hideMark/>
+          </w:tcPr>
+          <w:p>
+            <w:pPr>
+              <w:cnfStyle w:val="000000100000" w:firstRow="0" w:lastRow="0" w:firstColumn="0" w:lastColumn="0" w:oddVBand="0" w:evenVBand="0" w:oddHBand="1" w:evenHBand="0" w:firstRowFirstColumn="0" w:firstRowLastColumn="0" w:lastRowFirstColumn="0" w:lastRowLastColumn="0"/>
+            </w:pPr>
+            <w:r>
+              <w:t>System reliability, platform integrity, regulatory compliance, and operational transparency.</w:t>
+            </w:r>
+          </w:p>
+        </w:tc>
+      </w:tr>
+      <w:tr>
+        <w:tc>
+          <w:tcPr>
+            <w:cnfStyle w:val="001000000000" w:firstRow="0" w:lastRow="0" w:firstColumn="1" w:lastColumn="0" w:oddVBand="0" w:evenVBand="0" w:oddHBand="0" w:evenHBand="0" w:firstRowFirstColumn="0" w:firstRowLastColumn="0" w:lastRowFirstColumn="0" w:lastRowLastColumn="0"/>
+            <w:tcW w:w="2695" w:type="dxa"/>
+            <w:vAlign w:val="center"/>
+            <w:hideMark/>
+          </w:tcPr>
+          <w:p>
+            <w:pPr>
+              <w:rPr>
+                <w:b w:val="0"/>
+                <w:bCs w:val="0"/>
+              </w:rPr>
+            </w:pPr>
+            <w:r>
+              <w:rPr>
+                <w:b w:val="0"/>
+                <w:bCs w:val="0"/>
+              </w:rPr>
+              <w:t>Pain Points</w:t>
+            </w:r>
+          </w:p>
+        </w:tc>
+        <w:tc>
+          <w:tcPr>
+            <w:tcW w:w="6652" w:type="dxa"/>
+            <w:vAlign w:val="center"/>
+            <w:hideMark/>
+          </w:tcPr>
+          <w:p>
+            <w:pPr>
+              <w:cnfStyle w:val="000000000000" w:firstRow="0" w:lastRow="0" w:firstColumn="0" w:lastColumn="0" w:oddVBand="0" w:evenVBand="0" w:oddHBand="0" w:evenHBand="0" w:firstRowFirstColumn="0" w:firstRowLastColumn="0" w:lastRowFirstColumn="0" w:lastRowLastColumn="0"/>
+            </w:pPr>
+            <w:r>
+              <w:t>Fraudulent registrations, security incidents, content moderation workload, and maintaining system performance.</w:t>
+            </w:r>
+          </w:p>
+        </w:tc>
+      </w:tr>
+      <w:tr>
+        <w:trPr>
+          <w:cnfStyle w:val="000000100000" w:firstRow="0" w:lastRow="0" w:firstColumn="0" w:lastColumn="0" w:oddVBand="0" w:evenVBand="0" w:oddHBand="1" w:evenHBand="0" w:firstRowFirstColumn="0" w:firstRowLastColumn="0" w:lastRowFirstColumn="0" w:lastRowLastColumn="0"/>
+        </w:trPr>
+        <w:tc>
+          <w:tcPr>
+            <w:cnfStyle w:val="001000000000" w:firstRow="0" w:lastRow="0" w:firstColumn="1" w:lastColumn="0" w:oddVBand="0" w:evenVBand="0" w:oddHBand="0" w:evenHBand="0" w:firstRowFirstColumn="0" w:firstRowLastColumn="0" w:lastRowFirstColumn="0" w:lastRowLastColumn="0"/>
+            <w:tcW w:w="2695" w:type="dxa"/>
+            <w:vAlign w:val="center"/>
+            <w:hideMark/>
+          </w:tcPr>
+          <w:p>
+            <w:pPr>
+              <w:rPr>
+                <w:b w:val="0"/>
+                <w:bCs w:val="0"/>
+              </w:rPr>
+            </w:pPr>
+            <w:r>
+              <w:rPr>
+                <w:b w:val="0"/>
+                <w:bCs w:val="0"/>
+              </w:rPr>
+              <w:t>System Usage</w:t>
+            </w:r>
+          </w:p>
+        </w:tc>
+        <w:tc>
+          <w:tcPr>
+            <w:tcW w:w="6652" w:type="dxa"/>
+            <w:vAlign w:val="center"/>
+            <w:hideMark/>
+          </w:tcPr>
+          <w:p>
+            <w:pPr>
+              <w:cnfStyle w:val="000000100000" w:firstRow="0" w:lastRow="0" w:firstColumn="0" w:lastColumn="0" w:oddVBand="0" w:evenVBand="0" w:oddHBand="1" w:evenHBand="0" w:firstRowFirstColumn="0" w:firstRowLastColumn="0" w:lastRowFirstColumn="0" w:lastRowLastColumn="0"/>
+            </w:pPr>
+            <w:r>
+              <w:t>User management, agency verification, dispute management, moderation, reporting, and system administration.</w:t>
+            </w:r>
+          </w:p>
+        </w:tc>
+      </w:tr>
+    </w:tbl>
+    <w:p/>
+    <w:p>
+      <w:pPr>
+        <w:spacing w:line="278" w:lineRule="auto"/>
+      </w:pPr>
+      <w:r>
+        <w:br w:type="page"/>
+      </w:r>
+    </w:p>
+    <w:p/>
     <w:sectPr>
+      <w:headerReference w:type="default" r:id="rId9"/>
+      <w:footerReference w:type="default" r:id="rId10"/>
       <w:pgSz w:w="11906" w:h="16838" w:code="9"/>
-      <w:pgMar w:top="1411" w:right="850" w:bottom="1411" w:left="1699" w:header="720" w:footer="720" w:gutter="0"/>
+      <w:pgMar w:top="1411" w:right="850" w:bottom="1411" w:left="1699" w:header="720" w:footer="288" w:gutter="0"/>
+      <w:pgNumType w:start="1"/>
       <w:cols w:space="720"/>
       <w:docGrid w:linePitch="360"/>
     </w:sectPr>
@@ -42,6 +2122,103 @@
 </w:endnotes>
 </file>
 
+<file path=word/footer1.xml><?xml version="1.0" encoding="utf-8"?>
+<w:ftr xmlns:wpc="http://schemas.microsoft.com/office/word/2010/wordprocessingCanvas" xmlns:cx="http://schemas.microsoft.com/office/drawing/2014/chartex" xmlns:cx1="http://schemas.microsoft.com/office/drawing/2015/9/8/chartex" xmlns:cx2="http://schemas.microsoft.com/office/drawing/2015/10/21/chartex" xmlns:cx3="http://schemas.microsoft.com/office/drawing/2016/5/9/chartex" xmlns:cx4="http://schemas.microsoft.com/office/drawing/2016/5/10/chartex" xmlns:cx5="http://schemas.microsoft.com/office/drawing/2016/5/11/chartex" xmlns:cx6="http://schemas.microsoft.com/office/drawing/2016/5/12/chartex" xmlns:cx7="http://schemas.microsoft.com/office/drawing/2016/5/13/chartex" xmlns:cx8="http://schemas.microsoft.com/office/drawing/2016/5/14/chartex" xmlns:mc="http://schemas.openxmlformats.org/markup-compatibility/2006" xmlns:aink="http://schemas.microsoft.com/office/drawing/2016/ink" xmlns:am3d="http://schemas.microsoft.com/office/drawing/2017/model3d" xmlns:o="urn:schemas-microsoft-com:office:office" xmlns:oel="http://schemas.microsoft.com/office/2019/extlst" xmlns:r="http://schemas.openxmlformats.org/officeDocument/2006/relationships" xmlns:m="http://schemas.openxmlformats.org/officeDocument/2006/math" xmlns:v="urn:schemas-microsoft-com:vml" xmlns:wp14="http://schemas.microsoft.com/office/word/2010/wordprocessingDrawing" xmlns:wp="http://schemas.openxmlformats.org/drawingml/2006/wordprocessingDrawing" xmlns:w10="urn:schemas-microsoft-com:office:word" xmlns:w="http://schemas.openxmlformats.org/wordprocessingml/2006/main" xmlns:w14="http://schemas.microsoft.com/office/word/2010/wordml" xmlns:w15="http://schemas.microsoft.com/office/word/2012/wordml" xmlns:w16cex="http://schemas.microsoft.com/office/word/2018/wordml/cex" xmlns:w16cid="http://schemas.microsoft.com/office/word/2016/wordml/cid" xmlns:w16="http://schemas.microsoft.com/office/word/2018/wordml" xmlns:w16du="http://schemas.microsoft.com/office/word/2023/wordml/word16du" xmlns:w16sdtdh="http://schemas.microsoft.com/office/word/2020/wordml/sdtdatahash" xmlns:w16sdtfl="http://schemas.microsoft.com/office/word/2024/wordml/sdtformatlock" xmlns:w16se="http://schemas.microsoft.com/office/word/2015/wordml/symex" xmlns:wpg="http://schemas.microsoft.com/office/word/2010/wordprocessingGroup" xmlns:wpi="http://schemas.microsoft.com/office/word/2010/wordprocessingInk" xmlns:wne="http://schemas.microsoft.com/office/word/2006/wordml" xmlns:wps="http://schemas.microsoft.com/office/word/2010/wordprocessingShape" mc:Ignorable="w14 w15 w16se w16cid w16 w16cex w16sdtdh w16sdtfl w16du wp14">
+  <w:sdt>
+    <w:sdtPr>
+      <w:rPr>
+        <w:sz w:val="20"/>
+        <w:szCs w:val="20"/>
+      </w:rPr>
+      <w:id w:val="-810944642"/>
+      <w:docPartObj>
+        <w:docPartGallery w:val="Page Numbers (Bottom of Page)"/>
+        <w:docPartUnique/>
+      </w:docPartObj>
+    </w:sdtPr>
+    <w:sdtEndPr>
+      <w:rPr>
+        <w:color w:val="7F7F7F" w:themeColor="background1" w:themeShade="7F"/>
+        <w:spacing w:val="60"/>
+      </w:rPr>
+    </w:sdtEndPr>
+    <w:sdtContent>
+      <w:p>
+        <w:pPr>
+          <w:pStyle w:val="Footer"/>
+          <w:pBdr>
+            <w:top w:val="single" w:sz="4" w:space="1" w:color="D9D9D9" w:themeColor="background1" w:themeShade="D9"/>
+          </w:pBdr>
+          <w:jc w:val="right"/>
+          <w:rPr>
+            <w:sz w:val="20"/>
+            <w:szCs w:val="20"/>
+          </w:rPr>
+        </w:pPr>
+        <w:r>
+          <w:rPr>
+            <w:sz w:val="20"/>
+            <w:szCs w:val="20"/>
+          </w:rPr>
+          <w:fldChar w:fldCharType="begin"/>
+        </w:r>
+        <w:r>
+          <w:rPr>
+            <w:sz w:val="20"/>
+            <w:szCs w:val="20"/>
+          </w:rPr>
+          <w:instrText xml:space="preserve"> PAGE   \* MERGEFORMAT </w:instrText>
+        </w:r>
+        <w:r>
+          <w:rPr>
+            <w:sz w:val="20"/>
+            <w:szCs w:val="20"/>
+          </w:rPr>
+          <w:fldChar w:fldCharType="separate"/>
+        </w:r>
+        <w:r>
+          <w:rPr>
+            <w:noProof/>
+            <w:sz w:val="20"/>
+            <w:szCs w:val="20"/>
+          </w:rPr>
+          <w:t>2</w:t>
+        </w:r>
+        <w:r>
+          <w:rPr>
+            <w:noProof/>
+            <w:sz w:val="20"/>
+            <w:szCs w:val="20"/>
+          </w:rPr>
+          <w:fldChar w:fldCharType="end"/>
+        </w:r>
+        <w:r>
+          <w:rPr>
+            <w:sz w:val="20"/>
+            <w:szCs w:val="20"/>
+          </w:rPr>
+          <w:t xml:space="preserve"> | </w:t>
+        </w:r>
+        <w:r>
+          <w:rPr>
+            <w:color w:val="7F7F7F" w:themeColor="background1" w:themeShade="7F"/>
+            <w:spacing w:val="60"/>
+            <w:sz w:val="20"/>
+            <w:szCs w:val="20"/>
+          </w:rPr>
+          <w:t>Page</w:t>
+        </w:r>
+      </w:p>
+    </w:sdtContent>
+  </w:sdt>
+  <w:p>
+    <w:pPr>
+      <w:pStyle w:val="Footer"/>
+    </w:pPr>
+  </w:p>
+</w:ftr>
+</file>
+
 <file path=word/footnotes.xml><?xml version="1.0" encoding="utf-8"?>
 <w:footnotes xmlns:wpc="http://schemas.microsoft.com/office/word/2010/wordprocessingCanvas" xmlns:cx="http://schemas.microsoft.com/office/drawing/2014/chartex" xmlns:cx1="http://schemas.microsoft.com/office/drawing/2015/9/8/chartex" xmlns:cx2="http://schemas.microsoft.com/office/drawing/2015/10/21/chartex" xmlns:cx3="http://schemas.microsoft.com/office/drawing/2016/5/9/chartex" xmlns:cx4="http://schemas.microsoft.com/office/drawing/2016/5/10/chartex" xmlns:cx5="http://schemas.microsoft.com/office/drawing/2016/5/11/chartex" xmlns:cx6="http://schemas.microsoft.com/office/drawing/2016/5/12/chartex" xmlns:cx7="http://schemas.microsoft.com/office/drawing/2016/5/13/chartex" xmlns:cx8="http://schemas.microsoft.com/office/drawing/2016/5/14/chartex" xmlns:mc="http://schemas.openxmlformats.org/markup-compatibility/2006" xmlns:aink="http://schemas.microsoft.com/office/drawing/2016/ink" xmlns:am3d="http://schemas.microsoft.com/office/drawing/2017/model3d" xmlns:o="urn:schemas-microsoft-com:office:office" xmlns:oel="http://schemas.microsoft.com/office/2019/extlst" xmlns:r="http://schemas.openxmlformats.org/officeDocument/2006/relationships" xmlns:m="http://schemas.openxmlformats.org/officeDocument/2006/math" xmlns:v="urn:schemas-microsoft-com:vml" xmlns:wp14="http://schemas.microsoft.com/office/word/2010/wordprocessingDrawing" xmlns:wp="http://schemas.openxmlformats.org/drawingml/2006/wordprocessingDrawing" xmlns:w10="urn:schemas-microsoft-com:office:word" xmlns:w="http://schemas.openxmlformats.org/wordprocessingml/2006/main" xmlns:w14="http://schemas.microsoft.com/office/word/2010/wordml" xmlns:w15="http://schemas.microsoft.com/office/word/2012/wordml" xmlns:w16cex="http://schemas.microsoft.com/office/word/2018/wordml/cex" xmlns:w16cid="http://schemas.microsoft.com/office/word/2016/wordml/cid" xmlns:w16="http://schemas.microsoft.com/office/word/2018/wordml" xmlns:w16du="http://schemas.microsoft.com/office/word/2023/wordml/word16du" xmlns:w16sdtdh="http://schemas.microsoft.com/office/word/2020/wordml/sdtdatahash" xmlns:w16sdtfl="http://schemas.microsoft.com/office/word/2024/wordml/sdtformatlock" xmlns:w16se="http://schemas.microsoft.com/office/word/2015/wordml/symex" xmlns:wpg="http://schemas.microsoft.com/office/word/2010/wordprocessingGroup" xmlns:wpi="http://schemas.microsoft.com/office/word/2010/wordprocessingInk" xmlns:wne="http://schemas.microsoft.com/office/word/2006/wordml" xmlns:wps="http://schemas.microsoft.com/office/word/2010/wordprocessingShape" mc:Ignorable="w14 w15 w16se w16cid w16 w16cex w16sdtdh w16sdtfl w16du wp14">
   <w:footnote w:type="separator" w:id="-1">
@@ -65,6 +2242,16 @@
     </w:p>
   </w:footnote>
 </w:footnotes>
+</file>
+
+<file path=word/header1.xml><?xml version="1.0" encoding="utf-8"?>
+<w:hdr xmlns:wpc="http://schemas.microsoft.com/office/word/2010/wordprocessingCanvas" xmlns:cx="http://schemas.microsoft.com/office/drawing/2014/chartex" xmlns:cx1="http://schemas.microsoft.com/office/drawing/2015/9/8/chartex" xmlns:cx2="http://schemas.microsoft.com/office/drawing/2015/10/21/chartex" xmlns:cx3="http://schemas.microsoft.com/office/drawing/2016/5/9/chartex" xmlns:cx4="http://schemas.microsoft.com/office/drawing/2016/5/10/chartex" xmlns:cx5="http://schemas.microsoft.com/office/drawing/2016/5/11/chartex" xmlns:cx6="http://schemas.microsoft.com/office/drawing/2016/5/12/chartex" xmlns:cx7="http://schemas.microsoft.com/office/drawing/2016/5/13/chartex" xmlns:cx8="http://schemas.microsoft.com/office/drawing/2016/5/14/chartex" xmlns:mc="http://schemas.openxmlformats.org/markup-compatibility/2006" xmlns:aink="http://schemas.microsoft.com/office/drawing/2016/ink" xmlns:am3d="http://schemas.microsoft.com/office/drawing/2017/model3d" xmlns:o="urn:schemas-microsoft-com:office:office" xmlns:oel="http://schemas.microsoft.com/office/2019/extlst" xmlns:r="http://schemas.openxmlformats.org/officeDocument/2006/relationships" xmlns:m="http://schemas.openxmlformats.org/officeDocument/2006/math" xmlns:v="urn:schemas-microsoft-com:vml" xmlns:wp14="http://schemas.microsoft.com/office/word/2010/wordprocessingDrawing" xmlns:wp="http://schemas.openxmlformats.org/drawingml/2006/wordprocessingDrawing" xmlns:w10="urn:schemas-microsoft-com:office:word" xmlns:w="http://schemas.openxmlformats.org/wordprocessingml/2006/main" xmlns:w14="http://schemas.microsoft.com/office/word/2010/wordml" xmlns:w15="http://schemas.microsoft.com/office/word/2012/wordml" xmlns:w16cex="http://schemas.microsoft.com/office/word/2018/wordml/cex" xmlns:w16cid="http://schemas.microsoft.com/office/word/2016/wordml/cid" xmlns:w16="http://schemas.microsoft.com/office/word/2018/wordml" xmlns:w16du="http://schemas.microsoft.com/office/word/2023/wordml/word16du" xmlns:w16sdtdh="http://schemas.microsoft.com/office/word/2020/wordml/sdtdatahash" xmlns:w16sdtfl="http://schemas.microsoft.com/office/word/2024/wordml/sdtformatlock" xmlns:w16se="http://schemas.microsoft.com/office/word/2015/wordml/symex" xmlns:wpg="http://schemas.microsoft.com/office/word/2010/wordprocessingGroup" xmlns:wpi="http://schemas.microsoft.com/office/word/2010/wordprocessingInk" xmlns:wne="http://schemas.microsoft.com/office/word/2006/wordml" xmlns:wps="http://schemas.microsoft.com/office/word/2010/wordprocessingShape" mc:Ignorable="w14 w15 w16se w16cid w16 w16cex w16sdtdh w16sdtfl w16du wp14">
+  <w:p>
+    <w:pPr>
+      <w:pStyle w:val="Header"/>
+    </w:pPr>
+  </w:p>
+</w:hdr>
 </file>
 
 <file path=word/numbering.xml><?xml version="1.0" encoding="utf-8"?>
@@ -4701,6 +6888,232 @@
     </w:lvl>
   </w:abstractNum>
   <w:abstractNum w:abstractNumId="36" w15:restartNumberingAfterBreak="0">
+    <w:nsid w:val="25294576"/>
+    <w:multiLevelType w:val="hybridMultilevel"/>
+    <w:tmpl w:val="2C14800A"/>
+    <w:lvl w:ilvl="0" w:tplc="04090001">
+      <w:start w:val="1"/>
+      <w:numFmt w:val="bullet"/>
+      <w:lvlText w:val=""/>
+      <w:lvlJc w:val="left"/>
+      <w:pPr>
+        <w:ind w:left="720" w:hanging="360"/>
+      </w:pPr>
+      <w:rPr>
+        <w:rFonts w:ascii="Symbol" w:hAnsi="Symbol" w:hint="default"/>
+      </w:rPr>
+    </w:lvl>
+    <w:lvl w:ilvl="1" w:tplc="04090003" w:tentative="1">
+      <w:start w:val="1"/>
+      <w:numFmt w:val="bullet"/>
+      <w:lvlText w:val="o"/>
+      <w:lvlJc w:val="left"/>
+      <w:pPr>
+        <w:ind w:left="1440" w:hanging="360"/>
+      </w:pPr>
+      <w:rPr>
+        <w:rFonts w:ascii="Courier New" w:hAnsi="Courier New" w:cs="Courier New" w:hint="default"/>
+      </w:rPr>
+    </w:lvl>
+    <w:lvl w:ilvl="2" w:tplc="04090005" w:tentative="1">
+      <w:start w:val="1"/>
+      <w:numFmt w:val="bullet"/>
+      <w:lvlText w:val=""/>
+      <w:lvlJc w:val="left"/>
+      <w:pPr>
+        <w:ind w:left="2160" w:hanging="360"/>
+      </w:pPr>
+      <w:rPr>
+        <w:rFonts w:ascii="Wingdings" w:hAnsi="Wingdings" w:hint="default"/>
+      </w:rPr>
+    </w:lvl>
+    <w:lvl w:ilvl="3" w:tplc="04090001" w:tentative="1">
+      <w:start w:val="1"/>
+      <w:numFmt w:val="bullet"/>
+      <w:lvlText w:val=""/>
+      <w:lvlJc w:val="left"/>
+      <w:pPr>
+        <w:ind w:left="2880" w:hanging="360"/>
+      </w:pPr>
+      <w:rPr>
+        <w:rFonts w:ascii="Symbol" w:hAnsi="Symbol" w:hint="default"/>
+      </w:rPr>
+    </w:lvl>
+    <w:lvl w:ilvl="4" w:tplc="04090003" w:tentative="1">
+      <w:start w:val="1"/>
+      <w:numFmt w:val="bullet"/>
+      <w:lvlText w:val="o"/>
+      <w:lvlJc w:val="left"/>
+      <w:pPr>
+        <w:ind w:left="3600" w:hanging="360"/>
+      </w:pPr>
+      <w:rPr>
+        <w:rFonts w:ascii="Courier New" w:hAnsi="Courier New" w:cs="Courier New" w:hint="default"/>
+      </w:rPr>
+    </w:lvl>
+    <w:lvl w:ilvl="5" w:tplc="04090005" w:tentative="1">
+      <w:start w:val="1"/>
+      <w:numFmt w:val="bullet"/>
+      <w:lvlText w:val=""/>
+      <w:lvlJc w:val="left"/>
+      <w:pPr>
+        <w:ind w:left="4320" w:hanging="360"/>
+      </w:pPr>
+      <w:rPr>
+        <w:rFonts w:ascii="Wingdings" w:hAnsi="Wingdings" w:hint="default"/>
+      </w:rPr>
+    </w:lvl>
+    <w:lvl w:ilvl="6" w:tplc="04090001" w:tentative="1">
+      <w:start w:val="1"/>
+      <w:numFmt w:val="bullet"/>
+      <w:lvlText w:val=""/>
+      <w:lvlJc w:val="left"/>
+      <w:pPr>
+        <w:ind w:left="5040" w:hanging="360"/>
+      </w:pPr>
+      <w:rPr>
+        <w:rFonts w:ascii="Symbol" w:hAnsi="Symbol" w:hint="default"/>
+      </w:rPr>
+    </w:lvl>
+    <w:lvl w:ilvl="7" w:tplc="04090003" w:tentative="1">
+      <w:start w:val="1"/>
+      <w:numFmt w:val="bullet"/>
+      <w:lvlText w:val="o"/>
+      <w:lvlJc w:val="left"/>
+      <w:pPr>
+        <w:ind w:left="5760" w:hanging="360"/>
+      </w:pPr>
+      <w:rPr>
+        <w:rFonts w:ascii="Courier New" w:hAnsi="Courier New" w:cs="Courier New" w:hint="default"/>
+      </w:rPr>
+    </w:lvl>
+    <w:lvl w:ilvl="8" w:tplc="04090005" w:tentative="1">
+      <w:start w:val="1"/>
+      <w:numFmt w:val="bullet"/>
+      <w:lvlText w:val=""/>
+      <w:lvlJc w:val="left"/>
+      <w:pPr>
+        <w:ind w:left="6480" w:hanging="360"/>
+      </w:pPr>
+      <w:rPr>
+        <w:rFonts w:ascii="Wingdings" w:hAnsi="Wingdings" w:hint="default"/>
+      </w:rPr>
+    </w:lvl>
+  </w:abstractNum>
+  <w:abstractNum w:abstractNumId="37" w15:restartNumberingAfterBreak="0">
+    <w:nsid w:val="256D132A"/>
+    <w:multiLevelType w:val="hybridMultilevel"/>
+    <w:tmpl w:val="4E26A0A4"/>
+    <w:lvl w:ilvl="0" w:tplc="04090005">
+      <w:start w:val="1"/>
+      <w:numFmt w:val="bullet"/>
+      <w:lvlText w:val=""/>
+      <w:lvlJc w:val="left"/>
+      <w:pPr>
+        <w:ind w:left="720" w:hanging="360"/>
+      </w:pPr>
+      <w:rPr>
+        <w:rFonts w:ascii="Wingdings" w:hAnsi="Wingdings" w:hint="default"/>
+      </w:rPr>
+    </w:lvl>
+    <w:lvl w:ilvl="1" w:tplc="FFFFFFFF" w:tentative="1">
+      <w:start w:val="1"/>
+      <w:numFmt w:val="bullet"/>
+      <w:lvlText w:val="o"/>
+      <w:lvlJc w:val="left"/>
+      <w:pPr>
+        <w:ind w:left="1440" w:hanging="360"/>
+      </w:pPr>
+      <w:rPr>
+        <w:rFonts w:ascii="Courier New" w:hAnsi="Courier New" w:cs="Courier New" w:hint="default"/>
+      </w:rPr>
+    </w:lvl>
+    <w:lvl w:ilvl="2" w:tplc="FFFFFFFF" w:tentative="1">
+      <w:start w:val="1"/>
+      <w:numFmt w:val="bullet"/>
+      <w:lvlText w:val=""/>
+      <w:lvlJc w:val="left"/>
+      <w:pPr>
+        <w:ind w:left="2160" w:hanging="360"/>
+      </w:pPr>
+      <w:rPr>
+        <w:rFonts w:ascii="Wingdings" w:hAnsi="Wingdings" w:hint="default"/>
+      </w:rPr>
+    </w:lvl>
+    <w:lvl w:ilvl="3" w:tplc="FFFFFFFF" w:tentative="1">
+      <w:start w:val="1"/>
+      <w:numFmt w:val="bullet"/>
+      <w:lvlText w:val=""/>
+      <w:lvlJc w:val="left"/>
+      <w:pPr>
+        <w:ind w:left="2880" w:hanging="360"/>
+      </w:pPr>
+      <w:rPr>
+        <w:rFonts w:ascii="Symbol" w:hAnsi="Symbol" w:hint="default"/>
+      </w:rPr>
+    </w:lvl>
+    <w:lvl w:ilvl="4" w:tplc="FFFFFFFF" w:tentative="1">
+      <w:start w:val="1"/>
+      <w:numFmt w:val="bullet"/>
+      <w:lvlText w:val="o"/>
+      <w:lvlJc w:val="left"/>
+      <w:pPr>
+        <w:ind w:left="3600" w:hanging="360"/>
+      </w:pPr>
+      <w:rPr>
+        <w:rFonts w:ascii="Courier New" w:hAnsi="Courier New" w:cs="Courier New" w:hint="default"/>
+      </w:rPr>
+    </w:lvl>
+    <w:lvl w:ilvl="5" w:tplc="FFFFFFFF" w:tentative="1">
+      <w:start w:val="1"/>
+      <w:numFmt w:val="bullet"/>
+      <w:lvlText w:val=""/>
+      <w:lvlJc w:val="left"/>
+      <w:pPr>
+        <w:ind w:left="4320" w:hanging="360"/>
+      </w:pPr>
+      <w:rPr>
+        <w:rFonts w:ascii="Wingdings" w:hAnsi="Wingdings" w:hint="default"/>
+      </w:rPr>
+    </w:lvl>
+    <w:lvl w:ilvl="6" w:tplc="FFFFFFFF" w:tentative="1">
+      <w:start w:val="1"/>
+      <w:numFmt w:val="bullet"/>
+      <w:lvlText w:val=""/>
+      <w:lvlJc w:val="left"/>
+      <w:pPr>
+        <w:ind w:left="5040" w:hanging="360"/>
+      </w:pPr>
+      <w:rPr>
+        <w:rFonts w:ascii="Symbol" w:hAnsi="Symbol" w:hint="default"/>
+      </w:rPr>
+    </w:lvl>
+    <w:lvl w:ilvl="7" w:tplc="FFFFFFFF" w:tentative="1">
+      <w:start w:val="1"/>
+      <w:numFmt w:val="bullet"/>
+      <w:lvlText w:val="o"/>
+      <w:lvlJc w:val="left"/>
+      <w:pPr>
+        <w:ind w:left="5760" w:hanging="360"/>
+      </w:pPr>
+      <w:rPr>
+        <w:rFonts w:ascii="Courier New" w:hAnsi="Courier New" w:cs="Courier New" w:hint="default"/>
+      </w:rPr>
+    </w:lvl>
+    <w:lvl w:ilvl="8" w:tplc="FFFFFFFF" w:tentative="1">
+      <w:start w:val="1"/>
+      <w:numFmt w:val="bullet"/>
+      <w:lvlText w:val=""/>
+      <w:lvlJc w:val="left"/>
+      <w:pPr>
+        <w:ind w:left="6480" w:hanging="360"/>
+      </w:pPr>
+      <w:rPr>
+        <w:rFonts w:ascii="Wingdings" w:hAnsi="Wingdings" w:hint="default"/>
+      </w:rPr>
+    </w:lvl>
+  </w:abstractNum>
+  <w:abstractNum w:abstractNumId="38" w15:restartNumberingAfterBreak="0">
     <w:nsid w:val="26BA6D3C"/>
     <w:multiLevelType w:val="hybridMultilevel"/>
     <w:tmpl w:val="F03CC954"/>
@@ -4812,7 +7225,7 @@
       </w:rPr>
     </w:lvl>
   </w:abstractNum>
-  <w:abstractNum w:abstractNumId="37" w15:restartNumberingAfterBreak="0">
+  <w:abstractNum w:abstractNumId="39" w15:restartNumberingAfterBreak="0">
     <w:nsid w:val="28765EA3"/>
     <w:multiLevelType w:val="hybridMultilevel"/>
     <w:tmpl w:val="1CFAEB30"/>
@@ -4925,7 +7338,7 @@
       </w:rPr>
     </w:lvl>
   </w:abstractNum>
-  <w:abstractNum w:abstractNumId="38" w15:restartNumberingAfterBreak="0">
+  <w:abstractNum w:abstractNumId="40" w15:restartNumberingAfterBreak="0">
     <w:nsid w:val="28940045"/>
     <w:multiLevelType w:val="multilevel"/>
     <w:tmpl w:val="23DE4804"/>
@@ -5074,7 +7487,7 @@
       </w:rPr>
     </w:lvl>
   </w:abstractNum>
-  <w:abstractNum w:abstractNumId="39" w15:restartNumberingAfterBreak="0">
+  <w:abstractNum w:abstractNumId="41" w15:restartNumberingAfterBreak="0">
     <w:nsid w:val="289938CC"/>
     <w:multiLevelType w:val="multilevel"/>
     <w:tmpl w:val="57745EE2"/>
@@ -5223,7 +7636,7 @@
       </w:rPr>
     </w:lvl>
   </w:abstractNum>
-  <w:abstractNum w:abstractNumId="40" w15:restartNumberingAfterBreak="0">
+  <w:abstractNum w:abstractNumId="42" w15:restartNumberingAfterBreak="0">
     <w:nsid w:val="2ADE3401"/>
     <w:multiLevelType w:val="multilevel"/>
     <w:tmpl w:val="63F4E6F0"/>
@@ -5372,7 +7785,7 @@
       </w:rPr>
     </w:lvl>
   </w:abstractNum>
-  <w:abstractNum w:abstractNumId="41" w15:restartNumberingAfterBreak="0">
+  <w:abstractNum w:abstractNumId="43" w15:restartNumberingAfterBreak="0">
     <w:nsid w:val="2B592B9C"/>
     <w:multiLevelType w:val="hybridMultilevel"/>
     <w:tmpl w:val="99D4C34E"/>
@@ -5485,7 +7898,7 @@
       </w:rPr>
     </w:lvl>
   </w:abstractNum>
-  <w:abstractNum w:abstractNumId="42" w15:restartNumberingAfterBreak="0">
+  <w:abstractNum w:abstractNumId="44" w15:restartNumberingAfterBreak="0">
     <w:nsid w:val="2B9413C9"/>
     <w:multiLevelType w:val="hybridMultilevel"/>
     <w:tmpl w:val="4F7A7546"/>
@@ -5597,7 +8010,7 @@
       </w:rPr>
     </w:lvl>
   </w:abstractNum>
-  <w:abstractNum w:abstractNumId="43" w15:restartNumberingAfterBreak="0">
+  <w:abstractNum w:abstractNumId="45" w15:restartNumberingAfterBreak="0">
     <w:nsid w:val="2B9539E3"/>
     <w:multiLevelType w:val="hybridMultilevel"/>
     <w:tmpl w:val="E6B8BBB6"/>
@@ -5709,7 +8122,7 @@
       </w:rPr>
     </w:lvl>
   </w:abstractNum>
-  <w:abstractNum w:abstractNumId="44" w15:restartNumberingAfterBreak="0">
+  <w:abstractNum w:abstractNumId="46" w15:restartNumberingAfterBreak="0">
     <w:nsid w:val="2E164C9A"/>
     <w:multiLevelType w:val="hybridMultilevel"/>
     <w:tmpl w:val="C6BA489A"/>
@@ -5822,7 +8235,7 @@
       </w:rPr>
     </w:lvl>
   </w:abstractNum>
-  <w:abstractNum w:abstractNumId="45" w15:restartNumberingAfterBreak="0">
+  <w:abstractNum w:abstractNumId="47" w15:restartNumberingAfterBreak="0">
     <w:nsid w:val="2E34438D"/>
     <w:multiLevelType w:val="multilevel"/>
     <w:tmpl w:val="63F4E6F0"/>
@@ -5971,7 +8384,7 @@
       </w:rPr>
     </w:lvl>
   </w:abstractNum>
-  <w:abstractNum w:abstractNumId="46" w15:restartNumberingAfterBreak="0">
+  <w:abstractNum w:abstractNumId="48" w15:restartNumberingAfterBreak="0">
     <w:nsid w:val="2E5D6D2A"/>
     <w:multiLevelType w:val="hybridMultilevel"/>
     <w:tmpl w:val="5D5ADC98"/>
@@ -6084,7 +8497,7 @@
       </w:rPr>
     </w:lvl>
   </w:abstractNum>
-  <w:abstractNum w:abstractNumId="47" w15:restartNumberingAfterBreak="0">
+  <w:abstractNum w:abstractNumId="49" w15:restartNumberingAfterBreak="0">
     <w:nsid w:val="2E716C12"/>
     <w:multiLevelType w:val="hybridMultilevel"/>
     <w:tmpl w:val="6D90C552"/>
@@ -6197,7 +8610,7 @@
       </w:rPr>
     </w:lvl>
   </w:abstractNum>
-  <w:abstractNum w:abstractNumId="48" w15:restartNumberingAfterBreak="0">
+  <w:abstractNum w:abstractNumId="50" w15:restartNumberingAfterBreak="0">
     <w:nsid w:val="2F162517"/>
     <w:multiLevelType w:val="hybridMultilevel"/>
     <w:tmpl w:val="4E3CAB7C"/>
@@ -6309,7 +8722,7 @@
       </w:rPr>
     </w:lvl>
   </w:abstractNum>
-  <w:abstractNum w:abstractNumId="49" w15:restartNumberingAfterBreak="0">
+  <w:abstractNum w:abstractNumId="51" w15:restartNumberingAfterBreak="0">
     <w:nsid w:val="2F1F6483"/>
     <w:multiLevelType w:val="multilevel"/>
     <w:tmpl w:val="993E874E"/>
@@ -6458,7 +8871,7 @@
       </w:rPr>
     </w:lvl>
   </w:abstractNum>
-  <w:abstractNum w:abstractNumId="50" w15:restartNumberingAfterBreak="0">
+  <w:abstractNum w:abstractNumId="52" w15:restartNumberingAfterBreak="0">
     <w:nsid w:val="2F2B2F8E"/>
     <w:multiLevelType w:val="multilevel"/>
     <w:tmpl w:val="547EDCFE"/>
@@ -6607,7 +9020,7 @@
       </w:rPr>
     </w:lvl>
   </w:abstractNum>
-  <w:abstractNum w:abstractNumId="51" w15:restartNumberingAfterBreak="0">
+  <w:abstractNum w:abstractNumId="53" w15:restartNumberingAfterBreak="0">
     <w:nsid w:val="2FF161E6"/>
     <w:multiLevelType w:val="hybridMultilevel"/>
     <w:tmpl w:val="ED6AA478"/>
@@ -6719,7 +9132,7 @@
       </w:rPr>
     </w:lvl>
   </w:abstractNum>
-  <w:abstractNum w:abstractNumId="52" w15:restartNumberingAfterBreak="0">
+  <w:abstractNum w:abstractNumId="54" w15:restartNumberingAfterBreak="0">
     <w:nsid w:val="30CD5DF3"/>
     <w:multiLevelType w:val="hybridMultilevel"/>
     <w:tmpl w:val="127EBD02"/>
@@ -6831,7 +9244,7 @@
       </w:rPr>
     </w:lvl>
   </w:abstractNum>
-  <w:abstractNum w:abstractNumId="53" w15:restartNumberingAfterBreak="0">
+  <w:abstractNum w:abstractNumId="55" w15:restartNumberingAfterBreak="0">
     <w:nsid w:val="31A24DDF"/>
     <w:multiLevelType w:val="multilevel"/>
     <w:tmpl w:val="63F4E6F0"/>
@@ -6980,7 +9393,7 @@
       </w:rPr>
     </w:lvl>
   </w:abstractNum>
-  <w:abstractNum w:abstractNumId="54" w15:restartNumberingAfterBreak="0">
+  <w:abstractNum w:abstractNumId="56" w15:restartNumberingAfterBreak="0">
     <w:nsid w:val="321E65E6"/>
     <w:multiLevelType w:val="multilevel"/>
     <w:tmpl w:val="63F4E6F0"/>
@@ -7129,7 +9542,7 @@
       </w:rPr>
     </w:lvl>
   </w:abstractNum>
-  <w:abstractNum w:abstractNumId="55" w15:restartNumberingAfterBreak="0">
+  <w:abstractNum w:abstractNumId="57" w15:restartNumberingAfterBreak="0">
     <w:nsid w:val="332E29E8"/>
     <w:multiLevelType w:val="multilevel"/>
     <w:tmpl w:val="BF082128"/>
@@ -7278,7 +9691,7 @@
       </w:rPr>
     </w:lvl>
   </w:abstractNum>
-  <w:abstractNum w:abstractNumId="56" w15:restartNumberingAfterBreak="0">
+  <w:abstractNum w:abstractNumId="58" w15:restartNumberingAfterBreak="0">
     <w:nsid w:val="34251C5D"/>
     <w:multiLevelType w:val="multilevel"/>
     <w:tmpl w:val="C31CBCE0"/>
@@ -7427,7 +9840,7 @@
       </w:rPr>
     </w:lvl>
   </w:abstractNum>
-  <w:abstractNum w:abstractNumId="57" w15:restartNumberingAfterBreak="0">
+  <w:abstractNum w:abstractNumId="59" w15:restartNumberingAfterBreak="0">
     <w:nsid w:val="342A6150"/>
     <w:multiLevelType w:val="multilevel"/>
     <w:tmpl w:val="29E0BE1C"/>
@@ -7576,7 +9989,7 @@
       </w:rPr>
     </w:lvl>
   </w:abstractNum>
-  <w:abstractNum w:abstractNumId="58" w15:restartNumberingAfterBreak="0">
+  <w:abstractNum w:abstractNumId="60" w15:restartNumberingAfterBreak="0">
     <w:nsid w:val="356F220A"/>
     <w:multiLevelType w:val="multilevel"/>
     <w:tmpl w:val="0FFA5254"/>
@@ -7725,7 +10138,7 @@
       </w:rPr>
     </w:lvl>
   </w:abstractNum>
-  <w:abstractNum w:abstractNumId="59" w15:restartNumberingAfterBreak="0">
+  <w:abstractNum w:abstractNumId="61" w15:restartNumberingAfterBreak="0">
     <w:nsid w:val="357B7363"/>
     <w:multiLevelType w:val="hybridMultilevel"/>
     <w:tmpl w:val="00D411EC"/>
@@ -7837,7 +10250,7 @@
       </w:rPr>
     </w:lvl>
   </w:abstractNum>
-  <w:abstractNum w:abstractNumId="60" w15:restartNumberingAfterBreak="0">
+  <w:abstractNum w:abstractNumId="62" w15:restartNumberingAfterBreak="0">
     <w:nsid w:val="3583100F"/>
     <w:multiLevelType w:val="hybridMultilevel"/>
     <w:tmpl w:val="848ECFAA"/>
@@ -7950,7 +10363,119 @@
       </w:rPr>
     </w:lvl>
   </w:abstractNum>
-  <w:abstractNum w:abstractNumId="61" w15:restartNumberingAfterBreak="0">
+  <w:abstractNum w:abstractNumId="63" w15:restartNumberingAfterBreak="0">
+    <w:nsid w:val="36117ABB"/>
+    <w:multiLevelType w:val="hybridMultilevel"/>
+    <w:tmpl w:val="89C4CD2C"/>
+    <w:lvl w:ilvl="0" w:tplc="E18E8624">
+      <w:numFmt w:val="bullet"/>
+      <w:lvlText w:val="-"/>
+      <w:lvlJc w:val="left"/>
+      <w:pPr>
+        <w:ind w:left="720" w:hanging="360"/>
+      </w:pPr>
+      <w:rPr>
+        <w:rFonts w:ascii="Times New Roman" w:eastAsiaTheme="minorHAnsi" w:hAnsi="Times New Roman" w:cs="Times New Roman" w:hint="default"/>
+      </w:rPr>
+    </w:lvl>
+    <w:lvl w:ilvl="1" w:tplc="04090003" w:tentative="1">
+      <w:start w:val="1"/>
+      <w:numFmt w:val="bullet"/>
+      <w:lvlText w:val="o"/>
+      <w:lvlJc w:val="left"/>
+      <w:pPr>
+        <w:ind w:left="1440" w:hanging="360"/>
+      </w:pPr>
+      <w:rPr>
+        <w:rFonts w:ascii="Courier New" w:hAnsi="Courier New" w:cs="Courier New" w:hint="default"/>
+      </w:rPr>
+    </w:lvl>
+    <w:lvl w:ilvl="2" w:tplc="04090005" w:tentative="1">
+      <w:start w:val="1"/>
+      <w:numFmt w:val="bullet"/>
+      <w:lvlText w:val=""/>
+      <w:lvlJc w:val="left"/>
+      <w:pPr>
+        <w:ind w:left="2160" w:hanging="360"/>
+      </w:pPr>
+      <w:rPr>
+        <w:rFonts w:ascii="Wingdings" w:hAnsi="Wingdings" w:hint="default"/>
+      </w:rPr>
+    </w:lvl>
+    <w:lvl w:ilvl="3" w:tplc="04090001" w:tentative="1">
+      <w:start w:val="1"/>
+      <w:numFmt w:val="bullet"/>
+      <w:lvlText w:val=""/>
+      <w:lvlJc w:val="left"/>
+      <w:pPr>
+        <w:ind w:left="2880" w:hanging="360"/>
+      </w:pPr>
+      <w:rPr>
+        <w:rFonts w:ascii="Symbol" w:hAnsi="Symbol" w:hint="default"/>
+      </w:rPr>
+    </w:lvl>
+    <w:lvl w:ilvl="4" w:tplc="04090003" w:tentative="1">
+      <w:start w:val="1"/>
+      <w:numFmt w:val="bullet"/>
+      <w:lvlText w:val="o"/>
+      <w:lvlJc w:val="left"/>
+      <w:pPr>
+        <w:ind w:left="3600" w:hanging="360"/>
+      </w:pPr>
+      <w:rPr>
+        <w:rFonts w:ascii="Courier New" w:hAnsi="Courier New" w:cs="Courier New" w:hint="default"/>
+      </w:rPr>
+    </w:lvl>
+    <w:lvl w:ilvl="5" w:tplc="04090005" w:tentative="1">
+      <w:start w:val="1"/>
+      <w:numFmt w:val="bullet"/>
+      <w:lvlText w:val=""/>
+      <w:lvlJc w:val="left"/>
+      <w:pPr>
+        <w:ind w:left="4320" w:hanging="360"/>
+      </w:pPr>
+      <w:rPr>
+        <w:rFonts w:ascii="Wingdings" w:hAnsi="Wingdings" w:hint="default"/>
+      </w:rPr>
+    </w:lvl>
+    <w:lvl w:ilvl="6" w:tplc="04090001" w:tentative="1">
+      <w:start w:val="1"/>
+      <w:numFmt w:val="bullet"/>
+      <w:lvlText w:val=""/>
+      <w:lvlJc w:val="left"/>
+      <w:pPr>
+        <w:ind w:left="5040" w:hanging="360"/>
+      </w:pPr>
+      <w:rPr>
+        <w:rFonts w:ascii="Symbol" w:hAnsi="Symbol" w:hint="default"/>
+      </w:rPr>
+    </w:lvl>
+    <w:lvl w:ilvl="7" w:tplc="04090003" w:tentative="1">
+      <w:start w:val="1"/>
+      <w:numFmt w:val="bullet"/>
+      <w:lvlText w:val="o"/>
+      <w:lvlJc w:val="left"/>
+      <w:pPr>
+        <w:ind w:left="5760" w:hanging="360"/>
+      </w:pPr>
+      <w:rPr>
+        <w:rFonts w:ascii="Courier New" w:hAnsi="Courier New" w:cs="Courier New" w:hint="default"/>
+      </w:rPr>
+    </w:lvl>
+    <w:lvl w:ilvl="8" w:tplc="04090005" w:tentative="1">
+      <w:start w:val="1"/>
+      <w:numFmt w:val="bullet"/>
+      <w:lvlText w:val=""/>
+      <w:lvlJc w:val="left"/>
+      <w:pPr>
+        <w:ind w:left="6480" w:hanging="360"/>
+      </w:pPr>
+      <w:rPr>
+        <w:rFonts w:ascii="Wingdings" w:hAnsi="Wingdings" w:hint="default"/>
+      </w:rPr>
+    </w:lvl>
+  </w:abstractNum>
+  <w:abstractNum w:abstractNumId="64" w15:restartNumberingAfterBreak="0">
     <w:nsid w:val="3623194A"/>
     <w:multiLevelType w:val="multilevel"/>
     <w:tmpl w:val="63F4E6F0"/>
@@ -8099,7 +10624,7 @@
       </w:rPr>
     </w:lvl>
   </w:abstractNum>
-  <w:abstractNum w:abstractNumId="62" w15:restartNumberingAfterBreak="0">
+  <w:abstractNum w:abstractNumId="65" w15:restartNumberingAfterBreak="0">
     <w:nsid w:val="36AD3FB0"/>
     <w:multiLevelType w:val="multilevel"/>
     <w:tmpl w:val="0644AEEA"/>
@@ -8248,7 +10773,7 @@
       </w:rPr>
     </w:lvl>
   </w:abstractNum>
-  <w:abstractNum w:abstractNumId="63" w15:restartNumberingAfterBreak="0">
+  <w:abstractNum w:abstractNumId="66" w15:restartNumberingAfterBreak="0">
     <w:nsid w:val="371A2CDE"/>
     <w:multiLevelType w:val="hybridMultilevel"/>
     <w:tmpl w:val="EA9C00CC"/>
@@ -8360,7 +10885,7 @@
       </w:rPr>
     </w:lvl>
   </w:abstractNum>
-  <w:abstractNum w:abstractNumId="64" w15:restartNumberingAfterBreak="0">
+  <w:abstractNum w:abstractNumId="67" w15:restartNumberingAfterBreak="0">
     <w:nsid w:val="373D5E48"/>
     <w:multiLevelType w:val="hybridMultilevel"/>
     <w:tmpl w:val="8A6E38C0"/>
@@ -8473,7 +10998,7 @@
       </w:rPr>
     </w:lvl>
   </w:abstractNum>
-  <w:abstractNum w:abstractNumId="65" w15:restartNumberingAfterBreak="0">
+  <w:abstractNum w:abstractNumId="68" w15:restartNumberingAfterBreak="0">
     <w:nsid w:val="3B446B2D"/>
     <w:multiLevelType w:val="hybridMultilevel"/>
     <w:tmpl w:val="B638176E"/>
@@ -8585,7 +11110,7 @@
       </w:rPr>
     </w:lvl>
   </w:abstractNum>
-  <w:abstractNum w:abstractNumId="66" w15:restartNumberingAfterBreak="0">
+  <w:abstractNum w:abstractNumId="69" w15:restartNumberingAfterBreak="0">
     <w:nsid w:val="3B6B41F5"/>
     <w:multiLevelType w:val="hybridMultilevel"/>
     <w:tmpl w:val="10A26168"/>
@@ -8697,7 +11222,7 @@
       </w:rPr>
     </w:lvl>
   </w:abstractNum>
-  <w:abstractNum w:abstractNumId="67" w15:restartNumberingAfterBreak="0">
+  <w:abstractNum w:abstractNumId="70" w15:restartNumberingAfterBreak="0">
     <w:nsid w:val="3C5546BA"/>
     <w:multiLevelType w:val="hybridMultilevel"/>
     <w:tmpl w:val="3434F5E4"/>
@@ -8809,7 +11334,7 @@
       </w:rPr>
     </w:lvl>
   </w:abstractNum>
-  <w:abstractNum w:abstractNumId="68" w15:restartNumberingAfterBreak="0">
+  <w:abstractNum w:abstractNumId="71" w15:restartNumberingAfterBreak="0">
     <w:nsid w:val="3C623C55"/>
     <w:multiLevelType w:val="multilevel"/>
     <w:tmpl w:val="A0B0E8F4"/>
@@ -8958,7 +11483,7 @@
       </w:rPr>
     </w:lvl>
   </w:abstractNum>
-  <w:abstractNum w:abstractNumId="69" w15:restartNumberingAfterBreak="0">
+  <w:abstractNum w:abstractNumId="72" w15:restartNumberingAfterBreak="0">
     <w:nsid w:val="3CD27F78"/>
     <w:multiLevelType w:val="multilevel"/>
     <w:tmpl w:val="FCDE767A"/>
@@ -9107,7 +11632,7 @@
       </w:rPr>
     </w:lvl>
   </w:abstractNum>
-  <w:abstractNum w:abstractNumId="70" w15:restartNumberingAfterBreak="0">
+  <w:abstractNum w:abstractNumId="73" w15:restartNumberingAfterBreak="0">
     <w:nsid w:val="3CD74B18"/>
     <w:multiLevelType w:val="hybridMultilevel"/>
     <w:tmpl w:val="2FF42220"/>
@@ -9220,7 +11745,7 @@
       </w:rPr>
     </w:lvl>
   </w:abstractNum>
-  <w:abstractNum w:abstractNumId="71" w15:restartNumberingAfterBreak="0">
+  <w:abstractNum w:abstractNumId="74" w15:restartNumberingAfterBreak="0">
     <w:nsid w:val="3D2F7E79"/>
     <w:multiLevelType w:val="hybridMultilevel"/>
     <w:tmpl w:val="6ED674BE"/>
@@ -9332,7 +11857,7 @@
       </w:rPr>
     </w:lvl>
   </w:abstractNum>
-  <w:abstractNum w:abstractNumId="72" w15:restartNumberingAfterBreak="0">
+  <w:abstractNum w:abstractNumId="75" w15:restartNumberingAfterBreak="0">
     <w:nsid w:val="3D397287"/>
     <w:multiLevelType w:val="hybridMultilevel"/>
     <w:tmpl w:val="F4503122"/>
@@ -9444,7 +11969,7 @@
       </w:rPr>
     </w:lvl>
   </w:abstractNum>
-  <w:abstractNum w:abstractNumId="73" w15:restartNumberingAfterBreak="0">
+  <w:abstractNum w:abstractNumId="76" w15:restartNumberingAfterBreak="0">
     <w:nsid w:val="3E685FF3"/>
     <w:multiLevelType w:val="multilevel"/>
     <w:tmpl w:val="7D20B538"/>
@@ -9593,7 +12118,7 @@
       </w:rPr>
     </w:lvl>
   </w:abstractNum>
-  <w:abstractNum w:abstractNumId="74" w15:restartNumberingAfterBreak="0">
+  <w:abstractNum w:abstractNumId="77" w15:restartNumberingAfterBreak="0">
     <w:nsid w:val="3F346C2C"/>
     <w:multiLevelType w:val="multilevel"/>
     <w:tmpl w:val="63F4E6F0"/>
@@ -9742,7 +12267,7 @@
       </w:rPr>
     </w:lvl>
   </w:abstractNum>
-  <w:abstractNum w:abstractNumId="75" w15:restartNumberingAfterBreak="0">
+  <w:abstractNum w:abstractNumId="78" w15:restartNumberingAfterBreak="0">
     <w:nsid w:val="3FCB1322"/>
     <w:multiLevelType w:val="hybridMultilevel"/>
     <w:tmpl w:val="55C012B2"/>
@@ -9854,7 +12379,7 @@
       </w:rPr>
     </w:lvl>
   </w:abstractNum>
-  <w:abstractNum w:abstractNumId="76" w15:restartNumberingAfterBreak="0">
+  <w:abstractNum w:abstractNumId="79" w15:restartNumberingAfterBreak="0">
     <w:nsid w:val="41A9344F"/>
     <w:multiLevelType w:val="hybridMultilevel"/>
     <w:tmpl w:val="0FB60038"/>
@@ -9967,7 +12492,7 @@
       </w:rPr>
     </w:lvl>
   </w:abstractNum>
-  <w:abstractNum w:abstractNumId="77" w15:restartNumberingAfterBreak="0">
+  <w:abstractNum w:abstractNumId="80" w15:restartNumberingAfterBreak="0">
     <w:nsid w:val="42004E1F"/>
     <w:multiLevelType w:val="hybridMultilevel"/>
     <w:tmpl w:val="770C8314"/>
@@ -10079,7 +12604,7 @@
       </w:rPr>
     </w:lvl>
   </w:abstractNum>
-  <w:abstractNum w:abstractNumId="78" w15:restartNumberingAfterBreak="0">
+  <w:abstractNum w:abstractNumId="81" w15:restartNumberingAfterBreak="0">
     <w:nsid w:val="439F7169"/>
     <w:multiLevelType w:val="hybridMultilevel"/>
     <w:tmpl w:val="1884EDCA"/>
@@ -10192,7 +12717,7 @@
       </w:rPr>
     </w:lvl>
   </w:abstractNum>
-  <w:abstractNum w:abstractNumId="79" w15:restartNumberingAfterBreak="0">
+  <w:abstractNum w:abstractNumId="82" w15:restartNumberingAfterBreak="0">
     <w:nsid w:val="43EA1D69"/>
     <w:multiLevelType w:val="multilevel"/>
     <w:tmpl w:val="DFEC23EC"/>
@@ -10341,7 +12866,7 @@
       </w:rPr>
     </w:lvl>
   </w:abstractNum>
-  <w:abstractNum w:abstractNumId="80" w15:restartNumberingAfterBreak="0">
+  <w:abstractNum w:abstractNumId="83" w15:restartNumberingAfterBreak="0">
     <w:nsid w:val="44320084"/>
     <w:multiLevelType w:val="hybridMultilevel"/>
     <w:tmpl w:val="CE5076D4"/>
@@ -10453,7 +12978,7 @@
       </w:rPr>
     </w:lvl>
   </w:abstractNum>
-  <w:abstractNum w:abstractNumId="81" w15:restartNumberingAfterBreak="0">
+  <w:abstractNum w:abstractNumId="84" w15:restartNumberingAfterBreak="0">
     <w:nsid w:val="44554567"/>
     <w:multiLevelType w:val="hybridMultilevel"/>
     <w:tmpl w:val="78748252"/>
@@ -10565,7 +13090,7 @@
       </w:rPr>
     </w:lvl>
   </w:abstractNum>
-  <w:abstractNum w:abstractNumId="82" w15:restartNumberingAfterBreak="0">
+  <w:abstractNum w:abstractNumId="85" w15:restartNumberingAfterBreak="0">
     <w:nsid w:val="49005094"/>
     <w:multiLevelType w:val="hybridMultilevel"/>
     <w:tmpl w:val="14848CBE"/>
@@ -10677,7 +13202,7 @@
       </w:rPr>
     </w:lvl>
   </w:abstractNum>
-  <w:abstractNum w:abstractNumId="83" w15:restartNumberingAfterBreak="0">
+  <w:abstractNum w:abstractNumId="86" w15:restartNumberingAfterBreak="0">
     <w:nsid w:val="49243794"/>
     <w:multiLevelType w:val="multilevel"/>
     <w:tmpl w:val="E7681528"/>
@@ -10826,7 +13351,7 @@
       </w:rPr>
     </w:lvl>
   </w:abstractNum>
-  <w:abstractNum w:abstractNumId="84" w15:restartNumberingAfterBreak="0">
+  <w:abstractNum w:abstractNumId="87" w15:restartNumberingAfterBreak="0">
     <w:nsid w:val="4A880990"/>
     <w:multiLevelType w:val="hybridMultilevel"/>
     <w:tmpl w:val="F17E12C2"/>
@@ -10938,7 +13463,7 @@
       </w:rPr>
     </w:lvl>
   </w:abstractNum>
-  <w:abstractNum w:abstractNumId="85" w15:restartNumberingAfterBreak="0">
+  <w:abstractNum w:abstractNumId="88" w15:restartNumberingAfterBreak="0">
     <w:nsid w:val="4B182B12"/>
     <w:multiLevelType w:val="hybridMultilevel"/>
     <w:tmpl w:val="31C486B4"/>
@@ -11050,7 +13575,7 @@
       </w:rPr>
     </w:lvl>
   </w:abstractNum>
-  <w:abstractNum w:abstractNumId="86" w15:restartNumberingAfterBreak="0">
+  <w:abstractNum w:abstractNumId="89" w15:restartNumberingAfterBreak="0">
     <w:nsid w:val="4BA13766"/>
     <w:multiLevelType w:val="multilevel"/>
     <w:tmpl w:val="63F4E6F0"/>
@@ -11199,7 +13724,7 @@
       </w:rPr>
     </w:lvl>
   </w:abstractNum>
-  <w:abstractNum w:abstractNumId="87" w15:restartNumberingAfterBreak="0">
+  <w:abstractNum w:abstractNumId="90" w15:restartNumberingAfterBreak="0">
     <w:nsid w:val="4E65371E"/>
     <w:multiLevelType w:val="hybridMultilevel"/>
     <w:tmpl w:val="53EE4538"/>
@@ -11311,7 +13836,7 @@
       </w:rPr>
     </w:lvl>
   </w:abstractNum>
-  <w:abstractNum w:abstractNumId="88" w15:restartNumberingAfterBreak="0">
+  <w:abstractNum w:abstractNumId="91" w15:restartNumberingAfterBreak="0">
     <w:nsid w:val="4E9A3F16"/>
     <w:multiLevelType w:val="multilevel"/>
     <w:tmpl w:val="63F4E6F0"/>
@@ -11460,7 +13985,7 @@
       </w:rPr>
     </w:lvl>
   </w:abstractNum>
-  <w:abstractNum w:abstractNumId="89" w15:restartNumberingAfterBreak="0">
+  <w:abstractNum w:abstractNumId="92" w15:restartNumberingAfterBreak="0">
     <w:nsid w:val="500B790D"/>
     <w:multiLevelType w:val="multilevel"/>
     <w:tmpl w:val="63F4E6F0"/>
@@ -11609,7 +14134,7 @@
       </w:rPr>
     </w:lvl>
   </w:abstractNum>
-  <w:abstractNum w:abstractNumId="90" w15:restartNumberingAfterBreak="0">
+  <w:abstractNum w:abstractNumId="93" w15:restartNumberingAfterBreak="0">
     <w:nsid w:val="526538B7"/>
     <w:multiLevelType w:val="hybridMultilevel"/>
     <w:tmpl w:val="E6A017F2"/>
@@ -11722,7 +14247,7 @@
       </w:rPr>
     </w:lvl>
   </w:abstractNum>
-  <w:abstractNum w:abstractNumId="91" w15:restartNumberingAfterBreak="0">
+  <w:abstractNum w:abstractNumId="94" w15:restartNumberingAfterBreak="0">
     <w:nsid w:val="537E56D9"/>
     <w:multiLevelType w:val="multilevel"/>
     <w:tmpl w:val="1B6E8B6A"/>
@@ -11871,7 +14396,7 @@
       </w:rPr>
     </w:lvl>
   </w:abstractNum>
-  <w:abstractNum w:abstractNumId="92" w15:restartNumberingAfterBreak="0">
+  <w:abstractNum w:abstractNumId="95" w15:restartNumberingAfterBreak="0">
     <w:nsid w:val="53E6601E"/>
     <w:multiLevelType w:val="hybridMultilevel"/>
     <w:tmpl w:val="66F0666A"/>
@@ -11984,7 +14509,7 @@
       </w:rPr>
     </w:lvl>
   </w:abstractNum>
-  <w:abstractNum w:abstractNumId="93" w15:restartNumberingAfterBreak="0">
+  <w:abstractNum w:abstractNumId="96" w15:restartNumberingAfterBreak="0">
     <w:nsid w:val="551D6F91"/>
     <w:multiLevelType w:val="hybridMultilevel"/>
     <w:tmpl w:val="9522B3C6"/>
@@ -12096,7 +14621,7 @@
       </w:rPr>
     </w:lvl>
   </w:abstractNum>
-  <w:abstractNum w:abstractNumId="94" w15:restartNumberingAfterBreak="0">
+  <w:abstractNum w:abstractNumId="97" w15:restartNumberingAfterBreak="0">
     <w:nsid w:val="55655B93"/>
     <w:multiLevelType w:val="multilevel"/>
     <w:tmpl w:val="9C88A4A8"/>
@@ -12245,7 +14770,7 @@
       </w:rPr>
     </w:lvl>
   </w:abstractNum>
-  <w:abstractNum w:abstractNumId="95" w15:restartNumberingAfterBreak="0">
+  <w:abstractNum w:abstractNumId="98" w15:restartNumberingAfterBreak="0">
     <w:nsid w:val="562D4F1F"/>
     <w:multiLevelType w:val="hybridMultilevel"/>
     <w:tmpl w:val="1FF8D31C"/>
@@ -12357,7 +14882,7 @@
       </w:rPr>
     </w:lvl>
   </w:abstractNum>
-  <w:abstractNum w:abstractNumId="96" w15:restartNumberingAfterBreak="0">
+  <w:abstractNum w:abstractNumId="99" w15:restartNumberingAfterBreak="0">
     <w:nsid w:val="565A0C8B"/>
     <w:multiLevelType w:val="multilevel"/>
     <w:tmpl w:val="AB24FF2E"/>
@@ -12506,7 +15031,7 @@
       </w:rPr>
     </w:lvl>
   </w:abstractNum>
-  <w:abstractNum w:abstractNumId="97" w15:restartNumberingAfterBreak="0">
+  <w:abstractNum w:abstractNumId="100" w15:restartNumberingAfterBreak="0">
     <w:nsid w:val="566E7C65"/>
     <w:multiLevelType w:val="multilevel"/>
     <w:tmpl w:val="28803B4C"/>
@@ -12655,7 +15180,7 @@
       </w:rPr>
     </w:lvl>
   </w:abstractNum>
-  <w:abstractNum w:abstractNumId="98" w15:restartNumberingAfterBreak="0">
+  <w:abstractNum w:abstractNumId="101" w15:restartNumberingAfterBreak="0">
     <w:nsid w:val="57407594"/>
     <w:multiLevelType w:val="multilevel"/>
     <w:tmpl w:val="E6E2F8AE"/>
@@ -12804,7 +15329,7 @@
       </w:rPr>
     </w:lvl>
   </w:abstractNum>
-  <w:abstractNum w:abstractNumId="99" w15:restartNumberingAfterBreak="0">
+  <w:abstractNum w:abstractNumId="102" w15:restartNumberingAfterBreak="0">
     <w:nsid w:val="577F771B"/>
     <w:multiLevelType w:val="hybridMultilevel"/>
     <w:tmpl w:val="0F2C5914"/>
@@ -12916,7 +15441,7 @@
       </w:rPr>
     </w:lvl>
   </w:abstractNum>
-  <w:abstractNum w:abstractNumId="100" w15:restartNumberingAfterBreak="0">
+  <w:abstractNum w:abstractNumId="103" w15:restartNumberingAfterBreak="0">
     <w:nsid w:val="57C43CDD"/>
     <w:multiLevelType w:val="hybridMultilevel"/>
     <w:tmpl w:val="6C94FB5E"/>
@@ -13029,7 +15554,7 @@
       </w:rPr>
     </w:lvl>
   </w:abstractNum>
-  <w:abstractNum w:abstractNumId="101" w15:restartNumberingAfterBreak="0">
+  <w:abstractNum w:abstractNumId="104" w15:restartNumberingAfterBreak="0">
     <w:nsid w:val="58393977"/>
     <w:multiLevelType w:val="hybridMultilevel"/>
     <w:tmpl w:val="985A5484"/>
@@ -13142,7 +15667,7 @@
       </w:rPr>
     </w:lvl>
   </w:abstractNum>
-  <w:abstractNum w:abstractNumId="102" w15:restartNumberingAfterBreak="0">
+  <w:abstractNum w:abstractNumId="105" w15:restartNumberingAfterBreak="0">
     <w:nsid w:val="59EB4CE4"/>
     <w:multiLevelType w:val="multilevel"/>
     <w:tmpl w:val="63F4E6F0"/>
@@ -13291,7 +15816,7 @@
       </w:rPr>
     </w:lvl>
   </w:abstractNum>
-  <w:abstractNum w:abstractNumId="103" w15:restartNumberingAfterBreak="0">
+  <w:abstractNum w:abstractNumId="106" w15:restartNumberingAfterBreak="0">
     <w:nsid w:val="5BD11962"/>
     <w:multiLevelType w:val="hybridMultilevel"/>
     <w:tmpl w:val="89A4B834"/>
@@ -13380,7 +15905,7 @@
       </w:pPr>
     </w:lvl>
   </w:abstractNum>
-  <w:abstractNum w:abstractNumId="104" w15:restartNumberingAfterBreak="0">
+  <w:abstractNum w:abstractNumId="107" w15:restartNumberingAfterBreak="0">
     <w:nsid w:val="5C950DBA"/>
     <w:multiLevelType w:val="hybridMultilevel"/>
     <w:tmpl w:val="7D78F950"/>
@@ -13492,7 +16017,7 @@
       </w:rPr>
     </w:lvl>
   </w:abstractNum>
-  <w:abstractNum w:abstractNumId="105" w15:restartNumberingAfterBreak="0">
+  <w:abstractNum w:abstractNumId="108" w15:restartNumberingAfterBreak="0">
     <w:nsid w:val="5D2A5D3B"/>
     <w:multiLevelType w:val="hybridMultilevel"/>
     <w:tmpl w:val="3AF89EA6"/>
@@ -13583,7 +16108,7 @@
       </w:pPr>
     </w:lvl>
   </w:abstractNum>
-  <w:abstractNum w:abstractNumId="106" w15:restartNumberingAfterBreak="0">
+  <w:abstractNum w:abstractNumId="109" w15:restartNumberingAfterBreak="0">
     <w:nsid w:val="5D9E49FD"/>
     <w:multiLevelType w:val="hybridMultilevel"/>
     <w:tmpl w:val="4EE40BB4"/>
@@ -13695,7 +16220,7 @@
       </w:rPr>
     </w:lvl>
   </w:abstractNum>
-  <w:abstractNum w:abstractNumId="107" w15:restartNumberingAfterBreak="0">
+  <w:abstractNum w:abstractNumId="110" w15:restartNumberingAfterBreak="0">
     <w:nsid w:val="5DB7107D"/>
     <w:multiLevelType w:val="multilevel"/>
     <w:tmpl w:val="6520107A"/>
@@ -13844,7 +16369,93 @@
       </w:rPr>
     </w:lvl>
   </w:abstractNum>
-  <w:abstractNum w:abstractNumId="108" w15:restartNumberingAfterBreak="0">
+  <w:abstractNum w:abstractNumId="111" w15:restartNumberingAfterBreak="0">
+    <w:nsid w:val="5F5C1AFF"/>
+    <w:multiLevelType w:val="hybridMultilevel"/>
+    <w:tmpl w:val="C6DA3D20"/>
+    <w:lvl w:ilvl="0" w:tplc="0409000F">
+      <w:start w:val="1"/>
+      <w:numFmt w:val="decimal"/>
+      <w:lvlText w:val="%1."/>
+      <w:lvlJc w:val="left"/>
+      <w:pPr>
+        <w:ind w:left="720" w:hanging="360"/>
+      </w:pPr>
+    </w:lvl>
+    <w:lvl w:ilvl="1" w:tplc="04090019" w:tentative="1">
+      <w:start w:val="1"/>
+      <w:numFmt w:val="lowerLetter"/>
+      <w:lvlText w:val="%2."/>
+      <w:lvlJc w:val="left"/>
+      <w:pPr>
+        <w:ind w:left="1440" w:hanging="360"/>
+      </w:pPr>
+    </w:lvl>
+    <w:lvl w:ilvl="2" w:tplc="0409001B" w:tentative="1">
+      <w:start w:val="1"/>
+      <w:numFmt w:val="lowerRoman"/>
+      <w:lvlText w:val="%3."/>
+      <w:lvlJc w:val="right"/>
+      <w:pPr>
+        <w:ind w:left="2160" w:hanging="180"/>
+      </w:pPr>
+    </w:lvl>
+    <w:lvl w:ilvl="3" w:tplc="0409000F" w:tentative="1">
+      <w:start w:val="1"/>
+      <w:numFmt w:val="decimal"/>
+      <w:lvlText w:val="%4."/>
+      <w:lvlJc w:val="left"/>
+      <w:pPr>
+        <w:ind w:left="2880" w:hanging="360"/>
+      </w:pPr>
+    </w:lvl>
+    <w:lvl w:ilvl="4" w:tplc="04090019" w:tentative="1">
+      <w:start w:val="1"/>
+      <w:numFmt w:val="lowerLetter"/>
+      <w:lvlText w:val="%5."/>
+      <w:lvlJc w:val="left"/>
+      <w:pPr>
+        <w:ind w:left="3600" w:hanging="360"/>
+      </w:pPr>
+    </w:lvl>
+    <w:lvl w:ilvl="5" w:tplc="0409001B" w:tentative="1">
+      <w:start w:val="1"/>
+      <w:numFmt w:val="lowerRoman"/>
+      <w:lvlText w:val="%6."/>
+      <w:lvlJc w:val="right"/>
+      <w:pPr>
+        <w:ind w:left="4320" w:hanging="180"/>
+      </w:pPr>
+    </w:lvl>
+    <w:lvl w:ilvl="6" w:tplc="0409000F" w:tentative="1">
+      <w:start w:val="1"/>
+      <w:numFmt w:val="decimal"/>
+      <w:lvlText w:val="%7."/>
+      <w:lvlJc w:val="left"/>
+      <w:pPr>
+        <w:ind w:left="5040" w:hanging="360"/>
+      </w:pPr>
+    </w:lvl>
+    <w:lvl w:ilvl="7" w:tplc="04090019" w:tentative="1">
+      <w:start w:val="1"/>
+      <w:numFmt w:val="lowerLetter"/>
+      <w:lvlText w:val="%8."/>
+      <w:lvlJc w:val="left"/>
+      <w:pPr>
+        <w:ind w:left="5760" w:hanging="360"/>
+      </w:pPr>
+    </w:lvl>
+    <w:lvl w:ilvl="8" w:tplc="0409001B" w:tentative="1">
+      <w:start w:val="1"/>
+      <w:numFmt w:val="lowerRoman"/>
+      <w:lvlText w:val="%9."/>
+      <w:lvlJc w:val="right"/>
+      <w:pPr>
+        <w:ind w:left="6480" w:hanging="180"/>
+      </w:pPr>
+    </w:lvl>
+  </w:abstractNum>
+  <w:abstractNum w:abstractNumId="112" w15:restartNumberingAfterBreak="0">
     <w:nsid w:val="60421322"/>
     <w:multiLevelType w:val="hybridMultilevel"/>
     <w:tmpl w:val="447CDBDC"/>
@@ -13956,7 +16567,7 @@
       </w:rPr>
     </w:lvl>
   </w:abstractNum>
-  <w:abstractNum w:abstractNumId="109" w15:restartNumberingAfterBreak="0">
+  <w:abstractNum w:abstractNumId="113" w15:restartNumberingAfterBreak="0">
     <w:nsid w:val="61926C31"/>
     <w:multiLevelType w:val="hybridMultilevel"/>
     <w:tmpl w:val="AFD27E5C"/>
@@ -14069,7 +16680,7 @@
       </w:rPr>
     </w:lvl>
   </w:abstractNum>
-  <w:abstractNum w:abstractNumId="110" w15:restartNumberingAfterBreak="0">
+  <w:abstractNum w:abstractNumId="114" w15:restartNumberingAfterBreak="0">
     <w:nsid w:val="622F5FC7"/>
     <w:multiLevelType w:val="hybridMultilevel"/>
     <w:tmpl w:val="49A6C2A6"/>
@@ -14182,7 +16793,7 @@
       </w:rPr>
     </w:lvl>
   </w:abstractNum>
-  <w:abstractNum w:abstractNumId="111" w15:restartNumberingAfterBreak="0">
+  <w:abstractNum w:abstractNumId="115" w15:restartNumberingAfterBreak="0">
     <w:nsid w:val="62AC33B4"/>
     <w:multiLevelType w:val="multilevel"/>
     <w:tmpl w:val="A074F3CA"/>
@@ -14331,7 +16942,7 @@
       </w:rPr>
     </w:lvl>
   </w:abstractNum>
-  <w:abstractNum w:abstractNumId="112" w15:restartNumberingAfterBreak="0">
+  <w:abstractNum w:abstractNumId="116" w15:restartNumberingAfterBreak="0">
     <w:nsid w:val="63B44674"/>
     <w:multiLevelType w:val="multilevel"/>
     <w:tmpl w:val="08F4FA9A"/>
@@ -14480,7 +17091,7 @@
       </w:rPr>
     </w:lvl>
   </w:abstractNum>
-  <w:abstractNum w:abstractNumId="113" w15:restartNumberingAfterBreak="0">
+  <w:abstractNum w:abstractNumId="117" w15:restartNumberingAfterBreak="0">
     <w:nsid w:val="63C245D4"/>
     <w:multiLevelType w:val="hybridMultilevel"/>
     <w:tmpl w:val="E1563A56"/>
@@ -14592,7 +17203,7 @@
       </w:rPr>
     </w:lvl>
   </w:abstractNum>
-  <w:abstractNum w:abstractNumId="114" w15:restartNumberingAfterBreak="0">
+  <w:abstractNum w:abstractNumId="118" w15:restartNumberingAfterBreak="0">
     <w:nsid w:val="64F30198"/>
     <w:multiLevelType w:val="multilevel"/>
     <w:tmpl w:val="63F4E6F0"/>
@@ -14741,7 +17352,7 @@
       </w:rPr>
     </w:lvl>
   </w:abstractNum>
-  <w:abstractNum w:abstractNumId="115" w15:restartNumberingAfterBreak="0">
+  <w:abstractNum w:abstractNumId="119" w15:restartNumberingAfterBreak="0">
     <w:nsid w:val="65AF2502"/>
     <w:multiLevelType w:val="hybridMultilevel"/>
     <w:tmpl w:val="FB2A44D8"/>
@@ -14854,7 +17465,7 @@
       </w:rPr>
     </w:lvl>
   </w:abstractNum>
-  <w:abstractNum w:abstractNumId="116" w15:restartNumberingAfterBreak="0">
+  <w:abstractNum w:abstractNumId="120" w15:restartNumberingAfterBreak="0">
     <w:nsid w:val="671614F0"/>
     <w:multiLevelType w:val="multilevel"/>
     <w:tmpl w:val="63F4E6F0"/>
@@ -15003,7 +17614,7 @@
       </w:rPr>
     </w:lvl>
   </w:abstractNum>
-  <w:abstractNum w:abstractNumId="117" w15:restartNumberingAfterBreak="0">
+  <w:abstractNum w:abstractNumId="121" w15:restartNumberingAfterBreak="0">
     <w:nsid w:val="6859691D"/>
     <w:multiLevelType w:val="multilevel"/>
     <w:tmpl w:val="826A9D48"/>
@@ -15152,7 +17763,7 @@
       </w:rPr>
     </w:lvl>
   </w:abstractNum>
-  <w:abstractNum w:abstractNumId="118" w15:restartNumberingAfterBreak="0">
+  <w:abstractNum w:abstractNumId="122" w15:restartNumberingAfterBreak="0">
     <w:nsid w:val="68817757"/>
     <w:multiLevelType w:val="multilevel"/>
     <w:tmpl w:val="34EE1968"/>
@@ -15301,7 +17912,7 @@
       </w:rPr>
     </w:lvl>
   </w:abstractNum>
-  <w:abstractNum w:abstractNumId="119" w15:restartNumberingAfterBreak="0">
+  <w:abstractNum w:abstractNumId="123" w15:restartNumberingAfterBreak="0">
     <w:nsid w:val="68BE10E8"/>
     <w:multiLevelType w:val="hybridMultilevel"/>
     <w:tmpl w:val="326CD592"/>
@@ -15414,7 +18025,7 @@
       </w:rPr>
     </w:lvl>
   </w:abstractNum>
-  <w:abstractNum w:abstractNumId="120" w15:restartNumberingAfterBreak="0">
+  <w:abstractNum w:abstractNumId="124" w15:restartNumberingAfterBreak="0">
     <w:nsid w:val="69996D9A"/>
     <w:multiLevelType w:val="multilevel"/>
     <w:tmpl w:val="1780FC38"/>
@@ -15563,7 +18174,7 @@
       </w:rPr>
     </w:lvl>
   </w:abstractNum>
-  <w:abstractNum w:abstractNumId="121" w15:restartNumberingAfterBreak="0">
+  <w:abstractNum w:abstractNumId="125" w15:restartNumberingAfterBreak="0">
     <w:nsid w:val="6B3C30B9"/>
     <w:multiLevelType w:val="hybridMultilevel"/>
     <w:tmpl w:val="C938F8DE"/>
@@ -15675,7 +18286,7 @@
       </w:rPr>
     </w:lvl>
   </w:abstractNum>
-  <w:abstractNum w:abstractNumId="122" w15:restartNumberingAfterBreak="0">
+  <w:abstractNum w:abstractNumId="126" w15:restartNumberingAfterBreak="0">
     <w:nsid w:val="6D1511A0"/>
     <w:multiLevelType w:val="hybridMultilevel"/>
     <w:tmpl w:val="AAD8B9B4"/>
@@ -15787,7 +18398,7 @@
       </w:rPr>
     </w:lvl>
   </w:abstractNum>
-  <w:abstractNum w:abstractNumId="123" w15:restartNumberingAfterBreak="0">
+  <w:abstractNum w:abstractNumId="127" w15:restartNumberingAfterBreak="0">
     <w:nsid w:val="6DD255F1"/>
     <w:multiLevelType w:val="hybridMultilevel"/>
     <w:tmpl w:val="ACBC1404"/>
@@ -15900,7 +18511,7 @@
       </w:rPr>
     </w:lvl>
   </w:abstractNum>
-  <w:abstractNum w:abstractNumId="124" w15:restartNumberingAfterBreak="0">
+  <w:abstractNum w:abstractNumId="128" w15:restartNumberingAfterBreak="0">
     <w:nsid w:val="6DDB4404"/>
     <w:multiLevelType w:val="hybridMultilevel"/>
     <w:tmpl w:val="06428E32"/>
@@ -16013,7 +18624,7 @@
       </w:rPr>
     </w:lvl>
   </w:abstractNum>
-  <w:abstractNum w:abstractNumId="125" w15:restartNumberingAfterBreak="0">
+  <w:abstractNum w:abstractNumId="129" w15:restartNumberingAfterBreak="0">
     <w:nsid w:val="6F014B3B"/>
     <w:multiLevelType w:val="hybridMultilevel"/>
     <w:tmpl w:val="C89A39BE"/>
@@ -16125,7 +18736,7 @@
       </w:rPr>
     </w:lvl>
   </w:abstractNum>
-  <w:abstractNum w:abstractNumId="126" w15:restartNumberingAfterBreak="0">
+  <w:abstractNum w:abstractNumId="130" w15:restartNumberingAfterBreak="0">
     <w:nsid w:val="6F171273"/>
     <w:multiLevelType w:val="multilevel"/>
     <w:tmpl w:val="0240C564"/>
@@ -16274,7 +18885,7 @@
       </w:rPr>
     </w:lvl>
   </w:abstractNum>
-  <w:abstractNum w:abstractNumId="127" w15:restartNumberingAfterBreak="0">
+  <w:abstractNum w:abstractNumId="131" w15:restartNumberingAfterBreak="0">
     <w:nsid w:val="6FB82AAA"/>
     <w:multiLevelType w:val="multilevel"/>
     <w:tmpl w:val="FC46C7C0"/>
@@ -16423,7 +19034,7 @@
       </w:rPr>
     </w:lvl>
   </w:abstractNum>
-  <w:abstractNum w:abstractNumId="128" w15:restartNumberingAfterBreak="0">
+  <w:abstractNum w:abstractNumId="132" w15:restartNumberingAfterBreak="0">
     <w:nsid w:val="6FD46DCF"/>
     <w:multiLevelType w:val="hybridMultilevel"/>
     <w:tmpl w:val="EF5E6EC6"/>
@@ -16536,7 +19147,7 @@
       </w:rPr>
     </w:lvl>
   </w:abstractNum>
-  <w:abstractNum w:abstractNumId="129" w15:restartNumberingAfterBreak="0">
+  <w:abstractNum w:abstractNumId="133" w15:restartNumberingAfterBreak="0">
     <w:nsid w:val="70484E38"/>
     <w:multiLevelType w:val="multilevel"/>
     <w:tmpl w:val="22B26DD2"/>
@@ -16685,7 +19296,7 @@
       </w:rPr>
     </w:lvl>
   </w:abstractNum>
-  <w:abstractNum w:abstractNumId="130" w15:restartNumberingAfterBreak="0">
+  <w:abstractNum w:abstractNumId="134" w15:restartNumberingAfterBreak="0">
     <w:nsid w:val="70CB723E"/>
     <w:multiLevelType w:val="multilevel"/>
     <w:tmpl w:val="63F4E6F0"/>
@@ -16834,7 +19445,7 @@
       </w:rPr>
     </w:lvl>
   </w:abstractNum>
-  <w:abstractNum w:abstractNumId="131" w15:restartNumberingAfterBreak="0">
+  <w:abstractNum w:abstractNumId="135" w15:restartNumberingAfterBreak="0">
     <w:nsid w:val="71DB3F58"/>
     <w:multiLevelType w:val="multilevel"/>
     <w:tmpl w:val="63F4E6F0"/>
@@ -16983,7 +19594,7 @@
       </w:rPr>
     </w:lvl>
   </w:abstractNum>
-  <w:abstractNum w:abstractNumId="132" w15:restartNumberingAfterBreak="0">
+  <w:abstractNum w:abstractNumId="136" w15:restartNumberingAfterBreak="0">
     <w:nsid w:val="72F31FF2"/>
     <w:multiLevelType w:val="hybridMultilevel"/>
     <w:tmpl w:val="5C2693A0"/>
@@ -17095,7 +19706,7 @@
       </w:rPr>
     </w:lvl>
   </w:abstractNum>
-  <w:abstractNum w:abstractNumId="133" w15:restartNumberingAfterBreak="0">
+  <w:abstractNum w:abstractNumId="137" w15:restartNumberingAfterBreak="0">
     <w:nsid w:val="75B45140"/>
     <w:multiLevelType w:val="hybridMultilevel"/>
     <w:tmpl w:val="93F8F3C4"/>
@@ -17208,7 +19819,7 @@
       </w:rPr>
     </w:lvl>
   </w:abstractNum>
-  <w:abstractNum w:abstractNumId="134" w15:restartNumberingAfterBreak="0">
+  <w:abstractNum w:abstractNumId="138" w15:restartNumberingAfterBreak="0">
     <w:nsid w:val="76F60FFE"/>
     <w:multiLevelType w:val="multilevel"/>
     <w:tmpl w:val="63F4E6F0"/>
@@ -17357,7 +19968,7 @@
       </w:rPr>
     </w:lvl>
   </w:abstractNum>
-  <w:abstractNum w:abstractNumId="135" w15:restartNumberingAfterBreak="0">
+  <w:abstractNum w:abstractNumId="139" w15:restartNumberingAfterBreak="0">
     <w:nsid w:val="77572323"/>
     <w:multiLevelType w:val="multilevel"/>
     <w:tmpl w:val="63F4E6F0"/>
@@ -17506,7 +20117,7 @@
       </w:rPr>
     </w:lvl>
   </w:abstractNum>
-  <w:abstractNum w:abstractNumId="136" w15:restartNumberingAfterBreak="0">
+  <w:abstractNum w:abstractNumId="140" w15:restartNumberingAfterBreak="0">
     <w:nsid w:val="77B8201F"/>
     <w:multiLevelType w:val="hybridMultilevel"/>
     <w:tmpl w:val="D7160708"/>
@@ -17618,7 +20229,7 @@
       </w:rPr>
     </w:lvl>
   </w:abstractNum>
-  <w:abstractNum w:abstractNumId="137" w15:restartNumberingAfterBreak="0">
+  <w:abstractNum w:abstractNumId="141" w15:restartNumberingAfterBreak="0">
     <w:nsid w:val="79796FF9"/>
     <w:multiLevelType w:val="hybridMultilevel"/>
     <w:tmpl w:val="CFA8EF82"/>
@@ -17730,7 +20341,7 @@
       </w:rPr>
     </w:lvl>
   </w:abstractNum>
-  <w:abstractNum w:abstractNumId="138" w15:restartNumberingAfterBreak="0">
+  <w:abstractNum w:abstractNumId="142" w15:restartNumberingAfterBreak="0">
     <w:nsid w:val="79910410"/>
     <w:multiLevelType w:val="hybridMultilevel"/>
     <w:tmpl w:val="FC923542"/>
@@ -17842,7 +20453,7 @@
       </w:rPr>
     </w:lvl>
   </w:abstractNum>
-  <w:abstractNum w:abstractNumId="139" w15:restartNumberingAfterBreak="0">
+  <w:abstractNum w:abstractNumId="143" w15:restartNumberingAfterBreak="0">
     <w:nsid w:val="7AFF575A"/>
     <w:multiLevelType w:val="hybridMultilevel"/>
     <w:tmpl w:val="A6323D3E"/>
@@ -17954,7 +20565,7 @@
       </w:rPr>
     </w:lvl>
   </w:abstractNum>
-  <w:abstractNum w:abstractNumId="140" w15:restartNumberingAfterBreak="0">
+  <w:abstractNum w:abstractNumId="144" w15:restartNumberingAfterBreak="0">
     <w:nsid w:val="7B4018BF"/>
     <w:multiLevelType w:val="multilevel"/>
     <w:tmpl w:val="63F4E6F0"/>
@@ -18103,7 +20714,7 @@
       </w:rPr>
     </w:lvl>
   </w:abstractNum>
-  <w:abstractNum w:abstractNumId="141" w15:restartNumberingAfterBreak="0">
+  <w:abstractNum w:abstractNumId="145" w15:restartNumberingAfterBreak="0">
     <w:nsid w:val="7B4D1B33"/>
     <w:multiLevelType w:val="hybridMultilevel"/>
     <w:tmpl w:val="5EAC717E"/>
@@ -18215,7 +20826,7 @@
       </w:rPr>
     </w:lvl>
   </w:abstractNum>
-  <w:abstractNum w:abstractNumId="142" w15:restartNumberingAfterBreak="0">
+  <w:abstractNum w:abstractNumId="146" w15:restartNumberingAfterBreak="0">
     <w:nsid w:val="7CAC27CD"/>
     <w:multiLevelType w:val="multilevel"/>
     <w:tmpl w:val="3BC20E58"/>
@@ -18364,7 +20975,7 @@
       </w:rPr>
     </w:lvl>
   </w:abstractNum>
-  <w:abstractNum w:abstractNumId="143" w15:restartNumberingAfterBreak="0">
+  <w:abstractNum w:abstractNumId="147" w15:restartNumberingAfterBreak="0">
     <w:nsid w:val="7E5978EA"/>
     <w:multiLevelType w:val="hybridMultilevel"/>
     <w:tmpl w:val="D74C0DB0"/>
@@ -18476,7 +21087,7 @@
       </w:rPr>
     </w:lvl>
   </w:abstractNum>
-  <w:abstractNum w:abstractNumId="144" w15:restartNumberingAfterBreak="0">
+  <w:abstractNum w:abstractNumId="148" w15:restartNumberingAfterBreak="0">
     <w:nsid w:val="7F106A5D"/>
     <w:multiLevelType w:val="hybridMultilevel"/>
     <w:tmpl w:val="A1CA4816"/>
@@ -18589,7 +21200,7 @@
     </w:lvl>
   </w:abstractNum>
   <w:num w:numId="1" w16cid:durableId="1882476756">
-    <w:abstractNumId w:val="83"/>
+    <w:abstractNumId w:val="86"/>
   </w:num>
   <w:num w:numId="2" w16cid:durableId="871453468">
     <w:abstractNumId w:val="22"/>
@@ -18598,73 +21209,73 @@
     <w:abstractNumId w:val="35"/>
   </w:num>
   <w:num w:numId="4" w16cid:durableId="1105467722">
-    <w:abstractNumId w:val="68"/>
+    <w:abstractNumId w:val="71"/>
   </w:num>
   <w:num w:numId="5" w16cid:durableId="769932622">
+    <w:abstractNumId w:val="100"/>
+  </w:num>
+  <w:num w:numId="6" w16cid:durableId="575944109">
+    <w:abstractNumId w:val="40"/>
+  </w:num>
+  <w:num w:numId="7" w16cid:durableId="877661689">
+    <w:abstractNumId w:val="133"/>
+  </w:num>
+  <w:num w:numId="8" w16cid:durableId="1390107422">
+    <w:abstractNumId w:val="76"/>
+  </w:num>
+  <w:num w:numId="9" w16cid:durableId="881866424">
     <w:abstractNumId w:val="97"/>
   </w:num>
-  <w:num w:numId="6" w16cid:durableId="575944109">
-    <w:abstractNumId w:val="38"/>
-  </w:num>
-  <w:num w:numId="7" w16cid:durableId="877661689">
-    <w:abstractNumId w:val="129"/>
-  </w:num>
-  <w:num w:numId="8" w16cid:durableId="1390107422">
-    <w:abstractNumId w:val="73"/>
-  </w:num>
-  <w:num w:numId="9" w16cid:durableId="881866424">
-    <w:abstractNumId w:val="94"/>
-  </w:num>
   <w:num w:numId="10" w16cid:durableId="1037244995">
-    <w:abstractNumId w:val="120"/>
+    <w:abstractNumId w:val="124"/>
   </w:num>
   <w:num w:numId="11" w16cid:durableId="1575554597">
-    <w:abstractNumId w:val="58"/>
+    <w:abstractNumId w:val="60"/>
   </w:num>
   <w:num w:numId="12" w16cid:durableId="915364478">
-    <w:abstractNumId w:val="79"/>
+    <w:abstractNumId w:val="82"/>
   </w:num>
   <w:num w:numId="13" w16cid:durableId="1386294114">
-    <w:abstractNumId w:val="112"/>
+    <w:abstractNumId w:val="116"/>
   </w:num>
   <w:num w:numId="14" w16cid:durableId="1071851223">
     <w:abstractNumId w:val="23"/>
   </w:num>
   <w:num w:numId="15" w16cid:durableId="1545557520">
-    <w:abstractNumId w:val="69"/>
+    <w:abstractNumId w:val="72"/>
   </w:num>
   <w:num w:numId="16" w16cid:durableId="1102919547">
-    <w:abstractNumId w:val="142"/>
+    <w:abstractNumId w:val="146"/>
   </w:num>
   <w:num w:numId="17" w16cid:durableId="294526838">
-    <w:abstractNumId w:val="49"/>
+    <w:abstractNumId w:val="51"/>
   </w:num>
   <w:num w:numId="18" w16cid:durableId="679889896">
-    <w:abstractNumId w:val="56"/>
+    <w:abstractNumId w:val="58"/>
   </w:num>
   <w:num w:numId="19" w16cid:durableId="2119449470">
-    <w:abstractNumId w:val="91"/>
+    <w:abstractNumId w:val="94"/>
   </w:num>
   <w:num w:numId="20" w16cid:durableId="1365054799">
     <w:abstractNumId w:val="12"/>
   </w:num>
   <w:num w:numId="21" w16cid:durableId="1683512738">
-    <w:abstractNumId w:val="57"/>
+    <w:abstractNumId w:val="59"/>
   </w:num>
   <w:num w:numId="22" w16cid:durableId="1080098953">
-    <w:abstractNumId w:val="117"/>
+    <w:abstractNumId w:val="121"/>
   </w:num>
   <w:num w:numId="23" w16cid:durableId="1635717296">
-    <w:abstractNumId w:val="62"/>
+    <w:abstractNumId w:val="65"/>
   </w:num>
   <w:num w:numId="24" w16cid:durableId="544873123">
-    <w:abstractNumId w:val="111"/>
+    <w:abstractNumId w:val="115"/>
   </w:num>
   <w:num w:numId="25" w16cid:durableId="1128352778">
     <w:abstractNumId w:val="11"/>
   </w:num>
   <w:num w:numId="26" w16cid:durableId="1732537407">
-    <w:abstractNumId w:val="124"/>
+    <w:abstractNumId w:val="128"/>
   </w:num>
   <w:num w:numId="27" w16cid:durableId="945502064">
     <w:abstractNumId w:val="5"/>
@@ -18673,61 +21284,61 @@
     <w:abstractNumId w:val="2"/>
   </w:num>
   <w:num w:numId="29" w16cid:durableId="815955639">
-    <w:abstractNumId w:val="55"/>
+    <w:abstractNumId w:val="57"/>
   </w:num>
   <w:num w:numId="30" w16cid:durableId="1500659483">
-    <w:abstractNumId w:val="76"/>
+    <w:abstractNumId w:val="79"/>
   </w:num>
   <w:num w:numId="31" w16cid:durableId="118301211">
     <w:abstractNumId w:val="13"/>
   </w:num>
   <w:num w:numId="32" w16cid:durableId="732387979">
-    <w:abstractNumId w:val="39"/>
+    <w:abstractNumId w:val="41"/>
   </w:num>
   <w:num w:numId="33" w16cid:durableId="2129276417">
     <w:abstractNumId w:val="15"/>
   </w:num>
   <w:num w:numId="34" w16cid:durableId="1470708820">
-    <w:abstractNumId w:val="44"/>
+    <w:abstractNumId w:val="46"/>
   </w:num>
   <w:num w:numId="35" w16cid:durableId="356852923">
-    <w:abstractNumId w:val="90"/>
+    <w:abstractNumId w:val="93"/>
   </w:num>
   <w:num w:numId="36" w16cid:durableId="430662559">
     <w:abstractNumId w:val="18"/>
   </w:num>
   <w:num w:numId="37" w16cid:durableId="247080868">
-    <w:abstractNumId w:val="133"/>
+    <w:abstractNumId w:val="137"/>
   </w:num>
   <w:num w:numId="38" w16cid:durableId="158887408">
-    <w:abstractNumId w:val="109"/>
+    <w:abstractNumId w:val="113"/>
   </w:num>
   <w:num w:numId="39" w16cid:durableId="1681347932">
-    <w:abstractNumId w:val="128"/>
+    <w:abstractNumId w:val="132"/>
   </w:num>
   <w:num w:numId="40" w16cid:durableId="2101440158">
-    <w:abstractNumId w:val="72"/>
+    <w:abstractNumId w:val="75"/>
   </w:num>
   <w:num w:numId="41" w16cid:durableId="1250391122">
-    <w:abstractNumId w:val="105"/>
+    <w:abstractNumId w:val="108"/>
   </w:num>
   <w:num w:numId="42" w16cid:durableId="479083359">
-    <w:abstractNumId w:val="132"/>
+    <w:abstractNumId w:val="136"/>
   </w:num>
   <w:num w:numId="43" w16cid:durableId="1557860317">
-    <w:abstractNumId w:val="92"/>
+    <w:abstractNumId w:val="95"/>
   </w:num>
   <w:num w:numId="44" w16cid:durableId="2142183763">
     <w:abstractNumId w:val="7"/>
   </w:num>
   <w:num w:numId="45" w16cid:durableId="1357736349">
-    <w:abstractNumId w:val="138"/>
+    <w:abstractNumId w:val="142"/>
   </w:num>
   <w:num w:numId="46" w16cid:durableId="1519656040">
-    <w:abstractNumId w:val="137"/>
+    <w:abstractNumId w:val="141"/>
   </w:num>
   <w:num w:numId="47" w16cid:durableId="1078596852">
-    <w:abstractNumId w:val="144"/>
+    <w:abstractNumId w:val="148"/>
   </w:num>
   <w:num w:numId="48" w16cid:durableId="1027950100">
     <w:abstractNumId w:val="32"/>
@@ -18736,22 +21347,22 @@
     <w:abstractNumId w:val="17"/>
   </w:num>
   <w:num w:numId="50" w16cid:durableId="363404927">
-    <w:abstractNumId w:val="63"/>
+    <w:abstractNumId w:val="66"/>
   </w:num>
   <w:num w:numId="51" w16cid:durableId="1128354320">
-    <w:abstractNumId w:val="122"/>
+    <w:abstractNumId w:val="126"/>
   </w:num>
   <w:num w:numId="52" w16cid:durableId="248543928">
-    <w:abstractNumId w:val="71"/>
+    <w:abstractNumId w:val="74"/>
   </w:num>
   <w:num w:numId="53" w16cid:durableId="965889214">
-    <w:abstractNumId w:val="95"/>
+    <w:abstractNumId w:val="98"/>
   </w:num>
   <w:num w:numId="54" w16cid:durableId="1827503240">
-    <w:abstractNumId w:val="103"/>
+    <w:abstractNumId w:val="106"/>
   </w:num>
   <w:num w:numId="55" w16cid:durableId="505748256">
-    <w:abstractNumId w:val="87"/>
+    <w:abstractNumId w:val="90"/>
   </w:num>
   <w:num w:numId="56" w16cid:durableId="2120370925">
     <w:abstractNumId w:val="29"/>
@@ -18760,52 +21371,52 @@
     <w:abstractNumId w:val="14"/>
   </w:num>
   <w:num w:numId="58" w16cid:durableId="1000235123">
-    <w:abstractNumId w:val="93"/>
+    <w:abstractNumId w:val="96"/>
   </w:num>
   <w:num w:numId="59" w16cid:durableId="628516409">
-    <w:abstractNumId w:val="121"/>
+    <w:abstractNumId w:val="125"/>
   </w:num>
   <w:num w:numId="60" w16cid:durableId="2028865444">
-    <w:abstractNumId w:val="85"/>
+    <w:abstractNumId w:val="88"/>
   </w:num>
   <w:num w:numId="61" w16cid:durableId="943926811">
-    <w:abstractNumId w:val="141"/>
+    <w:abstractNumId w:val="145"/>
   </w:num>
   <w:num w:numId="62" w16cid:durableId="1841193257">
-    <w:abstractNumId w:val="65"/>
+    <w:abstractNumId w:val="68"/>
   </w:num>
   <w:num w:numId="63" w16cid:durableId="682322850">
-    <w:abstractNumId w:val="125"/>
+    <w:abstractNumId w:val="129"/>
   </w:num>
   <w:num w:numId="64" w16cid:durableId="2043705333">
-    <w:abstractNumId w:val="66"/>
+    <w:abstractNumId w:val="69"/>
   </w:num>
   <w:num w:numId="65" w16cid:durableId="1164854761">
-    <w:abstractNumId w:val="48"/>
+    <w:abstractNumId w:val="50"/>
   </w:num>
   <w:num w:numId="66" w16cid:durableId="1919972541">
-    <w:abstractNumId w:val="81"/>
+    <w:abstractNumId w:val="84"/>
   </w:num>
   <w:num w:numId="67" w16cid:durableId="463617329">
-    <w:abstractNumId w:val="52"/>
+    <w:abstractNumId w:val="54"/>
   </w:num>
   <w:num w:numId="68" w16cid:durableId="2064014330">
-    <w:abstractNumId w:val="99"/>
+    <w:abstractNumId w:val="102"/>
   </w:num>
   <w:num w:numId="69" w16cid:durableId="452797354">
-    <w:abstractNumId w:val="104"/>
+    <w:abstractNumId w:val="107"/>
   </w:num>
   <w:num w:numId="70" w16cid:durableId="1196650037">
-    <w:abstractNumId w:val="43"/>
+    <w:abstractNumId w:val="45"/>
   </w:num>
   <w:num w:numId="71" w16cid:durableId="940071828">
-    <w:abstractNumId w:val="136"/>
+    <w:abstractNumId w:val="140"/>
   </w:num>
   <w:num w:numId="72" w16cid:durableId="1608273926">
-    <w:abstractNumId w:val="67"/>
+    <w:abstractNumId w:val="70"/>
   </w:num>
   <w:num w:numId="73" w16cid:durableId="2009864772">
-    <w:abstractNumId w:val="82"/>
+    <w:abstractNumId w:val="85"/>
   </w:num>
   <w:num w:numId="74" w16cid:durableId="712267004">
     <w:abstractNumId w:val="31"/>
@@ -18814,31 +21425,31 @@
     <w:abstractNumId w:val="27"/>
   </w:num>
   <w:num w:numId="76" w16cid:durableId="286202349">
-    <w:abstractNumId w:val="108"/>
+    <w:abstractNumId w:val="112"/>
   </w:num>
   <w:num w:numId="77" w16cid:durableId="156460757">
-    <w:abstractNumId w:val="59"/>
+    <w:abstractNumId w:val="61"/>
   </w:num>
   <w:num w:numId="78" w16cid:durableId="1230077056">
     <w:abstractNumId w:val="4"/>
   </w:num>
   <w:num w:numId="79" w16cid:durableId="1837106927">
-    <w:abstractNumId w:val="42"/>
+    <w:abstractNumId w:val="44"/>
   </w:num>
   <w:num w:numId="80" w16cid:durableId="287929152">
     <w:abstractNumId w:val="30"/>
   </w:num>
   <w:num w:numId="81" w16cid:durableId="1672175260">
-    <w:abstractNumId w:val="77"/>
+    <w:abstractNumId w:val="80"/>
   </w:num>
   <w:num w:numId="82" w16cid:durableId="1954820163">
-    <w:abstractNumId w:val="51"/>
+    <w:abstractNumId w:val="53"/>
   </w:num>
   <w:num w:numId="83" w16cid:durableId="1990016594">
     <w:abstractNumId w:val="20"/>
   </w:num>
   <w:num w:numId="84" w16cid:durableId="366876741">
-    <w:abstractNumId w:val="84"/>
+    <w:abstractNumId w:val="87"/>
   </w:num>
   <w:num w:numId="85" w16cid:durableId="15274915">
     <w:abstractNumId w:val="33"/>
@@ -18847,22 +21458,22 @@
     <w:abstractNumId w:val="8"/>
   </w:num>
   <w:num w:numId="87" w16cid:durableId="591351385">
-    <w:abstractNumId w:val="96"/>
+    <w:abstractNumId w:val="99"/>
   </w:num>
   <w:num w:numId="88" w16cid:durableId="1361005725">
-    <w:abstractNumId w:val="139"/>
+    <w:abstractNumId w:val="143"/>
   </w:num>
   <w:num w:numId="89" w16cid:durableId="219681743">
     <w:abstractNumId w:val="9"/>
   </w:num>
   <w:num w:numId="90" w16cid:durableId="194386594">
-    <w:abstractNumId w:val="106"/>
+    <w:abstractNumId w:val="109"/>
   </w:num>
   <w:num w:numId="91" w16cid:durableId="777793346">
-    <w:abstractNumId w:val="75"/>
+    <w:abstractNumId w:val="78"/>
   </w:num>
   <w:num w:numId="92" w16cid:durableId="173346871">
-    <w:abstractNumId w:val="80"/>
+    <w:abstractNumId w:val="83"/>
   </w:num>
   <w:num w:numId="93" w16cid:durableId="948700467">
     <w:abstractNumId w:val="34"/>
@@ -18871,94 +21482,94 @@
     <w:abstractNumId w:val="19"/>
   </w:num>
   <w:num w:numId="95" w16cid:durableId="541676570">
-    <w:abstractNumId w:val="60"/>
+    <w:abstractNumId w:val="62"/>
   </w:num>
   <w:num w:numId="96" w16cid:durableId="694119229">
-    <w:abstractNumId w:val="78"/>
+    <w:abstractNumId w:val="81"/>
   </w:num>
   <w:num w:numId="97" w16cid:durableId="704327987">
-    <w:abstractNumId w:val="46"/>
+    <w:abstractNumId w:val="48"/>
   </w:num>
   <w:num w:numId="98" w16cid:durableId="1157303613">
     <w:abstractNumId w:val="21"/>
   </w:num>
   <w:num w:numId="99" w16cid:durableId="1706099794">
-    <w:abstractNumId w:val="127"/>
+    <w:abstractNumId w:val="131"/>
   </w:num>
   <w:num w:numId="100" w16cid:durableId="256404901">
-    <w:abstractNumId w:val="126"/>
+    <w:abstractNumId w:val="130"/>
   </w:num>
   <w:num w:numId="101" w16cid:durableId="924923012">
     <w:abstractNumId w:val="25"/>
   </w:num>
   <w:num w:numId="102" w16cid:durableId="536550966">
-    <w:abstractNumId w:val="140"/>
+    <w:abstractNumId w:val="144"/>
   </w:num>
   <w:num w:numId="103" w16cid:durableId="425157302">
-    <w:abstractNumId w:val="61"/>
+    <w:abstractNumId w:val="64"/>
   </w:num>
   <w:num w:numId="104" w16cid:durableId="967664612">
-    <w:abstractNumId w:val="114"/>
+    <w:abstractNumId w:val="118"/>
   </w:num>
   <w:num w:numId="105" w16cid:durableId="361631616">
-    <w:abstractNumId w:val="86"/>
+    <w:abstractNumId w:val="89"/>
   </w:num>
   <w:num w:numId="106" w16cid:durableId="443623616">
-    <w:abstractNumId w:val="118"/>
+    <w:abstractNumId w:val="122"/>
   </w:num>
   <w:num w:numId="107" w16cid:durableId="150101619">
     <w:abstractNumId w:val="10"/>
   </w:num>
   <w:num w:numId="108" w16cid:durableId="1431658174">
-    <w:abstractNumId w:val="50"/>
+    <w:abstractNumId w:val="52"/>
   </w:num>
   <w:num w:numId="109" w16cid:durableId="1050495440">
     <w:abstractNumId w:val="0"/>
   </w:num>
   <w:num w:numId="110" w16cid:durableId="712924661">
-    <w:abstractNumId w:val="102"/>
+    <w:abstractNumId w:val="105"/>
   </w:num>
   <w:num w:numId="111" w16cid:durableId="1917784113">
-    <w:abstractNumId w:val="98"/>
+    <w:abstractNumId w:val="101"/>
   </w:num>
   <w:num w:numId="112" w16cid:durableId="896237065">
-    <w:abstractNumId w:val="107"/>
+    <w:abstractNumId w:val="110"/>
   </w:num>
   <w:num w:numId="113" w16cid:durableId="1171681430">
-    <w:abstractNumId w:val="130"/>
+    <w:abstractNumId w:val="134"/>
   </w:num>
   <w:num w:numId="114" w16cid:durableId="1552573199">
-    <w:abstractNumId w:val="131"/>
+    <w:abstractNumId w:val="135"/>
   </w:num>
   <w:num w:numId="115" w16cid:durableId="1920869674">
-    <w:abstractNumId w:val="116"/>
+    <w:abstractNumId w:val="120"/>
   </w:num>
   <w:num w:numId="116" w16cid:durableId="476724716">
-    <w:abstractNumId w:val="89"/>
+    <w:abstractNumId w:val="92"/>
   </w:num>
   <w:num w:numId="117" w16cid:durableId="658919541">
-    <w:abstractNumId w:val="88"/>
+    <w:abstractNumId w:val="91"/>
   </w:num>
   <w:num w:numId="118" w16cid:durableId="1622418131">
-    <w:abstractNumId w:val="40"/>
+    <w:abstractNumId w:val="42"/>
   </w:num>
   <w:num w:numId="119" w16cid:durableId="1693994672">
     <w:abstractNumId w:val="1"/>
   </w:num>
   <w:num w:numId="120" w16cid:durableId="396828229">
-    <w:abstractNumId w:val="135"/>
+    <w:abstractNumId w:val="139"/>
   </w:num>
   <w:num w:numId="121" w16cid:durableId="986058889">
     <w:abstractNumId w:val="16"/>
   </w:num>
   <w:num w:numId="122" w16cid:durableId="1224410703">
-    <w:abstractNumId w:val="54"/>
+    <w:abstractNumId w:val="56"/>
   </w:num>
   <w:num w:numId="123" w16cid:durableId="1804040304">
-    <w:abstractNumId w:val="74"/>
+    <w:abstractNumId w:val="77"/>
   </w:num>
   <w:num w:numId="124" w16cid:durableId="114181197">
-    <w:abstractNumId w:val="134"/>
+    <w:abstractNumId w:val="138"/>
   </w:num>
   <w:num w:numId="125" w16cid:durableId="772671624">
     <w:abstractNumId w:val="3"/>
@@ -18967,61 +21578,73 @@
     <w:abstractNumId w:val="6"/>
   </w:num>
   <w:num w:numId="127" w16cid:durableId="1818105337">
-    <w:abstractNumId w:val="45"/>
+    <w:abstractNumId w:val="47"/>
   </w:num>
   <w:num w:numId="128" w16cid:durableId="384987847">
     <w:abstractNumId w:val="26"/>
   </w:num>
   <w:num w:numId="129" w16cid:durableId="659895420">
-    <w:abstractNumId w:val="53"/>
+    <w:abstractNumId w:val="55"/>
   </w:num>
   <w:num w:numId="130" w16cid:durableId="1168907903">
-    <w:abstractNumId w:val="119"/>
+    <w:abstractNumId w:val="123"/>
   </w:num>
   <w:num w:numId="131" w16cid:durableId="430206235">
-    <w:abstractNumId w:val="110"/>
+    <w:abstractNumId w:val="114"/>
   </w:num>
   <w:num w:numId="132" w16cid:durableId="1207327089">
     <w:abstractNumId w:val="24"/>
   </w:num>
   <w:num w:numId="133" w16cid:durableId="596404292">
-    <w:abstractNumId w:val="100"/>
+    <w:abstractNumId w:val="103"/>
   </w:num>
   <w:num w:numId="134" w16cid:durableId="2070372549">
-    <w:abstractNumId w:val="37"/>
+    <w:abstractNumId w:val="39"/>
   </w:num>
   <w:num w:numId="135" w16cid:durableId="1841265039">
-    <w:abstractNumId w:val="41"/>
+    <w:abstractNumId w:val="43"/>
   </w:num>
   <w:num w:numId="136" w16cid:durableId="1988632595">
-    <w:abstractNumId w:val="36"/>
+    <w:abstractNumId w:val="38"/>
   </w:num>
   <w:num w:numId="137" w16cid:durableId="1218275126">
-    <w:abstractNumId w:val="64"/>
+    <w:abstractNumId w:val="67"/>
   </w:num>
   <w:num w:numId="138" w16cid:durableId="568660900">
-    <w:abstractNumId w:val="70"/>
+    <w:abstractNumId w:val="73"/>
   </w:num>
   <w:num w:numId="139" w16cid:durableId="967976864">
-    <w:abstractNumId w:val="101"/>
+    <w:abstractNumId w:val="104"/>
   </w:num>
   <w:num w:numId="140" w16cid:durableId="650643288">
-    <w:abstractNumId w:val="115"/>
+    <w:abstractNumId w:val="119"/>
   </w:num>
   <w:num w:numId="141" w16cid:durableId="219370247">
-    <w:abstractNumId w:val="113"/>
+    <w:abstractNumId w:val="117"/>
   </w:num>
   <w:num w:numId="142" w16cid:durableId="323239876">
-    <w:abstractNumId w:val="143"/>
+    <w:abstractNumId w:val="147"/>
   </w:num>
   <w:num w:numId="143" w16cid:durableId="1619793156">
     <w:abstractNumId w:val="28"/>
   </w:num>
   <w:num w:numId="144" w16cid:durableId="1186332867">
-    <w:abstractNumId w:val="123"/>
+    <w:abstractNumId w:val="127"/>
   </w:num>
   <w:num w:numId="145" w16cid:durableId="89937035">
-    <w:abstractNumId w:val="47"/>
+    <w:abstractNumId w:val="49"/>
+  </w:num>
+  <w:num w:numId="146" w16cid:durableId="1284070319">
+    <w:abstractNumId w:val="36"/>
+  </w:num>
+  <w:num w:numId="147" w16cid:durableId="761142609">
+    <w:abstractNumId w:val="63"/>
+  </w:num>
+  <w:num w:numId="148" w16cid:durableId="1855614070">
+    <w:abstractNumId w:val="37"/>
+  </w:num>
+  <w:num w:numId="149" w16cid:durableId="1894997680">
+    <w:abstractNumId w:val="111"/>
   </w:num>
 </w:numbering>
 </file>
@@ -19426,7 +22049,7 @@
   <w:style w:type="paragraph" w:default="1" w:styleId="Normal">
     <w:name w:val="Normal"/>
     <w:qFormat/>
-    <w:rsid w:val="008C2DBC"/>
+    <w:rsid w:val="00E45842"/>
     <w:pPr>
       <w:spacing w:line="240" w:lineRule="auto"/>
     </w:pPr>
@@ -19509,18 +22132,18 @@
     <w:uiPriority w:val="9"/>
     <w:unhideWhenUsed/>
     <w:qFormat/>
-    <w:rsid w:val="003D176F"/>
+    <w:rsid w:val="00E540C0"/>
     <w:pPr>
       <w:keepNext/>
       <w:keepLines/>
-      <w:spacing w:before="80" w:after="40"/>
+      <w:spacing w:before="80" w:after="40" w:line="360" w:lineRule="auto"/>
       <w:outlineLvl w:val="3"/>
     </w:pPr>
     <w:rPr>
       <w:rFonts w:eastAsiaTheme="majorEastAsia" w:cstheme="majorBidi"/>
-      <w:i/>
+      <w:b/>
       <w:iCs/>
-      <w:color w:val="2F5496" w:themeColor="accent1" w:themeShade="BF"/>
+      <w:color w:val="000000" w:themeColor="text1"/>
     </w:rPr>
   </w:style>
   <w:style w:type="paragraph" w:styleId="Heading5">
@@ -19635,7 +22258,6 @@
   <w:style w:type="character" w:default="1" w:styleId="DefaultParagraphFont">
     <w:name w:val="Default Paragraph Font"/>
     <w:uiPriority w:val="1"/>
-    <w:semiHidden/>
     <w:unhideWhenUsed/>
   </w:style>
   <w:style w:type="table" w:default="1" w:styleId="TableNormal">
@@ -19705,12 +22327,12 @@
     <w:basedOn w:val="DefaultParagraphFont"/>
     <w:link w:val="Heading4"/>
     <w:uiPriority w:val="9"/>
-    <w:rsid w:val="003D176F"/>
+    <w:rsid w:val="00E540C0"/>
     <w:rPr>
-      <w:rFonts w:eastAsiaTheme="majorEastAsia" w:cstheme="majorBidi"/>
-      <w:i/>
+      <w:rFonts w:ascii="Times New Roman" w:eastAsiaTheme="majorEastAsia" w:hAnsi="Times New Roman" w:cstheme="majorBidi"/>
+      <w:b/>
       <w:iCs/>
-      <w:color w:val="2F5496" w:themeColor="accent1" w:themeShade="BF"/>
+      <w:color w:val="000000" w:themeColor="text1"/>
     </w:rPr>
   </w:style>
   <w:style w:type="character" w:customStyle="1" w:styleId="Heading5Char">
@@ -20193,6 +22815,89 @@
       <w:contextualSpacing/>
     </w:pPr>
   </w:style>
+  <w:style w:type="table" w:styleId="PlainTable1">
+    <w:name w:val="Plain Table 1"/>
+    <w:basedOn w:val="TableNormal"/>
+    <w:uiPriority w:val="41"/>
+    <w:rsid w:val="00E540C0"/>
+    <w:pPr>
+      <w:spacing w:after="0" w:line="240" w:lineRule="auto"/>
+    </w:pPr>
+    <w:tblPr>
+      <w:tblStyleRowBandSize w:val="1"/>
+      <w:tblStyleColBandSize w:val="1"/>
+      <w:tblBorders>
+        <w:top w:val="single" w:sz="4" w:space="0" w:color="BFBFBF" w:themeColor="background1" w:themeShade="BF"/>
+        <w:left w:val="single" w:sz="4" w:space="0" w:color="BFBFBF" w:themeColor="background1" w:themeShade="BF"/>
+        <w:bottom w:val="single" w:sz="4" w:space="0" w:color="BFBFBF" w:themeColor="background1" w:themeShade="BF"/>
+        <w:right w:val="single" w:sz="4" w:space="0" w:color="BFBFBF" w:themeColor="background1" w:themeShade="BF"/>
+        <w:insideH w:val="single" w:sz="4" w:space="0" w:color="BFBFBF" w:themeColor="background1" w:themeShade="BF"/>
+        <w:insideV w:val="single" w:sz="4" w:space="0" w:color="BFBFBF" w:themeColor="background1" w:themeShade="BF"/>
+      </w:tblBorders>
+    </w:tblPr>
+    <w:tblStylePr w:type="firstRow">
+      <w:rPr>
+        <w:b/>
+        <w:bCs/>
+      </w:rPr>
+    </w:tblStylePr>
+    <w:tblStylePr w:type="lastRow">
+      <w:rPr>
+        <w:b/>
+        <w:bCs/>
+      </w:rPr>
+      <w:tblPr/>
+      <w:tcPr>
+        <w:tcBorders>
+          <w:top w:val="double" w:sz="4" w:space="0" w:color="BFBFBF" w:themeColor="background1" w:themeShade="BF"/>
+        </w:tcBorders>
+      </w:tcPr>
+    </w:tblStylePr>
+    <w:tblStylePr w:type="firstCol">
+      <w:rPr>
+        <w:b/>
+        <w:bCs/>
+      </w:rPr>
+    </w:tblStylePr>
+    <w:tblStylePr w:type="lastCol">
+      <w:rPr>
+        <w:b/>
+        <w:bCs/>
+      </w:rPr>
+    </w:tblStylePr>
+    <w:tblStylePr w:type="band1Vert">
+      <w:tblPr/>
+      <w:tcPr>
+        <w:shd w:val="clear" w:color="auto" w:fill="F2F2F2" w:themeFill="background1" w:themeFillShade="F2"/>
+      </w:tcPr>
+    </w:tblStylePr>
+    <w:tblStylePr w:type="band1Horz">
+      <w:tblPr/>
+      <w:tcPr>
+        <w:shd w:val="clear" w:color="auto" w:fill="F2F2F2" w:themeFill="background1" w:themeFillShade="F2"/>
+      </w:tcPr>
+    </w:tblStylePr>
+  </w:style>
+  <w:style w:type="paragraph" w:styleId="Caption">
+    <w:name w:val="caption"/>
+    <w:basedOn w:val="Normal"/>
+    <w:next w:val="Normal"/>
+    <w:uiPriority w:val="35"/>
+    <w:unhideWhenUsed/>
+    <w:qFormat/>
+    <w:rsid w:val="001A60FD"/>
+    <w:pPr>
+      <w:spacing w:after="200"/>
+      <w:jc w:val="center"/>
+    </w:pPr>
+    <w:rPr>
+      <w:i/>
+      <w:iCs/>
+      <w:color w:val="000000" w:themeColor="text1"/>
+      <w:sz w:val="20"/>
+      <w:szCs w:val="18"/>
+    </w:rPr>
+  </w:style>
 </w:styles>
 </file>
 

</xml_diff>

<commit_message>
User Journey Mapping (#419)
</commit_message>
<xml_diff>
--- a/UI UX Design Document.docx
+++ b/UI UX Design Document.docx
@@ -2083,6 +2083,2091 @@
         <w:br w:type="page"/>
       </w:r>
     </w:p>
+    <w:p>
+      <w:pPr>
+        <w:pStyle w:val="Heading3"/>
+      </w:pPr>
+      <w:r>
+        <w:lastRenderedPageBreak/>
+        <w:t>User Journey Mapping</w:t>
+      </w:r>
+    </w:p>
+    <w:p>
+      <w:r>
+        <w:t>User Journey Mapping serves as a User Experience (UX) design method aimed at illustrating the user's interaction steps required for accomplishing certain tasks on the KriGo platform. Different from user personas, which describe user types and their characteristics and goals, user journeys show the whole experience, from starting an action to completing it and reaching its intended result. This methodology allows finding user's objectives, decision-making moments, possible difficulties and ways to improve the interaction experience in general.</w:t>
+      </w:r>
+    </w:p>
+    <w:p>
+      <w:r>
+        <w:t>The main idea behind user journey mapping is to create an intuitive, effective and user-friendly process, which corresponds to the requirements of platform stakeholders. With the help of analyzing all interaction stages, the designers will be able to simplify unnecessary processes, minimize efforts and make it easy for users to switch between different pages and functions of the system. Moreover, the user journey analysis can help to detect problems and introduce the interface changes before implementation.</w:t>
+      </w:r>
+    </w:p>
+    <w:p>
+      <w:r>
+        <w:t>In case of the KriGo platform, user journeys are made for the three most significant user groups, described in the User Persona Definition section: Customers, Rental Agency Managers, and Platform Administrators. Every journey describes typical actions made by particular users and how the platform makes it possible to complete them by means of interaction process.</w:t>
+      </w:r>
+    </w:p>
+    <w:p>
+      <w:r>
+        <w:t>Further subsections will describe main user journeys for each persona and include user's goals, interaction stages, system's reactions and desired results.</w:t>
+      </w:r>
+    </w:p>
+    <w:p>
+      <w:pPr>
+        <w:spacing w:line="278" w:lineRule="auto"/>
+      </w:pPr>
+      <w:r>
+        <w:br w:type="page"/>
+      </w:r>
+    </w:p>
+    <w:p>
+      <w:pPr>
+        <w:pStyle w:val="Heading4"/>
+      </w:pPr>
+      <w:r>
+        <w:lastRenderedPageBreak/>
+        <w:t>Customer Journey</w:t>
+      </w:r>
+    </w:p>
+    <w:p>
+      <w:pPr>
+        <w:pStyle w:val="Title"/>
+      </w:pPr>
+      <w:r>
+        <w:t>Scenario</w:t>
+      </w:r>
+    </w:p>
+    <w:p>
+      <w:r>
+        <w:t>Lina Benamar is a travel and lifestyle influencer and she intends to rent a luxury car during her next content creation journey. She desires to select a suitable car fast, book the car safely, and conduct the booking using the KriGo mobile app.</w:t>
+      </w:r>
+    </w:p>
+    <w:p>
+      <w:pPr>
+        <w:pStyle w:val="Caption"/>
+        <w:keepNext/>
+        <w:jc w:val="left"/>
+      </w:pPr>
+      <w:r>
+        <w:t xml:space="preserve">Table </w:t>
+      </w:r>
+      <w:r>
+        <w:fldChar w:fldCharType="begin"/>
+      </w:r>
+      <w:r>
+        <w:instrText xml:space="preserve"> SEQ Table \* ARABIC </w:instrText>
+      </w:r>
+      <w:r>
+        <w:fldChar w:fldCharType="separate"/>
+      </w:r>
+      <w:r>
+        <w:rPr>
+          <w:noProof/>
+        </w:rPr>
+        <w:t>4</w:t>
+      </w:r>
+      <w:r>
+        <w:fldChar w:fldCharType="end"/>
+      </w:r>
+      <w:r>
+        <w:t xml:space="preserve"> - Customer Journey Mapping Table</w:t>
+      </w:r>
+    </w:p>
+    <w:tbl>
+      <w:tblPr>
+        <w:tblStyle w:val="PlainTable1"/>
+        <w:tblW w:w="0" w:type="auto"/>
+        <w:tblCellMar>
+          <w:top w:w="72" w:type="dxa"/>
+          <w:bottom w:w="72" w:type="dxa"/>
+        </w:tblCellMar>
+        <w:tblLook w:val="04A0" w:firstRow="1" w:lastRow="0" w:firstColumn="1" w:lastColumn="0" w:noHBand="0" w:noVBand="1"/>
+      </w:tblPr>
+      <w:tblGrid>
+        <w:gridCol w:w="1510"/>
+        <w:gridCol w:w="2997"/>
+        <w:gridCol w:w="2651"/>
+        <w:gridCol w:w="2189"/>
+      </w:tblGrid>
+      <w:tr>
+        <w:trPr>
+          <w:cnfStyle w:val="100000000000" w:firstRow="1" w:lastRow="0" w:firstColumn="0" w:lastColumn="0" w:oddVBand="0" w:evenVBand="0" w:oddHBand="0" w:evenHBand="0" w:firstRowFirstColumn="0" w:firstRowLastColumn="0" w:lastRowFirstColumn="0" w:lastRowLastColumn="0"/>
+        </w:trPr>
+        <w:tc>
+          <w:tcPr>
+            <w:cnfStyle w:val="001000000000" w:firstRow="0" w:lastRow="0" w:firstColumn="1" w:lastColumn="0" w:oddVBand="0" w:evenVBand="0" w:oddHBand="0" w:evenHBand="0" w:firstRowFirstColumn="0" w:firstRowLastColumn="0" w:lastRowFirstColumn="0" w:lastRowLastColumn="0"/>
+            <w:tcW w:w="1435" w:type="dxa"/>
+            <w:vAlign w:val="center"/>
+            <w:hideMark/>
+          </w:tcPr>
+          <w:p>
+            <w:r>
+              <w:t>Stage</w:t>
+            </w:r>
+          </w:p>
+        </w:tc>
+        <w:tc>
+          <w:tcPr>
+            <w:tcW w:w="2997" w:type="dxa"/>
+            <w:vAlign w:val="center"/>
+            <w:hideMark/>
+          </w:tcPr>
+          <w:p>
+            <w:pPr>
+              <w:cnfStyle w:val="100000000000" w:firstRow="1" w:lastRow="0" w:firstColumn="0" w:lastColumn="0" w:oddVBand="0" w:evenVBand="0" w:oddHBand="0" w:evenHBand="0" w:firstRowFirstColumn="0" w:firstRowLastColumn="0" w:lastRowFirstColumn="0" w:lastRowLastColumn="0"/>
+            </w:pPr>
+            <w:r>
+              <w:t>User Action</w:t>
+            </w:r>
+          </w:p>
+        </w:tc>
+        <w:tc>
+          <w:tcPr>
+            <w:tcW w:w="0" w:type="auto"/>
+            <w:vAlign w:val="center"/>
+            <w:hideMark/>
+          </w:tcPr>
+          <w:p>
+            <w:pPr>
+              <w:cnfStyle w:val="100000000000" w:firstRow="1" w:lastRow="0" w:firstColumn="0" w:lastColumn="0" w:oddVBand="0" w:evenVBand="0" w:oddHBand="0" w:evenHBand="0" w:firstRowFirstColumn="0" w:firstRowLastColumn="0" w:lastRowFirstColumn="0" w:lastRowLastColumn="0"/>
+            </w:pPr>
+            <w:r>
+              <w:t>System Response</w:t>
+            </w:r>
+          </w:p>
+        </w:tc>
+        <w:tc>
+          <w:tcPr>
+            <w:tcW w:w="0" w:type="auto"/>
+            <w:vAlign w:val="center"/>
+            <w:hideMark/>
+          </w:tcPr>
+          <w:p>
+            <w:pPr>
+              <w:cnfStyle w:val="100000000000" w:firstRow="1" w:lastRow="0" w:firstColumn="0" w:lastColumn="0" w:oddVBand="0" w:evenVBand="0" w:oddHBand="0" w:evenHBand="0" w:firstRowFirstColumn="0" w:firstRowLastColumn="0" w:lastRowFirstColumn="0" w:lastRowLastColumn="0"/>
+            </w:pPr>
+            <w:r>
+              <w:t>User Experience</w:t>
+            </w:r>
+          </w:p>
+        </w:tc>
+      </w:tr>
+      <w:tr>
+        <w:trPr>
+          <w:cnfStyle w:val="000000100000" w:firstRow="0" w:lastRow="0" w:firstColumn="0" w:lastColumn="0" w:oddVBand="0" w:evenVBand="0" w:oddHBand="1" w:evenHBand="0" w:firstRowFirstColumn="0" w:firstRowLastColumn="0" w:lastRowFirstColumn="0" w:lastRowLastColumn="0"/>
+        </w:trPr>
+        <w:tc>
+          <w:tcPr>
+            <w:cnfStyle w:val="001000000000" w:firstRow="0" w:lastRow="0" w:firstColumn="1" w:lastColumn="0" w:oddVBand="0" w:evenVBand="0" w:oddHBand="0" w:evenHBand="0" w:firstRowFirstColumn="0" w:firstRowLastColumn="0" w:lastRowFirstColumn="0" w:lastRowLastColumn="0"/>
+            <w:tcW w:w="1435" w:type="dxa"/>
+            <w:vAlign w:val="center"/>
+            <w:hideMark/>
+          </w:tcPr>
+          <w:p>
+            <w:pPr>
+              <w:rPr>
+                <w:b w:val="0"/>
+                <w:bCs w:val="0"/>
+              </w:rPr>
+            </w:pPr>
+            <w:r>
+              <w:rPr>
+                <w:b w:val="0"/>
+                <w:bCs w:val="0"/>
+              </w:rPr>
+              <w:t>Discover</w:t>
+            </w:r>
+          </w:p>
+        </w:tc>
+        <w:tc>
+          <w:tcPr>
+            <w:tcW w:w="2997" w:type="dxa"/>
+            <w:vAlign w:val="center"/>
+            <w:hideMark/>
+          </w:tcPr>
+          <w:p>
+            <w:pPr>
+              <w:cnfStyle w:val="000000100000" w:firstRow="0" w:lastRow="0" w:firstColumn="0" w:lastColumn="0" w:oddVBand="0" w:evenVBand="0" w:oddHBand="1" w:evenHBand="0" w:firstRowFirstColumn="0" w:firstRowLastColumn="0" w:lastRowFirstColumn="0" w:lastRowLastColumn="0"/>
+            </w:pPr>
+            <w:r>
+              <w:t>Opens the KriGo application</w:t>
+            </w:r>
+          </w:p>
+        </w:tc>
+        <w:tc>
+          <w:tcPr>
+            <w:tcW w:w="0" w:type="auto"/>
+            <w:vAlign w:val="center"/>
+            <w:hideMark/>
+          </w:tcPr>
+          <w:p>
+            <w:pPr>
+              <w:cnfStyle w:val="000000100000" w:firstRow="0" w:lastRow="0" w:firstColumn="0" w:lastColumn="0" w:oddVBand="0" w:evenVBand="0" w:oddHBand="1" w:evenHBand="0" w:firstRowFirstColumn="0" w:firstRowLastColumn="0" w:lastRowFirstColumn="0" w:lastRowLastColumn="0"/>
+            </w:pPr>
+            <w:r>
+              <w:t>Displays home page and search interface</w:t>
+            </w:r>
+          </w:p>
+        </w:tc>
+        <w:tc>
+          <w:tcPr>
+            <w:tcW w:w="0" w:type="auto"/>
+            <w:vAlign w:val="center"/>
+            <w:hideMark/>
+          </w:tcPr>
+          <w:p>
+            <w:pPr>
+              <w:cnfStyle w:val="000000100000" w:firstRow="0" w:lastRow="0" w:firstColumn="0" w:lastColumn="0" w:oddVBand="0" w:evenVBand="0" w:oddHBand="1" w:evenHBand="0" w:firstRowFirstColumn="0" w:firstRowLastColumn="0" w:lastRowFirstColumn="0" w:lastRowLastColumn="0"/>
+            </w:pPr>
+            <w:r>
+              <w:t>Easy access to services</w:t>
+            </w:r>
+          </w:p>
+        </w:tc>
+      </w:tr>
+      <w:tr>
+        <w:tc>
+          <w:tcPr>
+            <w:cnfStyle w:val="001000000000" w:firstRow="0" w:lastRow="0" w:firstColumn="1" w:lastColumn="0" w:oddVBand="0" w:evenVBand="0" w:oddHBand="0" w:evenHBand="0" w:firstRowFirstColumn="0" w:firstRowLastColumn="0" w:lastRowFirstColumn="0" w:lastRowLastColumn="0"/>
+            <w:tcW w:w="1435" w:type="dxa"/>
+            <w:vAlign w:val="center"/>
+            <w:hideMark/>
+          </w:tcPr>
+          <w:p>
+            <w:pPr>
+              <w:rPr>
+                <w:b w:val="0"/>
+                <w:bCs w:val="0"/>
+              </w:rPr>
+            </w:pPr>
+            <w:r>
+              <w:rPr>
+                <w:b w:val="0"/>
+                <w:bCs w:val="0"/>
+              </w:rPr>
+              <w:t>Search</w:t>
+            </w:r>
+          </w:p>
+        </w:tc>
+        <w:tc>
+          <w:tcPr>
+            <w:tcW w:w="2997" w:type="dxa"/>
+            <w:vAlign w:val="center"/>
+            <w:hideMark/>
+          </w:tcPr>
+          <w:p>
+            <w:pPr>
+              <w:cnfStyle w:val="000000000000" w:firstRow="0" w:lastRow="0" w:firstColumn="0" w:lastColumn="0" w:oddVBand="0" w:evenVBand="0" w:oddHBand="0" w:evenHBand="0" w:firstRowFirstColumn="0" w:firstRowLastColumn="0" w:lastRowFirstColumn="0" w:lastRowLastColumn="0"/>
+            </w:pPr>
+            <w:r>
+              <w:t>Searches vehicles by city and rental dates</w:t>
+            </w:r>
+          </w:p>
+        </w:tc>
+        <w:tc>
+          <w:tcPr>
+            <w:tcW w:w="0" w:type="auto"/>
+            <w:vAlign w:val="center"/>
+            <w:hideMark/>
+          </w:tcPr>
+          <w:p>
+            <w:pPr>
+              <w:cnfStyle w:val="000000000000" w:firstRow="0" w:lastRow="0" w:firstColumn="0" w:lastColumn="0" w:oddVBand="0" w:evenVBand="0" w:oddHBand="0" w:evenHBand="0" w:firstRowFirstColumn="0" w:firstRowLastColumn="0" w:lastRowFirstColumn="0" w:lastRowLastColumn="0"/>
+            </w:pPr>
+            <w:r>
+              <w:t>Displays available vehicles with filters</w:t>
+            </w:r>
+          </w:p>
+        </w:tc>
+        <w:tc>
+          <w:tcPr>
+            <w:tcW w:w="0" w:type="auto"/>
+            <w:vAlign w:val="center"/>
+            <w:hideMark/>
+          </w:tcPr>
+          <w:p>
+            <w:pPr>
+              <w:cnfStyle w:val="000000000000" w:firstRow="0" w:lastRow="0" w:firstColumn="0" w:lastColumn="0" w:oddVBand="0" w:evenVBand="0" w:oddHBand="0" w:evenHBand="0" w:firstRowFirstColumn="0" w:firstRowLastColumn="0" w:lastRowFirstColumn="0" w:lastRowLastColumn="0"/>
+            </w:pPr>
+            <w:r>
+              <w:t>Finds suitable vehicles quickly</w:t>
+            </w:r>
+          </w:p>
+        </w:tc>
+      </w:tr>
+      <w:tr>
+        <w:trPr>
+          <w:cnfStyle w:val="000000100000" w:firstRow="0" w:lastRow="0" w:firstColumn="0" w:lastColumn="0" w:oddVBand="0" w:evenVBand="0" w:oddHBand="1" w:evenHBand="0" w:firstRowFirstColumn="0" w:firstRowLastColumn="0" w:lastRowFirstColumn="0" w:lastRowLastColumn="0"/>
+        </w:trPr>
+        <w:tc>
+          <w:tcPr>
+            <w:cnfStyle w:val="001000000000" w:firstRow="0" w:lastRow="0" w:firstColumn="1" w:lastColumn="0" w:oddVBand="0" w:evenVBand="0" w:oddHBand="0" w:evenHBand="0" w:firstRowFirstColumn="0" w:firstRowLastColumn="0" w:lastRowFirstColumn="0" w:lastRowLastColumn="0"/>
+            <w:tcW w:w="1435" w:type="dxa"/>
+            <w:vAlign w:val="center"/>
+            <w:hideMark/>
+          </w:tcPr>
+          <w:p>
+            <w:pPr>
+              <w:rPr>
+                <w:b w:val="0"/>
+                <w:bCs w:val="0"/>
+              </w:rPr>
+            </w:pPr>
+            <w:r>
+              <w:rPr>
+                <w:b w:val="0"/>
+                <w:bCs w:val="0"/>
+              </w:rPr>
+              <w:t>Compare</w:t>
+            </w:r>
+          </w:p>
+        </w:tc>
+        <w:tc>
+          <w:tcPr>
+            <w:tcW w:w="2997" w:type="dxa"/>
+            <w:vAlign w:val="center"/>
+            <w:hideMark/>
+          </w:tcPr>
+          <w:p>
+            <w:pPr>
+              <w:cnfStyle w:val="000000100000" w:firstRow="0" w:lastRow="0" w:firstColumn="0" w:lastColumn="0" w:oddVBand="0" w:evenVBand="0" w:oddHBand="1" w:evenHBand="0" w:firstRowFirstColumn="0" w:firstRowLastColumn="0" w:lastRowFirstColumn="0" w:lastRowLastColumn="0"/>
+            </w:pPr>
+            <w:r>
+              <w:t>Reviews vehicle details, prices, ratings, and images</w:t>
+            </w:r>
+          </w:p>
+        </w:tc>
+        <w:tc>
+          <w:tcPr>
+            <w:tcW w:w="0" w:type="auto"/>
+            <w:vAlign w:val="center"/>
+            <w:hideMark/>
+          </w:tcPr>
+          <w:p>
+            <w:pPr>
+              <w:cnfStyle w:val="000000100000" w:firstRow="0" w:lastRow="0" w:firstColumn="0" w:lastColumn="0" w:oddVBand="0" w:evenVBand="0" w:oddHBand="1" w:evenHBand="0" w:firstRowFirstColumn="0" w:firstRowLastColumn="0" w:lastRowFirstColumn="0" w:lastRowLastColumn="0"/>
+            </w:pPr>
+            <w:r>
+              <w:t>Displays detailed vehicle information</w:t>
+            </w:r>
+          </w:p>
+        </w:tc>
+        <w:tc>
+          <w:tcPr>
+            <w:tcW w:w="0" w:type="auto"/>
+            <w:vAlign w:val="center"/>
+            <w:hideMark/>
+          </w:tcPr>
+          <w:p>
+            <w:pPr>
+              <w:cnfStyle w:val="000000100000" w:firstRow="0" w:lastRow="0" w:firstColumn="0" w:lastColumn="0" w:oddVBand="0" w:evenVBand="0" w:oddHBand="1" w:evenHBand="0" w:firstRowFirstColumn="0" w:firstRowLastColumn="0" w:lastRowFirstColumn="0" w:lastRowLastColumn="0"/>
+            </w:pPr>
+            <w:r>
+              <w:t>Makes informed decisions</w:t>
+            </w:r>
+          </w:p>
+        </w:tc>
+      </w:tr>
+      <w:tr>
+        <w:tc>
+          <w:tcPr>
+            <w:cnfStyle w:val="001000000000" w:firstRow="0" w:lastRow="0" w:firstColumn="1" w:lastColumn="0" w:oddVBand="0" w:evenVBand="0" w:oddHBand="0" w:evenHBand="0" w:firstRowFirstColumn="0" w:firstRowLastColumn="0" w:lastRowFirstColumn="0" w:lastRowLastColumn="0"/>
+            <w:tcW w:w="1435" w:type="dxa"/>
+            <w:vAlign w:val="center"/>
+            <w:hideMark/>
+          </w:tcPr>
+          <w:p>
+            <w:pPr>
+              <w:rPr>
+                <w:b w:val="0"/>
+                <w:bCs w:val="0"/>
+              </w:rPr>
+            </w:pPr>
+            <w:r>
+              <w:rPr>
+                <w:b w:val="0"/>
+                <w:bCs w:val="0"/>
+              </w:rPr>
+              <w:t>Reserve</w:t>
+            </w:r>
+          </w:p>
+        </w:tc>
+        <w:tc>
+          <w:tcPr>
+            <w:tcW w:w="2997" w:type="dxa"/>
+            <w:vAlign w:val="center"/>
+            <w:hideMark/>
+          </w:tcPr>
+          <w:p>
+            <w:pPr>
+              <w:cnfStyle w:val="000000000000" w:firstRow="0" w:lastRow="0" w:firstColumn="0" w:lastColumn="0" w:oddVBand="0" w:evenVBand="0" w:oddHBand="0" w:evenHBand="0" w:firstRowFirstColumn="0" w:firstRowLastColumn="0" w:lastRowFirstColumn="0" w:lastRowLastColumn="0"/>
+            </w:pPr>
+            <w:r>
+              <w:t>Selects a vehicle and submits reservation</w:t>
+            </w:r>
+          </w:p>
+        </w:tc>
+        <w:tc>
+          <w:tcPr>
+            <w:tcW w:w="0" w:type="auto"/>
+            <w:vAlign w:val="center"/>
+            <w:hideMark/>
+          </w:tcPr>
+          <w:p>
+            <w:pPr>
+              <w:cnfStyle w:val="000000000000" w:firstRow="0" w:lastRow="0" w:firstColumn="0" w:lastColumn="0" w:oddVBand="0" w:evenVBand="0" w:oddHBand="0" w:evenHBand="0" w:firstRowFirstColumn="0" w:firstRowLastColumn="0" w:lastRowFirstColumn="0" w:lastRowLastColumn="0"/>
+            </w:pPr>
+            <w:r>
+              <w:t>Creates reservation and redirects to payment</w:t>
+            </w:r>
+          </w:p>
+        </w:tc>
+        <w:tc>
+          <w:tcPr>
+            <w:tcW w:w="0" w:type="auto"/>
+            <w:vAlign w:val="center"/>
+            <w:hideMark/>
+          </w:tcPr>
+          <w:p>
+            <w:pPr>
+              <w:cnfStyle w:val="000000000000" w:firstRow="0" w:lastRow="0" w:firstColumn="0" w:lastColumn="0" w:oddVBand="0" w:evenVBand="0" w:oddHBand="0" w:evenHBand="0" w:firstRowFirstColumn="0" w:firstRowLastColumn="0" w:lastRowFirstColumn="0" w:lastRowLastColumn="0"/>
+            </w:pPr>
+            <w:r>
+              <w:t>Smooth booking process</w:t>
+            </w:r>
+          </w:p>
+        </w:tc>
+      </w:tr>
+      <w:tr>
+        <w:trPr>
+          <w:cnfStyle w:val="000000100000" w:firstRow="0" w:lastRow="0" w:firstColumn="0" w:lastColumn="0" w:oddVBand="0" w:evenVBand="0" w:oddHBand="1" w:evenHBand="0" w:firstRowFirstColumn="0" w:firstRowLastColumn="0" w:lastRowFirstColumn="0" w:lastRowLastColumn="0"/>
+        </w:trPr>
+        <w:tc>
+          <w:tcPr>
+            <w:cnfStyle w:val="001000000000" w:firstRow="0" w:lastRow="0" w:firstColumn="1" w:lastColumn="0" w:oddVBand="0" w:evenVBand="0" w:oddHBand="0" w:evenHBand="0" w:firstRowFirstColumn="0" w:firstRowLastColumn="0" w:lastRowFirstColumn="0" w:lastRowLastColumn="0"/>
+            <w:tcW w:w="1435" w:type="dxa"/>
+            <w:vAlign w:val="center"/>
+            <w:hideMark/>
+          </w:tcPr>
+          <w:p>
+            <w:pPr>
+              <w:rPr>
+                <w:b w:val="0"/>
+                <w:bCs w:val="0"/>
+              </w:rPr>
+            </w:pPr>
+            <w:r>
+              <w:rPr>
+                <w:b w:val="0"/>
+                <w:bCs w:val="0"/>
+              </w:rPr>
+              <w:t>Payment</w:t>
+            </w:r>
+          </w:p>
+        </w:tc>
+        <w:tc>
+          <w:tcPr>
+            <w:tcW w:w="2997" w:type="dxa"/>
+            <w:vAlign w:val="center"/>
+            <w:hideMark/>
+          </w:tcPr>
+          <w:p>
+            <w:pPr>
+              <w:cnfStyle w:val="000000100000" w:firstRow="0" w:lastRow="0" w:firstColumn="0" w:lastColumn="0" w:oddVBand="0" w:evenVBand="0" w:oddHBand="1" w:evenHBand="0" w:firstRowFirstColumn="0" w:firstRowLastColumn="0" w:lastRowFirstColumn="0" w:lastRowLastColumn="0"/>
+            </w:pPr>
+            <w:r>
+              <w:t>Completes secure online payment</w:t>
+            </w:r>
+          </w:p>
+        </w:tc>
+        <w:tc>
+          <w:tcPr>
+            <w:tcW w:w="0" w:type="auto"/>
+            <w:vAlign w:val="center"/>
+            <w:hideMark/>
+          </w:tcPr>
+          <w:p>
+            <w:pPr>
+              <w:cnfStyle w:val="000000100000" w:firstRow="0" w:lastRow="0" w:firstColumn="0" w:lastColumn="0" w:oddVBand="0" w:evenVBand="0" w:oddHBand="1" w:evenHBand="0" w:firstRowFirstColumn="0" w:firstRowLastColumn="0" w:lastRowFirstColumn="0" w:lastRowLastColumn="0"/>
+            </w:pPr>
+            <w:r>
+              <w:t>Confirms successful payment</w:t>
+            </w:r>
+          </w:p>
+        </w:tc>
+        <w:tc>
+          <w:tcPr>
+            <w:tcW w:w="0" w:type="auto"/>
+            <w:vAlign w:val="center"/>
+            <w:hideMark/>
+          </w:tcPr>
+          <w:p>
+            <w:pPr>
+              <w:cnfStyle w:val="000000100000" w:firstRow="0" w:lastRow="0" w:firstColumn="0" w:lastColumn="0" w:oddVBand="0" w:evenVBand="0" w:oddHBand="1" w:evenHBand="0" w:firstRowFirstColumn="0" w:firstRowLastColumn="0" w:lastRowFirstColumn="0" w:lastRowLastColumn="0"/>
+            </w:pPr>
+            <w:r>
+              <w:t>Feels confident and secure</w:t>
+            </w:r>
+          </w:p>
+        </w:tc>
+      </w:tr>
+      <w:tr>
+        <w:tc>
+          <w:tcPr>
+            <w:cnfStyle w:val="001000000000" w:firstRow="0" w:lastRow="0" w:firstColumn="1" w:lastColumn="0" w:oddVBand="0" w:evenVBand="0" w:oddHBand="0" w:evenHBand="0" w:firstRowFirstColumn="0" w:firstRowLastColumn="0" w:lastRowFirstColumn="0" w:lastRowLastColumn="0"/>
+            <w:tcW w:w="1435" w:type="dxa"/>
+            <w:vAlign w:val="center"/>
+            <w:hideMark/>
+          </w:tcPr>
+          <w:p>
+            <w:pPr>
+              <w:rPr>
+                <w:b w:val="0"/>
+                <w:bCs w:val="0"/>
+              </w:rPr>
+            </w:pPr>
+            <w:r>
+              <w:rPr>
+                <w:b w:val="0"/>
+                <w:bCs w:val="0"/>
+              </w:rPr>
+              <w:t>Confirmation</w:t>
+            </w:r>
+          </w:p>
+        </w:tc>
+        <w:tc>
+          <w:tcPr>
+            <w:tcW w:w="2997" w:type="dxa"/>
+            <w:vAlign w:val="center"/>
+            <w:hideMark/>
+          </w:tcPr>
+          <w:p>
+            <w:pPr>
+              <w:cnfStyle w:val="000000000000" w:firstRow="0" w:lastRow="0" w:firstColumn="0" w:lastColumn="0" w:oddVBand="0" w:evenVBand="0" w:oddHBand="0" w:evenHBand="0" w:firstRowFirstColumn="0" w:firstRowLastColumn="0" w:lastRowFirstColumn="0" w:lastRowLastColumn="0"/>
+            </w:pPr>
+            <w:r>
+              <w:t>Receives reservation confirmation</w:t>
+            </w:r>
+          </w:p>
+        </w:tc>
+        <w:tc>
+          <w:tcPr>
+            <w:tcW w:w="0" w:type="auto"/>
+            <w:vAlign w:val="center"/>
+            <w:hideMark/>
+          </w:tcPr>
+          <w:p>
+            <w:pPr>
+              <w:cnfStyle w:val="000000000000" w:firstRow="0" w:lastRow="0" w:firstColumn="0" w:lastColumn="0" w:oddVBand="0" w:evenVBand="0" w:oddHBand="0" w:evenHBand="0" w:firstRowFirstColumn="0" w:firstRowLastColumn="0" w:lastRowFirstColumn="0" w:lastRowLastColumn="0"/>
+            </w:pPr>
+            <w:r>
+              <w:t>Displays booking details and sends notification</w:t>
+            </w:r>
+          </w:p>
+        </w:tc>
+        <w:tc>
+          <w:tcPr>
+            <w:tcW w:w="0" w:type="auto"/>
+            <w:vAlign w:val="center"/>
+            <w:hideMark/>
+          </w:tcPr>
+          <w:p>
+            <w:pPr>
+              <w:cnfStyle w:val="000000000000" w:firstRow="0" w:lastRow="0" w:firstColumn="0" w:lastColumn="0" w:oddVBand="0" w:evenVBand="0" w:oddHBand="0" w:evenHBand="0" w:firstRowFirstColumn="0" w:firstRowLastColumn="0" w:lastRowFirstColumn="0" w:lastRowLastColumn="0"/>
+            </w:pPr>
+            <w:r>
+              <w:t>Immediate confirmation</w:t>
+            </w:r>
+          </w:p>
+        </w:tc>
+      </w:tr>
+      <w:tr>
+        <w:trPr>
+          <w:cnfStyle w:val="000000100000" w:firstRow="0" w:lastRow="0" w:firstColumn="0" w:lastColumn="0" w:oddVBand="0" w:evenVBand="0" w:oddHBand="1" w:evenHBand="0" w:firstRowFirstColumn="0" w:firstRowLastColumn="0" w:lastRowFirstColumn="0" w:lastRowLastColumn="0"/>
+        </w:trPr>
+        <w:tc>
+          <w:tcPr>
+            <w:cnfStyle w:val="001000000000" w:firstRow="0" w:lastRow="0" w:firstColumn="1" w:lastColumn="0" w:oddVBand="0" w:evenVBand="0" w:oddHBand="0" w:evenHBand="0" w:firstRowFirstColumn="0" w:firstRowLastColumn="0" w:lastRowFirstColumn="0" w:lastRowLastColumn="0"/>
+            <w:tcW w:w="1435" w:type="dxa"/>
+            <w:vAlign w:val="center"/>
+            <w:hideMark/>
+          </w:tcPr>
+          <w:p>
+            <w:pPr>
+              <w:rPr>
+                <w:b w:val="0"/>
+                <w:bCs w:val="0"/>
+              </w:rPr>
+            </w:pPr>
+            <w:r>
+              <w:rPr>
+                <w:b w:val="0"/>
+                <w:bCs w:val="0"/>
+              </w:rPr>
+              <w:t>Rental</w:t>
+            </w:r>
+          </w:p>
+        </w:tc>
+        <w:tc>
+          <w:tcPr>
+            <w:tcW w:w="2997" w:type="dxa"/>
+            <w:vAlign w:val="center"/>
+            <w:hideMark/>
+          </w:tcPr>
+          <w:p>
+            <w:pPr>
+              <w:cnfStyle w:val="000000100000" w:firstRow="0" w:lastRow="0" w:firstColumn="0" w:lastColumn="0" w:oddVBand="0" w:evenVBand="0" w:oddHBand="1" w:evenHBand="0" w:firstRowFirstColumn="0" w:firstRowLastColumn="0" w:lastRowFirstColumn="0" w:lastRowLastColumn="0"/>
+            </w:pPr>
+            <w:r>
+              <w:t>Picks up and uses the vehicle</w:t>
+            </w:r>
+          </w:p>
+        </w:tc>
+        <w:tc>
+          <w:tcPr>
+            <w:tcW w:w="0" w:type="auto"/>
+            <w:vAlign w:val="center"/>
+            <w:hideMark/>
+          </w:tcPr>
+          <w:p>
+            <w:pPr>
+              <w:cnfStyle w:val="000000100000" w:firstRow="0" w:lastRow="0" w:firstColumn="0" w:lastColumn="0" w:oddVBand="0" w:evenVBand="0" w:oddHBand="1" w:evenHBand="0" w:firstRowFirstColumn="0" w:firstRowLastColumn="0" w:lastRowFirstColumn="0" w:lastRowLastColumn="0"/>
+            </w:pPr>
+            <w:r>
+              <w:t>Updates reservation status</w:t>
+            </w:r>
+          </w:p>
+        </w:tc>
+        <w:tc>
+          <w:tcPr>
+            <w:tcW w:w="0" w:type="auto"/>
+            <w:vAlign w:val="center"/>
+            <w:hideMark/>
+          </w:tcPr>
+          <w:p>
+            <w:pPr>
+              <w:cnfStyle w:val="000000100000" w:firstRow="0" w:lastRow="0" w:firstColumn="0" w:lastColumn="0" w:oddVBand="0" w:evenVBand="0" w:oddHBand="1" w:evenHBand="0" w:firstRowFirstColumn="0" w:firstRowLastColumn="0" w:lastRowFirstColumn="0" w:lastRowLastColumn="0"/>
+            </w:pPr>
+            <w:r>
+              <w:t>Positive rental experience</w:t>
+            </w:r>
+          </w:p>
+        </w:tc>
+      </w:tr>
+      <w:tr>
+        <w:tc>
+          <w:tcPr>
+            <w:cnfStyle w:val="001000000000" w:firstRow="0" w:lastRow="0" w:firstColumn="1" w:lastColumn="0" w:oddVBand="0" w:evenVBand="0" w:oddHBand="0" w:evenHBand="0" w:firstRowFirstColumn="0" w:firstRowLastColumn="0" w:lastRowFirstColumn="0" w:lastRowLastColumn="0"/>
+            <w:tcW w:w="1435" w:type="dxa"/>
+            <w:vAlign w:val="center"/>
+            <w:hideMark/>
+          </w:tcPr>
+          <w:p>
+            <w:pPr>
+              <w:rPr>
+                <w:b w:val="0"/>
+                <w:bCs w:val="0"/>
+              </w:rPr>
+            </w:pPr>
+            <w:r>
+              <w:rPr>
+                <w:b w:val="0"/>
+                <w:bCs w:val="0"/>
+              </w:rPr>
+              <w:t>Review</w:t>
+            </w:r>
+          </w:p>
+        </w:tc>
+        <w:tc>
+          <w:tcPr>
+            <w:tcW w:w="2997" w:type="dxa"/>
+            <w:vAlign w:val="center"/>
+            <w:hideMark/>
+          </w:tcPr>
+          <w:p>
+            <w:pPr>
+              <w:cnfStyle w:val="000000000000" w:firstRow="0" w:lastRow="0" w:firstColumn="0" w:lastColumn="0" w:oddVBand="0" w:evenVBand="0" w:oddHBand="0" w:evenHBand="0" w:firstRowFirstColumn="0" w:firstRowLastColumn="0" w:lastRowFirstColumn="0" w:lastRowLastColumn="0"/>
+            </w:pPr>
+            <w:r>
+              <w:t>Returns vehicle and submits review</w:t>
+            </w:r>
+          </w:p>
+        </w:tc>
+        <w:tc>
+          <w:tcPr>
+            <w:tcW w:w="0" w:type="auto"/>
+            <w:vAlign w:val="center"/>
+            <w:hideMark/>
+          </w:tcPr>
+          <w:p>
+            <w:pPr>
+              <w:cnfStyle w:val="000000000000" w:firstRow="0" w:lastRow="0" w:firstColumn="0" w:lastColumn="0" w:oddVBand="0" w:evenVBand="0" w:oddHBand="0" w:evenHBand="0" w:firstRowFirstColumn="0" w:firstRowLastColumn="0" w:lastRowFirstColumn="0" w:lastRowLastColumn="0"/>
+            </w:pPr>
+            <w:r>
+              <w:t>Publishes review and updates ratings</w:t>
+            </w:r>
+          </w:p>
+        </w:tc>
+        <w:tc>
+          <w:tcPr>
+            <w:tcW w:w="0" w:type="auto"/>
+            <w:vAlign w:val="center"/>
+            <w:hideMark/>
+          </w:tcPr>
+          <w:p>
+            <w:pPr>
+              <w:cnfStyle w:val="000000000000" w:firstRow="0" w:lastRow="0" w:firstColumn="0" w:lastColumn="0" w:oddVBand="0" w:evenVBand="0" w:oddHBand="0" w:evenHBand="0" w:firstRowFirstColumn="0" w:firstRowLastColumn="0" w:lastRowFirstColumn="0" w:lastRowLastColumn="0"/>
+            </w:pPr>
+            <w:r>
+              <w:t>Shares feedback with other users</w:t>
+            </w:r>
+          </w:p>
+        </w:tc>
+      </w:tr>
+    </w:tbl>
+    <w:p>
+      <w:r>
+        <w:tab/>
+      </w:r>
+    </w:p>
+    <w:p>
+      <w:r>
+        <w:rPr>
+          <w:b/>
+          <w:bCs/>
+        </w:rPr>
+        <w:t>Journey Outcome:</w:t>
+      </w:r>
+      <w:r>
+        <w:t xml:space="preserve"> Successfully reserves a vehicle with minimal effort while receiving a transparent and reliable digital experience.</w:t>
+      </w:r>
+    </w:p>
+    <w:p>
+      <w:pPr>
+        <w:spacing w:line="278" w:lineRule="auto"/>
+      </w:pPr>
+      <w:r>
+        <w:br w:type="page"/>
+      </w:r>
+    </w:p>
+    <w:p>
+      <w:pPr>
+        <w:pStyle w:val="Heading4"/>
+      </w:pPr>
+      <w:r>
+        <w:lastRenderedPageBreak/>
+        <w:t>Rental Agency Manager Journey</w:t>
+      </w:r>
+    </w:p>
+    <w:p>
+      <w:r>
+        <w:t>Mohammed Ouali</w:t>
+      </w:r>
+      <w:r>
+        <w:t xml:space="preserve"> </w:t>
+      </w:r>
+      <w:r>
+        <w:t xml:space="preserve">starts </w:t>
+      </w:r>
+      <w:r>
+        <w:t>his</w:t>
+      </w:r>
+      <w:r>
+        <w:t xml:space="preserve"> day by analyzing reservations, managing fleet capacity and monitoring performance through the agency management dashboard.</w:t>
+      </w:r>
+    </w:p>
+    <w:p>
+      <w:pPr>
+        <w:pStyle w:val="Caption"/>
+        <w:keepNext/>
+        <w:jc w:val="left"/>
+      </w:pPr>
+      <w:r>
+        <w:t xml:space="preserve">Table </w:t>
+      </w:r>
+      <w:r>
+        <w:fldChar w:fldCharType="begin"/>
+      </w:r>
+      <w:r>
+        <w:instrText xml:space="preserve"> SEQ Table \* ARABIC </w:instrText>
+      </w:r>
+      <w:r>
+        <w:fldChar w:fldCharType="separate"/>
+      </w:r>
+      <w:r>
+        <w:rPr>
+          <w:noProof/>
+        </w:rPr>
+        <w:t>5</w:t>
+      </w:r>
+      <w:r>
+        <w:fldChar w:fldCharType="end"/>
+      </w:r>
+      <w:r>
+        <w:t xml:space="preserve"> - Rental Agency Manager Journey Mapping Table</w:t>
+      </w:r>
+    </w:p>
+    <w:tbl>
+      <w:tblPr>
+        <w:tblStyle w:val="PlainTable1"/>
+        <w:tblW w:w="0" w:type="auto"/>
+        <w:tblCellMar>
+          <w:top w:w="72" w:type="dxa"/>
+          <w:bottom w:w="72" w:type="dxa"/>
+        </w:tblCellMar>
+        <w:tblLook w:val="04A0" w:firstRow="1" w:lastRow="0" w:firstColumn="1" w:lastColumn="0" w:noHBand="0" w:noVBand="1"/>
+      </w:tblPr>
+      <w:tblGrid>
+        <w:gridCol w:w="2058"/>
+        <w:gridCol w:w="2760"/>
+        <w:gridCol w:w="2412"/>
+        <w:gridCol w:w="2117"/>
+      </w:tblGrid>
+      <w:tr>
+        <w:trPr>
+          <w:cnfStyle w:val="100000000000" w:firstRow="1" w:lastRow="0" w:firstColumn="0" w:lastColumn="0" w:oddVBand="0" w:evenVBand="0" w:oddHBand="0" w:evenHBand="0" w:firstRowFirstColumn="0" w:firstRowLastColumn="0" w:lastRowFirstColumn="0" w:lastRowLastColumn="0"/>
+        </w:trPr>
+        <w:tc>
+          <w:tcPr>
+            <w:cnfStyle w:val="001000000000" w:firstRow="0" w:lastRow="0" w:firstColumn="1" w:lastColumn="0" w:oddVBand="0" w:evenVBand="0" w:oddHBand="0" w:evenHBand="0" w:firstRowFirstColumn="0" w:firstRowLastColumn="0" w:lastRowFirstColumn="0" w:lastRowLastColumn="0"/>
+            <w:tcW w:w="0" w:type="auto"/>
+            <w:vAlign w:val="center"/>
+            <w:hideMark/>
+          </w:tcPr>
+          <w:p>
+            <w:r>
+              <w:t>Stage</w:t>
+            </w:r>
+          </w:p>
+        </w:tc>
+        <w:tc>
+          <w:tcPr>
+            <w:tcW w:w="0" w:type="auto"/>
+            <w:vAlign w:val="center"/>
+            <w:hideMark/>
+          </w:tcPr>
+          <w:p>
+            <w:pPr>
+              <w:cnfStyle w:val="100000000000" w:firstRow="1" w:lastRow="0" w:firstColumn="0" w:lastColumn="0" w:oddVBand="0" w:evenVBand="0" w:oddHBand="0" w:evenHBand="0" w:firstRowFirstColumn="0" w:firstRowLastColumn="0" w:lastRowFirstColumn="0" w:lastRowLastColumn="0"/>
+            </w:pPr>
+            <w:r>
+              <w:t>User Action</w:t>
+            </w:r>
+          </w:p>
+        </w:tc>
+        <w:tc>
+          <w:tcPr>
+            <w:tcW w:w="0" w:type="auto"/>
+            <w:vAlign w:val="center"/>
+            <w:hideMark/>
+          </w:tcPr>
+          <w:p>
+            <w:pPr>
+              <w:cnfStyle w:val="100000000000" w:firstRow="1" w:lastRow="0" w:firstColumn="0" w:lastColumn="0" w:oddVBand="0" w:evenVBand="0" w:oddHBand="0" w:evenHBand="0" w:firstRowFirstColumn="0" w:firstRowLastColumn="0" w:lastRowFirstColumn="0" w:lastRowLastColumn="0"/>
+            </w:pPr>
+            <w:r>
+              <w:t>System Response</w:t>
+            </w:r>
+          </w:p>
+        </w:tc>
+        <w:tc>
+          <w:tcPr>
+            <w:tcW w:w="0" w:type="auto"/>
+            <w:vAlign w:val="center"/>
+            <w:hideMark/>
+          </w:tcPr>
+          <w:p>
+            <w:pPr>
+              <w:cnfStyle w:val="100000000000" w:firstRow="1" w:lastRow="0" w:firstColumn="0" w:lastColumn="0" w:oddVBand="0" w:evenVBand="0" w:oddHBand="0" w:evenHBand="0" w:firstRowFirstColumn="0" w:firstRowLastColumn="0" w:lastRowFirstColumn="0" w:lastRowLastColumn="0"/>
+            </w:pPr>
+            <w:r>
+              <w:t>User Experience</w:t>
+            </w:r>
+          </w:p>
+        </w:tc>
+      </w:tr>
+      <w:tr>
+        <w:trPr>
+          <w:cnfStyle w:val="000000100000" w:firstRow="0" w:lastRow="0" w:firstColumn="0" w:lastColumn="0" w:oddVBand="0" w:evenVBand="0" w:oddHBand="1" w:evenHBand="0" w:firstRowFirstColumn="0" w:firstRowLastColumn="0" w:lastRowFirstColumn="0" w:lastRowLastColumn="0"/>
+        </w:trPr>
+        <w:tc>
+          <w:tcPr>
+            <w:cnfStyle w:val="001000000000" w:firstRow="0" w:lastRow="0" w:firstColumn="1" w:lastColumn="0" w:oddVBand="0" w:evenVBand="0" w:oddHBand="0" w:evenHBand="0" w:firstRowFirstColumn="0" w:firstRowLastColumn="0" w:lastRowFirstColumn="0" w:lastRowLastColumn="0"/>
+            <w:tcW w:w="0" w:type="auto"/>
+            <w:vAlign w:val="center"/>
+            <w:hideMark/>
+          </w:tcPr>
+          <w:p>
+            <w:pPr>
+              <w:rPr>
+                <w:b w:val="0"/>
+                <w:bCs w:val="0"/>
+              </w:rPr>
+            </w:pPr>
+            <w:r>
+              <w:rPr>
+                <w:b w:val="0"/>
+                <w:bCs w:val="0"/>
+              </w:rPr>
+              <w:t>Login</w:t>
+            </w:r>
+          </w:p>
+        </w:tc>
+        <w:tc>
+          <w:tcPr>
+            <w:tcW w:w="0" w:type="auto"/>
+            <w:vAlign w:val="center"/>
+            <w:hideMark/>
+          </w:tcPr>
+          <w:p>
+            <w:pPr>
+              <w:cnfStyle w:val="000000100000" w:firstRow="0" w:lastRow="0" w:firstColumn="0" w:lastColumn="0" w:oddVBand="0" w:evenVBand="0" w:oddHBand="1" w:evenHBand="0" w:firstRowFirstColumn="0" w:firstRowLastColumn="0" w:lastRowFirstColumn="0" w:lastRowLastColumn="0"/>
+            </w:pPr>
+            <w:r>
+              <w:t>Authenticates to the management portal</w:t>
+            </w:r>
+          </w:p>
+        </w:tc>
+        <w:tc>
+          <w:tcPr>
+            <w:tcW w:w="0" w:type="auto"/>
+            <w:vAlign w:val="center"/>
+            <w:hideMark/>
+          </w:tcPr>
+          <w:p>
+            <w:pPr>
+              <w:cnfStyle w:val="000000100000" w:firstRow="0" w:lastRow="0" w:firstColumn="0" w:lastColumn="0" w:oddVBand="0" w:evenVBand="0" w:oddHBand="1" w:evenHBand="0" w:firstRowFirstColumn="0" w:firstRowLastColumn="0" w:lastRowFirstColumn="0" w:lastRowLastColumn="0"/>
+            </w:pPr>
+            <w:r>
+              <w:t>Displays agency dashboard</w:t>
+            </w:r>
+          </w:p>
+        </w:tc>
+        <w:tc>
+          <w:tcPr>
+            <w:tcW w:w="0" w:type="auto"/>
+            <w:vAlign w:val="center"/>
+            <w:hideMark/>
+          </w:tcPr>
+          <w:p>
+            <w:pPr>
+              <w:cnfStyle w:val="000000100000" w:firstRow="0" w:lastRow="0" w:firstColumn="0" w:lastColumn="0" w:oddVBand="0" w:evenVBand="0" w:oddHBand="1" w:evenHBand="0" w:firstRowFirstColumn="0" w:firstRowLastColumn="0" w:lastRowFirstColumn="0" w:lastRowLastColumn="0"/>
+            </w:pPr>
+            <w:r>
+              <w:t>Secure access</w:t>
+            </w:r>
+          </w:p>
+        </w:tc>
+      </w:tr>
+      <w:tr>
+        <w:tc>
+          <w:tcPr>
+            <w:cnfStyle w:val="001000000000" w:firstRow="0" w:lastRow="0" w:firstColumn="1" w:lastColumn="0" w:oddVBand="0" w:evenVBand="0" w:oddHBand="0" w:evenHBand="0" w:firstRowFirstColumn="0" w:firstRowLastColumn="0" w:lastRowFirstColumn="0" w:lastRowLastColumn="0"/>
+            <w:tcW w:w="0" w:type="auto"/>
+            <w:vAlign w:val="center"/>
+            <w:hideMark/>
+          </w:tcPr>
+          <w:p>
+            <w:pPr>
+              <w:rPr>
+                <w:b w:val="0"/>
+                <w:bCs w:val="0"/>
+              </w:rPr>
+            </w:pPr>
+            <w:r>
+              <w:rPr>
+                <w:b w:val="0"/>
+                <w:bCs w:val="0"/>
+              </w:rPr>
+              <w:t>Dashboard</w:t>
+            </w:r>
+          </w:p>
+        </w:tc>
+        <w:tc>
+          <w:tcPr>
+            <w:tcW w:w="0" w:type="auto"/>
+            <w:vAlign w:val="center"/>
+            <w:hideMark/>
+          </w:tcPr>
+          <w:p>
+            <w:pPr>
+              <w:cnfStyle w:val="000000000000" w:firstRow="0" w:lastRow="0" w:firstColumn="0" w:lastColumn="0" w:oddVBand="0" w:evenVBand="0" w:oddHBand="0" w:evenHBand="0" w:firstRowFirstColumn="0" w:firstRowLastColumn="0" w:lastRowFirstColumn="0" w:lastRowLastColumn="0"/>
+            </w:pPr>
+            <w:r>
+              <w:t>Reviews daily reservation summary</w:t>
+            </w:r>
+          </w:p>
+        </w:tc>
+        <w:tc>
+          <w:tcPr>
+            <w:tcW w:w="0" w:type="auto"/>
+            <w:vAlign w:val="center"/>
+            <w:hideMark/>
+          </w:tcPr>
+          <w:p>
+            <w:pPr>
+              <w:cnfStyle w:val="000000000000" w:firstRow="0" w:lastRow="0" w:firstColumn="0" w:lastColumn="0" w:oddVBand="0" w:evenVBand="0" w:oddHBand="0" w:evenHBand="0" w:firstRowFirstColumn="0" w:firstRowLastColumn="0" w:lastRowFirstColumn="0" w:lastRowLastColumn="0"/>
+            </w:pPr>
+            <w:r>
+              <w:t>Shows KPIs and notifications</w:t>
+            </w:r>
+          </w:p>
+        </w:tc>
+        <w:tc>
+          <w:tcPr>
+            <w:tcW w:w="0" w:type="auto"/>
+            <w:vAlign w:val="center"/>
+            <w:hideMark/>
+          </w:tcPr>
+          <w:p>
+            <w:pPr>
+              <w:cnfStyle w:val="000000000000" w:firstRow="0" w:lastRow="0" w:firstColumn="0" w:lastColumn="0" w:oddVBand="0" w:evenVBand="0" w:oddHBand="0" w:evenHBand="0" w:firstRowFirstColumn="0" w:firstRowLastColumn="0" w:lastRowFirstColumn="0" w:lastRowLastColumn="0"/>
+            </w:pPr>
+            <w:r>
+              <w:t>Quick overview</w:t>
+            </w:r>
+          </w:p>
+        </w:tc>
+      </w:tr>
+      <w:tr>
+        <w:trPr>
+          <w:cnfStyle w:val="000000100000" w:firstRow="0" w:lastRow="0" w:firstColumn="0" w:lastColumn="0" w:oddVBand="0" w:evenVBand="0" w:oddHBand="1" w:evenHBand="0" w:firstRowFirstColumn="0" w:firstRowLastColumn="0" w:lastRowFirstColumn="0" w:lastRowLastColumn="0"/>
+        </w:trPr>
+        <w:tc>
+          <w:tcPr>
+            <w:cnfStyle w:val="001000000000" w:firstRow="0" w:lastRow="0" w:firstColumn="1" w:lastColumn="0" w:oddVBand="0" w:evenVBand="0" w:oddHBand="0" w:evenHBand="0" w:firstRowFirstColumn="0" w:firstRowLastColumn="0" w:lastRowFirstColumn="0" w:lastRowLastColumn="0"/>
+            <w:tcW w:w="0" w:type="auto"/>
+            <w:vAlign w:val="center"/>
+            <w:hideMark/>
+          </w:tcPr>
+          <w:p>
+            <w:pPr>
+              <w:rPr>
+                <w:b w:val="0"/>
+                <w:bCs w:val="0"/>
+              </w:rPr>
+            </w:pPr>
+            <w:r>
+              <w:rPr>
+                <w:b w:val="0"/>
+                <w:bCs w:val="0"/>
+              </w:rPr>
+              <w:t>Fleet Management</w:t>
+            </w:r>
+          </w:p>
+        </w:tc>
+        <w:tc>
+          <w:tcPr>
+            <w:tcW w:w="0" w:type="auto"/>
+            <w:vAlign w:val="center"/>
+            <w:hideMark/>
+          </w:tcPr>
+          <w:p>
+            <w:pPr>
+              <w:cnfStyle w:val="000000100000" w:firstRow="0" w:lastRow="0" w:firstColumn="0" w:lastColumn="0" w:oddVBand="0" w:evenVBand="0" w:oddHBand="1" w:evenHBand="0" w:firstRowFirstColumn="0" w:firstRowLastColumn="0" w:lastRowFirstColumn="0" w:lastRowLastColumn="0"/>
+            </w:pPr>
+            <w:r>
+              <w:t>Adds or updates vehicle information</w:t>
+            </w:r>
+          </w:p>
+        </w:tc>
+        <w:tc>
+          <w:tcPr>
+            <w:tcW w:w="0" w:type="auto"/>
+            <w:vAlign w:val="center"/>
+            <w:hideMark/>
+          </w:tcPr>
+          <w:p>
+            <w:pPr>
+              <w:cnfStyle w:val="000000100000" w:firstRow="0" w:lastRow="0" w:firstColumn="0" w:lastColumn="0" w:oddVBand="0" w:evenVBand="0" w:oddHBand="1" w:evenHBand="0" w:firstRowFirstColumn="0" w:firstRowLastColumn="0" w:lastRowFirstColumn="0" w:lastRowLastColumn="0"/>
+            </w:pPr>
+            <w:r>
+              <w:t>Saves vehicle details</w:t>
+            </w:r>
+          </w:p>
+        </w:tc>
+        <w:tc>
+          <w:tcPr>
+            <w:tcW w:w="0" w:type="auto"/>
+            <w:vAlign w:val="center"/>
+            <w:hideMark/>
+          </w:tcPr>
+          <w:p>
+            <w:pPr>
+              <w:cnfStyle w:val="000000100000" w:firstRow="0" w:lastRow="0" w:firstColumn="0" w:lastColumn="0" w:oddVBand="0" w:evenVBand="0" w:oddHBand="1" w:evenHBand="0" w:firstRowFirstColumn="0" w:firstRowLastColumn="0" w:lastRowFirstColumn="0" w:lastRowLastColumn="0"/>
+            </w:pPr>
+            <w:r>
+              <w:t>Efficient fleet management</w:t>
+            </w:r>
+          </w:p>
+        </w:tc>
+      </w:tr>
+      <w:tr>
+        <w:tc>
+          <w:tcPr>
+            <w:cnfStyle w:val="001000000000" w:firstRow="0" w:lastRow="0" w:firstColumn="1" w:lastColumn="0" w:oddVBand="0" w:evenVBand="0" w:oddHBand="0" w:evenHBand="0" w:firstRowFirstColumn="0" w:firstRowLastColumn="0" w:lastRowFirstColumn="0" w:lastRowLastColumn="0"/>
+            <w:tcW w:w="0" w:type="auto"/>
+            <w:vAlign w:val="center"/>
+            <w:hideMark/>
+          </w:tcPr>
+          <w:p>
+            <w:pPr>
+              <w:rPr>
+                <w:b w:val="0"/>
+                <w:bCs w:val="0"/>
+              </w:rPr>
+            </w:pPr>
+            <w:r>
+              <w:rPr>
+                <w:b w:val="0"/>
+                <w:bCs w:val="0"/>
+              </w:rPr>
+              <w:t>Reservation Management</w:t>
+            </w:r>
+          </w:p>
+        </w:tc>
+        <w:tc>
+          <w:tcPr>
+            <w:tcW w:w="0" w:type="auto"/>
+            <w:vAlign w:val="center"/>
+            <w:hideMark/>
+          </w:tcPr>
+          <w:p>
+            <w:pPr>
+              <w:cnfStyle w:val="000000000000" w:firstRow="0" w:lastRow="0" w:firstColumn="0" w:lastColumn="0" w:oddVBand="0" w:evenVBand="0" w:oddHBand="0" w:evenHBand="0" w:firstRowFirstColumn="0" w:firstRowLastColumn="0" w:lastRowFirstColumn="0" w:lastRowLastColumn="0"/>
+            </w:pPr>
+            <w:r>
+              <w:t>Reviews new reservations</w:t>
+            </w:r>
+          </w:p>
+        </w:tc>
+        <w:tc>
+          <w:tcPr>
+            <w:tcW w:w="0" w:type="auto"/>
+            <w:vAlign w:val="center"/>
+            <w:hideMark/>
+          </w:tcPr>
+          <w:p>
+            <w:pPr>
+              <w:cnfStyle w:val="000000000000" w:firstRow="0" w:lastRow="0" w:firstColumn="0" w:lastColumn="0" w:oddVBand="0" w:evenVBand="0" w:oddHBand="0" w:evenHBand="0" w:firstRowFirstColumn="0" w:firstRowLastColumn="0" w:lastRowFirstColumn="0" w:lastRowLastColumn="0"/>
+            </w:pPr>
+            <w:r>
+              <w:t>Updates reservation status</w:t>
+            </w:r>
+          </w:p>
+        </w:tc>
+        <w:tc>
+          <w:tcPr>
+            <w:tcW w:w="0" w:type="auto"/>
+            <w:vAlign w:val="center"/>
+            <w:hideMark/>
+          </w:tcPr>
+          <w:p>
+            <w:pPr>
+              <w:cnfStyle w:val="000000000000" w:firstRow="0" w:lastRow="0" w:firstColumn="0" w:lastColumn="0" w:oddVBand="0" w:evenVBand="0" w:oddHBand="0" w:evenHBand="0" w:firstRowFirstColumn="0" w:firstRowLastColumn="0" w:lastRowFirstColumn="0" w:lastRowLastColumn="0"/>
+            </w:pPr>
+            <w:r>
+              <w:t>Simplified operations</w:t>
+            </w:r>
+          </w:p>
+        </w:tc>
+      </w:tr>
+      <w:tr>
+        <w:trPr>
+          <w:cnfStyle w:val="000000100000" w:firstRow="0" w:lastRow="0" w:firstColumn="0" w:lastColumn="0" w:oddVBand="0" w:evenVBand="0" w:oddHBand="1" w:evenHBand="0" w:firstRowFirstColumn="0" w:firstRowLastColumn="0" w:lastRowFirstColumn="0" w:lastRowLastColumn="0"/>
+        </w:trPr>
+        <w:tc>
+          <w:tcPr>
+            <w:cnfStyle w:val="001000000000" w:firstRow="0" w:lastRow="0" w:firstColumn="1" w:lastColumn="0" w:oddVBand="0" w:evenVBand="0" w:oddHBand="0" w:evenHBand="0" w:firstRowFirstColumn="0" w:firstRowLastColumn="0" w:lastRowFirstColumn="0" w:lastRowLastColumn="0"/>
+            <w:tcW w:w="0" w:type="auto"/>
+            <w:vAlign w:val="center"/>
+            <w:hideMark/>
+          </w:tcPr>
+          <w:p>
+            <w:pPr>
+              <w:rPr>
+                <w:b w:val="0"/>
+                <w:bCs w:val="0"/>
+              </w:rPr>
+            </w:pPr>
+            <w:r>
+              <w:rPr>
+                <w:b w:val="0"/>
+                <w:bCs w:val="0"/>
+              </w:rPr>
+              <w:t>Employee Management</w:t>
+            </w:r>
+          </w:p>
+        </w:tc>
+        <w:tc>
+          <w:tcPr>
+            <w:tcW w:w="0" w:type="auto"/>
+            <w:vAlign w:val="center"/>
+            <w:hideMark/>
+          </w:tcPr>
+          <w:p>
+            <w:pPr>
+              <w:cnfStyle w:val="000000100000" w:firstRow="0" w:lastRow="0" w:firstColumn="0" w:lastColumn="0" w:oddVBand="0" w:evenVBand="0" w:oddHBand="1" w:evenHBand="0" w:firstRowFirstColumn="0" w:firstRowLastColumn="0" w:lastRowFirstColumn="0" w:lastRowLastColumn="0"/>
+            </w:pPr>
+            <w:r>
+              <w:t>Assigns tasks to employees</w:t>
+            </w:r>
+          </w:p>
+        </w:tc>
+        <w:tc>
+          <w:tcPr>
+            <w:tcW w:w="0" w:type="auto"/>
+            <w:vAlign w:val="center"/>
+            <w:hideMark/>
+          </w:tcPr>
+          <w:p>
+            <w:pPr>
+              <w:cnfStyle w:val="000000100000" w:firstRow="0" w:lastRow="0" w:firstColumn="0" w:lastColumn="0" w:oddVBand="0" w:evenVBand="0" w:oddHBand="1" w:evenHBand="0" w:firstRowFirstColumn="0" w:firstRowLastColumn="0" w:lastRowFirstColumn="0" w:lastRowLastColumn="0"/>
+            </w:pPr>
+            <w:r>
+              <w:t>Updates employee schedules</w:t>
+            </w:r>
+          </w:p>
+        </w:tc>
+        <w:tc>
+          <w:tcPr>
+            <w:tcW w:w="0" w:type="auto"/>
+            <w:vAlign w:val="center"/>
+            <w:hideMark/>
+          </w:tcPr>
+          <w:p>
+            <w:pPr>
+              <w:cnfStyle w:val="000000100000" w:firstRow="0" w:lastRow="0" w:firstColumn="0" w:lastColumn="0" w:oddVBand="0" w:evenVBand="0" w:oddHBand="1" w:evenHBand="0" w:firstRowFirstColumn="0" w:firstRowLastColumn="0" w:lastRowFirstColumn="0" w:lastRowLastColumn="0"/>
+            </w:pPr>
+            <w:r>
+              <w:t>Better coordination</w:t>
+            </w:r>
+          </w:p>
+        </w:tc>
+      </w:tr>
+      <w:tr>
+        <w:tc>
+          <w:tcPr>
+            <w:cnfStyle w:val="001000000000" w:firstRow="0" w:lastRow="0" w:firstColumn="1" w:lastColumn="0" w:oddVBand="0" w:evenVBand="0" w:oddHBand="0" w:evenHBand="0" w:firstRowFirstColumn="0" w:firstRowLastColumn="0" w:lastRowFirstColumn="0" w:lastRowLastColumn="0"/>
+            <w:tcW w:w="0" w:type="auto"/>
+            <w:vAlign w:val="center"/>
+            <w:hideMark/>
+          </w:tcPr>
+          <w:p>
+            <w:pPr>
+              <w:rPr>
+                <w:b w:val="0"/>
+                <w:bCs w:val="0"/>
+              </w:rPr>
+            </w:pPr>
+            <w:r>
+              <w:rPr>
+                <w:b w:val="0"/>
+                <w:bCs w:val="0"/>
+              </w:rPr>
+              <w:t>Reporting</w:t>
+            </w:r>
+          </w:p>
+        </w:tc>
+        <w:tc>
+          <w:tcPr>
+            <w:tcW w:w="0" w:type="auto"/>
+            <w:vAlign w:val="center"/>
+            <w:hideMark/>
+          </w:tcPr>
+          <w:p>
+            <w:pPr>
+              <w:cnfStyle w:val="000000000000" w:firstRow="0" w:lastRow="0" w:firstColumn="0" w:lastColumn="0" w:oddVBand="0" w:evenVBand="0" w:oddHBand="0" w:evenHBand="0" w:firstRowFirstColumn="0" w:firstRowLastColumn="0" w:lastRowFirstColumn="0" w:lastRowLastColumn="0"/>
+            </w:pPr>
+            <w:r>
+              <w:t>Views business reports and analytics</w:t>
+            </w:r>
+          </w:p>
+        </w:tc>
+        <w:tc>
+          <w:tcPr>
+            <w:tcW w:w="0" w:type="auto"/>
+            <w:vAlign w:val="center"/>
+            <w:hideMark/>
+          </w:tcPr>
+          <w:p>
+            <w:pPr>
+              <w:cnfStyle w:val="000000000000" w:firstRow="0" w:lastRow="0" w:firstColumn="0" w:lastColumn="0" w:oddVBand="0" w:evenVBand="0" w:oddHBand="0" w:evenHBand="0" w:firstRowFirstColumn="0" w:firstRowLastColumn="0" w:lastRowFirstColumn="0" w:lastRowLastColumn="0"/>
+            </w:pPr>
+            <w:r>
+              <w:t>Generates operational reports</w:t>
+            </w:r>
+          </w:p>
+        </w:tc>
+        <w:tc>
+          <w:tcPr>
+            <w:tcW w:w="0" w:type="auto"/>
+            <w:vAlign w:val="center"/>
+            <w:hideMark/>
+          </w:tcPr>
+          <w:p>
+            <w:pPr>
+              <w:cnfStyle w:val="000000000000" w:firstRow="0" w:lastRow="0" w:firstColumn="0" w:lastColumn="0" w:oddVBand="0" w:evenVBand="0" w:oddHBand="0" w:evenHBand="0" w:firstRowFirstColumn="0" w:firstRowLastColumn="0" w:lastRowFirstColumn="0" w:lastRowLastColumn="0"/>
+            </w:pPr>
+            <w:r>
+              <w:t>Supports decision making</w:t>
+            </w:r>
+          </w:p>
+        </w:tc>
+      </w:tr>
+      <w:tr>
+        <w:trPr>
+          <w:cnfStyle w:val="000000100000" w:firstRow="0" w:lastRow="0" w:firstColumn="0" w:lastColumn="0" w:oddVBand="0" w:evenVBand="0" w:oddHBand="1" w:evenHBand="0" w:firstRowFirstColumn="0" w:firstRowLastColumn="0" w:lastRowFirstColumn="0" w:lastRowLastColumn="0"/>
+        </w:trPr>
+        <w:tc>
+          <w:tcPr>
+            <w:cnfStyle w:val="001000000000" w:firstRow="0" w:lastRow="0" w:firstColumn="1" w:lastColumn="0" w:oddVBand="0" w:evenVBand="0" w:oddHBand="0" w:evenHBand="0" w:firstRowFirstColumn="0" w:firstRowLastColumn="0" w:lastRowFirstColumn="0" w:lastRowLastColumn="0"/>
+            <w:tcW w:w="0" w:type="auto"/>
+            <w:vAlign w:val="center"/>
+            <w:hideMark/>
+          </w:tcPr>
+          <w:p>
+            <w:pPr>
+              <w:rPr>
+                <w:b w:val="0"/>
+                <w:bCs w:val="0"/>
+              </w:rPr>
+            </w:pPr>
+            <w:r>
+              <w:rPr>
+                <w:b w:val="0"/>
+                <w:bCs w:val="0"/>
+              </w:rPr>
+              <w:t>Logout</w:t>
+            </w:r>
+          </w:p>
+        </w:tc>
+        <w:tc>
+          <w:tcPr>
+            <w:tcW w:w="0" w:type="auto"/>
+            <w:vAlign w:val="center"/>
+            <w:hideMark/>
+          </w:tcPr>
+          <w:p>
+            <w:pPr>
+              <w:cnfStyle w:val="000000100000" w:firstRow="0" w:lastRow="0" w:firstColumn="0" w:lastColumn="0" w:oddVBand="0" w:evenVBand="0" w:oddHBand="1" w:evenHBand="0" w:firstRowFirstColumn="0" w:firstRowLastColumn="0" w:lastRowFirstColumn="0" w:lastRowLastColumn="0"/>
+            </w:pPr>
+            <w:r>
+              <w:t>Ends session</w:t>
+            </w:r>
+          </w:p>
+        </w:tc>
+        <w:tc>
+          <w:tcPr>
+            <w:tcW w:w="0" w:type="auto"/>
+            <w:vAlign w:val="center"/>
+            <w:hideMark/>
+          </w:tcPr>
+          <w:p>
+            <w:pPr>
+              <w:cnfStyle w:val="000000100000" w:firstRow="0" w:lastRow="0" w:firstColumn="0" w:lastColumn="0" w:oddVBand="0" w:evenVBand="0" w:oddHBand="1" w:evenHBand="0" w:firstRowFirstColumn="0" w:firstRowLastColumn="0" w:lastRowFirstColumn="0" w:lastRowLastColumn="0"/>
+            </w:pPr>
+            <w:r>
+              <w:t>Terminates authenticated session</w:t>
+            </w:r>
+          </w:p>
+        </w:tc>
+        <w:tc>
+          <w:tcPr>
+            <w:tcW w:w="0" w:type="auto"/>
+            <w:vAlign w:val="center"/>
+            <w:hideMark/>
+          </w:tcPr>
+          <w:p>
+            <w:pPr>
+              <w:cnfStyle w:val="000000100000" w:firstRow="0" w:lastRow="0" w:firstColumn="0" w:lastColumn="0" w:oddVBand="0" w:evenVBand="0" w:oddHBand="1" w:evenHBand="0" w:firstRowFirstColumn="0" w:firstRowLastColumn="0" w:lastRowFirstColumn="0" w:lastRowLastColumn="0"/>
+            </w:pPr>
+            <w:r>
+              <w:t>Secure completion</w:t>
+            </w:r>
+          </w:p>
+        </w:tc>
+      </w:tr>
+    </w:tbl>
+    <w:p/>
+    <w:p>
+      <w:r>
+        <w:rPr>
+          <w:b/>
+          <w:bCs/>
+        </w:rPr>
+        <w:t>Outcome of Journey</w:t>
+      </w:r>
+      <w:r>
+        <w:t>: Effective management of agency processes through the use of a central dashboard that gives real time data.</w:t>
+      </w:r>
+    </w:p>
+    <w:p>
+      <w:pPr>
+        <w:spacing w:line="278" w:lineRule="auto"/>
+      </w:pPr>
+      <w:r>
+        <w:br w:type="page"/>
+      </w:r>
+    </w:p>
+    <w:p>
+      <w:pPr>
+        <w:pStyle w:val="Heading4"/>
+      </w:pPr>
+      <w:r>
+        <w:lastRenderedPageBreak/>
+        <w:t>Platform Administrator Journey</w:t>
+      </w:r>
+    </w:p>
+    <w:p>
+      <w:r>
+        <w:t>Youcef Boucine</w:t>
+      </w:r>
+      <w:r>
+        <w:t xml:space="preserve"> </w:t>
+      </w:r>
+      <w:r>
+        <w:t>manages platform processes, verifies new agencies, manages disputes and ensures the security of the KriGo platform</w:t>
+      </w:r>
+      <w:r>
+        <w:tab/>
+      </w:r>
+    </w:p>
+    <w:p>
+      <w:pPr>
+        <w:pStyle w:val="Caption"/>
+        <w:keepNext/>
+        <w:jc w:val="left"/>
+      </w:pPr>
+      <w:r>
+        <w:t xml:space="preserve">Table </w:t>
+      </w:r>
+      <w:r>
+        <w:fldChar w:fldCharType="begin"/>
+      </w:r>
+      <w:r>
+        <w:instrText xml:space="preserve"> SEQ Table \* ARABIC </w:instrText>
+      </w:r>
+      <w:r>
+        <w:fldChar w:fldCharType="separate"/>
+      </w:r>
+      <w:r>
+        <w:rPr>
+          <w:noProof/>
+        </w:rPr>
+        <w:t>6</w:t>
+      </w:r>
+      <w:r>
+        <w:fldChar w:fldCharType="end"/>
+      </w:r>
+      <w:r>
+        <w:t xml:space="preserve"> - Platform Administrator Journey Mapping Table</w:t>
+      </w:r>
+    </w:p>
+    <w:tbl>
+      <w:tblPr>
+        <w:tblStyle w:val="PlainTable1"/>
+        <w:tblW w:w="0" w:type="auto"/>
+        <w:tblCellMar>
+          <w:top w:w="72" w:type="dxa"/>
+          <w:bottom w:w="72" w:type="dxa"/>
+        </w:tblCellMar>
+        <w:tblLook w:val="04A0" w:firstRow="1" w:lastRow="0" w:firstColumn="1" w:lastColumn="0" w:noHBand="0" w:noVBand="1"/>
+      </w:tblPr>
+      <w:tblGrid>
+        <w:gridCol w:w="1656"/>
+        <w:gridCol w:w="2862"/>
+        <w:gridCol w:w="2425"/>
+        <w:gridCol w:w="2404"/>
+      </w:tblGrid>
+      <w:tr>
+        <w:trPr>
+          <w:cnfStyle w:val="100000000000" w:firstRow="1" w:lastRow="0" w:firstColumn="0" w:lastColumn="0" w:oddVBand="0" w:evenVBand="0" w:oddHBand="0" w:evenHBand="0" w:firstRowFirstColumn="0" w:firstRowLastColumn="0" w:lastRowFirstColumn="0" w:lastRowLastColumn="0"/>
+        </w:trPr>
+        <w:tc>
+          <w:tcPr>
+            <w:cnfStyle w:val="001000000000" w:firstRow="0" w:lastRow="0" w:firstColumn="1" w:lastColumn="0" w:oddVBand="0" w:evenVBand="0" w:oddHBand="0" w:evenHBand="0" w:firstRowFirstColumn="0" w:firstRowLastColumn="0" w:lastRowFirstColumn="0" w:lastRowLastColumn="0"/>
+            <w:tcW w:w="0" w:type="auto"/>
+            <w:vAlign w:val="center"/>
+            <w:hideMark/>
+          </w:tcPr>
+          <w:p>
+            <w:r>
+              <w:t>Stage</w:t>
+            </w:r>
+          </w:p>
+        </w:tc>
+        <w:tc>
+          <w:tcPr>
+            <w:tcW w:w="0" w:type="auto"/>
+            <w:vAlign w:val="center"/>
+            <w:hideMark/>
+          </w:tcPr>
+          <w:p>
+            <w:pPr>
+              <w:cnfStyle w:val="100000000000" w:firstRow="1" w:lastRow="0" w:firstColumn="0" w:lastColumn="0" w:oddVBand="0" w:evenVBand="0" w:oddHBand="0" w:evenHBand="0" w:firstRowFirstColumn="0" w:firstRowLastColumn="0" w:lastRowFirstColumn="0" w:lastRowLastColumn="0"/>
+            </w:pPr>
+            <w:r>
+              <w:t>User Action</w:t>
+            </w:r>
+          </w:p>
+        </w:tc>
+        <w:tc>
+          <w:tcPr>
+            <w:tcW w:w="0" w:type="auto"/>
+            <w:vAlign w:val="center"/>
+            <w:hideMark/>
+          </w:tcPr>
+          <w:p>
+            <w:pPr>
+              <w:cnfStyle w:val="100000000000" w:firstRow="1" w:lastRow="0" w:firstColumn="0" w:lastColumn="0" w:oddVBand="0" w:evenVBand="0" w:oddHBand="0" w:evenHBand="0" w:firstRowFirstColumn="0" w:firstRowLastColumn="0" w:lastRowFirstColumn="0" w:lastRowLastColumn="0"/>
+            </w:pPr>
+            <w:r>
+              <w:t>System Response</w:t>
+            </w:r>
+          </w:p>
+        </w:tc>
+        <w:tc>
+          <w:tcPr>
+            <w:tcW w:w="0" w:type="auto"/>
+            <w:vAlign w:val="center"/>
+            <w:hideMark/>
+          </w:tcPr>
+          <w:p>
+            <w:pPr>
+              <w:cnfStyle w:val="100000000000" w:firstRow="1" w:lastRow="0" w:firstColumn="0" w:lastColumn="0" w:oddVBand="0" w:evenVBand="0" w:oddHBand="0" w:evenHBand="0" w:firstRowFirstColumn="0" w:firstRowLastColumn="0" w:lastRowFirstColumn="0" w:lastRowLastColumn="0"/>
+            </w:pPr>
+            <w:r>
+              <w:t>User Experience</w:t>
+            </w:r>
+          </w:p>
+        </w:tc>
+      </w:tr>
+      <w:tr>
+        <w:trPr>
+          <w:cnfStyle w:val="000000100000" w:firstRow="0" w:lastRow="0" w:firstColumn="0" w:lastColumn="0" w:oddVBand="0" w:evenVBand="0" w:oddHBand="1" w:evenHBand="0" w:firstRowFirstColumn="0" w:firstRowLastColumn="0" w:lastRowFirstColumn="0" w:lastRowLastColumn="0"/>
+        </w:trPr>
+        <w:tc>
+          <w:tcPr>
+            <w:cnfStyle w:val="001000000000" w:firstRow="0" w:lastRow="0" w:firstColumn="1" w:lastColumn="0" w:oddVBand="0" w:evenVBand="0" w:oddHBand="0" w:evenHBand="0" w:firstRowFirstColumn="0" w:firstRowLastColumn="0" w:lastRowFirstColumn="0" w:lastRowLastColumn="0"/>
+            <w:tcW w:w="0" w:type="auto"/>
+            <w:vAlign w:val="center"/>
+            <w:hideMark/>
+          </w:tcPr>
+          <w:p>
+            <w:pPr>
+              <w:rPr>
+                <w:b w:val="0"/>
+                <w:bCs w:val="0"/>
+              </w:rPr>
+            </w:pPr>
+            <w:r>
+              <w:rPr>
+                <w:b w:val="0"/>
+                <w:bCs w:val="0"/>
+              </w:rPr>
+              <w:t>Login</w:t>
+            </w:r>
+          </w:p>
+        </w:tc>
+        <w:tc>
+          <w:tcPr>
+            <w:tcW w:w="0" w:type="auto"/>
+            <w:vAlign w:val="center"/>
+            <w:hideMark/>
+          </w:tcPr>
+          <w:p>
+            <w:pPr>
+              <w:cnfStyle w:val="000000100000" w:firstRow="0" w:lastRow="0" w:firstColumn="0" w:lastColumn="0" w:oddVBand="0" w:evenVBand="0" w:oddHBand="1" w:evenHBand="0" w:firstRowFirstColumn="0" w:firstRowLastColumn="0" w:lastRowFirstColumn="0" w:lastRowLastColumn="0"/>
+            </w:pPr>
+            <w:r>
+              <w:t>Authenticates using administrator credentials</w:t>
+            </w:r>
+          </w:p>
+        </w:tc>
+        <w:tc>
+          <w:tcPr>
+            <w:tcW w:w="0" w:type="auto"/>
+            <w:vAlign w:val="center"/>
+            <w:hideMark/>
+          </w:tcPr>
+          <w:p>
+            <w:pPr>
+              <w:cnfStyle w:val="000000100000" w:firstRow="0" w:lastRow="0" w:firstColumn="0" w:lastColumn="0" w:oddVBand="0" w:evenVBand="0" w:oddHBand="1" w:evenHBand="0" w:firstRowFirstColumn="0" w:firstRowLastColumn="0" w:lastRowFirstColumn="0" w:lastRowLastColumn="0"/>
+            </w:pPr>
+            <w:r>
+              <w:t>Displays administrative dashboard</w:t>
+            </w:r>
+          </w:p>
+        </w:tc>
+        <w:tc>
+          <w:tcPr>
+            <w:tcW w:w="0" w:type="auto"/>
+            <w:vAlign w:val="center"/>
+            <w:hideMark/>
+          </w:tcPr>
+          <w:p>
+            <w:pPr>
+              <w:cnfStyle w:val="000000100000" w:firstRow="0" w:lastRow="0" w:firstColumn="0" w:lastColumn="0" w:oddVBand="0" w:evenVBand="0" w:oddHBand="1" w:evenHBand="0" w:firstRowFirstColumn="0" w:firstRowLastColumn="0" w:lastRowFirstColumn="0" w:lastRowLastColumn="0"/>
+            </w:pPr>
+            <w:r>
+              <w:t>Secure platform access</w:t>
+            </w:r>
+          </w:p>
+        </w:tc>
+      </w:tr>
+      <w:tr>
+        <w:tc>
+          <w:tcPr>
+            <w:cnfStyle w:val="001000000000" w:firstRow="0" w:lastRow="0" w:firstColumn="1" w:lastColumn="0" w:oddVBand="0" w:evenVBand="0" w:oddHBand="0" w:evenHBand="0" w:firstRowFirstColumn="0" w:firstRowLastColumn="0" w:lastRowFirstColumn="0" w:lastRowLastColumn="0"/>
+            <w:tcW w:w="0" w:type="auto"/>
+            <w:vAlign w:val="center"/>
+            <w:hideMark/>
+          </w:tcPr>
+          <w:p>
+            <w:pPr>
+              <w:rPr>
+                <w:b w:val="0"/>
+                <w:bCs w:val="0"/>
+              </w:rPr>
+            </w:pPr>
+            <w:r>
+              <w:rPr>
+                <w:b w:val="0"/>
+                <w:bCs w:val="0"/>
+              </w:rPr>
+              <w:t>Monitoring</w:t>
+            </w:r>
+          </w:p>
+        </w:tc>
+        <w:tc>
+          <w:tcPr>
+            <w:tcW w:w="0" w:type="auto"/>
+            <w:vAlign w:val="center"/>
+            <w:hideMark/>
+          </w:tcPr>
+          <w:p>
+            <w:pPr>
+              <w:cnfStyle w:val="000000000000" w:firstRow="0" w:lastRow="0" w:firstColumn="0" w:lastColumn="0" w:oddVBand="0" w:evenVBand="0" w:oddHBand="0" w:evenHBand="0" w:firstRowFirstColumn="0" w:firstRowLastColumn="0" w:lastRowFirstColumn="0" w:lastRowLastColumn="0"/>
+            </w:pPr>
+            <w:r>
+              <w:t>Reviews platform statistics and alerts</w:t>
+            </w:r>
+          </w:p>
+        </w:tc>
+        <w:tc>
+          <w:tcPr>
+            <w:tcW w:w="0" w:type="auto"/>
+            <w:vAlign w:val="center"/>
+            <w:hideMark/>
+          </w:tcPr>
+          <w:p>
+            <w:pPr>
+              <w:cnfStyle w:val="000000000000" w:firstRow="0" w:lastRow="0" w:firstColumn="0" w:lastColumn="0" w:oddVBand="0" w:evenVBand="0" w:oddHBand="0" w:evenHBand="0" w:firstRowFirstColumn="0" w:firstRowLastColumn="0" w:lastRowFirstColumn="0" w:lastRowLastColumn="0"/>
+            </w:pPr>
+            <w:r>
+              <w:t>Displays system analytics</w:t>
+            </w:r>
+          </w:p>
+        </w:tc>
+        <w:tc>
+          <w:tcPr>
+            <w:tcW w:w="0" w:type="auto"/>
+            <w:vAlign w:val="center"/>
+            <w:hideMark/>
+          </w:tcPr>
+          <w:p>
+            <w:pPr>
+              <w:cnfStyle w:val="000000000000" w:firstRow="0" w:lastRow="0" w:firstColumn="0" w:lastColumn="0" w:oddVBand="0" w:evenVBand="0" w:oddHBand="0" w:evenHBand="0" w:firstRowFirstColumn="0" w:firstRowLastColumn="0" w:lastRowFirstColumn="0" w:lastRowLastColumn="0"/>
+            </w:pPr>
+            <w:r>
+              <w:t>Comprehensive overview</w:t>
+            </w:r>
+          </w:p>
+        </w:tc>
+      </w:tr>
+      <w:tr>
+        <w:trPr>
+          <w:cnfStyle w:val="000000100000" w:firstRow="0" w:lastRow="0" w:firstColumn="0" w:lastColumn="0" w:oddVBand="0" w:evenVBand="0" w:oddHBand="1" w:evenHBand="0" w:firstRowFirstColumn="0" w:firstRowLastColumn="0" w:lastRowFirstColumn="0" w:lastRowLastColumn="0"/>
+        </w:trPr>
+        <w:tc>
+          <w:tcPr>
+            <w:cnfStyle w:val="001000000000" w:firstRow="0" w:lastRow="0" w:firstColumn="1" w:lastColumn="0" w:oddVBand="0" w:evenVBand="0" w:oddHBand="0" w:evenHBand="0" w:firstRowFirstColumn="0" w:firstRowLastColumn="0" w:lastRowFirstColumn="0" w:lastRowLastColumn="0"/>
+            <w:tcW w:w="0" w:type="auto"/>
+            <w:vAlign w:val="center"/>
+            <w:hideMark/>
+          </w:tcPr>
+          <w:p>
+            <w:pPr>
+              <w:rPr>
+                <w:b w:val="0"/>
+                <w:bCs w:val="0"/>
+              </w:rPr>
+            </w:pPr>
+            <w:r>
+              <w:rPr>
+                <w:b w:val="0"/>
+                <w:bCs w:val="0"/>
+              </w:rPr>
+              <w:t>Verification</w:t>
+            </w:r>
+          </w:p>
+        </w:tc>
+        <w:tc>
+          <w:tcPr>
+            <w:tcW w:w="0" w:type="auto"/>
+            <w:vAlign w:val="center"/>
+            <w:hideMark/>
+          </w:tcPr>
+          <w:p>
+            <w:pPr>
+              <w:cnfStyle w:val="000000100000" w:firstRow="0" w:lastRow="0" w:firstColumn="0" w:lastColumn="0" w:oddVBand="0" w:evenVBand="0" w:oddHBand="1" w:evenHBand="0" w:firstRowFirstColumn="0" w:firstRowLastColumn="0" w:lastRowFirstColumn="0" w:lastRowLastColumn="0"/>
+            </w:pPr>
+            <w:r>
+              <w:t>Reviews pending agency registrations</w:t>
+            </w:r>
+          </w:p>
+        </w:tc>
+        <w:tc>
+          <w:tcPr>
+            <w:tcW w:w="0" w:type="auto"/>
+            <w:vAlign w:val="center"/>
+            <w:hideMark/>
+          </w:tcPr>
+          <w:p>
+            <w:pPr>
+              <w:cnfStyle w:val="000000100000" w:firstRow="0" w:lastRow="0" w:firstColumn="0" w:lastColumn="0" w:oddVBand="0" w:evenVBand="0" w:oddHBand="1" w:evenHBand="0" w:firstRowFirstColumn="0" w:firstRowLastColumn="0" w:lastRowFirstColumn="0" w:lastRowLastColumn="0"/>
+            </w:pPr>
+            <w:r>
+              <w:t>Approves or rejects requests</w:t>
+            </w:r>
+          </w:p>
+        </w:tc>
+        <w:tc>
+          <w:tcPr>
+            <w:tcW w:w="0" w:type="auto"/>
+            <w:vAlign w:val="center"/>
+            <w:hideMark/>
+          </w:tcPr>
+          <w:p>
+            <w:pPr>
+              <w:cnfStyle w:val="000000100000" w:firstRow="0" w:lastRow="0" w:firstColumn="0" w:lastColumn="0" w:oddVBand="0" w:evenVBand="0" w:oddHBand="1" w:evenHBand="0" w:firstRowFirstColumn="0" w:firstRowLastColumn="0" w:lastRowFirstColumn="0" w:lastRowLastColumn="0"/>
+            </w:pPr>
+            <w:r>
+              <w:t>Efficient verification process</w:t>
+            </w:r>
+          </w:p>
+        </w:tc>
+      </w:tr>
+      <w:tr>
+        <w:tc>
+          <w:tcPr>
+            <w:cnfStyle w:val="001000000000" w:firstRow="0" w:lastRow="0" w:firstColumn="1" w:lastColumn="0" w:oddVBand="0" w:evenVBand="0" w:oddHBand="0" w:evenHBand="0" w:firstRowFirstColumn="0" w:firstRowLastColumn="0" w:lastRowFirstColumn="0" w:lastRowLastColumn="0"/>
+            <w:tcW w:w="0" w:type="auto"/>
+            <w:vAlign w:val="center"/>
+            <w:hideMark/>
+          </w:tcPr>
+          <w:p>
+            <w:pPr>
+              <w:rPr>
+                <w:b w:val="0"/>
+                <w:bCs w:val="0"/>
+              </w:rPr>
+            </w:pPr>
+            <w:r>
+              <w:rPr>
+                <w:b w:val="0"/>
+                <w:bCs w:val="0"/>
+              </w:rPr>
+              <w:t>Moderation</w:t>
+            </w:r>
+          </w:p>
+        </w:tc>
+        <w:tc>
+          <w:tcPr>
+            <w:tcW w:w="0" w:type="auto"/>
+            <w:vAlign w:val="center"/>
+            <w:hideMark/>
+          </w:tcPr>
+          <w:p>
+            <w:pPr>
+              <w:cnfStyle w:val="000000000000" w:firstRow="0" w:lastRow="0" w:firstColumn="0" w:lastColumn="0" w:oddVBand="0" w:evenVBand="0" w:oddHBand="0" w:evenHBand="0" w:firstRowFirstColumn="0" w:firstRowLastColumn="0" w:lastRowFirstColumn="0" w:lastRowLastColumn="0"/>
+            </w:pPr>
+            <w:r>
+              <w:t>Reviews reported content</w:t>
+            </w:r>
+          </w:p>
+        </w:tc>
+        <w:tc>
+          <w:tcPr>
+            <w:tcW w:w="0" w:type="auto"/>
+            <w:vAlign w:val="center"/>
+            <w:hideMark/>
+          </w:tcPr>
+          <w:p>
+            <w:pPr>
+              <w:cnfStyle w:val="000000000000" w:firstRow="0" w:lastRow="0" w:firstColumn="0" w:lastColumn="0" w:oddVBand="0" w:evenVBand="0" w:oddHBand="0" w:evenHBand="0" w:firstRowFirstColumn="0" w:firstRowLastColumn="0" w:lastRowFirstColumn="0" w:lastRowLastColumn="0"/>
+            </w:pPr>
+            <w:r>
+              <w:t>Removes or approves content</w:t>
+            </w:r>
+          </w:p>
+        </w:tc>
+        <w:tc>
+          <w:tcPr>
+            <w:tcW w:w="0" w:type="auto"/>
+            <w:vAlign w:val="center"/>
+            <w:hideMark/>
+          </w:tcPr>
+          <w:p>
+            <w:pPr>
+              <w:cnfStyle w:val="000000000000" w:firstRow="0" w:lastRow="0" w:firstColumn="0" w:lastColumn="0" w:oddVBand="0" w:evenVBand="0" w:oddHBand="0" w:evenHBand="0" w:firstRowFirstColumn="0" w:firstRowLastColumn="0" w:lastRowFirstColumn="0" w:lastRowLastColumn="0"/>
+            </w:pPr>
+            <w:r>
+              <w:t>Maintains platform quality</w:t>
+            </w:r>
+          </w:p>
+        </w:tc>
+      </w:tr>
+      <w:tr>
+        <w:trPr>
+          <w:cnfStyle w:val="000000100000" w:firstRow="0" w:lastRow="0" w:firstColumn="0" w:lastColumn="0" w:oddVBand="0" w:evenVBand="0" w:oddHBand="1" w:evenHBand="0" w:firstRowFirstColumn="0" w:firstRowLastColumn="0" w:lastRowFirstColumn="0" w:lastRowLastColumn="0"/>
+        </w:trPr>
+        <w:tc>
+          <w:tcPr>
+            <w:cnfStyle w:val="001000000000" w:firstRow="0" w:lastRow="0" w:firstColumn="1" w:lastColumn="0" w:oddVBand="0" w:evenVBand="0" w:oddHBand="0" w:evenHBand="0" w:firstRowFirstColumn="0" w:firstRowLastColumn="0" w:lastRowFirstColumn="0" w:lastRowLastColumn="0"/>
+            <w:tcW w:w="0" w:type="auto"/>
+            <w:vAlign w:val="center"/>
+            <w:hideMark/>
+          </w:tcPr>
+          <w:p>
+            <w:pPr>
+              <w:rPr>
+                <w:b w:val="0"/>
+                <w:bCs w:val="0"/>
+              </w:rPr>
+            </w:pPr>
+            <w:r>
+              <w:rPr>
+                <w:b w:val="0"/>
+                <w:bCs w:val="0"/>
+              </w:rPr>
+              <w:t>Dispute Resolution</w:t>
+            </w:r>
+          </w:p>
+        </w:tc>
+        <w:tc>
+          <w:tcPr>
+            <w:tcW w:w="0" w:type="auto"/>
+            <w:vAlign w:val="center"/>
+            <w:hideMark/>
+          </w:tcPr>
+          <w:p>
+            <w:pPr>
+              <w:cnfStyle w:val="000000100000" w:firstRow="0" w:lastRow="0" w:firstColumn="0" w:lastColumn="0" w:oddVBand="0" w:evenVBand="0" w:oddHBand="1" w:evenHBand="0" w:firstRowFirstColumn="0" w:firstRowLastColumn="0" w:lastRowFirstColumn="0" w:lastRowLastColumn="0"/>
+            </w:pPr>
+            <w:r>
+              <w:t>Investigates customer disputes</w:t>
+            </w:r>
+          </w:p>
+        </w:tc>
+        <w:tc>
+          <w:tcPr>
+            <w:tcW w:w="0" w:type="auto"/>
+            <w:vAlign w:val="center"/>
+            <w:hideMark/>
+          </w:tcPr>
+          <w:p>
+            <w:pPr>
+              <w:cnfStyle w:val="000000100000" w:firstRow="0" w:lastRow="0" w:firstColumn="0" w:lastColumn="0" w:oddVBand="0" w:evenVBand="0" w:oddHBand="1" w:evenHBand="0" w:firstRowFirstColumn="0" w:firstRowLastColumn="0" w:lastRowFirstColumn="0" w:lastRowLastColumn="0"/>
+            </w:pPr>
+            <w:r>
+              <w:t>Records administrative decision</w:t>
+            </w:r>
+          </w:p>
+        </w:tc>
+        <w:tc>
+          <w:tcPr>
+            <w:tcW w:w="0" w:type="auto"/>
+            <w:vAlign w:val="center"/>
+            <w:hideMark/>
+          </w:tcPr>
+          <w:p>
+            <w:pPr>
+              <w:cnfStyle w:val="000000100000" w:firstRow="0" w:lastRow="0" w:firstColumn="0" w:lastColumn="0" w:oddVBand="0" w:evenVBand="0" w:oddHBand="1" w:evenHBand="0" w:firstRowFirstColumn="0" w:firstRowLastColumn="0" w:lastRowFirstColumn="0" w:lastRowLastColumn="0"/>
+            </w:pPr>
+            <w:r>
+              <w:t>Transparent conflict resolution</w:t>
+            </w:r>
+          </w:p>
+        </w:tc>
+      </w:tr>
+      <w:tr>
+        <w:tc>
+          <w:tcPr>
+            <w:cnfStyle w:val="001000000000" w:firstRow="0" w:lastRow="0" w:firstColumn="1" w:lastColumn="0" w:oddVBand="0" w:evenVBand="0" w:oddHBand="0" w:evenHBand="0" w:firstRowFirstColumn="0" w:firstRowLastColumn="0" w:lastRowFirstColumn="0" w:lastRowLastColumn="0"/>
+            <w:tcW w:w="0" w:type="auto"/>
+            <w:vAlign w:val="center"/>
+            <w:hideMark/>
+          </w:tcPr>
+          <w:p>
+            <w:pPr>
+              <w:rPr>
+                <w:b w:val="0"/>
+                <w:bCs w:val="0"/>
+              </w:rPr>
+            </w:pPr>
+            <w:r>
+              <w:rPr>
+                <w:b w:val="0"/>
+                <w:bCs w:val="0"/>
+              </w:rPr>
+              <w:t>Reporting</w:t>
+            </w:r>
+          </w:p>
+        </w:tc>
+        <w:tc>
+          <w:tcPr>
+            <w:tcW w:w="0" w:type="auto"/>
+            <w:vAlign w:val="center"/>
+            <w:hideMark/>
+          </w:tcPr>
+          <w:p>
+            <w:pPr>
+              <w:cnfStyle w:val="000000000000" w:firstRow="0" w:lastRow="0" w:firstColumn="0" w:lastColumn="0" w:oddVBand="0" w:evenVBand="0" w:oddHBand="0" w:evenHBand="0" w:firstRowFirstColumn="0" w:firstRowLastColumn="0" w:lastRowFirstColumn="0" w:lastRowLastColumn="0"/>
+            </w:pPr>
+            <w:r>
+              <w:t>Generates administrative reports</w:t>
+            </w:r>
+          </w:p>
+        </w:tc>
+        <w:tc>
+          <w:tcPr>
+            <w:tcW w:w="0" w:type="auto"/>
+            <w:vAlign w:val="center"/>
+            <w:hideMark/>
+          </w:tcPr>
+          <w:p>
+            <w:pPr>
+              <w:cnfStyle w:val="000000000000" w:firstRow="0" w:lastRow="0" w:firstColumn="0" w:lastColumn="0" w:oddVBand="0" w:evenVBand="0" w:oddHBand="0" w:evenHBand="0" w:firstRowFirstColumn="0" w:firstRowLastColumn="0" w:lastRowFirstColumn="0" w:lastRowLastColumn="0"/>
+            </w:pPr>
+            <w:r>
+              <w:t>Displays platform statistics</w:t>
+            </w:r>
+          </w:p>
+        </w:tc>
+        <w:tc>
+          <w:tcPr>
+            <w:tcW w:w="0" w:type="auto"/>
+            <w:vAlign w:val="center"/>
+            <w:hideMark/>
+          </w:tcPr>
+          <w:p>
+            <w:pPr>
+              <w:cnfStyle w:val="000000000000" w:firstRow="0" w:lastRow="0" w:firstColumn="0" w:lastColumn="0" w:oddVBand="0" w:evenVBand="0" w:oddHBand="0" w:evenHBand="0" w:firstRowFirstColumn="0" w:firstRowLastColumn="0" w:lastRowFirstColumn="0" w:lastRowLastColumn="0"/>
+            </w:pPr>
+            <w:r>
+              <w:t>Supports management decisions</w:t>
+            </w:r>
+          </w:p>
+        </w:tc>
+      </w:tr>
+      <w:tr>
+        <w:trPr>
+          <w:cnfStyle w:val="000000100000" w:firstRow="0" w:lastRow="0" w:firstColumn="0" w:lastColumn="0" w:oddVBand="0" w:evenVBand="0" w:oddHBand="1" w:evenHBand="0" w:firstRowFirstColumn="0" w:firstRowLastColumn="0" w:lastRowFirstColumn="0" w:lastRowLastColumn="0"/>
+        </w:trPr>
+        <w:tc>
+          <w:tcPr>
+            <w:cnfStyle w:val="001000000000" w:firstRow="0" w:lastRow="0" w:firstColumn="1" w:lastColumn="0" w:oddVBand="0" w:evenVBand="0" w:oddHBand="0" w:evenHBand="0" w:firstRowFirstColumn="0" w:firstRowLastColumn="0" w:lastRowFirstColumn="0" w:lastRowLastColumn="0"/>
+            <w:tcW w:w="0" w:type="auto"/>
+            <w:vAlign w:val="center"/>
+            <w:hideMark/>
+          </w:tcPr>
+          <w:p>
+            <w:pPr>
+              <w:rPr>
+                <w:b w:val="0"/>
+                <w:bCs w:val="0"/>
+              </w:rPr>
+            </w:pPr>
+            <w:r>
+              <w:rPr>
+                <w:b w:val="0"/>
+                <w:bCs w:val="0"/>
+              </w:rPr>
+              <w:t>Logout</w:t>
+            </w:r>
+          </w:p>
+        </w:tc>
+        <w:tc>
+          <w:tcPr>
+            <w:tcW w:w="0" w:type="auto"/>
+            <w:vAlign w:val="center"/>
+            <w:hideMark/>
+          </w:tcPr>
+          <w:p>
+            <w:pPr>
+              <w:cnfStyle w:val="000000100000" w:firstRow="0" w:lastRow="0" w:firstColumn="0" w:lastColumn="0" w:oddVBand="0" w:evenVBand="0" w:oddHBand="1" w:evenHBand="0" w:firstRowFirstColumn="0" w:firstRowLastColumn="0" w:lastRowFirstColumn="0" w:lastRowLastColumn="0"/>
+            </w:pPr>
+            <w:r>
+              <w:t>Ends administrative session</w:t>
+            </w:r>
+          </w:p>
+        </w:tc>
+        <w:tc>
+          <w:tcPr>
+            <w:tcW w:w="0" w:type="auto"/>
+            <w:vAlign w:val="center"/>
+            <w:hideMark/>
+          </w:tcPr>
+          <w:p>
+            <w:pPr>
+              <w:cnfStyle w:val="000000100000" w:firstRow="0" w:lastRow="0" w:firstColumn="0" w:lastColumn="0" w:oddVBand="0" w:evenVBand="0" w:oddHBand="1" w:evenHBand="0" w:firstRowFirstColumn="0" w:firstRowLastColumn="0" w:lastRowFirstColumn="0" w:lastRowLastColumn="0"/>
+            </w:pPr>
+            <w:r>
+              <w:t>Securely terminates session</w:t>
+            </w:r>
+          </w:p>
+        </w:tc>
+        <w:tc>
+          <w:tcPr>
+            <w:tcW w:w="0" w:type="auto"/>
+            <w:vAlign w:val="center"/>
+            <w:hideMark/>
+          </w:tcPr>
+          <w:p>
+            <w:pPr>
+              <w:cnfStyle w:val="000000100000" w:firstRow="0" w:lastRow="0" w:firstColumn="0" w:lastColumn="0" w:oddVBand="0" w:evenVBand="0" w:oddHBand="1" w:evenHBand="0" w:firstRowFirstColumn="0" w:firstRowLastColumn="0" w:lastRowFirstColumn="0" w:lastRowLastColumn="0"/>
+            </w:pPr>
+            <w:r>
+              <w:t>Protects administrative account</w:t>
+            </w:r>
+          </w:p>
+        </w:tc>
+      </w:tr>
+    </w:tbl>
+    <w:p/>
+    <w:p>
+      <w:r>
+        <w:rPr>
+          <w:b/>
+          <w:bCs/>
+        </w:rPr>
+        <w:t>Outcome of Journey</w:t>
+      </w:r>
+      <w:r>
+        <w:t>: Centralized management and maintenance of a secure platform.</w:t>
+      </w:r>
+    </w:p>
+    <w:p/>
+    <w:p>
+      <w:r>
+        <w:t>The user journeys describe the manner in which the three main users interact with the KriGo platform in order to realize their individual aims. The process of design by specifying the various steps that users undergo when performing tasks makes it possible to discover how usability can be improved and how workflows can be simplified. The journeys offer a basis for the future stages of the UI/UX design process, such as information architecture, user flow modeling, and wireframes creation.</w:t>
+      </w:r>
+    </w:p>
+    <w:p/>
+    <w:p/>
+    <w:p/>
     <w:p/>
     <w:sectPr>
       <w:headerReference w:type="default" r:id="rId9"/>

</xml_diff>

<commit_message>
UX Research & Planning (#417) Information Architecture (#420)
</commit_message>
<xml_diff>
--- a/UI UX Design Document.docx
+++ b/UI UX Design Document.docx
@@ -4165,13 +4165,957 @@
         <w:t>The user journeys describe the manner in which the three main users interact with the KriGo platform in order to realize their individual aims. The process of design by specifying the various steps that users undergo when performing tasks makes it possible to discover how usability can be improved and how workflows can be simplified. The journeys offer a basis for the future stages of the UI/UX design process, such as information architecture, user flow modeling, and wireframes creation.</w:t>
       </w:r>
     </w:p>
+    <w:p>
+      <w:pPr>
+        <w:spacing w:line="278" w:lineRule="auto"/>
+      </w:pPr>
+      <w:r>
+        <w:br w:type="page"/>
+      </w:r>
+    </w:p>
+    <w:p>
+      <w:pPr>
+        <w:pStyle w:val="Heading3"/>
+      </w:pPr>
+      <w:r>
+        <w:lastRenderedPageBreak/>
+        <w:t xml:space="preserve">Information Architecture </w:t>
+      </w:r>
+    </w:p>
+    <w:p>
+      <w:r>
+        <w:t>Information Architecture (IA) establishes the structure of the KriGo platform by organizing content, features, and navigation in a hierarchical manner. It serves as a design guide of the interface providing the basis for efficient searching for the necessary information, moving between system functionalities, and performing different tasks with minimum mental efforts. Good IA contributes significantly to usability, navigability and user experience.</w:t>
+      </w:r>
+    </w:p>
+    <w:p>
+      <w:r>
+        <w:t>The Information Architecture of the KriGo platform is created based on user-centered design taking into account needs and responsibilities of the three main types of users: Customers, Rental Agency Managers, and Platform Administrators. As each of them performs their own tasks, the platform provides role-specific navigation menus but uses the same design language and interaction model throughout the application.</w:t>
+      </w:r>
+    </w:p>
+    <w:p>
+      <w:r>
+        <w:t>Hierarchical navigation is implemented in the platform design as users start from the main dashboard/home page and navigate through increasingly specific parts. In this way, navigation becomes easier, the number of actions performed when completing certain tasks decreases, and access to often used functionality is quicker.</w:t>
+      </w:r>
+    </w:p>
+    <w:p>
+      <w:r>
+        <w:t>In order to increase consistency and maintainability of the platform, related features are grouped into functional modules. Each of these modules includes related screens and operations making the understanding of the structure of the system easier and allowing its further scalability.</w:t>
+      </w:r>
+    </w:p>
+    <w:p>
+      <w:pPr>
+        <w:pStyle w:val="Title"/>
+      </w:pPr>
+      <w:r>
+        <w:t>Information Architecture Principles</w:t>
+      </w:r>
+    </w:p>
+    <w:p>
+      <w:r>
+        <w:t>The information architecture of KriGo is based on the following principles:</w:t>
+      </w:r>
+    </w:p>
+    <w:p>
+      <w:pPr>
+        <w:pStyle w:val="ListParagraph"/>
+        <w:numPr>
+          <w:ilvl w:val="0"/>
+          <w:numId w:val="152"/>
+        </w:numPr>
+      </w:pPr>
+      <w:r>
+        <w:t>Goal-Based Structure: Navigation structure is oriented on users' goals and tasks not on the inner structure of the system itself.</w:t>
+      </w:r>
+    </w:p>
+    <w:p>
+      <w:pPr>
+        <w:pStyle w:val="ListParagraph"/>
+        <w:numPr>
+          <w:ilvl w:val="0"/>
+          <w:numId w:val="152"/>
+        </w:numPr>
+      </w:pPr>
+      <w:r>
+        <w:t>Consistency: Navigation mechanisms and elements of interfaces are the same for the whole platform.</w:t>
+      </w:r>
+    </w:p>
+    <w:p>
+      <w:pPr>
+        <w:pStyle w:val="ListParagraph"/>
+        <w:numPr>
+          <w:ilvl w:val="0"/>
+          <w:numId w:val="152"/>
+        </w:numPr>
+      </w:pPr>
+      <w:r>
+        <w:t>Minimalism: Navigation levels are kept to a minimum.</w:t>
+      </w:r>
+    </w:p>
+    <w:p>
+      <w:pPr>
+        <w:pStyle w:val="ListParagraph"/>
+        <w:numPr>
+          <w:ilvl w:val="0"/>
+          <w:numId w:val="152"/>
+        </w:numPr>
+      </w:pPr>
+      <w:r>
+        <w:t>Scalability: Information architecture allows incorporating new modules and features without changing the current hierarchy of navigation.</w:t>
+      </w:r>
+    </w:p>
+    <w:p>
+      <w:pPr>
+        <w:pStyle w:val="ListParagraph"/>
+        <w:numPr>
+          <w:ilvl w:val="0"/>
+          <w:numId w:val="152"/>
+        </w:numPr>
+      </w:pPr>
+      <w:r>
+        <w:t>Accessibility: Information is structured in such a way that would help people with different technical skills and accessibility problems.</w:t>
+      </w:r>
+    </w:p>
+    <w:p>
+      <w:pPr>
+        <w:pStyle w:val="ListParagraph"/>
+        <w:numPr>
+          <w:ilvl w:val="0"/>
+          <w:numId w:val="152"/>
+        </w:numPr>
+      </w:pPr>
+      <w:r>
+        <w:t>Role-Based Navigation: Users (customers, agencies' users, administrators) see only necessary features.</w:t>
+      </w:r>
+    </w:p>
+    <w:p>
+      <w:pPr>
+        <w:spacing w:line="278" w:lineRule="auto"/>
+      </w:pPr>
+      <w:r>
+        <w:br w:type="page"/>
+      </w:r>
+    </w:p>
+    <w:p>
+      <w:pPr>
+        <w:pStyle w:val="Title"/>
+      </w:pPr>
+      <w:r>
+        <w:lastRenderedPageBreak/>
+        <w:t>Customer Information Architecture</w:t>
+      </w:r>
+    </w:p>
+    <w:p>
+      <w:r>
+        <w:rPr>
+          <w:noProof/>
+        </w:rPr>
+        <mc:AlternateContent>
+          <mc:Choice Requires="wps">
+            <w:drawing>
+              <wp:anchor distT="0" distB="0" distL="114300" distR="114300" simplePos="0" relativeHeight="251663360" behindDoc="0" locked="0" layoutInCell="1" allowOverlap="1" wp14:anchorId="21A5048E" wp14:editId="1827213D">
+                <wp:simplePos x="0" y="0"/>
+                <wp:positionH relativeFrom="column">
+                  <wp:posOffset>3175</wp:posOffset>
+                </wp:positionH>
+                <wp:positionV relativeFrom="paragraph">
+                  <wp:posOffset>7084695</wp:posOffset>
+                </wp:positionV>
+                <wp:extent cx="5941695" cy="635"/>
+                <wp:effectExtent l="0" t="0" r="0" b="0"/>
+                <wp:wrapSquare wrapText="bothSides"/>
+                <wp:docPr id="1785579569" name="Text Box 1"/>
+                <wp:cNvGraphicFramePr/>
+                <a:graphic xmlns:a="http://schemas.openxmlformats.org/drawingml/2006/main">
+                  <a:graphicData uri="http://schemas.microsoft.com/office/word/2010/wordprocessingShape">
+                    <wps:wsp>
+                      <wps:cNvSpPr txBox="1"/>
+                      <wps:spPr>
+                        <a:xfrm>
+                          <a:off x="0" y="0"/>
+                          <a:ext cx="5941695" cy="635"/>
+                        </a:xfrm>
+                        <a:prstGeom prst="rect">
+                          <a:avLst/>
+                        </a:prstGeom>
+                        <a:solidFill>
+                          <a:prstClr val="white"/>
+                        </a:solidFill>
+                        <a:ln>
+                          <a:noFill/>
+                        </a:ln>
+                      </wps:spPr>
+                      <wps:txbx>
+                        <w:txbxContent>
+                          <w:p>
+                            <w:pPr>
+                              <w:pStyle w:val="Caption"/>
+                              <w:rPr>
+                                <w:noProof/>
+                              </w:rPr>
+                            </w:pPr>
+                            <w:r>
+                              <w:t xml:space="preserve">Figure </w:t>
+                            </w:r>
+                            <w:r>
+                              <w:fldChar w:fldCharType="begin"/>
+                            </w:r>
+                            <w:r>
+                              <w:instrText xml:space="preserve"> SEQ Figure \* ARABIC </w:instrText>
+                            </w:r>
+                            <w:r>
+                              <w:fldChar w:fldCharType="separate"/>
+                            </w:r>
+                            <w:r>
+                              <w:rPr>
+                                <w:noProof/>
+                              </w:rPr>
+                              <w:t>2</w:t>
+                            </w:r>
+                            <w:r>
+                              <w:fldChar w:fldCharType="end"/>
+                            </w:r>
+                            <w:r>
+                              <w:t xml:space="preserve"> - </w:t>
+                            </w:r>
+                            <w:r>
+                              <w:t>Customer Information Architecture</w:t>
+                            </w:r>
+                          </w:p>
+                        </w:txbxContent>
+                      </wps:txbx>
+                      <wps:bodyPr rot="0" spcFirstLastPara="0" vertOverflow="overflow" horzOverflow="overflow" vert="horz" wrap="square" lIns="0" tIns="0" rIns="0" bIns="0" numCol="1" spcCol="0" rtlCol="0" fromWordArt="0" anchor="t" anchorCtr="0" forceAA="0" compatLnSpc="1">
+                        <a:prstTxWarp prst="textNoShape">
+                          <a:avLst/>
+                        </a:prstTxWarp>
+                        <a:spAutoFit/>
+                      </wps:bodyPr>
+                    </wps:wsp>
+                  </a:graphicData>
+                </a:graphic>
+              </wp:anchor>
+            </w:drawing>
+          </mc:Choice>
+          <mc:Fallback>
+            <w:pict>
+              <v:shape w14:anchorId="21A5048E" id="_x0000_s1027" type="#_x0000_t202" style="position:absolute;margin-left:.25pt;margin-top:557.85pt;width:467.85pt;height:.05pt;z-index:251663360;visibility:visible;mso-wrap-style:square;mso-wrap-distance-left:9pt;mso-wrap-distance-top:0;mso-wrap-distance-right:9pt;mso-wrap-distance-bottom:0;mso-position-horizontal:absolute;mso-position-horizontal-relative:text;mso-position-vertical:absolute;mso-position-vertical-relative:text;v-text-anchor:top" o:gfxdata="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" stroked="f">
+                <v:textbox style="mso-fit-shape-to-text:t" inset="0,0,0,0">
+                  <w:txbxContent>
+                    <w:p>
+                      <w:pPr>
+                        <w:pStyle w:val="Caption"/>
+                        <w:rPr>
+                          <w:noProof/>
+                        </w:rPr>
+                      </w:pPr>
+                      <w:r>
+                        <w:t xml:space="preserve">Figure </w:t>
+                      </w:r>
+                      <w:r>
+                        <w:fldChar w:fldCharType="begin"/>
+                      </w:r>
+                      <w:r>
+                        <w:instrText xml:space="preserve"> SEQ Figure \* ARABIC </w:instrText>
+                      </w:r>
+                      <w:r>
+                        <w:fldChar w:fldCharType="separate"/>
+                      </w:r>
+                      <w:r>
+                        <w:rPr>
+                          <w:noProof/>
+                        </w:rPr>
+                        <w:t>2</w:t>
+                      </w:r>
+                      <w:r>
+                        <w:fldChar w:fldCharType="end"/>
+                      </w:r>
+                      <w:r>
+                        <w:t xml:space="preserve"> - </w:t>
+                      </w:r>
+                      <w:r>
+                        <w:t>Customer Information Architecture</w:t>
+                      </w:r>
+                    </w:p>
+                  </w:txbxContent>
+                </v:textbox>
+                <w10:wrap type="square"/>
+              </v:shape>
+            </w:pict>
+          </mc:Fallback>
+        </mc:AlternateContent>
+      </w:r>
+      <w:r>
+        <w:rPr>
+          <w:noProof/>
+        </w:rPr>
+        <w:drawing>
+          <wp:anchor distT="0" distB="0" distL="114300" distR="114300" simplePos="0" relativeHeight="251661312" behindDoc="0" locked="0" layoutInCell="1" allowOverlap="1" wp14:anchorId="56695851" wp14:editId="3036F93B">
+            <wp:simplePos x="0" y="0"/>
+            <wp:positionH relativeFrom="column">
+              <wp:posOffset>3175</wp:posOffset>
+            </wp:positionH>
+            <wp:positionV relativeFrom="paragraph">
+              <wp:posOffset>486410</wp:posOffset>
+            </wp:positionV>
+            <wp:extent cx="5941695" cy="6541135"/>
+            <wp:effectExtent l="0" t="0" r="1905" b="0"/>
+            <wp:wrapSquare wrapText="bothSides"/>
+            <wp:docPr id="1473287963" name="Picture 3"/>
+            <wp:cNvGraphicFramePr>
+              <a:graphicFrameLocks xmlns:a="http://schemas.openxmlformats.org/drawingml/2006/main" noChangeAspect="1"/>
+            </wp:cNvGraphicFramePr>
+            <a:graphic xmlns:a="http://schemas.openxmlformats.org/drawingml/2006/main">
+              <a:graphicData uri="http://schemas.openxmlformats.org/drawingml/2006/picture">
+                <pic:pic xmlns:pic="http://schemas.openxmlformats.org/drawingml/2006/picture">
+                  <pic:nvPicPr>
+                    <pic:cNvPr id="0" name="Picture 4"/>
+                    <pic:cNvPicPr>
+                      <a:picLocks noChangeAspect="1" noChangeArrowheads="1"/>
+                    </pic:cNvPicPr>
+                  </pic:nvPicPr>
+                  <pic:blipFill>
+                    <a:blip r:embed="rId9">
+                      <a:extLst>
+                        <a:ext uri="{28A0092B-C50C-407E-A947-70E740481C1C}">
+                          <a14:useLocalDpi xmlns:a14="http://schemas.microsoft.com/office/drawing/2010/main" val="0"/>
+                        </a:ext>
+                      </a:extLst>
+                    </a:blip>
+                    <a:srcRect/>
+                    <a:stretch>
+                      <a:fillRect/>
+                    </a:stretch>
+                  </pic:blipFill>
+                  <pic:spPr bwMode="auto">
+                    <a:xfrm>
+                      <a:off x="0" y="0"/>
+                      <a:ext cx="5941695" cy="6541135"/>
+                    </a:xfrm>
+                    <a:prstGeom prst="rect">
+                      <a:avLst/>
+                    </a:prstGeom>
+                    <a:noFill/>
+                    <a:ln>
+                      <a:noFill/>
+                    </a:ln>
+                  </pic:spPr>
+                </pic:pic>
+              </a:graphicData>
+            </a:graphic>
+            <wp14:sizeRelH relativeFrom="margin">
+              <wp14:pctWidth>0</wp14:pctWidth>
+            </wp14:sizeRelH>
+            <wp14:sizeRelV relativeFrom="margin">
+              <wp14:pctHeight>0</wp14:pctHeight>
+            </wp14:sizeRelV>
+          </wp:anchor>
+        </w:drawing>
+      </w:r>
+      <w:r>
+        <w:t>The customer interface focuses on enabling users to search, reserve, and manage vehicle rentals efficiently.</w:t>
+      </w:r>
+    </w:p>
+    <w:p>
+      <w:pPr>
+        <w:spacing w:line="278" w:lineRule="auto"/>
+      </w:pPr>
+      <w:r>
+        <w:br w:type="page"/>
+      </w:r>
+    </w:p>
+    <w:p>
+      <w:pPr>
+        <w:pStyle w:val="Title"/>
+      </w:pPr>
+      <w:r>
+        <w:lastRenderedPageBreak/>
+        <w:t>Agency Management Information Architecture</w:t>
+      </w:r>
+    </w:p>
+    <w:p>
+      <w:r>
+        <w:t>The agency management interface provides centralized access to operational activities.</w:t>
+      </w:r>
+    </w:p>
+    <w:p>
+      <w:pPr>
+        <w:keepNext/>
+      </w:pPr>
+      <w:r>
+        <w:rPr>
+          <w:noProof/>
+        </w:rPr>
+        <w:drawing>
+          <wp:inline distT="0" distB="0" distL="0" distR="0" wp14:anchorId="54FFDFED" wp14:editId="701EFFB3">
+            <wp:extent cx="3223260" cy="7467600"/>
+            <wp:effectExtent l="0" t="0" r="0" b="0"/>
+            <wp:docPr id="1158442418" name="Picture 5"/>
+            <wp:cNvGraphicFramePr>
+              <a:graphicFrameLocks xmlns:a="http://schemas.openxmlformats.org/drawingml/2006/main" noChangeAspect="1"/>
+            </wp:cNvGraphicFramePr>
+            <a:graphic xmlns:a="http://schemas.openxmlformats.org/drawingml/2006/main">
+              <a:graphicData uri="http://schemas.openxmlformats.org/drawingml/2006/picture">
+                <pic:pic xmlns:pic="http://schemas.openxmlformats.org/drawingml/2006/picture">
+                  <pic:nvPicPr>
+                    <pic:cNvPr id="0" name="Picture 8"/>
+                    <pic:cNvPicPr>
+                      <a:picLocks noChangeAspect="1" noChangeArrowheads="1"/>
+                    </pic:cNvPicPr>
+                  </pic:nvPicPr>
+                  <pic:blipFill>
+                    <a:blip r:embed="rId10">
+                      <a:extLst>
+                        <a:ext uri="{28A0092B-C50C-407E-A947-70E740481C1C}">
+                          <a14:useLocalDpi xmlns:a14="http://schemas.microsoft.com/office/drawing/2010/main" val="0"/>
+                        </a:ext>
+                      </a:extLst>
+                    </a:blip>
+                    <a:srcRect/>
+                    <a:stretch>
+                      <a:fillRect/>
+                    </a:stretch>
+                  </pic:blipFill>
+                  <pic:spPr bwMode="auto">
+                    <a:xfrm>
+                      <a:off x="0" y="0"/>
+                      <a:ext cx="3223260" cy="7467600"/>
+                    </a:xfrm>
+                    <a:prstGeom prst="rect">
+                      <a:avLst/>
+                    </a:prstGeom>
+                    <a:noFill/>
+                    <a:ln>
+                      <a:noFill/>
+                    </a:ln>
+                  </pic:spPr>
+                </pic:pic>
+              </a:graphicData>
+            </a:graphic>
+          </wp:inline>
+        </w:drawing>
+      </w:r>
+    </w:p>
+    <w:p>
+      <w:pPr>
+        <w:pStyle w:val="Caption"/>
+        <w:jc w:val="left"/>
+      </w:pPr>
+      <w:r>
+        <w:t xml:space="preserve">Figure </w:t>
+      </w:r>
+      <w:r>
+        <w:fldChar w:fldCharType="begin"/>
+      </w:r>
+      <w:r>
+        <w:instrText xml:space="preserve"> SEQ Figure \* ARABIC </w:instrText>
+      </w:r>
+      <w:r>
+        <w:fldChar w:fldCharType="separate"/>
+      </w:r>
+      <w:r>
+        <w:rPr>
+          <w:noProof/>
+        </w:rPr>
+        <w:t>3</w:t>
+      </w:r>
+      <w:r>
+        <w:fldChar w:fldCharType="end"/>
+      </w:r>
+      <w:r>
+        <w:t xml:space="preserve"> - </w:t>
+      </w:r>
+      <w:r>
+        <w:t>Agency Management Information Architecture</w:t>
+      </w:r>
+    </w:p>
+    <w:p>
+      <w:pPr>
+        <w:spacing w:line="278" w:lineRule="auto"/>
+      </w:pPr>
+      <w:r>
+        <w:br w:type="page"/>
+      </w:r>
+    </w:p>
+    <w:p>
+      <w:pPr>
+        <w:pStyle w:val="Title"/>
+      </w:pPr>
+      <w:r>
+        <w:lastRenderedPageBreak/>
+        <w:t>Administration Information Architecture</w:t>
+      </w:r>
+    </w:p>
+    <w:p>
+      <w:r>
+        <w:t>The administrative interface provides comprehensive control over the entire platform.</w:t>
+      </w:r>
+    </w:p>
+    <w:p/>
+    <w:p>
+      <w:pPr>
+        <w:keepNext/>
+      </w:pPr>
+      <w:r>
+        <w:rPr>
+          <w:noProof/>
+        </w:rPr>
+        <w:drawing>
+          <wp:inline distT="0" distB="0" distL="0" distR="0" wp14:anchorId="26595697" wp14:editId="4C3E6C37">
+            <wp:extent cx="2849880" cy="6065520"/>
+            <wp:effectExtent l="0" t="0" r="7620" b="0"/>
+            <wp:docPr id="719132457" name="Picture 6"/>
+            <wp:cNvGraphicFramePr>
+              <a:graphicFrameLocks xmlns:a="http://schemas.openxmlformats.org/drawingml/2006/main" noChangeAspect="1"/>
+            </wp:cNvGraphicFramePr>
+            <a:graphic xmlns:a="http://schemas.openxmlformats.org/drawingml/2006/main">
+              <a:graphicData uri="http://schemas.openxmlformats.org/drawingml/2006/picture">
+                <pic:pic xmlns:pic="http://schemas.openxmlformats.org/drawingml/2006/picture">
+                  <pic:nvPicPr>
+                    <pic:cNvPr id="0" name="Picture 10"/>
+                    <pic:cNvPicPr>
+                      <a:picLocks noChangeAspect="1" noChangeArrowheads="1"/>
+                    </pic:cNvPicPr>
+                  </pic:nvPicPr>
+                  <pic:blipFill>
+                    <a:blip r:embed="rId11">
+                      <a:extLst>
+                        <a:ext uri="{28A0092B-C50C-407E-A947-70E740481C1C}">
+                          <a14:useLocalDpi xmlns:a14="http://schemas.microsoft.com/office/drawing/2010/main" val="0"/>
+                        </a:ext>
+                      </a:extLst>
+                    </a:blip>
+                    <a:srcRect/>
+                    <a:stretch>
+                      <a:fillRect/>
+                    </a:stretch>
+                  </pic:blipFill>
+                  <pic:spPr bwMode="auto">
+                    <a:xfrm>
+                      <a:off x="0" y="0"/>
+                      <a:ext cx="2849880" cy="6065520"/>
+                    </a:xfrm>
+                    <a:prstGeom prst="rect">
+                      <a:avLst/>
+                    </a:prstGeom>
+                    <a:noFill/>
+                    <a:ln>
+                      <a:noFill/>
+                    </a:ln>
+                  </pic:spPr>
+                </pic:pic>
+              </a:graphicData>
+            </a:graphic>
+          </wp:inline>
+        </w:drawing>
+      </w:r>
+    </w:p>
+    <w:p>
+      <w:pPr>
+        <w:pStyle w:val="Caption"/>
+        <w:jc w:val="left"/>
+      </w:pPr>
+      <w:r>
+        <w:t xml:space="preserve">Figure </w:t>
+      </w:r>
+      <w:r>
+        <w:fldChar w:fldCharType="begin"/>
+      </w:r>
+      <w:r>
+        <w:instrText xml:space="preserve"> SEQ Figure \* ARABIC </w:instrText>
+      </w:r>
+      <w:r>
+        <w:fldChar w:fldCharType="separate"/>
+      </w:r>
+      <w:r>
+        <w:rPr>
+          <w:noProof/>
+        </w:rPr>
+        <w:t>4</w:t>
+      </w:r>
+      <w:r>
+        <w:fldChar w:fldCharType="end"/>
+      </w:r>
+      <w:r>
+        <w:t xml:space="preserve"> - </w:t>
+      </w:r>
+      <w:r>
+        <w:t>Administration Information Architecture</w:t>
+      </w:r>
+    </w:p>
     <w:p/>
     <w:p/>
     <w:p/>
     <w:p/>
+    <w:p/>
+    <w:p/>
+    <w:p>
+      <w:pPr>
+        <w:pStyle w:val="Heading4"/>
+      </w:pPr>
+      <w:r>
+        <w:lastRenderedPageBreak/>
+        <w:t>Navigation Structure</w:t>
+      </w:r>
+    </w:p>
+    <w:p>
+      <w:r>
+        <w:t>The KriGo platform employs a hierarchical navigation structure that involves global navigation, contextual navigation, and utility navigation.</w:t>
+      </w:r>
+    </w:p>
+    <w:p>
+      <w:pPr>
+        <w:pStyle w:val="Title"/>
+      </w:pPr>
+      <w:r>
+        <w:t>Global Navigation</w:t>
+      </w:r>
+    </w:p>
+    <w:p>
+      <w:r>
+        <w:t>Global navigation gives access to the main features of the platform and is available throughout the application.</w:t>
+      </w:r>
+    </w:p>
+    <w:p>
+      <w:r>
+        <w:t>Examples of features include:</w:t>
+      </w:r>
+    </w:p>
+    <w:p>
+      <w:pPr>
+        <w:pStyle w:val="ListParagraph"/>
+        <w:numPr>
+          <w:ilvl w:val="0"/>
+          <w:numId w:val="155"/>
+        </w:numPr>
+      </w:pPr>
+      <w:r>
+        <w:t>Home</w:t>
+      </w:r>
+    </w:p>
+    <w:p>
+      <w:pPr>
+        <w:pStyle w:val="ListParagraph"/>
+        <w:numPr>
+          <w:ilvl w:val="0"/>
+          <w:numId w:val="155"/>
+        </w:numPr>
+      </w:pPr>
+      <w:r>
+        <w:t>Dashboard</w:t>
+      </w:r>
+    </w:p>
+    <w:p>
+      <w:pPr>
+        <w:pStyle w:val="ListParagraph"/>
+        <w:numPr>
+          <w:ilvl w:val="0"/>
+          <w:numId w:val="155"/>
+        </w:numPr>
+      </w:pPr>
+      <w:r>
+        <w:t>Search Vehicles</w:t>
+      </w:r>
+    </w:p>
+    <w:p>
+      <w:pPr>
+        <w:pStyle w:val="ListParagraph"/>
+        <w:numPr>
+          <w:ilvl w:val="0"/>
+          <w:numId w:val="155"/>
+        </w:numPr>
+      </w:pPr>
+      <w:r>
+        <w:t>Make a Reservation</w:t>
+      </w:r>
+    </w:p>
+    <w:p>
+      <w:pPr>
+        <w:pStyle w:val="ListParagraph"/>
+        <w:numPr>
+          <w:ilvl w:val="0"/>
+          <w:numId w:val="155"/>
+        </w:numPr>
+      </w:pPr>
+      <w:r>
+        <w:t>Manage Fleets</w:t>
+      </w:r>
+    </w:p>
+    <w:p>
+      <w:pPr>
+        <w:pStyle w:val="ListParagraph"/>
+        <w:numPr>
+          <w:ilvl w:val="0"/>
+          <w:numId w:val="155"/>
+        </w:numPr>
+      </w:pPr>
+      <w:r>
+        <w:t>Reports</w:t>
+      </w:r>
+    </w:p>
+    <w:p>
+      <w:pPr>
+        <w:pStyle w:val="ListParagraph"/>
+        <w:numPr>
+          <w:ilvl w:val="0"/>
+          <w:numId w:val="155"/>
+        </w:numPr>
+      </w:pPr>
+      <w:r>
+        <w:t>Profile</w:t>
+      </w:r>
+    </w:p>
+    <w:p>
+      <w:pPr>
+        <w:pStyle w:val="Title"/>
+      </w:pPr>
+      <w:r>
+        <w:t>Contextual Navigation</w:t>
+      </w:r>
+    </w:p>
+    <w:p>
+      <w:r>
+        <w:t>Contextual navigation allows users to move between similar tasks in a specific feature.</w:t>
+      </w:r>
+    </w:p>
+    <w:p>
+      <w:r>
+        <w:t>Examples of features include:</w:t>
+      </w:r>
+    </w:p>
+    <w:p>
+      <w:pPr>
+        <w:pStyle w:val="ListParagraph"/>
+        <w:numPr>
+          <w:ilvl w:val="0"/>
+          <w:numId w:val="157"/>
+        </w:numPr>
+      </w:pPr>
+      <w:r>
+        <w:t>Vehicle details → Book vehicle</w:t>
+      </w:r>
+    </w:p>
+    <w:p>
+      <w:pPr>
+        <w:pStyle w:val="ListParagraph"/>
+        <w:numPr>
+          <w:ilvl w:val="0"/>
+          <w:numId w:val="157"/>
+        </w:numPr>
+      </w:pPr>
+      <w:r>
+        <w:t>Reservation details → Make payment</w:t>
+      </w:r>
+    </w:p>
+    <w:p>
+      <w:pPr>
+        <w:pStyle w:val="ListParagraph"/>
+        <w:numPr>
+          <w:ilvl w:val="0"/>
+          <w:numId w:val="157"/>
+        </w:numPr>
+      </w:pPr>
+      <w:r>
+        <w:t>Manage fleets → Edit vehicle</w:t>
+      </w:r>
+    </w:p>
+    <w:p>
+      <w:pPr>
+        <w:pStyle w:val="ListParagraph"/>
+        <w:numPr>
+          <w:ilvl w:val="0"/>
+          <w:numId w:val="157"/>
+        </w:numPr>
+      </w:pPr>
+      <w:r>
+        <w:t>Reports → Export report</w:t>
+      </w:r>
+    </w:p>
+    <w:p>
+      <w:pPr>
+        <w:pStyle w:val="Title"/>
+      </w:pPr>
+      <w:r>
+        <w:t>Utility Navigation</w:t>
+      </w:r>
+    </w:p>
+    <w:p>
+      <w:r>
+        <w:t>Utility navigation is for accessing universal features.</w:t>
+      </w:r>
+    </w:p>
+    <w:p>
+      <w:r>
+        <w:t>Examples of features include:</w:t>
+      </w:r>
+    </w:p>
+    <w:p>
+      <w:pPr>
+        <w:pStyle w:val="ListParagraph"/>
+        <w:numPr>
+          <w:ilvl w:val="0"/>
+          <w:numId w:val="157"/>
+        </w:numPr>
+      </w:pPr>
+      <w:r>
+        <w:t>Notifications</w:t>
+      </w:r>
+    </w:p>
+    <w:p>
+      <w:pPr>
+        <w:pStyle w:val="ListParagraph"/>
+        <w:numPr>
+          <w:ilvl w:val="0"/>
+          <w:numId w:val="157"/>
+        </w:numPr>
+      </w:pPr>
+      <w:r>
+        <w:t>User profile</w:t>
+      </w:r>
+    </w:p>
+    <w:p>
+      <w:pPr>
+        <w:pStyle w:val="ListParagraph"/>
+        <w:numPr>
+          <w:ilvl w:val="0"/>
+          <w:numId w:val="157"/>
+        </w:numPr>
+      </w:pPr>
+      <w:r>
+        <w:t>Settings</w:t>
+      </w:r>
+    </w:p>
+    <w:p>
+      <w:pPr>
+        <w:pStyle w:val="ListParagraph"/>
+        <w:numPr>
+          <w:ilvl w:val="0"/>
+          <w:numId w:val="157"/>
+        </w:numPr>
+      </w:pPr>
+      <w:r>
+        <w:t>Help center</w:t>
+      </w:r>
+    </w:p>
+    <w:p>
+      <w:pPr>
+        <w:pStyle w:val="ListParagraph"/>
+        <w:numPr>
+          <w:ilvl w:val="0"/>
+          <w:numId w:val="157"/>
+        </w:numPr>
+      </w:pPr>
+      <w:r>
+        <w:t>Log out</w:t>
+      </w:r>
+    </w:p>
+    <w:p>
+      <w:pPr>
+        <w:pStyle w:val="Heading4"/>
+      </w:pPr>
+      <w:r>
+        <w:t>Information Architecture Benefits</w:t>
+      </w:r>
+    </w:p>
+    <w:p>
+      <w:r>
+        <w:t>Advantages offered by the chosen information architecture include:</w:t>
+      </w:r>
+    </w:p>
+    <w:p>
+      <w:pPr>
+        <w:pStyle w:val="ListParagraph"/>
+        <w:numPr>
+          <w:ilvl w:val="0"/>
+          <w:numId w:val="160"/>
+        </w:numPr>
+      </w:pPr>
+      <w:r>
+        <w:t>Improves the effectiveness of navigation due to proper arrangement of functionalities.</w:t>
+      </w:r>
+    </w:p>
+    <w:p>
+      <w:pPr>
+        <w:pStyle w:val="ListParagraph"/>
+        <w:numPr>
+          <w:ilvl w:val="0"/>
+          <w:numId w:val="160"/>
+        </w:numPr>
+      </w:pPr>
+      <w:r>
+        <w:t>Minimizes cognitive load using simpler menu options.</w:t>
+      </w:r>
+    </w:p>
+    <w:p>
+      <w:pPr>
+        <w:pStyle w:val="ListParagraph"/>
+        <w:numPr>
+          <w:ilvl w:val="0"/>
+          <w:numId w:val="160"/>
+        </w:numPr>
+      </w:pPr>
+      <w:r>
+        <w:t>Facilitates completion of tasks without having to navigate too much.</w:t>
+      </w:r>
+    </w:p>
+    <w:p>
+      <w:pPr>
+        <w:pStyle w:val="ListParagraph"/>
+        <w:numPr>
+          <w:ilvl w:val="0"/>
+          <w:numId w:val="160"/>
+        </w:numPr>
+      </w:pPr>
+      <w:r>
+        <w:t>Allows development of interface based on roles for different stakeholders.</w:t>
+      </w:r>
+    </w:p>
+    <w:p>
+      <w:pPr>
+        <w:pStyle w:val="ListParagraph"/>
+        <w:numPr>
+          <w:ilvl w:val="0"/>
+          <w:numId w:val="160"/>
+        </w:numPr>
+      </w:pPr>
+      <w:r>
+        <w:t>Increases consistency in desktop and mobile versions.</w:t>
+      </w:r>
+    </w:p>
+    <w:p>
+      <w:pPr>
+        <w:pStyle w:val="ListParagraph"/>
+        <w:numPr>
+          <w:ilvl w:val="0"/>
+          <w:numId w:val="160"/>
+        </w:numPr>
+      </w:pPr>
+      <w:r>
+        <w:t>Helps in future extension of systems due to modularity.</w:t>
+      </w:r>
+    </w:p>
+    <w:p>
+      <w:pPr>
+        <w:pStyle w:val="ListParagraph"/>
+        <w:numPr>
+          <w:ilvl w:val="0"/>
+          <w:numId w:val="160"/>
+        </w:numPr>
+      </w:pPr>
+      <w:r>
+        <w:t>Increases usability by bundling similar functionalities.</w:t>
+      </w:r>
+    </w:p>
+    <w:p>
+      <w:pPr>
+        <w:spacing w:line="278" w:lineRule="auto"/>
+      </w:pPr>
+      <w:r>
+        <w:br w:type="page"/>
+      </w:r>
+    </w:p>
+    <w:p/>
     <w:sectPr>
-      <w:headerReference w:type="default" r:id="rId9"/>
-      <w:footerReference w:type="default" r:id="rId10"/>
+      <w:headerReference w:type="default" r:id="rId12"/>
+      <w:footerReference w:type="default" r:id="rId13"/>
       <w:pgSz w:w="11906" w:h="16838" w:code="9"/>
       <w:pgMar w:top="1411" w:right="850" w:bottom="1411" w:left="1699" w:header="720" w:footer="288" w:gutter="0"/>
       <w:pgNumType w:start="1"/>
@@ -5014,6 +5958,119 @@
     </w:lvl>
   </w:abstractNum>
   <w:abstractNum w:abstractNumId="5" w15:restartNumberingAfterBreak="0">
+    <w:nsid w:val="0A3F340C"/>
+    <w:multiLevelType w:val="hybridMultilevel"/>
+    <w:tmpl w:val="BA26F584"/>
+    <w:lvl w:ilvl="0" w:tplc="28E6576C">
+      <w:start w:val="3"/>
+      <w:numFmt w:val="bullet"/>
+      <w:lvlText w:val="-"/>
+      <w:lvlJc w:val="left"/>
+      <w:pPr>
+        <w:ind w:left="720" w:hanging="360"/>
+      </w:pPr>
+      <w:rPr>
+        <w:rFonts w:ascii="Times New Roman" w:eastAsiaTheme="minorHAnsi" w:hAnsi="Times New Roman" w:cs="Times New Roman" w:hint="default"/>
+      </w:rPr>
+    </w:lvl>
+    <w:lvl w:ilvl="1" w:tplc="04090003" w:tentative="1">
+      <w:start w:val="1"/>
+      <w:numFmt w:val="bullet"/>
+      <w:lvlText w:val="o"/>
+      <w:lvlJc w:val="left"/>
+      <w:pPr>
+        <w:ind w:left="1440" w:hanging="360"/>
+      </w:pPr>
+      <w:rPr>
+        <w:rFonts w:ascii="Courier New" w:hAnsi="Courier New" w:cs="Courier New" w:hint="default"/>
+      </w:rPr>
+    </w:lvl>
+    <w:lvl w:ilvl="2" w:tplc="04090005" w:tentative="1">
+      <w:start w:val="1"/>
+      <w:numFmt w:val="bullet"/>
+      <w:lvlText w:val=""/>
+      <w:lvlJc w:val="left"/>
+      <w:pPr>
+        <w:ind w:left="2160" w:hanging="360"/>
+      </w:pPr>
+      <w:rPr>
+        <w:rFonts w:ascii="Wingdings" w:hAnsi="Wingdings" w:hint="default"/>
+      </w:rPr>
+    </w:lvl>
+    <w:lvl w:ilvl="3" w:tplc="04090001" w:tentative="1">
+      <w:start w:val="1"/>
+      <w:numFmt w:val="bullet"/>
+      <w:lvlText w:val=""/>
+      <w:lvlJc w:val="left"/>
+      <w:pPr>
+        <w:ind w:left="2880" w:hanging="360"/>
+      </w:pPr>
+      <w:rPr>
+        <w:rFonts w:ascii="Symbol" w:hAnsi="Symbol" w:hint="default"/>
+      </w:rPr>
+    </w:lvl>
+    <w:lvl w:ilvl="4" w:tplc="04090003" w:tentative="1">
+      <w:start w:val="1"/>
+      <w:numFmt w:val="bullet"/>
+      <w:lvlText w:val="o"/>
+      <w:lvlJc w:val="left"/>
+      <w:pPr>
+        <w:ind w:left="3600" w:hanging="360"/>
+      </w:pPr>
+      <w:rPr>
+        <w:rFonts w:ascii="Courier New" w:hAnsi="Courier New" w:cs="Courier New" w:hint="default"/>
+      </w:rPr>
+    </w:lvl>
+    <w:lvl w:ilvl="5" w:tplc="04090005" w:tentative="1">
+      <w:start w:val="1"/>
+      <w:numFmt w:val="bullet"/>
+      <w:lvlText w:val=""/>
+      <w:lvlJc w:val="left"/>
+      <w:pPr>
+        <w:ind w:left="4320" w:hanging="360"/>
+      </w:pPr>
+      <w:rPr>
+        <w:rFonts w:ascii="Wingdings" w:hAnsi="Wingdings" w:hint="default"/>
+      </w:rPr>
+    </w:lvl>
+    <w:lvl w:ilvl="6" w:tplc="04090001" w:tentative="1">
+      <w:start w:val="1"/>
+      <w:numFmt w:val="bullet"/>
+      <w:lvlText w:val=""/>
+      <w:lvlJc w:val="left"/>
+      <w:pPr>
+        <w:ind w:left="5040" w:hanging="360"/>
+      </w:pPr>
+      <w:rPr>
+        <w:rFonts w:ascii="Symbol" w:hAnsi="Symbol" w:hint="default"/>
+      </w:rPr>
+    </w:lvl>
+    <w:lvl w:ilvl="7" w:tplc="04090003" w:tentative="1">
+      <w:start w:val="1"/>
+      <w:numFmt w:val="bullet"/>
+      <w:lvlText w:val="o"/>
+      <w:lvlJc w:val="left"/>
+      <w:pPr>
+        <w:ind w:left="5760" w:hanging="360"/>
+      </w:pPr>
+      <w:rPr>
+        <w:rFonts w:ascii="Courier New" w:hAnsi="Courier New" w:cs="Courier New" w:hint="default"/>
+      </w:rPr>
+    </w:lvl>
+    <w:lvl w:ilvl="8" w:tplc="04090005" w:tentative="1">
+      <w:start w:val="1"/>
+      <w:numFmt w:val="bullet"/>
+      <w:lvlText w:val=""/>
+      <w:lvlJc w:val="left"/>
+      <w:pPr>
+        <w:ind w:left="6480" w:hanging="360"/>
+      </w:pPr>
+      <w:rPr>
+        <w:rFonts w:ascii="Wingdings" w:hAnsi="Wingdings" w:hint="default"/>
+      </w:rPr>
+    </w:lvl>
+  </w:abstractNum>
+  <w:abstractNum w:abstractNumId="6" w15:restartNumberingAfterBreak="0">
     <w:nsid w:val="0B782C17"/>
     <w:multiLevelType w:val="hybridMultilevel"/>
     <w:tmpl w:val="18A01304"/>
@@ -5126,7 +6183,7 @@
       </w:rPr>
     </w:lvl>
   </w:abstractNum>
-  <w:abstractNum w:abstractNumId="6" w15:restartNumberingAfterBreak="0">
+  <w:abstractNum w:abstractNumId="7" w15:restartNumberingAfterBreak="0">
     <w:nsid w:val="0C1B283C"/>
     <w:multiLevelType w:val="multilevel"/>
     <w:tmpl w:val="63F4E6F0"/>
@@ -5275,7 +6332,7 @@
       </w:rPr>
     </w:lvl>
   </w:abstractNum>
-  <w:abstractNum w:abstractNumId="7" w15:restartNumberingAfterBreak="0">
+  <w:abstractNum w:abstractNumId="8" w15:restartNumberingAfterBreak="0">
     <w:nsid w:val="0C6E0690"/>
     <w:multiLevelType w:val="hybridMultilevel"/>
     <w:tmpl w:val="54D4A188"/>
@@ -5387,7 +6444,7 @@
       </w:rPr>
     </w:lvl>
   </w:abstractNum>
-  <w:abstractNum w:abstractNumId="8" w15:restartNumberingAfterBreak="0">
+  <w:abstractNum w:abstractNumId="9" w15:restartNumberingAfterBreak="0">
     <w:nsid w:val="0F4F06D8"/>
     <w:multiLevelType w:val="multilevel"/>
     <w:tmpl w:val="68E44DE0"/>
@@ -5536,7 +6593,7 @@
       </w:rPr>
     </w:lvl>
   </w:abstractNum>
-  <w:abstractNum w:abstractNumId="9" w15:restartNumberingAfterBreak="0">
+  <w:abstractNum w:abstractNumId="10" w15:restartNumberingAfterBreak="0">
     <w:nsid w:val="0FDE792A"/>
     <w:multiLevelType w:val="hybridMultilevel"/>
     <w:tmpl w:val="43823D74"/>
@@ -5648,7 +6705,120 @@
       </w:rPr>
     </w:lvl>
   </w:abstractNum>
-  <w:abstractNum w:abstractNumId="10" w15:restartNumberingAfterBreak="0">
+  <w:abstractNum w:abstractNumId="11" w15:restartNumberingAfterBreak="0">
+    <w:nsid w:val="12200A49"/>
+    <w:multiLevelType w:val="hybridMultilevel"/>
+    <w:tmpl w:val="5FF22F2A"/>
+    <w:lvl w:ilvl="0" w:tplc="04090005">
+      <w:start w:val="1"/>
+      <w:numFmt w:val="bullet"/>
+      <w:lvlText w:val=""/>
+      <w:lvlJc w:val="left"/>
+      <w:pPr>
+        <w:ind w:left="720" w:hanging="360"/>
+      </w:pPr>
+      <w:rPr>
+        <w:rFonts w:ascii="Wingdings" w:hAnsi="Wingdings" w:hint="default"/>
+      </w:rPr>
+    </w:lvl>
+    <w:lvl w:ilvl="1" w:tplc="FFFFFFFF" w:tentative="1">
+      <w:start w:val="1"/>
+      <w:numFmt w:val="bullet"/>
+      <w:lvlText w:val="o"/>
+      <w:lvlJc w:val="left"/>
+      <w:pPr>
+        <w:ind w:left="1440" w:hanging="360"/>
+      </w:pPr>
+      <w:rPr>
+        <w:rFonts w:ascii="Courier New" w:hAnsi="Courier New" w:cs="Courier New" w:hint="default"/>
+      </w:rPr>
+    </w:lvl>
+    <w:lvl w:ilvl="2" w:tplc="FFFFFFFF" w:tentative="1">
+      <w:start w:val="1"/>
+      <w:numFmt w:val="bullet"/>
+      <w:lvlText w:val=""/>
+      <w:lvlJc w:val="left"/>
+      <w:pPr>
+        <w:ind w:left="2160" w:hanging="360"/>
+      </w:pPr>
+      <w:rPr>
+        <w:rFonts w:ascii="Wingdings" w:hAnsi="Wingdings" w:hint="default"/>
+      </w:rPr>
+    </w:lvl>
+    <w:lvl w:ilvl="3" w:tplc="FFFFFFFF" w:tentative="1">
+      <w:start w:val="1"/>
+      <w:numFmt w:val="bullet"/>
+      <w:lvlText w:val=""/>
+      <w:lvlJc w:val="left"/>
+      <w:pPr>
+        <w:ind w:left="2880" w:hanging="360"/>
+      </w:pPr>
+      <w:rPr>
+        <w:rFonts w:ascii="Symbol" w:hAnsi="Symbol" w:hint="default"/>
+      </w:rPr>
+    </w:lvl>
+    <w:lvl w:ilvl="4" w:tplc="FFFFFFFF" w:tentative="1">
+      <w:start w:val="1"/>
+      <w:numFmt w:val="bullet"/>
+      <w:lvlText w:val="o"/>
+      <w:lvlJc w:val="left"/>
+      <w:pPr>
+        <w:ind w:left="3600" w:hanging="360"/>
+      </w:pPr>
+      <w:rPr>
+        <w:rFonts w:ascii="Courier New" w:hAnsi="Courier New" w:cs="Courier New" w:hint="default"/>
+      </w:rPr>
+    </w:lvl>
+    <w:lvl w:ilvl="5" w:tplc="FFFFFFFF" w:tentative="1">
+      <w:start w:val="1"/>
+      <w:numFmt w:val="bullet"/>
+      <w:lvlText w:val=""/>
+      <w:lvlJc w:val="left"/>
+      <w:pPr>
+        <w:ind w:left="4320" w:hanging="360"/>
+      </w:pPr>
+      <w:rPr>
+        <w:rFonts w:ascii="Wingdings" w:hAnsi="Wingdings" w:hint="default"/>
+      </w:rPr>
+    </w:lvl>
+    <w:lvl w:ilvl="6" w:tplc="FFFFFFFF" w:tentative="1">
+      <w:start w:val="1"/>
+      <w:numFmt w:val="bullet"/>
+      <w:lvlText w:val=""/>
+      <w:lvlJc w:val="left"/>
+      <w:pPr>
+        <w:ind w:left="5040" w:hanging="360"/>
+      </w:pPr>
+      <w:rPr>
+        <w:rFonts w:ascii="Symbol" w:hAnsi="Symbol" w:hint="default"/>
+      </w:rPr>
+    </w:lvl>
+    <w:lvl w:ilvl="7" w:tplc="FFFFFFFF" w:tentative="1">
+      <w:start w:val="1"/>
+      <w:numFmt w:val="bullet"/>
+      <w:lvlText w:val="o"/>
+      <w:lvlJc w:val="left"/>
+      <w:pPr>
+        <w:ind w:left="5760" w:hanging="360"/>
+      </w:pPr>
+      <w:rPr>
+        <w:rFonts w:ascii="Courier New" w:hAnsi="Courier New" w:cs="Courier New" w:hint="default"/>
+      </w:rPr>
+    </w:lvl>
+    <w:lvl w:ilvl="8" w:tplc="FFFFFFFF" w:tentative="1">
+      <w:start w:val="1"/>
+      <w:numFmt w:val="bullet"/>
+      <w:lvlText w:val=""/>
+      <w:lvlJc w:val="left"/>
+      <w:pPr>
+        <w:ind w:left="6480" w:hanging="360"/>
+      </w:pPr>
+      <w:rPr>
+        <w:rFonts w:ascii="Wingdings" w:hAnsi="Wingdings" w:hint="default"/>
+      </w:rPr>
+    </w:lvl>
+  </w:abstractNum>
+  <w:abstractNum w:abstractNumId="12" w15:restartNumberingAfterBreak="0">
     <w:nsid w:val="12201BE9"/>
     <w:multiLevelType w:val="multilevel"/>
     <w:tmpl w:val="CED6A096"/>
@@ -5797,7 +6967,7 @@
       </w:rPr>
     </w:lvl>
   </w:abstractNum>
-  <w:abstractNum w:abstractNumId="11" w15:restartNumberingAfterBreak="0">
+  <w:abstractNum w:abstractNumId="13" w15:restartNumberingAfterBreak="0">
     <w:nsid w:val="135C5CF3"/>
     <w:multiLevelType w:val="multilevel"/>
     <w:tmpl w:val="61D20A04"/>
@@ -5946,7 +7116,7 @@
       </w:rPr>
     </w:lvl>
   </w:abstractNum>
-  <w:abstractNum w:abstractNumId="12" w15:restartNumberingAfterBreak="0">
+  <w:abstractNum w:abstractNumId="14" w15:restartNumberingAfterBreak="0">
     <w:nsid w:val="137648CC"/>
     <w:multiLevelType w:val="multilevel"/>
     <w:tmpl w:val="EC983E9E"/>
@@ -6095,7 +7265,120 @@
       </w:rPr>
     </w:lvl>
   </w:abstractNum>
-  <w:abstractNum w:abstractNumId="13" w15:restartNumberingAfterBreak="0">
+  <w:abstractNum w:abstractNumId="15" w15:restartNumberingAfterBreak="0">
+    <w:nsid w:val="15230D18"/>
+    <w:multiLevelType w:val="hybridMultilevel"/>
+    <w:tmpl w:val="D766203A"/>
+    <w:lvl w:ilvl="0" w:tplc="04090005">
+      <w:start w:val="1"/>
+      <w:numFmt w:val="bullet"/>
+      <w:lvlText w:val=""/>
+      <w:lvlJc w:val="left"/>
+      <w:pPr>
+        <w:ind w:left="720" w:hanging="360"/>
+      </w:pPr>
+      <w:rPr>
+        <w:rFonts w:ascii="Wingdings" w:hAnsi="Wingdings" w:hint="default"/>
+      </w:rPr>
+    </w:lvl>
+    <w:lvl w:ilvl="1" w:tplc="FFFFFFFF" w:tentative="1">
+      <w:start w:val="1"/>
+      <w:numFmt w:val="bullet"/>
+      <w:lvlText w:val="o"/>
+      <w:lvlJc w:val="left"/>
+      <w:pPr>
+        <w:ind w:left="1440" w:hanging="360"/>
+      </w:pPr>
+      <w:rPr>
+        <w:rFonts w:ascii="Courier New" w:hAnsi="Courier New" w:cs="Courier New" w:hint="default"/>
+      </w:rPr>
+    </w:lvl>
+    <w:lvl w:ilvl="2" w:tplc="FFFFFFFF" w:tentative="1">
+      <w:start w:val="1"/>
+      <w:numFmt w:val="bullet"/>
+      <w:lvlText w:val=""/>
+      <w:lvlJc w:val="left"/>
+      <w:pPr>
+        <w:ind w:left="2160" w:hanging="360"/>
+      </w:pPr>
+      <w:rPr>
+        <w:rFonts w:ascii="Wingdings" w:hAnsi="Wingdings" w:hint="default"/>
+      </w:rPr>
+    </w:lvl>
+    <w:lvl w:ilvl="3" w:tplc="FFFFFFFF" w:tentative="1">
+      <w:start w:val="1"/>
+      <w:numFmt w:val="bullet"/>
+      <w:lvlText w:val=""/>
+      <w:lvlJc w:val="left"/>
+      <w:pPr>
+        <w:ind w:left="2880" w:hanging="360"/>
+      </w:pPr>
+      <w:rPr>
+        <w:rFonts w:ascii="Symbol" w:hAnsi="Symbol" w:hint="default"/>
+      </w:rPr>
+    </w:lvl>
+    <w:lvl w:ilvl="4" w:tplc="FFFFFFFF" w:tentative="1">
+      <w:start w:val="1"/>
+      <w:numFmt w:val="bullet"/>
+      <w:lvlText w:val="o"/>
+      <w:lvlJc w:val="left"/>
+      <w:pPr>
+        <w:ind w:left="3600" w:hanging="360"/>
+      </w:pPr>
+      <w:rPr>
+        <w:rFonts w:ascii="Courier New" w:hAnsi="Courier New" w:cs="Courier New" w:hint="default"/>
+      </w:rPr>
+    </w:lvl>
+    <w:lvl w:ilvl="5" w:tplc="FFFFFFFF" w:tentative="1">
+      <w:start w:val="1"/>
+      <w:numFmt w:val="bullet"/>
+      <w:lvlText w:val=""/>
+      <w:lvlJc w:val="left"/>
+      <w:pPr>
+        <w:ind w:left="4320" w:hanging="360"/>
+      </w:pPr>
+      <w:rPr>
+        <w:rFonts w:ascii="Wingdings" w:hAnsi="Wingdings" w:hint="default"/>
+      </w:rPr>
+    </w:lvl>
+    <w:lvl w:ilvl="6" w:tplc="FFFFFFFF" w:tentative="1">
+      <w:start w:val="1"/>
+      <w:numFmt w:val="bullet"/>
+      <w:lvlText w:val=""/>
+      <w:lvlJc w:val="left"/>
+      <w:pPr>
+        <w:ind w:left="5040" w:hanging="360"/>
+      </w:pPr>
+      <w:rPr>
+        <w:rFonts w:ascii="Symbol" w:hAnsi="Symbol" w:hint="default"/>
+      </w:rPr>
+    </w:lvl>
+    <w:lvl w:ilvl="7" w:tplc="FFFFFFFF" w:tentative="1">
+      <w:start w:val="1"/>
+      <w:numFmt w:val="bullet"/>
+      <w:lvlText w:val="o"/>
+      <w:lvlJc w:val="left"/>
+      <w:pPr>
+        <w:ind w:left="5760" w:hanging="360"/>
+      </w:pPr>
+      <w:rPr>
+        <w:rFonts w:ascii="Courier New" w:hAnsi="Courier New" w:cs="Courier New" w:hint="default"/>
+      </w:rPr>
+    </w:lvl>
+    <w:lvl w:ilvl="8" w:tplc="FFFFFFFF" w:tentative="1">
+      <w:start w:val="1"/>
+      <w:numFmt w:val="bullet"/>
+      <w:lvlText w:val=""/>
+      <w:lvlJc w:val="left"/>
+      <w:pPr>
+        <w:ind w:left="6480" w:hanging="360"/>
+      </w:pPr>
+      <w:rPr>
+        <w:rFonts w:ascii="Wingdings" w:hAnsi="Wingdings" w:hint="default"/>
+      </w:rPr>
+    </w:lvl>
+  </w:abstractNum>
+  <w:abstractNum w:abstractNumId="16" w15:restartNumberingAfterBreak="0">
     <w:nsid w:val="15354085"/>
     <w:multiLevelType w:val="multilevel"/>
     <w:tmpl w:val="ED488EA0"/>
@@ -6244,7 +7527,7 @@
       </w:rPr>
     </w:lvl>
   </w:abstractNum>
-  <w:abstractNum w:abstractNumId="14" w15:restartNumberingAfterBreak="0">
+  <w:abstractNum w:abstractNumId="17" w15:restartNumberingAfterBreak="0">
     <w:nsid w:val="15923962"/>
     <w:multiLevelType w:val="hybridMultilevel"/>
     <w:tmpl w:val="2A8A437A"/>
@@ -6356,7 +7639,7 @@
       </w:rPr>
     </w:lvl>
   </w:abstractNum>
-  <w:abstractNum w:abstractNumId="15" w15:restartNumberingAfterBreak="0">
+  <w:abstractNum w:abstractNumId="18" w15:restartNumberingAfterBreak="0">
     <w:nsid w:val="15E231DD"/>
     <w:multiLevelType w:val="hybridMultilevel"/>
     <w:tmpl w:val="48B4AB8E"/>
@@ -6469,7 +7752,7 @@
       </w:rPr>
     </w:lvl>
   </w:abstractNum>
-  <w:abstractNum w:abstractNumId="16" w15:restartNumberingAfterBreak="0">
+  <w:abstractNum w:abstractNumId="19" w15:restartNumberingAfterBreak="0">
     <w:nsid w:val="15FB6E59"/>
     <w:multiLevelType w:val="multilevel"/>
     <w:tmpl w:val="63F4E6F0"/>
@@ -6618,7 +7901,7 @@
       </w:rPr>
     </w:lvl>
   </w:abstractNum>
-  <w:abstractNum w:abstractNumId="17" w15:restartNumberingAfterBreak="0">
+  <w:abstractNum w:abstractNumId="20" w15:restartNumberingAfterBreak="0">
     <w:nsid w:val="16057B40"/>
     <w:multiLevelType w:val="hybridMultilevel"/>
     <w:tmpl w:val="C63C7D68"/>
@@ -6730,7 +8013,7 @@
       </w:rPr>
     </w:lvl>
   </w:abstractNum>
-  <w:abstractNum w:abstractNumId="18" w15:restartNumberingAfterBreak="0">
+  <w:abstractNum w:abstractNumId="21" w15:restartNumberingAfterBreak="0">
     <w:nsid w:val="18441B3D"/>
     <w:multiLevelType w:val="hybridMultilevel"/>
     <w:tmpl w:val="F162D252"/>
@@ -6842,7 +8125,7 @@
       </w:rPr>
     </w:lvl>
   </w:abstractNum>
-  <w:abstractNum w:abstractNumId="19" w15:restartNumberingAfterBreak="0">
+  <w:abstractNum w:abstractNumId="22" w15:restartNumberingAfterBreak="0">
     <w:nsid w:val="185230B0"/>
     <w:multiLevelType w:val="hybridMultilevel"/>
     <w:tmpl w:val="FDFE89EE"/>
@@ -6955,7 +8238,7 @@
       </w:rPr>
     </w:lvl>
   </w:abstractNum>
-  <w:abstractNum w:abstractNumId="20" w15:restartNumberingAfterBreak="0">
+  <w:abstractNum w:abstractNumId="23" w15:restartNumberingAfterBreak="0">
     <w:nsid w:val="18A93E35"/>
     <w:multiLevelType w:val="hybridMultilevel"/>
     <w:tmpl w:val="7A6E3062"/>
@@ -7067,7 +8350,7 @@
       </w:rPr>
     </w:lvl>
   </w:abstractNum>
-  <w:abstractNum w:abstractNumId="21" w15:restartNumberingAfterBreak="0">
+  <w:abstractNum w:abstractNumId="24" w15:restartNumberingAfterBreak="0">
     <w:nsid w:val="18EC3D82"/>
     <w:multiLevelType w:val="hybridMultilevel"/>
     <w:tmpl w:val="BC5A743C"/>
@@ -7180,7 +8463,7 @@
       </w:rPr>
     </w:lvl>
   </w:abstractNum>
-  <w:abstractNum w:abstractNumId="22" w15:restartNumberingAfterBreak="0">
+  <w:abstractNum w:abstractNumId="25" w15:restartNumberingAfterBreak="0">
     <w:nsid w:val="18F46E01"/>
     <w:multiLevelType w:val="multilevel"/>
     <w:tmpl w:val="C77EDED0"/>
@@ -7329,7 +8612,7 @@
       </w:rPr>
     </w:lvl>
   </w:abstractNum>
-  <w:abstractNum w:abstractNumId="23" w15:restartNumberingAfterBreak="0">
+  <w:abstractNum w:abstractNumId="26" w15:restartNumberingAfterBreak="0">
     <w:nsid w:val="19C83C12"/>
     <w:multiLevelType w:val="multilevel"/>
     <w:tmpl w:val="7690D588"/>
@@ -7478,7 +8761,7 @@
       </w:rPr>
     </w:lvl>
   </w:abstractNum>
-  <w:abstractNum w:abstractNumId="24" w15:restartNumberingAfterBreak="0">
+  <w:abstractNum w:abstractNumId="27" w15:restartNumberingAfterBreak="0">
     <w:nsid w:val="1A236A44"/>
     <w:multiLevelType w:val="hybridMultilevel"/>
     <w:tmpl w:val="E06C248C"/>
@@ -7591,7 +8874,7 @@
       </w:rPr>
     </w:lvl>
   </w:abstractNum>
-  <w:abstractNum w:abstractNumId="25" w15:restartNumberingAfterBreak="0">
+  <w:abstractNum w:abstractNumId="28" w15:restartNumberingAfterBreak="0">
     <w:nsid w:val="1C511176"/>
     <w:multiLevelType w:val="multilevel"/>
     <w:tmpl w:val="201E7F12"/>
@@ -7740,7 +9023,120 @@
       </w:rPr>
     </w:lvl>
   </w:abstractNum>
-  <w:abstractNum w:abstractNumId="26" w15:restartNumberingAfterBreak="0">
+  <w:abstractNum w:abstractNumId="29" w15:restartNumberingAfterBreak="0">
+    <w:nsid w:val="1D115B8F"/>
+    <w:multiLevelType w:val="hybridMultilevel"/>
+    <w:tmpl w:val="96D2682E"/>
+    <w:lvl w:ilvl="0" w:tplc="DCFA213E">
+      <w:start w:val="3"/>
+      <w:numFmt w:val="bullet"/>
+      <w:lvlText w:val="-"/>
+      <w:lvlJc w:val="left"/>
+      <w:pPr>
+        <w:ind w:left="720" w:hanging="360"/>
+      </w:pPr>
+      <w:rPr>
+        <w:rFonts w:ascii="Times New Roman" w:eastAsiaTheme="minorHAnsi" w:hAnsi="Times New Roman" w:cs="Times New Roman" w:hint="default"/>
+      </w:rPr>
+    </w:lvl>
+    <w:lvl w:ilvl="1" w:tplc="04090003" w:tentative="1">
+      <w:start w:val="1"/>
+      <w:numFmt w:val="bullet"/>
+      <w:lvlText w:val="o"/>
+      <w:lvlJc w:val="left"/>
+      <w:pPr>
+        <w:ind w:left="1440" w:hanging="360"/>
+      </w:pPr>
+      <w:rPr>
+        <w:rFonts w:ascii="Courier New" w:hAnsi="Courier New" w:cs="Courier New" w:hint="default"/>
+      </w:rPr>
+    </w:lvl>
+    <w:lvl w:ilvl="2" w:tplc="04090005" w:tentative="1">
+      <w:start w:val="1"/>
+      <w:numFmt w:val="bullet"/>
+      <w:lvlText w:val=""/>
+      <w:lvlJc w:val="left"/>
+      <w:pPr>
+        <w:ind w:left="2160" w:hanging="360"/>
+      </w:pPr>
+      <w:rPr>
+        <w:rFonts w:ascii="Wingdings" w:hAnsi="Wingdings" w:hint="default"/>
+      </w:rPr>
+    </w:lvl>
+    <w:lvl w:ilvl="3" w:tplc="04090001" w:tentative="1">
+      <w:start w:val="1"/>
+      <w:numFmt w:val="bullet"/>
+      <w:lvlText w:val=""/>
+      <w:lvlJc w:val="left"/>
+      <w:pPr>
+        <w:ind w:left="2880" w:hanging="360"/>
+      </w:pPr>
+      <w:rPr>
+        <w:rFonts w:ascii="Symbol" w:hAnsi="Symbol" w:hint="default"/>
+      </w:rPr>
+    </w:lvl>
+    <w:lvl w:ilvl="4" w:tplc="04090003" w:tentative="1">
+      <w:start w:val="1"/>
+      <w:numFmt w:val="bullet"/>
+      <w:lvlText w:val="o"/>
+      <w:lvlJc w:val="left"/>
+      <w:pPr>
+        <w:ind w:left="3600" w:hanging="360"/>
+      </w:pPr>
+      <w:rPr>
+        <w:rFonts w:ascii="Courier New" w:hAnsi="Courier New" w:cs="Courier New" w:hint="default"/>
+      </w:rPr>
+    </w:lvl>
+    <w:lvl w:ilvl="5" w:tplc="04090005" w:tentative="1">
+      <w:start w:val="1"/>
+      <w:numFmt w:val="bullet"/>
+      <w:lvlText w:val=""/>
+      <w:lvlJc w:val="left"/>
+      <w:pPr>
+        <w:ind w:left="4320" w:hanging="360"/>
+      </w:pPr>
+      <w:rPr>
+        <w:rFonts w:ascii="Wingdings" w:hAnsi="Wingdings" w:hint="default"/>
+      </w:rPr>
+    </w:lvl>
+    <w:lvl w:ilvl="6" w:tplc="04090001" w:tentative="1">
+      <w:start w:val="1"/>
+      <w:numFmt w:val="bullet"/>
+      <w:lvlText w:val=""/>
+      <w:lvlJc w:val="left"/>
+      <w:pPr>
+        <w:ind w:left="5040" w:hanging="360"/>
+      </w:pPr>
+      <w:rPr>
+        <w:rFonts w:ascii="Symbol" w:hAnsi="Symbol" w:hint="default"/>
+      </w:rPr>
+    </w:lvl>
+    <w:lvl w:ilvl="7" w:tplc="04090003" w:tentative="1">
+      <w:start w:val="1"/>
+      <w:numFmt w:val="bullet"/>
+      <w:lvlText w:val="o"/>
+      <w:lvlJc w:val="left"/>
+      <w:pPr>
+        <w:ind w:left="5760" w:hanging="360"/>
+      </w:pPr>
+      <w:rPr>
+        <w:rFonts w:ascii="Courier New" w:hAnsi="Courier New" w:cs="Courier New" w:hint="default"/>
+      </w:rPr>
+    </w:lvl>
+    <w:lvl w:ilvl="8" w:tplc="04090005" w:tentative="1">
+      <w:start w:val="1"/>
+      <w:numFmt w:val="bullet"/>
+      <w:lvlText w:val=""/>
+      <w:lvlJc w:val="left"/>
+      <w:pPr>
+        <w:ind w:left="6480" w:hanging="360"/>
+      </w:pPr>
+      <w:rPr>
+        <w:rFonts w:ascii="Wingdings" w:hAnsi="Wingdings" w:hint="default"/>
+      </w:rPr>
+    </w:lvl>
+  </w:abstractNum>
+  <w:abstractNum w:abstractNumId="30" w15:restartNumberingAfterBreak="0">
     <w:nsid w:val="1D4C2E50"/>
     <w:multiLevelType w:val="multilevel"/>
     <w:tmpl w:val="63F4E6F0"/>
@@ -7889,7 +9285,120 @@
       </w:rPr>
     </w:lvl>
   </w:abstractNum>
-  <w:abstractNum w:abstractNumId="27" w15:restartNumberingAfterBreak="0">
+  <w:abstractNum w:abstractNumId="31" w15:restartNumberingAfterBreak="0">
+    <w:nsid w:val="1DF92343"/>
+    <w:multiLevelType w:val="hybridMultilevel"/>
+    <w:tmpl w:val="DAD22FBA"/>
+    <w:lvl w:ilvl="0" w:tplc="28E6576C">
+      <w:start w:val="3"/>
+      <w:numFmt w:val="bullet"/>
+      <w:lvlText w:val="-"/>
+      <w:lvlJc w:val="left"/>
+      <w:pPr>
+        <w:ind w:left="720" w:hanging="360"/>
+      </w:pPr>
+      <w:rPr>
+        <w:rFonts w:ascii="Times New Roman" w:eastAsiaTheme="minorHAnsi" w:hAnsi="Times New Roman" w:cs="Times New Roman" w:hint="default"/>
+      </w:rPr>
+    </w:lvl>
+    <w:lvl w:ilvl="1" w:tplc="04090003" w:tentative="1">
+      <w:start w:val="1"/>
+      <w:numFmt w:val="bullet"/>
+      <w:lvlText w:val="o"/>
+      <w:lvlJc w:val="left"/>
+      <w:pPr>
+        <w:ind w:left="1440" w:hanging="360"/>
+      </w:pPr>
+      <w:rPr>
+        <w:rFonts w:ascii="Courier New" w:hAnsi="Courier New" w:cs="Courier New" w:hint="default"/>
+      </w:rPr>
+    </w:lvl>
+    <w:lvl w:ilvl="2" w:tplc="04090005" w:tentative="1">
+      <w:start w:val="1"/>
+      <w:numFmt w:val="bullet"/>
+      <w:lvlText w:val=""/>
+      <w:lvlJc w:val="left"/>
+      <w:pPr>
+        <w:ind w:left="2160" w:hanging="360"/>
+      </w:pPr>
+      <w:rPr>
+        <w:rFonts w:ascii="Wingdings" w:hAnsi="Wingdings" w:hint="default"/>
+      </w:rPr>
+    </w:lvl>
+    <w:lvl w:ilvl="3" w:tplc="04090001" w:tentative="1">
+      <w:start w:val="1"/>
+      <w:numFmt w:val="bullet"/>
+      <w:lvlText w:val=""/>
+      <w:lvlJc w:val="left"/>
+      <w:pPr>
+        <w:ind w:left="2880" w:hanging="360"/>
+      </w:pPr>
+      <w:rPr>
+        <w:rFonts w:ascii="Symbol" w:hAnsi="Symbol" w:hint="default"/>
+      </w:rPr>
+    </w:lvl>
+    <w:lvl w:ilvl="4" w:tplc="04090003" w:tentative="1">
+      <w:start w:val="1"/>
+      <w:numFmt w:val="bullet"/>
+      <w:lvlText w:val="o"/>
+      <w:lvlJc w:val="left"/>
+      <w:pPr>
+        <w:ind w:left="3600" w:hanging="360"/>
+      </w:pPr>
+      <w:rPr>
+        <w:rFonts w:ascii="Courier New" w:hAnsi="Courier New" w:cs="Courier New" w:hint="default"/>
+      </w:rPr>
+    </w:lvl>
+    <w:lvl w:ilvl="5" w:tplc="04090005" w:tentative="1">
+      <w:start w:val="1"/>
+      <w:numFmt w:val="bullet"/>
+      <w:lvlText w:val=""/>
+      <w:lvlJc w:val="left"/>
+      <w:pPr>
+        <w:ind w:left="4320" w:hanging="360"/>
+      </w:pPr>
+      <w:rPr>
+        <w:rFonts w:ascii="Wingdings" w:hAnsi="Wingdings" w:hint="default"/>
+      </w:rPr>
+    </w:lvl>
+    <w:lvl w:ilvl="6" w:tplc="04090001" w:tentative="1">
+      <w:start w:val="1"/>
+      <w:numFmt w:val="bullet"/>
+      <w:lvlText w:val=""/>
+      <w:lvlJc w:val="left"/>
+      <w:pPr>
+        <w:ind w:left="5040" w:hanging="360"/>
+      </w:pPr>
+      <w:rPr>
+        <w:rFonts w:ascii="Symbol" w:hAnsi="Symbol" w:hint="default"/>
+      </w:rPr>
+    </w:lvl>
+    <w:lvl w:ilvl="7" w:tplc="04090003" w:tentative="1">
+      <w:start w:val="1"/>
+      <w:numFmt w:val="bullet"/>
+      <w:lvlText w:val="o"/>
+      <w:lvlJc w:val="left"/>
+      <w:pPr>
+        <w:ind w:left="5760" w:hanging="360"/>
+      </w:pPr>
+      <w:rPr>
+        <w:rFonts w:ascii="Courier New" w:hAnsi="Courier New" w:cs="Courier New" w:hint="default"/>
+      </w:rPr>
+    </w:lvl>
+    <w:lvl w:ilvl="8" w:tplc="04090005" w:tentative="1">
+      <w:start w:val="1"/>
+      <w:numFmt w:val="bullet"/>
+      <w:lvlText w:val=""/>
+      <w:lvlJc w:val="left"/>
+      <w:pPr>
+        <w:ind w:left="6480" w:hanging="360"/>
+      </w:pPr>
+      <w:rPr>
+        <w:rFonts w:ascii="Wingdings" w:hAnsi="Wingdings" w:hint="default"/>
+      </w:rPr>
+    </w:lvl>
+  </w:abstractNum>
+  <w:abstractNum w:abstractNumId="32" w15:restartNumberingAfterBreak="0">
     <w:nsid w:val="1EC4731F"/>
     <w:multiLevelType w:val="hybridMultilevel"/>
     <w:tmpl w:val="8E26D8F0"/>
@@ -8001,7 +9510,7 @@
       </w:rPr>
     </w:lvl>
   </w:abstractNum>
-  <w:abstractNum w:abstractNumId="28" w15:restartNumberingAfterBreak="0">
+  <w:abstractNum w:abstractNumId="33" w15:restartNumberingAfterBreak="0">
     <w:nsid w:val="20017871"/>
     <w:multiLevelType w:val="hybridMultilevel"/>
     <w:tmpl w:val="EA76608A"/>
@@ -8114,7 +9623,7 @@
       </w:rPr>
     </w:lvl>
   </w:abstractNum>
-  <w:abstractNum w:abstractNumId="29" w15:restartNumberingAfterBreak="0">
+  <w:abstractNum w:abstractNumId="34" w15:restartNumberingAfterBreak="0">
     <w:nsid w:val="206A32F9"/>
     <w:multiLevelType w:val="hybridMultilevel"/>
     <w:tmpl w:val="7A405CA6"/>
@@ -8226,7 +9735,7 @@
       </w:rPr>
     </w:lvl>
   </w:abstractNum>
-  <w:abstractNum w:abstractNumId="30" w15:restartNumberingAfterBreak="0">
+  <w:abstractNum w:abstractNumId="35" w15:restartNumberingAfterBreak="0">
     <w:nsid w:val="20786568"/>
     <w:multiLevelType w:val="hybridMultilevel"/>
     <w:tmpl w:val="200CC0BC"/>
@@ -8338,7 +9847,7 @@
       </w:rPr>
     </w:lvl>
   </w:abstractNum>
-  <w:abstractNum w:abstractNumId="31" w15:restartNumberingAfterBreak="0">
+  <w:abstractNum w:abstractNumId="36" w15:restartNumberingAfterBreak="0">
     <w:nsid w:val="207D21A1"/>
     <w:multiLevelType w:val="hybridMultilevel"/>
     <w:tmpl w:val="AAAE4260"/>
@@ -8450,7 +9959,7 @@
       </w:rPr>
     </w:lvl>
   </w:abstractNum>
-  <w:abstractNum w:abstractNumId="32" w15:restartNumberingAfterBreak="0">
+  <w:abstractNum w:abstractNumId="37" w15:restartNumberingAfterBreak="0">
     <w:nsid w:val="20DC5034"/>
     <w:multiLevelType w:val="hybridMultilevel"/>
     <w:tmpl w:val="4B5425EA"/>
@@ -8562,7 +10071,7 @@
       </w:rPr>
     </w:lvl>
   </w:abstractNum>
-  <w:abstractNum w:abstractNumId="33" w15:restartNumberingAfterBreak="0">
+  <w:abstractNum w:abstractNumId="38" w15:restartNumberingAfterBreak="0">
     <w:nsid w:val="224C7C45"/>
     <w:multiLevelType w:val="multilevel"/>
     <w:tmpl w:val="5C800264"/>
@@ -8711,7 +10220,7 @@
       </w:rPr>
     </w:lvl>
   </w:abstractNum>
-  <w:abstractNum w:abstractNumId="34" w15:restartNumberingAfterBreak="0">
+  <w:abstractNum w:abstractNumId="39" w15:restartNumberingAfterBreak="0">
     <w:nsid w:val="23970AD1"/>
     <w:multiLevelType w:val="hybridMultilevel"/>
     <w:tmpl w:val="6A1E8A04"/>
@@ -8823,7 +10332,7 @@
       </w:rPr>
     </w:lvl>
   </w:abstractNum>
-  <w:abstractNum w:abstractNumId="35" w15:restartNumberingAfterBreak="0">
+  <w:abstractNum w:abstractNumId="40" w15:restartNumberingAfterBreak="0">
     <w:nsid w:val="243D731E"/>
     <w:multiLevelType w:val="multilevel"/>
     <w:tmpl w:val="51303158"/>
@@ -8972,7 +10481,7 @@
       </w:rPr>
     </w:lvl>
   </w:abstractNum>
-  <w:abstractNum w:abstractNumId="36" w15:restartNumberingAfterBreak="0">
+  <w:abstractNum w:abstractNumId="41" w15:restartNumberingAfterBreak="0">
     <w:nsid w:val="25294576"/>
     <w:multiLevelType w:val="hybridMultilevel"/>
     <w:tmpl w:val="2C14800A"/>
@@ -9085,7 +10594,7 @@
       </w:rPr>
     </w:lvl>
   </w:abstractNum>
-  <w:abstractNum w:abstractNumId="37" w15:restartNumberingAfterBreak="0">
+  <w:abstractNum w:abstractNumId="42" w15:restartNumberingAfterBreak="0">
     <w:nsid w:val="256D132A"/>
     <w:multiLevelType w:val="hybridMultilevel"/>
     <w:tmpl w:val="4E26A0A4"/>
@@ -9198,7 +10707,7 @@
       </w:rPr>
     </w:lvl>
   </w:abstractNum>
-  <w:abstractNum w:abstractNumId="38" w15:restartNumberingAfterBreak="0">
+  <w:abstractNum w:abstractNumId="43" w15:restartNumberingAfterBreak="0">
     <w:nsid w:val="26BA6D3C"/>
     <w:multiLevelType w:val="hybridMultilevel"/>
     <w:tmpl w:val="F03CC954"/>
@@ -9310,7 +10819,7 @@
       </w:rPr>
     </w:lvl>
   </w:abstractNum>
-  <w:abstractNum w:abstractNumId="39" w15:restartNumberingAfterBreak="0">
+  <w:abstractNum w:abstractNumId="44" w15:restartNumberingAfterBreak="0">
     <w:nsid w:val="28765EA3"/>
     <w:multiLevelType w:val="hybridMultilevel"/>
     <w:tmpl w:val="1CFAEB30"/>
@@ -9423,7 +10932,7 @@
       </w:rPr>
     </w:lvl>
   </w:abstractNum>
-  <w:abstractNum w:abstractNumId="40" w15:restartNumberingAfterBreak="0">
+  <w:abstractNum w:abstractNumId="45" w15:restartNumberingAfterBreak="0">
     <w:nsid w:val="28940045"/>
     <w:multiLevelType w:val="multilevel"/>
     <w:tmpl w:val="23DE4804"/>
@@ -9572,7 +11081,7 @@
       </w:rPr>
     </w:lvl>
   </w:abstractNum>
-  <w:abstractNum w:abstractNumId="41" w15:restartNumberingAfterBreak="0">
+  <w:abstractNum w:abstractNumId="46" w15:restartNumberingAfterBreak="0">
     <w:nsid w:val="289938CC"/>
     <w:multiLevelType w:val="multilevel"/>
     <w:tmpl w:val="57745EE2"/>
@@ -9721,7 +11230,7 @@
       </w:rPr>
     </w:lvl>
   </w:abstractNum>
-  <w:abstractNum w:abstractNumId="42" w15:restartNumberingAfterBreak="0">
+  <w:abstractNum w:abstractNumId="47" w15:restartNumberingAfterBreak="0">
     <w:nsid w:val="2ADE3401"/>
     <w:multiLevelType w:val="multilevel"/>
     <w:tmpl w:val="63F4E6F0"/>
@@ -9870,7 +11379,7 @@
       </w:rPr>
     </w:lvl>
   </w:abstractNum>
-  <w:abstractNum w:abstractNumId="43" w15:restartNumberingAfterBreak="0">
+  <w:abstractNum w:abstractNumId="48" w15:restartNumberingAfterBreak="0">
     <w:nsid w:val="2B592B9C"/>
     <w:multiLevelType w:val="hybridMultilevel"/>
     <w:tmpl w:val="99D4C34E"/>
@@ -9983,7 +11492,7 @@
       </w:rPr>
     </w:lvl>
   </w:abstractNum>
-  <w:abstractNum w:abstractNumId="44" w15:restartNumberingAfterBreak="0">
+  <w:abstractNum w:abstractNumId="49" w15:restartNumberingAfterBreak="0">
     <w:nsid w:val="2B9413C9"/>
     <w:multiLevelType w:val="hybridMultilevel"/>
     <w:tmpl w:val="4F7A7546"/>
@@ -10095,7 +11604,7 @@
       </w:rPr>
     </w:lvl>
   </w:abstractNum>
-  <w:abstractNum w:abstractNumId="45" w15:restartNumberingAfterBreak="0">
+  <w:abstractNum w:abstractNumId="50" w15:restartNumberingAfterBreak="0">
     <w:nsid w:val="2B9539E3"/>
     <w:multiLevelType w:val="hybridMultilevel"/>
     <w:tmpl w:val="E6B8BBB6"/>
@@ -10207,7 +11716,120 @@
       </w:rPr>
     </w:lvl>
   </w:abstractNum>
-  <w:abstractNum w:abstractNumId="46" w15:restartNumberingAfterBreak="0">
+  <w:abstractNum w:abstractNumId="51" w15:restartNumberingAfterBreak="0">
+    <w:nsid w:val="2CF31303"/>
+    <w:multiLevelType w:val="hybridMultilevel"/>
+    <w:tmpl w:val="0194DB70"/>
+    <w:lvl w:ilvl="0" w:tplc="34480AE2">
+      <w:start w:val="3"/>
+      <w:numFmt w:val="bullet"/>
+      <w:lvlText w:val="-"/>
+      <w:lvlJc w:val="left"/>
+      <w:pPr>
+        <w:ind w:left="720" w:hanging="360"/>
+      </w:pPr>
+      <w:rPr>
+        <w:rFonts w:ascii="Times New Roman" w:eastAsiaTheme="minorHAnsi" w:hAnsi="Times New Roman" w:cs="Times New Roman" w:hint="default"/>
+      </w:rPr>
+    </w:lvl>
+    <w:lvl w:ilvl="1" w:tplc="04090003" w:tentative="1">
+      <w:start w:val="1"/>
+      <w:numFmt w:val="bullet"/>
+      <w:lvlText w:val="o"/>
+      <w:lvlJc w:val="left"/>
+      <w:pPr>
+        <w:ind w:left="1440" w:hanging="360"/>
+      </w:pPr>
+      <w:rPr>
+        <w:rFonts w:ascii="Courier New" w:hAnsi="Courier New" w:cs="Courier New" w:hint="default"/>
+      </w:rPr>
+    </w:lvl>
+    <w:lvl w:ilvl="2" w:tplc="04090005" w:tentative="1">
+      <w:start w:val="1"/>
+      <w:numFmt w:val="bullet"/>
+      <w:lvlText w:val=""/>
+      <w:lvlJc w:val="left"/>
+      <w:pPr>
+        <w:ind w:left="2160" w:hanging="360"/>
+      </w:pPr>
+      <w:rPr>
+        <w:rFonts w:ascii="Wingdings" w:hAnsi="Wingdings" w:hint="default"/>
+      </w:rPr>
+    </w:lvl>
+    <w:lvl w:ilvl="3" w:tplc="04090001" w:tentative="1">
+      <w:start w:val="1"/>
+      <w:numFmt w:val="bullet"/>
+      <w:lvlText w:val=""/>
+      <w:lvlJc w:val="left"/>
+      <w:pPr>
+        <w:ind w:left="2880" w:hanging="360"/>
+      </w:pPr>
+      <w:rPr>
+        <w:rFonts w:ascii="Symbol" w:hAnsi="Symbol" w:hint="default"/>
+      </w:rPr>
+    </w:lvl>
+    <w:lvl w:ilvl="4" w:tplc="04090003" w:tentative="1">
+      <w:start w:val="1"/>
+      <w:numFmt w:val="bullet"/>
+      <w:lvlText w:val="o"/>
+      <w:lvlJc w:val="left"/>
+      <w:pPr>
+        <w:ind w:left="3600" w:hanging="360"/>
+      </w:pPr>
+      <w:rPr>
+        <w:rFonts w:ascii="Courier New" w:hAnsi="Courier New" w:cs="Courier New" w:hint="default"/>
+      </w:rPr>
+    </w:lvl>
+    <w:lvl w:ilvl="5" w:tplc="04090005" w:tentative="1">
+      <w:start w:val="1"/>
+      <w:numFmt w:val="bullet"/>
+      <w:lvlText w:val=""/>
+      <w:lvlJc w:val="left"/>
+      <w:pPr>
+        <w:ind w:left="4320" w:hanging="360"/>
+      </w:pPr>
+      <w:rPr>
+        <w:rFonts w:ascii="Wingdings" w:hAnsi="Wingdings" w:hint="default"/>
+      </w:rPr>
+    </w:lvl>
+    <w:lvl w:ilvl="6" w:tplc="04090001" w:tentative="1">
+      <w:start w:val="1"/>
+      <w:numFmt w:val="bullet"/>
+      <w:lvlText w:val=""/>
+      <w:lvlJc w:val="left"/>
+      <w:pPr>
+        <w:ind w:left="5040" w:hanging="360"/>
+      </w:pPr>
+      <w:rPr>
+        <w:rFonts w:ascii="Symbol" w:hAnsi="Symbol" w:hint="default"/>
+      </w:rPr>
+    </w:lvl>
+    <w:lvl w:ilvl="7" w:tplc="04090003" w:tentative="1">
+      <w:start w:val="1"/>
+      <w:numFmt w:val="bullet"/>
+      <w:lvlText w:val="o"/>
+      <w:lvlJc w:val="left"/>
+      <w:pPr>
+        <w:ind w:left="5760" w:hanging="360"/>
+      </w:pPr>
+      <w:rPr>
+        <w:rFonts w:ascii="Courier New" w:hAnsi="Courier New" w:cs="Courier New" w:hint="default"/>
+      </w:rPr>
+    </w:lvl>
+    <w:lvl w:ilvl="8" w:tplc="04090005" w:tentative="1">
+      <w:start w:val="1"/>
+      <w:numFmt w:val="bullet"/>
+      <w:lvlText w:val=""/>
+      <w:lvlJc w:val="left"/>
+      <w:pPr>
+        <w:ind w:left="6480" w:hanging="360"/>
+      </w:pPr>
+      <w:rPr>
+        <w:rFonts w:ascii="Wingdings" w:hAnsi="Wingdings" w:hint="default"/>
+      </w:rPr>
+    </w:lvl>
+  </w:abstractNum>
+  <w:abstractNum w:abstractNumId="52" w15:restartNumberingAfterBreak="0">
     <w:nsid w:val="2E164C9A"/>
     <w:multiLevelType w:val="hybridMultilevel"/>
     <w:tmpl w:val="C6BA489A"/>
@@ -10320,7 +11942,7 @@
       </w:rPr>
     </w:lvl>
   </w:abstractNum>
-  <w:abstractNum w:abstractNumId="47" w15:restartNumberingAfterBreak="0">
+  <w:abstractNum w:abstractNumId="53" w15:restartNumberingAfterBreak="0">
     <w:nsid w:val="2E34438D"/>
     <w:multiLevelType w:val="multilevel"/>
     <w:tmpl w:val="63F4E6F0"/>
@@ -10469,7 +12091,7 @@
       </w:rPr>
     </w:lvl>
   </w:abstractNum>
-  <w:abstractNum w:abstractNumId="48" w15:restartNumberingAfterBreak="0">
+  <w:abstractNum w:abstractNumId="54" w15:restartNumberingAfterBreak="0">
     <w:nsid w:val="2E5D6D2A"/>
     <w:multiLevelType w:val="hybridMultilevel"/>
     <w:tmpl w:val="5D5ADC98"/>
@@ -10582,7 +12204,7 @@
       </w:rPr>
     </w:lvl>
   </w:abstractNum>
-  <w:abstractNum w:abstractNumId="49" w15:restartNumberingAfterBreak="0">
+  <w:abstractNum w:abstractNumId="55" w15:restartNumberingAfterBreak="0">
     <w:nsid w:val="2E716C12"/>
     <w:multiLevelType w:val="hybridMultilevel"/>
     <w:tmpl w:val="6D90C552"/>
@@ -10695,7 +12317,7 @@
       </w:rPr>
     </w:lvl>
   </w:abstractNum>
-  <w:abstractNum w:abstractNumId="50" w15:restartNumberingAfterBreak="0">
+  <w:abstractNum w:abstractNumId="56" w15:restartNumberingAfterBreak="0">
     <w:nsid w:val="2F162517"/>
     <w:multiLevelType w:val="hybridMultilevel"/>
     <w:tmpl w:val="4E3CAB7C"/>
@@ -10807,7 +12429,7 @@
       </w:rPr>
     </w:lvl>
   </w:abstractNum>
-  <w:abstractNum w:abstractNumId="51" w15:restartNumberingAfterBreak="0">
+  <w:abstractNum w:abstractNumId="57" w15:restartNumberingAfterBreak="0">
     <w:nsid w:val="2F1F6483"/>
     <w:multiLevelType w:val="multilevel"/>
     <w:tmpl w:val="993E874E"/>
@@ -10956,7 +12578,7 @@
       </w:rPr>
     </w:lvl>
   </w:abstractNum>
-  <w:abstractNum w:abstractNumId="52" w15:restartNumberingAfterBreak="0">
+  <w:abstractNum w:abstractNumId="58" w15:restartNumberingAfterBreak="0">
     <w:nsid w:val="2F2B2F8E"/>
     <w:multiLevelType w:val="multilevel"/>
     <w:tmpl w:val="547EDCFE"/>
@@ -11105,7 +12727,7 @@
       </w:rPr>
     </w:lvl>
   </w:abstractNum>
-  <w:abstractNum w:abstractNumId="53" w15:restartNumberingAfterBreak="0">
+  <w:abstractNum w:abstractNumId="59" w15:restartNumberingAfterBreak="0">
     <w:nsid w:val="2FF161E6"/>
     <w:multiLevelType w:val="hybridMultilevel"/>
     <w:tmpl w:val="ED6AA478"/>
@@ -11217,7 +12839,7 @@
       </w:rPr>
     </w:lvl>
   </w:abstractNum>
-  <w:abstractNum w:abstractNumId="54" w15:restartNumberingAfterBreak="0">
+  <w:abstractNum w:abstractNumId="60" w15:restartNumberingAfterBreak="0">
     <w:nsid w:val="30CD5DF3"/>
     <w:multiLevelType w:val="hybridMultilevel"/>
     <w:tmpl w:val="127EBD02"/>
@@ -11329,7 +12951,7 @@
       </w:rPr>
     </w:lvl>
   </w:abstractNum>
-  <w:abstractNum w:abstractNumId="55" w15:restartNumberingAfterBreak="0">
+  <w:abstractNum w:abstractNumId="61" w15:restartNumberingAfterBreak="0">
     <w:nsid w:val="31A24DDF"/>
     <w:multiLevelType w:val="multilevel"/>
     <w:tmpl w:val="63F4E6F0"/>
@@ -11478,7 +13100,7 @@
       </w:rPr>
     </w:lvl>
   </w:abstractNum>
-  <w:abstractNum w:abstractNumId="56" w15:restartNumberingAfterBreak="0">
+  <w:abstractNum w:abstractNumId="62" w15:restartNumberingAfterBreak="0">
     <w:nsid w:val="321E65E6"/>
     <w:multiLevelType w:val="multilevel"/>
     <w:tmpl w:val="63F4E6F0"/>
@@ -11627,7 +13249,7 @@
       </w:rPr>
     </w:lvl>
   </w:abstractNum>
-  <w:abstractNum w:abstractNumId="57" w15:restartNumberingAfterBreak="0">
+  <w:abstractNum w:abstractNumId="63" w15:restartNumberingAfterBreak="0">
     <w:nsid w:val="332E29E8"/>
     <w:multiLevelType w:val="multilevel"/>
     <w:tmpl w:val="BF082128"/>
@@ -11776,7 +13398,7 @@
       </w:rPr>
     </w:lvl>
   </w:abstractNum>
-  <w:abstractNum w:abstractNumId="58" w15:restartNumberingAfterBreak="0">
+  <w:abstractNum w:abstractNumId="64" w15:restartNumberingAfterBreak="0">
     <w:nsid w:val="34251C5D"/>
     <w:multiLevelType w:val="multilevel"/>
     <w:tmpl w:val="C31CBCE0"/>
@@ -11925,7 +13547,7 @@
       </w:rPr>
     </w:lvl>
   </w:abstractNum>
-  <w:abstractNum w:abstractNumId="59" w15:restartNumberingAfterBreak="0">
+  <w:abstractNum w:abstractNumId="65" w15:restartNumberingAfterBreak="0">
     <w:nsid w:val="342A6150"/>
     <w:multiLevelType w:val="multilevel"/>
     <w:tmpl w:val="29E0BE1C"/>
@@ -12074,7 +13696,7 @@
       </w:rPr>
     </w:lvl>
   </w:abstractNum>
-  <w:abstractNum w:abstractNumId="60" w15:restartNumberingAfterBreak="0">
+  <w:abstractNum w:abstractNumId="66" w15:restartNumberingAfterBreak="0">
     <w:nsid w:val="356F220A"/>
     <w:multiLevelType w:val="multilevel"/>
     <w:tmpl w:val="0FFA5254"/>
@@ -12223,7 +13845,7 @@
       </w:rPr>
     </w:lvl>
   </w:abstractNum>
-  <w:abstractNum w:abstractNumId="61" w15:restartNumberingAfterBreak="0">
+  <w:abstractNum w:abstractNumId="67" w15:restartNumberingAfterBreak="0">
     <w:nsid w:val="357B7363"/>
     <w:multiLevelType w:val="hybridMultilevel"/>
     <w:tmpl w:val="00D411EC"/>
@@ -12335,7 +13957,7 @@
       </w:rPr>
     </w:lvl>
   </w:abstractNum>
-  <w:abstractNum w:abstractNumId="62" w15:restartNumberingAfterBreak="0">
+  <w:abstractNum w:abstractNumId="68" w15:restartNumberingAfterBreak="0">
     <w:nsid w:val="3583100F"/>
     <w:multiLevelType w:val="hybridMultilevel"/>
     <w:tmpl w:val="848ECFAA"/>
@@ -12448,7 +14070,7 @@
       </w:rPr>
     </w:lvl>
   </w:abstractNum>
-  <w:abstractNum w:abstractNumId="63" w15:restartNumberingAfterBreak="0">
+  <w:abstractNum w:abstractNumId="69" w15:restartNumberingAfterBreak="0">
     <w:nsid w:val="36117ABB"/>
     <w:multiLevelType w:val="hybridMultilevel"/>
     <w:tmpl w:val="89C4CD2C"/>
@@ -12560,7 +14182,7 @@
       </w:rPr>
     </w:lvl>
   </w:abstractNum>
-  <w:abstractNum w:abstractNumId="64" w15:restartNumberingAfterBreak="0">
+  <w:abstractNum w:abstractNumId="70" w15:restartNumberingAfterBreak="0">
     <w:nsid w:val="3623194A"/>
     <w:multiLevelType w:val="multilevel"/>
     <w:tmpl w:val="63F4E6F0"/>
@@ -12709,7 +14331,7 @@
       </w:rPr>
     </w:lvl>
   </w:abstractNum>
-  <w:abstractNum w:abstractNumId="65" w15:restartNumberingAfterBreak="0">
+  <w:abstractNum w:abstractNumId="71" w15:restartNumberingAfterBreak="0">
     <w:nsid w:val="36AD3FB0"/>
     <w:multiLevelType w:val="multilevel"/>
     <w:tmpl w:val="0644AEEA"/>
@@ -12858,7 +14480,7 @@
       </w:rPr>
     </w:lvl>
   </w:abstractNum>
-  <w:abstractNum w:abstractNumId="66" w15:restartNumberingAfterBreak="0">
+  <w:abstractNum w:abstractNumId="72" w15:restartNumberingAfterBreak="0">
     <w:nsid w:val="371A2CDE"/>
     <w:multiLevelType w:val="hybridMultilevel"/>
     <w:tmpl w:val="EA9C00CC"/>
@@ -12970,7 +14592,7 @@
       </w:rPr>
     </w:lvl>
   </w:abstractNum>
-  <w:abstractNum w:abstractNumId="67" w15:restartNumberingAfterBreak="0">
+  <w:abstractNum w:abstractNumId="73" w15:restartNumberingAfterBreak="0">
     <w:nsid w:val="373D5E48"/>
     <w:multiLevelType w:val="hybridMultilevel"/>
     <w:tmpl w:val="8A6E38C0"/>
@@ -13083,7 +14705,7 @@
       </w:rPr>
     </w:lvl>
   </w:abstractNum>
-  <w:abstractNum w:abstractNumId="68" w15:restartNumberingAfterBreak="0">
+  <w:abstractNum w:abstractNumId="74" w15:restartNumberingAfterBreak="0">
     <w:nsid w:val="3B446B2D"/>
     <w:multiLevelType w:val="hybridMultilevel"/>
     <w:tmpl w:val="B638176E"/>
@@ -13195,7 +14817,7 @@
       </w:rPr>
     </w:lvl>
   </w:abstractNum>
-  <w:abstractNum w:abstractNumId="69" w15:restartNumberingAfterBreak="0">
+  <w:abstractNum w:abstractNumId="75" w15:restartNumberingAfterBreak="0">
     <w:nsid w:val="3B6B41F5"/>
     <w:multiLevelType w:val="hybridMultilevel"/>
     <w:tmpl w:val="10A26168"/>
@@ -13307,7 +14929,7 @@
       </w:rPr>
     </w:lvl>
   </w:abstractNum>
-  <w:abstractNum w:abstractNumId="70" w15:restartNumberingAfterBreak="0">
+  <w:abstractNum w:abstractNumId="76" w15:restartNumberingAfterBreak="0">
     <w:nsid w:val="3C5546BA"/>
     <w:multiLevelType w:val="hybridMultilevel"/>
     <w:tmpl w:val="3434F5E4"/>
@@ -13419,7 +15041,7 @@
       </w:rPr>
     </w:lvl>
   </w:abstractNum>
-  <w:abstractNum w:abstractNumId="71" w15:restartNumberingAfterBreak="0">
+  <w:abstractNum w:abstractNumId="77" w15:restartNumberingAfterBreak="0">
     <w:nsid w:val="3C623C55"/>
     <w:multiLevelType w:val="multilevel"/>
     <w:tmpl w:val="A0B0E8F4"/>
@@ -13568,7 +15190,7 @@
       </w:rPr>
     </w:lvl>
   </w:abstractNum>
-  <w:abstractNum w:abstractNumId="72" w15:restartNumberingAfterBreak="0">
+  <w:abstractNum w:abstractNumId="78" w15:restartNumberingAfterBreak="0">
     <w:nsid w:val="3CD27F78"/>
     <w:multiLevelType w:val="multilevel"/>
     <w:tmpl w:val="FCDE767A"/>
@@ -13717,7 +15339,7 @@
       </w:rPr>
     </w:lvl>
   </w:abstractNum>
-  <w:abstractNum w:abstractNumId="73" w15:restartNumberingAfterBreak="0">
+  <w:abstractNum w:abstractNumId="79" w15:restartNumberingAfterBreak="0">
     <w:nsid w:val="3CD74B18"/>
     <w:multiLevelType w:val="hybridMultilevel"/>
     <w:tmpl w:val="2FF42220"/>
@@ -13830,7 +15452,7 @@
       </w:rPr>
     </w:lvl>
   </w:abstractNum>
-  <w:abstractNum w:abstractNumId="74" w15:restartNumberingAfterBreak="0">
+  <w:abstractNum w:abstractNumId="80" w15:restartNumberingAfterBreak="0">
     <w:nsid w:val="3D2F7E79"/>
     <w:multiLevelType w:val="hybridMultilevel"/>
     <w:tmpl w:val="6ED674BE"/>
@@ -13942,7 +15564,7 @@
       </w:rPr>
     </w:lvl>
   </w:abstractNum>
-  <w:abstractNum w:abstractNumId="75" w15:restartNumberingAfterBreak="0">
+  <w:abstractNum w:abstractNumId="81" w15:restartNumberingAfterBreak="0">
     <w:nsid w:val="3D397287"/>
     <w:multiLevelType w:val="hybridMultilevel"/>
     <w:tmpl w:val="F4503122"/>
@@ -14054,7 +15676,7 @@
       </w:rPr>
     </w:lvl>
   </w:abstractNum>
-  <w:abstractNum w:abstractNumId="76" w15:restartNumberingAfterBreak="0">
+  <w:abstractNum w:abstractNumId="82" w15:restartNumberingAfterBreak="0">
     <w:nsid w:val="3E685FF3"/>
     <w:multiLevelType w:val="multilevel"/>
     <w:tmpl w:val="7D20B538"/>
@@ -14203,7 +15825,7 @@
       </w:rPr>
     </w:lvl>
   </w:abstractNum>
-  <w:abstractNum w:abstractNumId="77" w15:restartNumberingAfterBreak="0">
+  <w:abstractNum w:abstractNumId="83" w15:restartNumberingAfterBreak="0">
     <w:nsid w:val="3F346C2C"/>
     <w:multiLevelType w:val="multilevel"/>
     <w:tmpl w:val="63F4E6F0"/>
@@ -14352,7 +15974,120 @@
       </w:rPr>
     </w:lvl>
   </w:abstractNum>
-  <w:abstractNum w:abstractNumId="78" w15:restartNumberingAfterBreak="0">
+  <w:abstractNum w:abstractNumId="84" w15:restartNumberingAfterBreak="0">
+    <w:nsid w:val="3F9328ED"/>
+    <w:multiLevelType w:val="hybridMultilevel"/>
+    <w:tmpl w:val="6988E1D6"/>
+    <w:lvl w:ilvl="0" w:tplc="04090005">
+      <w:start w:val="1"/>
+      <w:numFmt w:val="bullet"/>
+      <w:lvlText w:val=""/>
+      <w:lvlJc w:val="left"/>
+      <w:pPr>
+        <w:ind w:left="720" w:hanging="360"/>
+      </w:pPr>
+      <w:rPr>
+        <w:rFonts w:ascii="Wingdings" w:hAnsi="Wingdings" w:hint="default"/>
+      </w:rPr>
+    </w:lvl>
+    <w:lvl w:ilvl="1" w:tplc="04090003" w:tentative="1">
+      <w:start w:val="1"/>
+      <w:numFmt w:val="bullet"/>
+      <w:lvlText w:val="o"/>
+      <w:lvlJc w:val="left"/>
+      <w:pPr>
+        <w:ind w:left="1440" w:hanging="360"/>
+      </w:pPr>
+      <w:rPr>
+        <w:rFonts w:ascii="Courier New" w:hAnsi="Courier New" w:cs="Courier New" w:hint="default"/>
+      </w:rPr>
+    </w:lvl>
+    <w:lvl w:ilvl="2" w:tplc="04090005" w:tentative="1">
+      <w:start w:val="1"/>
+      <w:numFmt w:val="bullet"/>
+      <w:lvlText w:val=""/>
+      <w:lvlJc w:val="left"/>
+      <w:pPr>
+        <w:ind w:left="2160" w:hanging="360"/>
+      </w:pPr>
+      <w:rPr>
+        <w:rFonts w:ascii="Wingdings" w:hAnsi="Wingdings" w:hint="default"/>
+      </w:rPr>
+    </w:lvl>
+    <w:lvl w:ilvl="3" w:tplc="04090001" w:tentative="1">
+      <w:start w:val="1"/>
+      <w:numFmt w:val="bullet"/>
+      <w:lvlText w:val=""/>
+      <w:lvlJc w:val="left"/>
+      <w:pPr>
+        <w:ind w:left="2880" w:hanging="360"/>
+      </w:pPr>
+      <w:rPr>
+        <w:rFonts w:ascii="Symbol" w:hAnsi="Symbol" w:hint="default"/>
+      </w:rPr>
+    </w:lvl>
+    <w:lvl w:ilvl="4" w:tplc="04090003" w:tentative="1">
+      <w:start w:val="1"/>
+      <w:numFmt w:val="bullet"/>
+      <w:lvlText w:val="o"/>
+      <w:lvlJc w:val="left"/>
+      <w:pPr>
+        <w:ind w:left="3600" w:hanging="360"/>
+      </w:pPr>
+      <w:rPr>
+        <w:rFonts w:ascii="Courier New" w:hAnsi="Courier New" w:cs="Courier New" w:hint="default"/>
+      </w:rPr>
+    </w:lvl>
+    <w:lvl w:ilvl="5" w:tplc="04090005" w:tentative="1">
+      <w:start w:val="1"/>
+      <w:numFmt w:val="bullet"/>
+      <w:lvlText w:val=""/>
+      <w:lvlJc w:val="left"/>
+      <w:pPr>
+        <w:ind w:left="4320" w:hanging="360"/>
+      </w:pPr>
+      <w:rPr>
+        <w:rFonts w:ascii="Wingdings" w:hAnsi="Wingdings" w:hint="default"/>
+      </w:rPr>
+    </w:lvl>
+    <w:lvl w:ilvl="6" w:tplc="04090001" w:tentative="1">
+      <w:start w:val="1"/>
+      <w:numFmt w:val="bullet"/>
+      <w:lvlText w:val=""/>
+      <w:lvlJc w:val="left"/>
+      <w:pPr>
+        <w:ind w:left="5040" w:hanging="360"/>
+      </w:pPr>
+      <w:rPr>
+        <w:rFonts w:ascii="Symbol" w:hAnsi="Symbol" w:hint="default"/>
+      </w:rPr>
+    </w:lvl>
+    <w:lvl w:ilvl="7" w:tplc="04090003" w:tentative="1">
+      <w:start w:val="1"/>
+      <w:numFmt w:val="bullet"/>
+      <w:lvlText w:val="o"/>
+      <w:lvlJc w:val="left"/>
+      <w:pPr>
+        <w:ind w:left="5760" w:hanging="360"/>
+      </w:pPr>
+      <w:rPr>
+        <w:rFonts w:ascii="Courier New" w:hAnsi="Courier New" w:cs="Courier New" w:hint="default"/>
+      </w:rPr>
+    </w:lvl>
+    <w:lvl w:ilvl="8" w:tplc="04090005" w:tentative="1">
+      <w:start w:val="1"/>
+      <w:numFmt w:val="bullet"/>
+      <w:lvlText w:val=""/>
+      <w:lvlJc w:val="left"/>
+      <w:pPr>
+        <w:ind w:left="6480" w:hanging="360"/>
+      </w:pPr>
+      <w:rPr>
+        <w:rFonts w:ascii="Wingdings" w:hAnsi="Wingdings" w:hint="default"/>
+      </w:rPr>
+    </w:lvl>
+  </w:abstractNum>
+  <w:abstractNum w:abstractNumId="85" w15:restartNumberingAfterBreak="0">
     <w:nsid w:val="3FCB1322"/>
     <w:multiLevelType w:val="hybridMultilevel"/>
     <w:tmpl w:val="55C012B2"/>
@@ -14464,7 +16199,7 @@
       </w:rPr>
     </w:lvl>
   </w:abstractNum>
-  <w:abstractNum w:abstractNumId="79" w15:restartNumberingAfterBreak="0">
+  <w:abstractNum w:abstractNumId="86" w15:restartNumberingAfterBreak="0">
     <w:nsid w:val="41A9344F"/>
     <w:multiLevelType w:val="hybridMultilevel"/>
     <w:tmpl w:val="0FB60038"/>
@@ -14577,7 +16312,7 @@
       </w:rPr>
     </w:lvl>
   </w:abstractNum>
-  <w:abstractNum w:abstractNumId="80" w15:restartNumberingAfterBreak="0">
+  <w:abstractNum w:abstractNumId="87" w15:restartNumberingAfterBreak="0">
     <w:nsid w:val="42004E1F"/>
     <w:multiLevelType w:val="hybridMultilevel"/>
     <w:tmpl w:val="770C8314"/>
@@ -14689,7 +16424,7 @@
       </w:rPr>
     </w:lvl>
   </w:abstractNum>
-  <w:abstractNum w:abstractNumId="81" w15:restartNumberingAfterBreak="0">
+  <w:abstractNum w:abstractNumId="88" w15:restartNumberingAfterBreak="0">
     <w:nsid w:val="439F7169"/>
     <w:multiLevelType w:val="hybridMultilevel"/>
     <w:tmpl w:val="1884EDCA"/>
@@ -14802,7 +16537,7 @@
       </w:rPr>
     </w:lvl>
   </w:abstractNum>
-  <w:abstractNum w:abstractNumId="82" w15:restartNumberingAfterBreak="0">
+  <w:abstractNum w:abstractNumId="89" w15:restartNumberingAfterBreak="0">
     <w:nsid w:val="43EA1D69"/>
     <w:multiLevelType w:val="multilevel"/>
     <w:tmpl w:val="DFEC23EC"/>
@@ -14951,7 +16686,7 @@
       </w:rPr>
     </w:lvl>
   </w:abstractNum>
-  <w:abstractNum w:abstractNumId="83" w15:restartNumberingAfterBreak="0">
+  <w:abstractNum w:abstractNumId="90" w15:restartNumberingAfterBreak="0">
     <w:nsid w:val="44320084"/>
     <w:multiLevelType w:val="hybridMultilevel"/>
     <w:tmpl w:val="CE5076D4"/>
@@ -15063,7 +16798,7 @@
       </w:rPr>
     </w:lvl>
   </w:abstractNum>
-  <w:abstractNum w:abstractNumId="84" w15:restartNumberingAfterBreak="0">
+  <w:abstractNum w:abstractNumId="91" w15:restartNumberingAfterBreak="0">
     <w:nsid w:val="44554567"/>
     <w:multiLevelType w:val="hybridMultilevel"/>
     <w:tmpl w:val="78748252"/>
@@ -15175,7 +16910,7 @@
       </w:rPr>
     </w:lvl>
   </w:abstractNum>
-  <w:abstractNum w:abstractNumId="85" w15:restartNumberingAfterBreak="0">
+  <w:abstractNum w:abstractNumId="92" w15:restartNumberingAfterBreak="0">
     <w:nsid w:val="49005094"/>
     <w:multiLevelType w:val="hybridMultilevel"/>
     <w:tmpl w:val="14848CBE"/>
@@ -15287,7 +17022,7 @@
       </w:rPr>
     </w:lvl>
   </w:abstractNum>
-  <w:abstractNum w:abstractNumId="86" w15:restartNumberingAfterBreak="0">
+  <w:abstractNum w:abstractNumId="93" w15:restartNumberingAfterBreak="0">
     <w:nsid w:val="49243794"/>
     <w:multiLevelType w:val="multilevel"/>
     <w:tmpl w:val="E7681528"/>
@@ -15436,7 +17171,7 @@
       </w:rPr>
     </w:lvl>
   </w:abstractNum>
-  <w:abstractNum w:abstractNumId="87" w15:restartNumberingAfterBreak="0">
+  <w:abstractNum w:abstractNumId="94" w15:restartNumberingAfterBreak="0">
     <w:nsid w:val="4A880990"/>
     <w:multiLevelType w:val="hybridMultilevel"/>
     <w:tmpl w:val="F17E12C2"/>
@@ -15548,7 +17283,7 @@
       </w:rPr>
     </w:lvl>
   </w:abstractNum>
-  <w:abstractNum w:abstractNumId="88" w15:restartNumberingAfterBreak="0">
+  <w:abstractNum w:abstractNumId="95" w15:restartNumberingAfterBreak="0">
     <w:nsid w:val="4B182B12"/>
     <w:multiLevelType w:val="hybridMultilevel"/>
     <w:tmpl w:val="31C486B4"/>
@@ -15660,7 +17395,7 @@
       </w:rPr>
     </w:lvl>
   </w:abstractNum>
-  <w:abstractNum w:abstractNumId="89" w15:restartNumberingAfterBreak="0">
+  <w:abstractNum w:abstractNumId="96" w15:restartNumberingAfterBreak="0">
     <w:nsid w:val="4BA13766"/>
     <w:multiLevelType w:val="multilevel"/>
     <w:tmpl w:val="63F4E6F0"/>
@@ -15809,7 +17544,7 @@
       </w:rPr>
     </w:lvl>
   </w:abstractNum>
-  <w:abstractNum w:abstractNumId="90" w15:restartNumberingAfterBreak="0">
+  <w:abstractNum w:abstractNumId="97" w15:restartNumberingAfterBreak="0">
     <w:nsid w:val="4E65371E"/>
     <w:multiLevelType w:val="hybridMultilevel"/>
     <w:tmpl w:val="53EE4538"/>
@@ -15921,7 +17656,7 @@
       </w:rPr>
     </w:lvl>
   </w:abstractNum>
-  <w:abstractNum w:abstractNumId="91" w15:restartNumberingAfterBreak="0">
+  <w:abstractNum w:abstractNumId="98" w15:restartNumberingAfterBreak="0">
     <w:nsid w:val="4E9A3F16"/>
     <w:multiLevelType w:val="multilevel"/>
     <w:tmpl w:val="63F4E6F0"/>
@@ -16070,7 +17805,7 @@
       </w:rPr>
     </w:lvl>
   </w:abstractNum>
-  <w:abstractNum w:abstractNumId="92" w15:restartNumberingAfterBreak="0">
+  <w:abstractNum w:abstractNumId="99" w15:restartNumberingAfterBreak="0">
     <w:nsid w:val="500B790D"/>
     <w:multiLevelType w:val="multilevel"/>
     <w:tmpl w:val="63F4E6F0"/>
@@ -16219,7 +17954,346 @@
       </w:rPr>
     </w:lvl>
   </w:abstractNum>
-  <w:abstractNum w:abstractNumId="93" w15:restartNumberingAfterBreak="0">
+  <w:abstractNum w:abstractNumId="100" w15:restartNumberingAfterBreak="0">
+    <w:nsid w:val="5192261A"/>
+    <w:multiLevelType w:val="hybridMultilevel"/>
+    <w:tmpl w:val="D09C7D94"/>
+    <w:lvl w:ilvl="0" w:tplc="04090005">
+      <w:start w:val="1"/>
+      <w:numFmt w:val="bullet"/>
+      <w:lvlText w:val=""/>
+      <w:lvlJc w:val="left"/>
+      <w:pPr>
+        <w:ind w:left="720" w:hanging="360"/>
+      </w:pPr>
+      <w:rPr>
+        <w:rFonts w:ascii="Wingdings" w:hAnsi="Wingdings" w:hint="default"/>
+      </w:rPr>
+    </w:lvl>
+    <w:lvl w:ilvl="1" w:tplc="FFFFFFFF" w:tentative="1">
+      <w:start w:val="1"/>
+      <w:numFmt w:val="bullet"/>
+      <w:lvlText w:val="o"/>
+      <w:lvlJc w:val="left"/>
+      <w:pPr>
+        <w:ind w:left="1440" w:hanging="360"/>
+      </w:pPr>
+      <w:rPr>
+        <w:rFonts w:ascii="Courier New" w:hAnsi="Courier New" w:cs="Courier New" w:hint="default"/>
+      </w:rPr>
+    </w:lvl>
+    <w:lvl w:ilvl="2" w:tplc="FFFFFFFF" w:tentative="1">
+      <w:start w:val="1"/>
+      <w:numFmt w:val="bullet"/>
+      <w:lvlText w:val=""/>
+      <w:lvlJc w:val="left"/>
+      <w:pPr>
+        <w:ind w:left="2160" w:hanging="360"/>
+      </w:pPr>
+      <w:rPr>
+        <w:rFonts w:ascii="Wingdings" w:hAnsi="Wingdings" w:hint="default"/>
+      </w:rPr>
+    </w:lvl>
+    <w:lvl w:ilvl="3" w:tplc="FFFFFFFF" w:tentative="1">
+      <w:start w:val="1"/>
+      <w:numFmt w:val="bullet"/>
+      <w:lvlText w:val=""/>
+      <w:lvlJc w:val="left"/>
+      <w:pPr>
+        <w:ind w:left="2880" w:hanging="360"/>
+      </w:pPr>
+      <w:rPr>
+        <w:rFonts w:ascii="Symbol" w:hAnsi="Symbol" w:hint="default"/>
+      </w:rPr>
+    </w:lvl>
+    <w:lvl w:ilvl="4" w:tplc="FFFFFFFF" w:tentative="1">
+      <w:start w:val="1"/>
+      <w:numFmt w:val="bullet"/>
+      <w:lvlText w:val="o"/>
+      <w:lvlJc w:val="left"/>
+      <w:pPr>
+        <w:ind w:left="3600" w:hanging="360"/>
+      </w:pPr>
+      <w:rPr>
+        <w:rFonts w:ascii="Courier New" w:hAnsi="Courier New" w:cs="Courier New" w:hint="default"/>
+      </w:rPr>
+    </w:lvl>
+    <w:lvl w:ilvl="5" w:tplc="FFFFFFFF" w:tentative="1">
+      <w:start w:val="1"/>
+      <w:numFmt w:val="bullet"/>
+      <w:lvlText w:val=""/>
+      <w:lvlJc w:val="left"/>
+      <w:pPr>
+        <w:ind w:left="4320" w:hanging="360"/>
+      </w:pPr>
+      <w:rPr>
+        <w:rFonts w:ascii="Wingdings" w:hAnsi="Wingdings" w:hint="default"/>
+      </w:rPr>
+    </w:lvl>
+    <w:lvl w:ilvl="6" w:tplc="FFFFFFFF" w:tentative="1">
+      <w:start w:val="1"/>
+      <w:numFmt w:val="bullet"/>
+      <w:lvlText w:val=""/>
+      <w:lvlJc w:val="left"/>
+      <w:pPr>
+        <w:ind w:left="5040" w:hanging="360"/>
+      </w:pPr>
+      <w:rPr>
+        <w:rFonts w:ascii="Symbol" w:hAnsi="Symbol" w:hint="default"/>
+      </w:rPr>
+    </w:lvl>
+    <w:lvl w:ilvl="7" w:tplc="FFFFFFFF" w:tentative="1">
+      <w:start w:val="1"/>
+      <w:numFmt w:val="bullet"/>
+      <w:lvlText w:val="o"/>
+      <w:lvlJc w:val="left"/>
+      <w:pPr>
+        <w:ind w:left="5760" w:hanging="360"/>
+      </w:pPr>
+      <w:rPr>
+        <w:rFonts w:ascii="Courier New" w:hAnsi="Courier New" w:cs="Courier New" w:hint="default"/>
+      </w:rPr>
+    </w:lvl>
+    <w:lvl w:ilvl="8" w:tplc="FFFFFFFF" w:tentative="1">
+      <w:start w:val="1"/>
+      <w:numFmt w:val="bullet"/>
+      <w:lvlText w:val=""/>
+      <w:lvlJc w:val="left"/>
+      <w:pPr>
+        <w:ind w:left="6480" w:hanging="360"/>
+      </w:pPr>
+      <w:rPr>
+        <w:rFonts w:ascii="Wingdings" w:hAnsi="Wingdings" w:hint="default"/>
+      </w:rPr>
+    </w:lvl>
+  </w:abstractNum>
+  <w:abstractNum w:abstractNumId="101" w15:restartNumberingAfterBreak="0">
+    <w:nsid w:val="51975E84"/>
+    <w:multiLevelType w:val="hybridMultilevel"/>
+    <w:tmpl w:val="6DC0CD90"/>
+    <w:lvl w:ilvl="0" w:tplc="04090005">
+      <w:start w:val="1"/>
+      <w:numFmt w:val="bullet"/>
+      <w:lvlText w:val=""/>
+      <w:lvlJc w:val="left"/>
+      <w:pPr>
+        <w:ind w:left="720" w:hanging="360"/>
+      </w:pPr>
+      <w:rPr>
+        <w:rFonts w:ascii="Wingdings" w:hAnsi="Wingdings" w:hint="default"/>
+      </w:rPr>
+    </w:lvl>
+    <w:lvl w:ilvl="1" w:tplc="04090003" w:tentative="1">
+      <w:start w:val="1"/>
+      <w:numFmt w:val="bullet"/>
+      <w:lvlText w:val="o"/>
+      <w:lvlJc w:val="left"/>
+      <w:pPr>
+        <w:ind w:left="1440" w:hanging="360"/>
+      </w:pPr>
+      <w:rPr>
+        <w:rFonts w:ascii="Courier New" w:hAnsi="Courier New" w:cs="Courier New" w:hint="default"/>
+      </w:rPr>
+    </w:lvl>
+    <w:lvl w:ilvl="2" w:tplc="04090005" w:tentative="1">
+      <w:start w:val="1"/>
+      <w:numFmt w:val="bullet"/>
+      <w:lvlText w:val=""/>
+      <w:lvlJc w:val="left"/>
+      <w:pPr>
+        <w:ind w:left="2160" w:hanging="360"/>
+      </w:pPr>
+      <w:rPr>
+        <w:rFonts w:ascii="Wingdings" w:hAnsi="Wingdings" w:hint="default"/>
+      </w:rPr>
+    </w:lvl>
+    <w:lvl w:ilvl="3" w:tplc="04090001" w:tentative="1">
+      <w:start w:val="1"/>
+      <w:numFmt w:val="bullet"/>
+      <w:lvlText w:val=""/>
+      <w:lvlJc w:val="left"/>
+      <w:pPr>
+        <w:ind w:left="2880" w:hanging="360"/>
+      </w:pPr>
+      <w:rPr>
+        <w:rFonts w:ascii="Symbol" w:hAnsi="Symbol" w:hint="default"/>
+      </w:rPr>
+    </w:lvl>
+    <w:lvl w:ilvl="4" w:tplc="04090003" w:tentative="1">
+      <w:start w:val="1"/>
+      <w:numFmt w:val="bullet"/>
+      <w:lvlText w:val="o"/>
+      <w:lvlJc w:val="left"/>
+      <w:pPr>
+        <w:ind w:left="3600" w:hanging="360"/>
+      </w:pPr>
+      <w:rPr>
+        <w:rFonts w:ascii="Courier New" w:hAnsi="Courier New" w:cs="Courier New" w:hint="default"/>
+      </w:rPr>
+    </w:lvl>
+    <w:lvl w:ilvl="5" w:tplc="04090005" w:tentative="1">
+      <w:start w:val="1"/>
+      <w:numFmt w:val="bullet"/>
+      <w:lvlText w:val=""/>
+      <w:lvlJc w:val="left"/>
+      <w:pPr>
+        <w:ind w:left="4320" w:hanging="360"/>
+      </w:pPr>
+      <w:rPr>
+        <w:rFonts w:ascii="Wingdings" w:hAnsi="Wingdings" w:hint="default"/>
+      </w:rPr>
+    </w:lvl>
+    <w:lvl w:ilvl="6" w:tplc="04090001" w:tentative="1">
+      <w:start w:val="1"/>
+      <w:numFmt w:val="bullet"/>
+      <w:lvlText w:val=""/>
+      <w:lvlJc w:val="left"/>
+      <w:pPr>
+        <w:ind w:left="5040" w:hanging="360"/>
+      </w:pPr>
+      <w:rPr>
+        <w:rFonts w:ascii="Symbol" w:hAnsi="Symbol" w:hint="default"/>
+      </w:rPr>
+    </w:lvl>
+    <w:lvl w:ilvl="7" w:tplc="04090003" w:tentative="1">
+      <w:start w:val="1"/>
+      <w:numFmt w:val="bullet"/>
+      <w:lvlText w:val="o"/>
+      <w:lvlJc w:val="left"/>
+      <w:pPr>
+        <w:ind w:left="5760" w:hanging="360"/>
+      </w:pPr>
+      <w:rPr>
+        <w:rFonts w:ascii="Courier New" w:hAnsi="Courier New" w:cs="Courier New" w:hint="default"/>
+      </w:rPr>
+    </w:lvl>
+    <w:lvl w:ilvl="8" w:tplc="04090005" w:tentative="1">
+      <w:start w:val="1"/>
+      <w:numFmt w:val="bullet"/>
+      <w:lvlText w:val=""/>
+      <w:lvlJc w:val="left"/>
+      <w:pPr>
+        <w:ind w:left="6480" w:hanging="360"/>
+      </w:pPr>
+      <w:rPr>
+        <w:rFonts w:ascii="Wingdings" w:hAnsi="Wingdings" w:hint="default"/>
+      </w:rPr>
+    </w:lvl>
+  </w:abstractNum>
+  <w:abstractNum w:abstractNumId="102" w15:restartNumberingAfterBreak="0">
+    <w:nsid w:val="51B9776C"/>
+    <w:multiLevelType w:val="hybridMultilevel"/>
+    <w:tmpl w:val="64883378"/>
+    <w:lvl w:ilvl="0" w:tplc="04090005">
+      <w:start w:val="1"/>
+      <w:numFmt w:val="bullet"/>
+      <w:lvlText w:val=""/>
+      <w:lvlJc w:val="left"/>
+      <w:pPr>
+        <w:ind w:left="720" w:hanging="360"/>
+      </w:pPr>
+      <w:rPr>
+        <w:rFonts w:ascii="Wingdings" w:hAnsi="Wingdings" w:hint="default"/>
+      </w:rPr>
+    </w:lvl>
+    <w:lvl w:ilvl="1" w:tplc="04090003" w:tentative="1">
+      <w:start w:val="1"/>
+      <w:numFmt w:val="bullet"/>
+      <w:lvlText w:val="o"/>
+      <w:lvlJc w:val="left"/>
+      <w:pPr>
+        <w:ind w:left="1440" w:hanging="360"/>
+      </w:pPr>
+      <w:rPr>
+        <w:rFonts w:ascii="Courier New" w:hAnsi="Courier New" w:cs="Courier New" w:hint="default"/>
+      </w:rPr>
+    </w:lvl>
+    <w:lvl w:ilvl="2" w:tplc="04090005" w:tentative="1">
+      <w:start w:val="1"/>
+      <w:numFmt w:val="bullet"/>
+      <w:lvlText w:val=""/>
+      <w:lvlJc w:val="left"/>
+      <w:pPr>
+        <w:ind w:left="2160" w:hanging="360"/>
+      </w:pPr>
+      <w:rPr>
+        <w:rFonts w:ascii="Wingdings" w:hAnsi="Wingdings" w:hint="default"/>
+      </w:rPr>
+    </w:lvl>
+    <w:lvl w:ilvl="3" w:tplc="04090001" w:tentative="1">
+      <w:start w:val="1"/>
+      <w:numFmt w:val="bullet"/>
+      <w:lvlText w:val=""/>
+      <w:lvlJc w:val="left"/>
+      <w:pPr>
+        <w:ind w:left="2880" w:hanging="360"/>
+      </w:pPr>
+      <w:rPr>
+        <w:rFonts w:ascii="Symbol" w:hAnsi="Symbol" w:hint="default"/>
+      </w:rPr>
+    </w:lvl>
+    <w:lvl w:ilvl="4" w:tplc="04090003" w:tentative="1">
+      <w:start w:val="1"/>
+      <w:numFmt w:val="bullet"/>
+      <w:lvlText w:val="o"/>
+      <w:lvlJc w:val="left"/>
+      <w:pPr>
+        <w:ind w:left="3600" w:hanging="360"/>
+      </w:pPr>
+      <w:rPr>
+        <w:rFonts w:ascii="Courier New" w:hAnsi="Courier New" w:cs="Courier New" w:hint="default"/>
+      </w:rPr>
+    </w:lvl>
+    <w:lvl w:ilvl="5" w:tplc="04090005" w:tentative="1">
+      <w:start w:val="1"/>
+      <w:numFmt w:val="bullet"/>
+      <w:lvlText w:val=""/>
+      <w:lvlJc w:val="left"/>
+      <w:pPr>
+        <w:ind w:left="4320" w:hanging="360"/>
+      </w:pPr>
+      <w:rPr>
+        <w:rFonts w:ascii="Wingdings" w:hAnsi="Wingdings" w:hint="default"/>
+      </w:rPr>
+    </w:lvl>
+    <w:lvl w:ilvl="6" w:tplc="04090001" w:tentative="1">
+      <w:start w:val="1"/>
+      <w:numFmt w:val="bullet"/>
+      <w:lvlText w:val=""/>
+      <w:lvlJc w:val="left"/>
+      <w:pPr>
+        <w:ind w:left="5040" w:hanging="360"/>
+      </w:pPr>
+      <w:rPr>
+        <w:rFonts w:ascii="Symbol" w:hAnsi="Symbol" w:hint="default"/>
+      </w:rPr>
+    </w:lvl>
+    <w:lvl w:ilvl="7" w:tplc="04090003" w:tentative="1">
+      <w:start w:val="1"/>
+      <w:numFmt w:val="bullet"/>
+      <w:lvlText w:val="o"/>
+      <w:lvlJc w:val="left"/>
+      <w:pPr>
+        <w:ind w:left="5760" w:hanging="360"/>
+      </w:pPr>
+      <w:rPr>
+        <w:rFonts w:ascii="Courier New" w:hAnsi="Courier New" w:cs="Courier New" w:hint="default"/>
+      </w:rPr>
+    </w:lvl>
+    <w:lvl w:ilvl="8" w:tplc="04090005" w:tentative="1">
+      <w:start w:val="1"/>
+      <w:numFmt w:val="bullet"/>
+      <w:lvlText w:val=""/>
+      <w:lvlJc w:val="left"/>
+      <w:pPr>
+        <w:ind w:left="6480" w:hanging="360"/>
+      </w:pPr>
+      <w:rPr>
+        <w:rFonts w:ascii="Wingdings" w:hAnsi="Wingdings" w:hint="default"/>
+      </w:rPr>
+    </w:lvl>
+  </w:abstractNum>
+  <w:abstractNum w:abstractNumId="103" w15:restartNumberingAfterBreak="0">
     <w:nsid w:val="526538B7"/>
     <w:multiLevelType w:val="hybridMultilevel"/>
     <w:tmpl w:val="E6A017F2"/>
@@ -16332,7 +18406,120 @@
       </w:rPr>
     </w:lvl>
   </w:abstractNum>
-  <w:abstractNum w:abstractNumId="94" w15:restartNumberingAfterBreak="0">
+  <w:abstractNum w:abstractNumId="104" w15:restartNumberingAfterBreak="0">
+    <w:nsid w:val="534A0D41"/>
+    <w:multiLevelType w:val="hybridMultilevel"/>
+    <w:tmpl w:val="3BDCF504"/>
+    <w:lvl w:ilvl="0" w:tplc="28E6576C">
+      <w:start w:val="3"/>
+      <w:numFmt w:val="bullet"/>
+      <w:lvlText w:val="-"/>
+      <w:lvlJc w:val="left"/>
+      <w:pPr>
+        <w:ind w:left="720" w:hanging="360"/>
+      </w:pPr>
+      <w:rPr>
+        <w:rFonts w:ascii="Times New Roman" w:eastAsiaTheme="minorHAnsi" w:hAnsi="Times New Roman" w:cs="Times New Roman" w:hint="default"/>
+      </w:rPr>
+    </w:lvl>
+    <w:lvl w:ilvl="1" w:tplc="04090003" w:tentative="1">
+      <w:start w:val="1"/>
+      <w:numFmt w:val="bullet"/>
+      <w:lvlText w:val="o"/>
+      <w:lvlJc w:val="left"/>
+      <w:pPr>
+        <w:ind w:left="1440" w:hanging="360"/>
+      </w:pPr>
+      <w:rPr>
+        <w:rFonts w:ascii="Courier New" w:hAnsi="Courier New" w:cs="Courier New" w:hint="default"/>
+      </w:rPr>
+    </w:lvl>
+    <w:lvl w:ilvl="2" w:tplc="04090005" w:tentative="1">
+      <w:start w:val="1"/>
+      <w:numFmt w:val="bullet"/>
+      <w:lvlText w:val=""/>
+      <w:lvlJc w:val="left"/>
+      <w:pPr>
+        <w:ind w:left="2160" w:hanging="360"/>
+      </w:pPr>
+      <w:rPr>
+        <w:rFonts w:ascii="Wingdings" w:hAnsi="Wingdings" w:hint="default"/>
+      </w:rPr>
+    </w:lvl>
+    <w:lvl w:ilvl="3" w:tplc="04090001" w:tentative="1">
+      <w:start w:val="1"/>
+      <w:numFmt w:val="bullet"/>
+      <w:lvlText w:val=""/>
+      <w:lvlJc w:val="left"/>
+      <w:pPr>
+        <w:ind w:left="2880" w:hanging="360"/>
+      </w:pPr>
+      <w:rPr>
+        <w:rFonts w:ascii="Symbol" w:hAnsi="Symbol" w:hint="default"/>
+      </w:rPr>
+    </w:lvl>
+    <w:lvl w:ilvl="4" w:tplc="04090003" w:tentative="1">
+      <w:start w:val="1"/>
+      <w:numFmt w:val="bullet"/>
+      <w:lvlText w:val="o"/>
+      <w:lvlJc w:val="left"/>
+      <w:pPr>
+        <w:ind w:left="3600" w:hanging="360"/>
+      </w:pPr>
+      <w:rPr>
+        <w:rFonts w:ascii="Courier New" w:hAnsi="Courier New" w:cs="Courier New" w:hint="default"/>
+      </w:rPr>
+    </w:lvl>
+    <w:lvl w:ilvl="5" w:tplc="04090005" w:tentative="1">
+      <w:start w:val="1"/>
+      <w:numFmt w:val="bullet"/>
+      <w:lvlText w:val=""/>
+      <w:lvlJc w:val="left"/>
+      <w:pPr>
+        <w:ind w:left="4320" w:hanging="360"/>
+      </w:pPr>
+      <w:rPr>
+        <w:rFonts w:ascii="Wingdings" w:hAnsi="Wingdings" w:hint="default"/>
+      </w:rPr>
+    </w:lvl>
+    <w:lvl w:ilvl="6" w:tplc="04090001" w:tentative="1">
+      <w:start w:val="1"/>
+      <w:numFmt w:val="bullet"/>
+      <w:lvlText w:val=""/>
+      <w:lvlJc w:val="left"/>
+      <w:pPr>
+        <w:ind w:left="5040" w:hanging="360"/>
+      </w:pPr>
+      <w:rPr>
+        <w:rFonts w:ascii="Symbol" w:hAnsi="Symbol" w:hint="default"/>
+      </w:rPr>
+    </w:lvl>
+    <w:lvl w:ilvl="7" w:tplc="04090003" w:tentative="1">
+      <w:start w:val="1"/>
+      <w:numFmt w:val="bullet"/>
+      <w:lvlText w:val="o"/>
+      <w:lvlJc w:val="left"/>
+      <w:pPr>
+        <w:ind w:left="5760" w:hanging="360"/>
+      </w:pPr>
+      <w:rPr>
+        <w:rFonts w:ascii="Courier New" w:hAnsi="Courier New" w:cs="Courier New" w:hint="default"/>
+      </w:rPr>
+    </w:lvl>
+    <w:lvl w:ilvl="8" w:tplc="04090005" w:tentative="1">
+      <w:start w:val="1"/>
+      <w:numFmt w:val="bullet"/>
+      <w:lvlText w:val=""/>
+      <w:lvlJc w:val="left"/>
+      <w:pPr>
+        <w:ind w:left="6480" w:hanging="360"/>
+      </w:pPr>
+      <w:rPr>
+        <w:rFonts w:ascii="Wingdings" w:hAnsi="Wingdings" w:hint="default"/>
+      </w:rPr>
+    </w:lvl>
+  </w:abstractNum>
+  <w:abstractNum w:abstractNumId="105" w15:restartNumberingAfterBreak="0">
     <w:nsid w:val="537E56D9"/>
     <w:multiLevelType w:val="multilevel"/>
     <w:tmpl w:val="1B6E8B6A"/>
@@ -16481,7 +18668,7 @@
       </w:rPr>
     </w:lvl>
   </w:abstractNum>
-  <w:abstractNum w:abstractNumId="95" w15:restartNumberingAfterBreak="0">
+  <w:abstractNum w:abstractNumId="106" w15:restartNumberingAfterBreak="0">
     <w:nsid w:val="53E6601E"/>
     <w:multiLevelType w:val="hybridMultilevel"/>
     <w:tmpl w:val="66F0666A"/>
@@ -16594,7 +18781,7 @@
       </w:rPr>
     </w:lvl>
   </w:abstractNum>
-  <w:abstractNum w:abstractNumId="96" w15:restartNumberingAfterBreak="0">
+  <w:abstractNum w:abstractNumId="107" w15:restartNumberingAfterBreak="0">
     <w:nsid w:val="551D6F91"/>
     <w:multiLevelType w:val="hybridMultilevel"/>
     <w:tmpl w:val="9522B3C6"/>
@@ -16706,7 +18893,7 @@
       </w:rPr>
     </w:lvl>
   </w:abstractNum>
-  <w:abstractNum w:abstractNumId="97" w15:restartNumberingAfterBreak="0">
+  <w:abstractNum w:abstractNumId="108" w15:restartNumberingAfterBreak="0">
     <w:nsid w:val="55655B93"/>
     <w:multiLevelType w:val="multilevel"/>
     <w:tmpl w:val="9C88A4A8"/>
@@ -16855,7 +19042,7 @@
       </w:rPr>
     </w:lvl>
   </w:abstractNum>
-  <w:abstractNum w:abstractNumId="98" w15:restartNumberingAfterBreak="0">
+  <w:abstractNum w:abstractNumId="109" w15:restartNumberingAfterBreak="0">
     <w:nsid w:val="562D4F1F"/>
     <w:multiLevelType w:val="hybridMultilevel"/>
     <w:tmpl w:val="1FF8D31C"/>
@@ -16967,7 +19154,7 @@
       </w:rPr>
     </w:lvl>
   </w:abstractNum>
-  <w:abstractNum w:abstractNumId="99" w15:restartNumberingAfterBreak="0">
+  <w:abstractNum w:abstractNumId="110" w15:restartNumberingAfterBreak="0">
     <w:nsid w:val="565A0C8B"/>
     <w:multiLevelType w:val="multilevel"/>
     <w:tmpl w:val="AB24FF2E"/>
@@ -17116,7 +19303,7 @@
       </w:rPr>
     </w:lvl>
   </w:abstractNum>
-  <w:abstractNum w:abstractNumId="100" w15:restartNumberingAfterBreak="0">
+  <w:abstractNum w:abstractNumId="111" w15:restartNumberingAfterBreak="0">
     <w:nsid w:val="566E7C65"/>
     <w:multiLevelType w:val="multilevel"/>
     <w:tmpl w:val="28803B4C"/>
@@ -17265,7 +19452,7 @@
       </w:rPr>
     </w:lvl>
   </w:abstractNum>
-  <w:abstractNum w:abstractNumId="101" w15:restartNumberingAfterBreak="0">
+  <w:abstractNum w:abstractNumId="112" w15:restartNumberingAfterBreak="0">
     <w:nsid w:val="57407594"/>
     <w:multiLevelType w:val="multilevel"/>
     <w:tmpl w:val="E6E2F8AE"/>
@@ -17414,7 +19601,7 @@
       </w:rPr>
     </w:lvl>
   </w:abstractNum>
-  <w:abstractNum w:abstractNumId="102" w15:restartNumberingAfterBreak="0">
+  <w:abstractNum w:abstractNumId="113" w15:restartNumberingAfterBreak="0">
     <w:nsid w:val="577F771B"/>
     <w:multiLevelType w:val="hybridMultilevel"/>
     <w:tmpl w:val="0F2C5914"/>
@@ -17526,7 +19713,7 @@
       </w:rPr>
     </w:lvl>
   </w:abstractNum>
-  <w:abstractNum w:abstractNumId="103" w15:restartNumberingAfterBreak="0">
+  <w:abstractNum w:abstractNumId="114" w15:restartNumberingAfterBreak="0">
     <w:nsid w:val="57C43CDD"/>
     <w:multiLevelType w:val="hybridMultilevel"/>
     <w:tmpl w:val="6C94FB5E"/>
@@ -17639,7 +19826,7 @@
       </w:rPr>
     </w:lvl>
   </w:abstractNum>
-  <w:abstractNum w:abstractNumId="104" w15:restartNumberingAfterBreak="0">
+  <w:abstractNum w:abstractNumId="115" w15:restartNumberingAfterBreak="0">
     <w:nsid w:val="58393977"/>
     <w:multiLevelType w:val="hybridMultilevel"/>
     <w:tmpl w:val="985A5484"/>
@@ -17752,7 +19939,7 @@
       </w:rPr>
     </w:lvl>
   </w:abstractNum>
-  <w:abstractNum w:abstractNumId="105" w15:restartNumberingAfterBreak="0">
+  <w:abstractNum w:abstractNumId="116" w15:restartNumberingAfterBreak="0">
     <w:nsid w:val="59EB4CE4"/>
     <w:multiLevelType w:val="multilevel"/>
     <w:tmpl w:val="63F4E6F0"/>
@@ -17901,7 +20088,7 @@
       </w:rPr>
     </w:lvl>
   </w:abstractNum>
-  <w:abstractNum w:abstractNumId="106" w15:restartNumberingAfterBreak="0">
+  <w:abstractNum w:abstractNumId="117" w15:restartNumberingAfterBreak="0">
     <w:nsid w:val="5BD11962"/>
     <w:multiLevelType w:val="hybridMultilevel"/>
     <w:tmpl w:val="89A4B834"/>
@@ -17990,7 +20177,7 @@
       </w:pPr>
     </w:lvl>
   </w:abstractNum>
-  <w:abstractNum w:abstractNumId="107" w15:restartNumberingAfterBreak="0">
+  <w:abstractNum w:abstractNumId="118" w15:restartNumberingAfterBreak="0">
     <w:nsid w:val="5C950DBA"/>
     <w:multiLevelType w:val="hybridMultilevel"/>
     <w:tmpl w:val="7D78F950"/>
@@ -18102,7 +20289,7 @@
       </w:rPr>
     </w:lvl>
   </w:abstractNum>
-  <w:abstractNum w:abstractNumId="108" w15:restartNumberingAfterBreak="0">
+  <w:abstractNum w:abstractNumId="119" w15:restartNumberingAfterBreak="0">
     <w:nsid w:val="5D2A5D3B"/>
     <w:multiLevelType w:val="hybridMultilevel"/>
     <w:tmpl w:val="3AF89EA6"/>
@@ -18193,7 +20380,7 @@
       </w:pPr>
     </w:lvl>
   </w:abstractNum>
-  <w:abstractNum w:abstractNumId="109" w15:restartNumberingAfterBreak="0">
+  <w:abstractNum w:abstractNumId="120" w15:restartNumberingAfterBreak="0">
     <w:nsid w:val="5D9E49FD"/>
     <w:multiLevelType w:val="hybridMultilevel"/>
     <w:tmpl w:val="4EE40BB4"/>
@@ -18305,7 +20492,7 @@
       </w:rPr>
     </w:lvl>
   </w:abstractNum>
-  <w:abstractNum w:abstractNumId="110" w15:restartNumberingAfterBreak="0">
+  <w:abstractNum w:abstractNumId="121" w15:restartNumberingAfterBreak="0">
     <w:nsid w:val="5DB7107D"/>
     <w:multiLevelType w:val="multilevel"/>
     <w:tmpl w:val="6520107A"/>
@@ -18454,7 +20641,7 @@
       </w:rPr>
     </w:lvl>
   </w:abstractNum>
-  <w:abstractNum w:abstractNumId="111" w15:restartNumberingAfterBreak="0">
+  <w:abstractNum w:abstractNumId="122" w15:restartNumberingAfterBreak="0">
     <w:nsid w:val="5F5C1AFF"/>
     <w:multiLevelType w:val="hybridMultilevel"/>
     <w:tmpl w:val="C6DA3D20"/>
@@ -18540,7 +20727,7 @@
       </w:pPr>
     </w:lvl>
   </w:abstractNum>
-  <w:abstractNum w:abstractNumId="112" w15:restartNumberingAfterBreak="0">
+  <w:abstractNum w:abstractNumId="123" w15:restartNumberingAfterBreak="0">
     <w:nsid w:val="60421322"/>
     <w:multiLevelType w:val="hybridMultilevel"/>
     <w:tmpl w:val="447CDBDC"/>
@@ -18652,7 +20839,7 @@
       </w:rPr>
     </w:lvl>
   </w:abstractNum>
-  <w:abstractNum w:abstractNumId="113" w15:restartNumberingAfterBreak="0">
+  <w:abstractNum w:abstractNumId="124" w15:restartNumberingAfterBreak="0">
     <w:nsid w:val="61926C31"/>
     <w:multiLevelType w:val="hybridMultilevel"/>
     <w:tmpl w:val="AFD27E5C"/>
@@ -18765,7 +20952,7 @@
       </w:rPr>
     </w:lvl>
   </w:abstractNum>
-  <w:abstractNum w:abstractNumId="114" w15:restartNumberingAfterBreak="0">
+  <w:abstractNum w:abstractNumId="125" w15:restartNumberingAfterBreak="0">
     <w:nsid w:val="622F5FC7"/>
     <w:multiLevelType w:val="hybridMultilevel"/>
     <w:tmpl w:val="49A6C2A6"/>
@@ -18878,7 +21065,7 @@
       </w:rPr>
     </w:lvl>
   </w:abstractNum>
-  <w:abstractNum w:abstractNumId="115" w15:restartNumberingAfterBreak="0">
+  <w:abstractNum w:abstractNumId="126" w15:restartNumberingAfterBreak="0">
     <w:nsid w:val="62AC33B4"/>
     <w:multiLevelType w:val="multilevel"/>
     <w:tmpl w:val="A074F3CA"/>
@@ -19027,7 +21214,7 @@
       </w:rPr>
     </w:lvl>
   </w:abstractNum>
-  <w:abstractNum w:abstractNumId="116" w15:restartNumberingAfterBreak="0">
+  <w:abstractNum w:abstractNumId="127" w15:restartNumberingAfterBreak="0">
     <w:nsid w:val="63B44674"/>
     <w:multiLevelType w:val="multilevel"/>
     <w:tmpl w:val="08F4FA9A"/>
@@ -19176,7 +21363,7 @@
       </w:rPr>
     </w:lvl>
   </w:abstractNum>
-  <w:abstractNum w:abstractNumId="117" w15:restartNumberingAfterBreak="0">
+  <w:abstractNum w:abstractNumId="128" w15:restartNumberingAfterBreak="0">
     <w:nsid w:val="63C245D4"/>
     <w:multiLevelType w:val="hybridMultilevel"/>
     <w:tmpl w:val="E1563A56"/>
@@ -19288,7 +21475,7 @@
       </w:rPr>
     </w:lvl>
   </w:abstractNum>
-  <w:abstractNum w:abstractNumId="118" w15:restartNumberingAfterBreak="0">
+  <w:abstractNum w:abstractNumId="129" w15:restartNumberingAfterBreak="0">
     <w:nsid w:val="64F30198"/>
     <w:multiLevelType w:val="multilevel"/>
     <w:tmpl w:val="63F4E6F0"/>
@@ -19437,7 +21624,7 @@
       </w:rPr>
     </w:lvl>
   </w:abstractNum>
-  <w:abstractNum w:abstractNumId="119" w15:restartNumberingAfterBreak="0">
+  <w:abstractNum w:abstractNumId="130" w15:restartNumberingAfterBreak="0">
     <w:nsid w:val="65AF2502"/>
     <w:multiLevelType w:val="hybridMultilevel"/>
     <w:tmpl w:val="FB2A44D8"/>
@@ -19550,7 +21737,7 @@
       </w:rPr>
     </w:lvl>
   </w:abstractNum>
-  <w:abstractNum w:abstractNumId="120" w15:restartNumberingAfterBreak="0">
+  <w:abstractNum w:abstractNumId="131" w15:restartNumberingAfterBreak="0">
     <w:nsid w:val="671614F0"/>
     <w:multiLevelType w:val="multilevel"/>
     <w:tmpl w:val="63F4E6F0"/>
@@ -19699,7 +21886,7 @@
       </w:rPr>
     </w:lvl>
   </w:abstractNum>
-  <w:abstractNum w:abstractNumId="121" w15:restartNumberingAfterBreak="0">
+  <w:abstractNum w:abstractNumId="132" w15:restartNumberingAfterBreak="0">
     <w:nsid w:val="6859691D"/>
     <w:multiLevelType w:val="multilevel"/>
     <w:tmpl w:val="826A9D48"/>
@@ -19848,7 +22035,7 @@
       </w:rPr>
     </w:lvl>
   </w:abstractNum>
-  <w:abstractNum w:abstractNumId="122" w15:restartNumberingAfterBreak="0">
+  <w:abstractNum w:abstractNumId="133" w15:restartNumberingAfterBreak="0">
     <w:nsid w:val="68817757"/>
     <w:multiLevelType w:val="multilevel"/>
     <w:tmpl w:val="34EE1968"/>
@@ -19997,7 +22184,7 @@
       </w:rPr>
     </w:lvl>
   </w:abstractNum>
-  <w:abstractNum w:abstractNumId="123" w15:restartNumberingAfterBreak="0">
+  <w:abstractNum w:abstractNumId="134" w15:restartNumberingAfterBreak="0">
     <w:nsid w:val="68BE10E8"/>
     <w:multiLevelType w:val="hybridMultilevel"/>
     <w:tmpl w:val="326CD592"/>
@@ -20110,7 +22297,7 @@
       </w:rPr>
     </w:lvl>
   </w:abstractNum>
-  <w:abstractNum w:abstractNumId="124" w15:restartNumberingAfterBreak="0">
+  <w:abstractNum w:abstractNumId="135" w15:restartNumberingAfterBreak="0">
     <w:nsid w:val="69996D9A"/>
     <w:multiLevelType w:val="multilevel"/>
     <w:tmpl w:val="1780FC38"/>
@@ -20259,7 +22446,7 @@
       </w:rPr>
     </w:lvl>
   </w:abstractNum>
-  <w:abstractNum w:abstractNumId="125" w15:restartNumberingAfterBreak="0">
+  <w:abstractNum w:abstractNumId="136" w15:restartNumberingAfterBreak="0">
     <w:nsid w:val="6B3C30B9"/>
     <w:multiLevelType w:val="hybridMultilevel"/>
     <w:tmpl w:val="C938F8DE"/>
@@ -20371,7 +22558,7 @@
       </w:rPr>
     </w:lvl>
   </w:abstractNum>
-  <w:abstractNum w:abstractNumId="126" w15:restartNumberingAfterBreak="0">
+  <w:abstractNum w:abstractNumId="137" w15:restartNumberingAfterBreak="0">
     <w:nsid w:val="6D1511A0"/>
     <w:multiLevelType w:val="hybridMultilevel"/>
     <w:tmpl w:val="AAD8B9B4"/>
@@ -20483,7 +22670,7 @@
       </w:rPr>
     </w:lvl>
   </w:abstractNum>
-  <w:abstractNum w:abstractNumId="127" w15:restartNumberingAfterBreak="0">
+  <w:abstractNum w:abstractNumId="138" w15:restartNumberingAfterBreak="0">
     <w:nsid w:val="6DD255F1"/>
     <w:multiLevelType w:val="hybridMultilevel"/>
     <w:tmpl w:val="ACBC1404"/>
@@ -20596,7 +22783,7 @@
       </w:rPr>
     </w:lvl>
   </w:abstractNum>
-  <w:abstractNum w:abstractNumId="128" w15:restartNumberingAfterBreak="0">
+  <w:abstractNum w:abstractNumId="139" w15:restartNumberingAfterBreak="0">
     <w:nsid w:val="6DDB4404"/>
     <w:multiLevelType w:val="hybridMultilevel"/>
     <w:tmpl w:val="06428E32"/>
@@ -20709,7 +22896,7 @@
       </w:rPr>
     </w:lvl>
   </w:abstractNum>
-  <w:abstractNum w:abstractNumId="129" w15:restartNumberingAfterBreak="0">
+  <w:abstractNum w:abstractNumId="140" w15:restartNumberingAfterBreak="0">
     <w:nsid w:val="6F014B3B"/>
     <w:multiLevelType w:val="hybridMultilevel"/>
     <w:tmpl w:val="C89A39BE"/>
@@ -20821,7 +23008,7 @@
       </w:rPr>
     </w:lvl>
   </w:abstractNum>
-  <w:abstractNum w:abstractNumId="130" w15:restartNumberingAfterBreak="0">
+  <w:abstractNum w:abstractNumId="141" w15:restartNumberingAfterBreak="0">
     <w:nsid w:val="6F171273"/>
     <w:multiLevelType w:val="multilevel"/>
     <w:tmpl w:val="0240C564"/>
@@ -20970,7 +23157,7 @@
       </w:rPr>
     </w:lvl>
   </w:abstractNum>
-  <w:abstractNum w:abstractNumId="131" w15:restartNumberingAfterBreak="0">
+  <w:abstractNum w:abstractNumId="142" w15:restartNumberingAfterBreak="0">
     <w:nsid w:val="6FB82AAA"/>
     <w:multiLevelType w:val="multilevel"/>
     <w:tmpl w:val="FC46C7C0"/>
@@ -21119,7 +23306,7 @@
       </w:rPr>
     </w:lvl>
   </w:abstractNum>
-  <w:abstractNum w:abstractNumId="132" w15:restartNumberingAfterBreak="0">
+  <w:abstractNum w:abstractNumId="143" w15:restartNumberingAfterBreak="0">
     <w:nsid w:val="6FD46DCF"/>
     <w:multiLevelType w:val="hybridMultilevel"/>
     <w:tmpl w:val="EF5E6EC6"/>
@@ -21232,7 +23419,7 @@
       </w:rPr>
     </w:lvl>
   </w:abstractNum>
-  <w:abstractNum w:abstractNumId="133" w15:restartNumberingAfterBreak="0">
+  <w:abstractNum w:abstractNumId="144" w15:restartNumberingAfterBreak="0">
     <w:nsid w:val="70484E38"/>
     <w:multiLevelType w:val="multilevel"/>
     <w:tmpl w:val="22B26DD2"/>
@@ -21381,7 +23568,7 @@
       </w:rPr>
     </w:lvl>
   </w:abstractNum>
-  <w:abstractNum w:abstractNumId="134" w15:restartNumberingAfterBreak="0">
+  <w:abstractNum w:abstractNumId="145" w15:restartNumberingAfterBreak="0">
     <w:nsid w:val="70CB723E"/>
     <w:multiLevelType w:val="multilevel"/>
     <w:tmpl w:val="63F4E6F0"/>
@@ -21530,7 +23717,7 @@
       </w:rPr>
     </w:lvl>
   </w:abstractNum>
-  <w:abstractNum w:abstractNumId="135" w15:restartNumberingAfterBreak="0">
+  <w:abstractNum w:abstractNumId="146" w15:restartNumberingAfterBreak="0">
     <w:nsid w:val="71DB3F58"/>
     <w:multiLevelType w:val="multilevel"/>
     <w:tmpl w:val="63F4E6F0"/>
@@ -21679,7 +23866,7 @@
       </w:rPr>
     </w:lvl>
   </w:abstractNum>
-  <w:abstractNum w:abstractNumId="136" w15:restartNumberingAfterBreak="0">
+  <w:abstractNum w:abstractNumId="147" w15:restartNumberingAfterBreak="0">
     <w:nsid w:val="72F31FF2"/>
     <w:multiLevelType w:val="hybridMultilevel"/>
     <w:tmpl w:val="5C2693A0"/>
@@ -21791,7 +23978,7 @@
       </w:rPr>
     </w:lvl>
   </w:abstractNum>
-  <w:abstractNum w:abstractNumId="137" w15:restartNumberingAfterBreak="0">
+  <w:abstractNum w:abstractNumId="148" w15:restartNumberingAfterBreak="0">
     <w:nsid w:val="75B45140"/>
     <w:multiLevelType w:val="hybridMultilevel"/>
     <w:tmpl w:val="93F8F3C4"/>
@@ -21904,7 +24091,7 @@
       </w:rPr>
     </w:lvl>
   </w:abstractNum>
-  <w:abstractNum w:abstractNumId="138" w15:restartNumberingAfterBreak="0">
+  <w:abstractNum w:abstractNumId="149" w15:restartNumberingAfterBreak="0">
     <w:nsid w:val="76F60FFE"/>
     <w:multiLevelType w:val="multilevel"/>
     <w:tmpl w:val="63F4E6F0"/>
@@ -22053,7 +24240,7 @@
       </w:rPr>
     </w:lvl>
   </w:abstractNum>
-  <w:abstractNum w:abstractNumId="139" w15:restartNumberingAfterBreak="0">
+  <w:abstractNum w:abstractNumId="150" w15:restartNumberingAfterBreak="0">
     <w:nsid w:val="77572323"/>
     <w:multiLevelType w:val="multilevel"/>
     <w:tmpl w:val="63F4E6F0"/>
@@ -22202,7 +24389,7 @@
       </w:rPr>
     </w:lvl>
   </w:abstractNum>
-  <w:abstractNum w:abstractNumId="140" w15:restartNumberingAfterBreak="0">
+  <w:abstractNum w:abstractNumId="151" w15:restartNumberingAfterBreak="0">
     <w:nsid w:val="77B8201F"/>
     <w:multiLevelType w:val="hybridMultilevel"/>
     <w:tmpl w:val="D7160708"/>
@@ -22314,7 +24501,7 @@
       </w:rPr>
     </w:lvl>
   </w:abstractNum>
-  <w:abstractNum w:abstractNumId="141" w15:restartNumberingAfterBreak="0">
+  <w:abstractNum w:abstractNumId="152" w15:restartNumberingAfterBreak="0">
     <w:nsid w:val="79796FF9"/>
     <w:multiLevelType w:val="hybridMultilevel"/>
     <w:tmpl w:val="CFA8EF82"/>
@@ -22426,7 +24613,7 @@
       </w:rPr>
     </w:lvl>
   </w:abstractNum>
-  <w:abstractNum w:abstractNumId="142" w15:restartNumberingAfterBreak="0">
+  <w:abstractNum w:abstractNumId="153" w15:restartNumberingAfterBreak="0">
     <w:nsid w:val="79910410"/>
     <w:multiLevelType w:val="hybridMultilevel"/>
     <w:tmpl w:val="FC923542"/>
@@ -22538,7 +24725,7 @@
       </w:rPr>
     </w:lvl>
   </w:abstractNum>
-  <w:abstractNum w:abstractNumId="143" w15:restartNumberingAfterBreak="0">
+  <w:abstractNum w:abstractNumId="154" w15:restartNumberingAfterBreak="0">
     <w:nsid w:val="7AFF575A"/>
     <w:multiLevelType w:val="hybridMultilevel"/>
     <w:tmpl w:val="A6323D3E"/>
@@ -22650,7 +24837,7 @@
       </w:rPr>
     </w:lvl>
   </w:abstractNum>
-  <w:abstractNum w:abstractNumId="144" w15:restartNumberingAfterBreak="0">
+  <w:abstractNum w:abstractNumId="155" w15:restartNumberingAfterBreak="0">
     <w:nsid w:val="7B4018BF"/>
     <w:multiLevelType w:val="multilevel"/>
     <w:tmpl w:val="63F4E6F0"/>
@@ -22799,7 +24986,7 @@
       </w:rPr>
     </w:lvl>
   </w:abstractNum>
-  <w:abstractNum w:abstractNumId="145" w15:restartNumberingAfterBreak="0">
+  <w:abstractNum w:abstractNumId="156" w15:restartNumberingAfterBreak="0">
     <w:nsid w:val="7B4D1B33"/>
     <w:multiLevelType w:val="hybridMultilevel"/>
     <w:tmpl w:val="5EAC717E"/>
@@ -22911,7 +25098,7 @@
       </w:rPr>
     </w:lvl>
   </w:abstractNum>
-  <w:abstractNum w:abstractNumId="146" w15:restartNumberingAfterBreak="0">
+  <w:abstractNum w:abstractNumId="157" w15:restartNumberingAfterBreak="0">
     <w:nsid w:val="7CAC27CD"/>
     <w:multiLevelType w:val="multilevel"/>
     <w:tmpl w:val="3BC20E58"/>
@@ -23060,7 +25247,7 @@
       </w:rPr>
     </w:lvl>
   </w:abstractNum>
-  <w:abstractNum w:abstractNumId="147" w15:restartNumberingAfterBreak="0">
+  <w:abstractNum w:abstractNumId="158" w15:restartNumberingAfterBreak="0">
     <w:nsid w:val="7E5978EA"/>
     <w:multiLevelType w:val="hybridMultilevel"/>
     <w:tmpl w:val="D74C0DB0"/>
@@ -23172,7 +25359,7 @@
       </w:rPr>
     </w:lvl>
   </w:abstractNum>
-  <w:abstractNum w:abstractNumId="148" w15:restartNumberingAfterBreak="0">
+  <w:abstractNum w:abstractNumId="159" w15:restartNumberingAfterBreak="0">
     <w:nsid w:val="7F106A5D"/>
     <w:multiLevelType w:val="hybridMultilevel"/>
     <w:tmpl w:val="A1CA4816"/>
@@ -23285,451 +25472,484 @@
     </w:lvl>
   </w:abstractNum>
   <w:num w:numId="1" w16cid:durableId="1882476756">
-    <w:abstractNumId w:val="86"/>
+    <w:abstractNumId w:val="93"/>
   </w:num>
   <w:num w:numId="2" w16cid:durableId="871453468">
-    <w:abstractNumId w:val="22"/>
+    <w:abstractNumId w:val="25"/>
   </w:num>
   <w:num w:numId="3" w16cid:durableId="698706805">
-    <w:abstractNumId w:val="35"/>
+    <w:abstractNumId w:val="40"/>
   </w:num>
   <w:num w:numId="4" w16cid:durableId="1105467722">
+    <w:abstractNumId w:val="77"/>
+  </w:num>
+  <w:num w:numId="5" w16cid:durableId="769932622">
+    <w:abstractNumId w:val="111"/>
+  </w:num>
+  <w:num w:numId="6" w16cid:durableId="575944109">
+    <w:abstractNumId w:val="45"/>
+  </w:num>
+  <w:num w:numId="7" w16cid:durableId="877661689">
+    <w:abstractNumId w:val="144"/>
+  </w:num>
+  <w:num w:numId="8" w16cid:durableId="1390107422">
+    <w:abstractNumId w:val="82"/>
+  </w:num>
+  <w:num w:numId="9" w16cid:durableId="881866424">
+    <w:abstractNumId w:val="108"/>
+  </w:num>
+  <w:num w:numId="10" w16cid:durableId="1037244995">
+    <w:abstractNumId w:val="135"/>
+  </w:num>
+  <w:num w:numId="11" w16cid:durableId="1575554597">
+    <w:abstractNumId w:val="66"/>
+  </w:num>
+  <w:num w:numId="12" w16cid:durableId="915364478">
+    <w:abstractNumId w:val="89"/>
+  </w:num>
+  <w:num w:numId="13" w16cid:durableId="1386294114">
+    <w:abstractNumId w:val="127"/>
+  </w:num>
+  <w:num w:numId="14" w16cid:durableId="1071851223">
+    <w:abstractNumId w:val="26"/>
+  </w:num>
+  <w:num w:numId="15" w16cid:durableId="1545557520">
+    <w:abstractNumId w:val="78"/>
+  </w:num>
+  <w:num w:numId="16" w16cid:durableId="1102919547">
+    <w:abstractNumId w:val="157"/>
+  </w:num>
+  <w:num w:numId="17" w16cid:durableId="294526838">
+    <w:abstractNumId w:val="57"/>
+  </w:num>
+  <w:num w:numId="18" w16cid:durableId="679889896">
+    <w:abstractNumId w:val="64"/>
+  </w:num>
+  <w:num w:numId="19" w16cid:durableId="2119449470">
+    <w:abstractNumId w:val="105"/>
+  </w:num>
+  <w:num w:numId="20" w16cid:durableId="1365054799">
+    <w:abstractNumId w:val="14"/>
+  </w:num>
+  <w:num w:numId="21" w16cid:durableId="1683512738">
+    <w:abstractNumId w:val="65"/>
+  </w:num>
+  <w:num w:numId="22" w16cid:durableId="1080098953">
+    <w:abstractNumId w:val="132"/>
+  </w:num>
+  <w:num w:numId="23" w16cid:durableId="1635717296">
     <w:abstractNumId w:val="71"/>
   </w:num>
-  <w:num w:numId="5" w16cid:durableId="769932622">
-    <w:abstractNumId w:val="100"/>
-  </w:num>
-  <w:num w:numId="6" w16cid:durableId="575944109">
-    <w:abstractNumId w:val="40"/>
-  </w:num>
-  <w:num w:numId="7" w16cid:durableId="877661689">
-    <w:abstractNumId w:val="133"/>
-  </w:num>
-  <w:num w:numId="8" w16cid:durableId="1390107422">
-    <w:abstractNumId w:val="76"/>
-  </w:num>
-  <w:num w:numId="9" w16cid:durableId="881866424">
-    <w:abstractNumId w:val="97"/>
-  </w:num>
-  <w:num w:numId="10" w16cid:durableId="1037244995">
-    <w:abstractNumId w:val="124"/>
-  </w:num>
-  <w:num w:numId="11" w16cid:durableId="1575554597">
-    <w:abstractNumId w:val="60"/>
-  </w:num>
-  <w:num w:numId="12" w16cid:durableId="915364478">
-    <w:abstractNumId w:val="82"/>
-  </w:num>
-  <w:num w:numId="13" w16cid:durableId="1386294114">
-    <w:abstractNumId w:val="116"/>
-  </w:num>
-  <w:num w:numId="14" w16cid:durableId="1071851223">
-    <w:abstractNumId w:val="23"/>
-  </w:num>
-  <w:num w:numId="15" w16cid:durableId="1545557520">
-    <w:abstractNumId w:val="72"/>
-  </w:num>
-  <w:num w:numId="16" w16cid:durableId="1102919547">
-    <w:abstractNumId w:val="146"/>
-  </w:num>
-  <w:num w:numId="17" w16cid:durableId="294526838">
-    <w:abstractNumId w:val="51"/>
-  </w:num>
-  <w:num w:numId="18" w16cid:durableId="679889896">
-    <w:abstractNumId w:val="58"/>
-  </w:num>
-  <w:num w:numId="19" w16cid:durableId="2119449470">
-    <w:abstractNumId w:val="94"/>
-  </w:num>
-  <w:num w:numId="20" w16cid:durableId="1365054799">
-    <w:abstractNumId w:val="12"/>
-  </w:num>
-  <w:num w:numId="21" w16cid:durableId="1683512738">
-    <w:abstractNumId w:val="59"/>
-  </w:num>
-  <w:num w:numId="22" w16cid:durableId="1080098953">
-    <w:abstractNumId w:val="121"/>
-  </w:num>
-  <w:num w:numId="23" w16cid:durableId="1635717296">
-    <w:abstractNumId w:val="65"/>
-  </w:num>
   <w:num w:numId="24" w16cid:durableId="544873123">
-    <w:abstractNumId w:val="115"/>
+    <w:abstractNumId w:val="126"/>
   </w:num>
   <w:num w:numId="25" w16cid:durableId="1128352778">
-    <w:abstractNumId w:val="11"/>
+    <w:abstractNumId w:val="13"/>
   </w:num>
   <w:num w:numId="26" w16cid:durableId="1732537407">
-    <w:abstractNumId w:val="128"/>
+    <w:abstractNumId w:val="139"/>
   </w:num>
   <w:num w:numId="27" w16cid:durableId="945502064">
-    <w:abstractNumId w:val="5"/>
+    <w:abstractNumId w:val="6"/>
   </w:num>
   <w:num w:numId="28" w16cid:durableId="1997681677">
     <w:abstractNumId w:val="2"/>
   </w:num>
   <w:num w:numId="29" w16cid:durableId="815955639">
-    <w:abstractNumId w:val="57"/>
+    <w:abstractNumId w:val="63"/>
   </w:num>
   <w:num w:numId="30" w16cid:durableId="1500659483">
-    <w:abstractNumId w:val="79"/>
+    <w:abstractNumId w:val="86"/>
   </w:num>
   <w:num w:numId="31" w16cid:durableId="118301211">
-    <w:abstractNumId w:val="13"/>
+    <w:abstractNumId w:val="16"/>
   </w:num>
   <w:num w:numId="32" w16cid:durableId="732387979">
-    <w:abstractNumId w:val="41"/>
+    <w:abstractNumId w:val="46"/>
   </w:num>
   <w:num w:numId="33" w16cid:durableId="2129276417">
-    <w:abstractNumId w:val="15"/>
+    <w:abstractNumId w:val="18"/>
   </w:num>
   <w:num w:numId="34" w16cid:durableId="1470708820">
-    <w:abstractNumId w:val="46"/>
+    <w:abstractNumId w:val="52"/>
   </w:num>
   <w:num w:numId="35" w16cid:durableId="356852923">
-    <w:abstractNumId w:val="93"/>
+    <w:abstractNumId w:val="103"/>
   </w:num>
   <w:num w:numId="36" w16cid:durableId="430662559">
-    <w:abstractNumId w:val="18"/>
+    <w:abstractNumId w:val="21"/>
   </w:num>
   <w:num w:numId="37" w16cid:durableId="247080868">
+    <w:abstractNumId w:val="148"/>
+  </w:num>
+  <w:num w:numId="38" w16cid:durableId="158887408">
+    <w:abstractNumId w:val="124"/>
+  </w:num>
+  <w:num w:numId="39" w16cid:durableId="1681347932">
+    <w:abstractNumId w:val="143"/>
+  </w:num>
+  <w:num w:numId="40" w16cid:durableId="2101440158">
+    <w:abstractNumId w:val="81"/>
+  </w:num>
+  <w:num w:numId="41" w16cid:durableId="1250391122">
+    <w:abstractNumId w:val="119"/>
+  </w:num>
+  <w:num w:numId="42" w16cid:durableId="479083359">
+    <w:abstractNumId w:val="147"/>
+  </w:num>
+  <w:num w:numId="43" w16cid:durableId="1557860317">
+    <w:abstractNumId w:val="106"/>
+  </w:num>
+  <w:num w:numId="44" w16cid:durableId="2142183763">
+    <w:abstractNumId w:val="8"/>
+  </w:num>
+  <w:num w:numId="45" w16cid:durableId="1357736349">
+    <w:abstractNumId w:val="153"/>
+  </w:num>
+  <w:num w:numId="46" w16cid:durableId="1519656040">
+    <w:abstractNumId w:val="152"/>
+  </w:num>
+  <w:num w:numId="47" w16cid:durableId="1078596852">
+    <w:abstractNumId w:val="159"/>
+  </w:num>
+  <w:num w:numId="48" w16cid:durableId="1027950100">
+    <w:abstractNumId w:val="37"/>
+  </w:num>
+  <w:num w:numId="49" w16cid:durableId="878516382">
+    <w:abstractNumId w:val="20"/>
+  </w:num>
+  <w:num w:numId="50" w16cid:durableId="363404927">
+    <w:abstractNumId w:val="72"/>
+  </w:num>
+  <w:num w:numId="51" w16cid:durableId="1128354320">
     <w:abstractNumId w:val="137"/>
   </w:num>
-  <w:num w:numId="38" w16cid:durableId="158887408">
+  <w:num w:numId="52" w16cid:durableId="248543928">
+    <w:abstractNumId w:val="80"/>
+  </w:num>
+  <w:num w:numId="53" w16cid:durableId="965889214">
+    <w:abstractNumId w:val="109"/>
+  </w:num>
+  <w:num w:numId="54" w16cid:durableId="1827503240">
+    <w:abstractNumId w:val="117"/>
+  </w:num>
+  <w:num w:numId="55" w16cid:durableId="505748256">
+    <w:abstractNumId w:val="97"/>
+  </w:num>
+  <w:num w:numId="56" w16cid:durableId="2120370925">
+    <w:abstractNumId w:val="34"/>
+  </w:num>
+  <w:num w:numId="57" w16cid:durableId="369182267">
+    <w:abstractNumId w:val="17"/>
+  </w:num>
+  <w:num w:numId="58" w16cid:durableId="1000235123">
+    <w:abstractNumId w:val="107"/>
+  </w:num>
+  <w:num w:numId="59" w16cid:durableId="628516409">
+    <w:abstractNumId w:val="136"/>
+  </w:num>
+  <w:num w:numId="60" w16cid:durableId="2028865444">
+    <w:abstractNumId w:val="95"/>
+  </w:num>
+  <w:num w:numId="61" w16cid:durableId="943926811">
+    <w:abstractNumId w:val="156"/>
+  </w:num>
+  <w:num w:numId="62" w16cid:durableId="1841193257">
+    <w:abstractNumId w:val="74"/>
+  </w:num>
+  <w:num w:numId="63" w16cid:durableId="682322850">
+    <w:abstractNumId w:val="140"/>
+  </w:num>
+  <w:num w:numId="64" w16cid:durableId="2043705333">
+    <w:abstractNumId w:val="75"/>
+  </w:num>
+  <w:num w:numId="65" w16cid:durableId="1164854761">
+    <w:abstractNumId w:val="56"/>
+  </w:num>
+  <w:num w:numId="66" w16cid:durableId="1919972541">
+    <w:abstractNumId w:val="91"/>
+  </w:num>
+  <w:num w:numId="67" w16cid:durableId="463617329">
+    <w:abstractNumId w:val="60"/>
+  </w:num>
+  <w:num w:numId="68" w16cid:durableId="2064014330">
     <w:abstractNumId w:val="113"/>
   </w:num>
-  <w:num w:numId="39" w16cid:durableId="1681347932">
-    <w:abstractNumId w:val="132"/>
+  <w:num w:numId="69" w16cid:durableId="452797354">
+    <w:abstractNumId w:val="118"/>
   </w:num>
-  <w:num w:numId="40" w16cid:durableId="2101440158">
-    <w:abstractNumId w:val="75"/>
+  <w:num w:numId="70" w16cid:durableId="1196650037">
+    <w:abstractNumId w:val="50"/>
   </w:num>
-  <w:num w:numId="41" w16cid:durableId="1250391122">
-    <w:abstractNumId w:val="108"/>
+  <w:num w:numId="71" w16cid:durableId="940071828">
+    <w:abstractNumId w:val="151"/>
   </w:num>
-  <w:num w:numId="42" w16cid:durableId="479083359">
-    <w:abstractNumId w:val="136"/>
+  <w:num w:numId="72" w16cid:durableId="1608273926">
+    <w:abstractNumId w:val="76"/>
   </w:num>
-  <w:num w:numId="43" w16cid:durableId="1557860317">
-    <w:abstractNumId w:val="95"/>
+  <w:num w:numId="73" w16cid:durableId="2009864772">
+    <w:abstractNumId w:val="92"/>
   </w:num>
-  <w:num w:numId="44" w16cid:durableId="2142183763">
-    <w:abstractNumId w:val="7"/>
+  <w:num w:numId="74" w16cid:durableId="712267004">
+    <w:abstractNumId w:val="36"/>
   </w:num>
-  <w:num w:numId="45" w16cid:durableId="1357736349">
-    <w:abstractNumId w:val="142"/>
-  </w:num>
-  <w:num w:numId="46" w16cid:durableId="1519656040">
-    <w:abstractNumId w:val="141"/>
-  </w:num>
-  <w:num w:numId="47" w16cid:durableId="1078596852">
-    <w:abstractNumId w:val="148"/>
-  </w:num>
-  <w:num w:numId="48" w16cid:durableId="1027950100">
+  <w:num w:numId="75" w16cid:durableId="506480902">
     <w:abstractNumId w:val="32"/>
   </w:num>
-  <w:num w:numId="49" w16cid:durableId="878516382">
-    <w:abstractNumId w:val="17"/>
-  </w:num>
-  <w:num w:numId="50" w16cid:durableId="363404927">
-    <w:abstractNumId w:val="66"/>
-  </w:num>
-  <w:num w:numId="51" w16cid:durableId="1128354320">
-    <w:abstractNumId w:val="126"/>
-  </w:num>
-  <w:num w:numId="52" w16cid:durableId="248543928">
-    <w:abstractNumId w:val="74"/>
-  </w:num>
-  <w:num w:numId="53" w16cid:durableId="965889214">
-    <w:abstractNumId w:val="98"/>
-  </w:num>
-  <w:num w:numId="54" w16cid:durableId="1827503240">
-    <w:abstractNumId w:val="106"/>
-  </w:num>
-  <w:num w:numId="55" w16cid:durableId="505748256">
-    <w:abstractNumId w:val="90"/>
-  </w:num>
-  <w:num w:numId="56" w16cid:durableId="2120370925">
-    <w:abstractNumId w:val="29"/>
-  </w:num>
-  <w:num w:numId="57" w16cid:durableId="369182267">
-    <w:abstractNumId w:val="14"/>
-  </w:num>
-  <w:num w:numId="58" w16cid:durableId="1000235123">
-    <w:abstractNumId w:val="96"/>
-  </w:num>
-  <w:num w:numId="59" w16cid:durableId="628516409">
-    <w:abstractNumId w:val="125"/>
-  </w:num>
-  <w:num w:numId="60" w16cid:durableId="2028865444">
-    <w:abstractNumId w:val="88"/>
-  </w:num>
-  <w:num w:numId="61" w16cid:durableId="943926811">
-    <w:abstractNumId w:val="145"/>
-  </w:num>
-  <w:num w:numId="62" w16cid:durableId="1841193257">
-    <w:abstractNumId w:val="68"/>
-  </w:num>
-  <w:num w:numId="63" w16cid:durableId="682322850">
-    <w:abstractNumId w:val="129"/>
-  </w:num>
-  <w:num w:numId="64" w16cid:durableId="2043705333">
-    <w:abstractNumId w:val="69"/>
-  </w:num>
-  <w:num w:numId="65" w16cid:durableId="1164854761">
-    <w:abstractNumId w:val="50"/>
-  </w:num>
-  <w:num w:numId="66" w16cid:durableId="1919972541">
-    <w:abstractNumId w:val="84"/>
-  </w:num>
-  <w:num w:numId="67" w16cid:durableId="463617329">
-    <w:abstractNumId w:val="54"/>
-  </w:num>
-  <w:num w:numId="68" w16cid:durableId="2064014330">
-    <w:abstractNumId w:val="102"/>
-  </w:num>
-  <w:num w:numId="69" w16cid:durableId="452797354">
-    <w:abstractNumId w:val="107"/>
-  </w:num>
-  <w:num w:numId="70" w16cid:durableId="1196650037">
-    <w:abstractNumId w:val="45"/>
-  </w:num>
-  <w:num w:numId="71" w16cid:durableId="940071828">
-    <w:abstractNumId w:val="140"/>
-  </w:num>
-  <w:num w:numId="72" w16cid:durableId="1608273926">
-    <w:abstractNumId w:val="70"/>
-  </w:num>
-  <w:num w:numId="73" w16cid:durableId="2009864772">
-    <w:abstractNumId w:val="85"/>
-  </w:num>
-  <w:num w:numId="74" w16cid:durableId="712267004">
-    <w:abstractNumId w:val="31"/>
-  </w:num>
-  <w:num w:numId="75" w16cid:durableId="506480902">
-    <w:abstractNumId w:val="27"/>
-  </w:num>
   <w:num w:numId="76" w16cid:durableId="286202349">
-    <w:abstractNumId w:val="112"/>
+    <w:abstractNumId w:val="123"/>
   </w:num>
   <w:num w:numId="77" w16cid:durableId="156460757">
-    <w:abstractNumId w:val="61"/>
+    <w:abstractNumId w:val="67"/>
   </w:num>
   <w:num w:numId="78" w16cid:durableId="1230077056">
     <w:abstractNumId w:val="4"/>
   </w:num>
   <w:num w:numId="79" w16cid:durableId="1837106927">
-    <w:abstractNumId w:val="44"/>
+    <w:abstractNumId w:val="49"/>
   </w:num>
   <w:num w:numId="80" w16cid:durableId="287929152">
-    <w:abstractNumId w:val="30"/>
+    <w:abstractNumId w:val="35"/>
   </w:num>
   <w:num w:numId="81" w16cid:durableId="1672175260">
-    <w:abstractNumId w:val="80"/>
+    <w:abstractNumId w:val="87"/>
   </w:num>
   <w:num w:numId="82" w16cid:durableId="1954820163">
-    <w:abstractNumId w:val="53"/>
+    <w:abstractNumId w:val="59"/>
   </w:num>
   <w:num w:numId="83" w16cid:durableId="1990016594">
-    <w:abstractNumId w:val="20"/>
+    <w:abstractNumId w:val="23"/>
   </w:num>
   <w:num w:numId="84" w16cid:durableId="366876741">
-    <w:abstractNumId w:val="87"/>
+    <w:abstractNumId w:val="94"/>
   </w:num>
   <w:num w:numId="85" w16cid:durableId="15274915">
-    <w:abstractNumId w:val="33"/>
+    <w:abstractNumId w:val="38"/>
   </w:num>
   <w:num w:numId="86" w16cid:durableId="288124443">
-    <w:abstractNumId w:val="8"/>
+    <w:abstractNumId w:val="9"/>
   </w:num>
   <w:num w:numId="87" w16cid:durableId="591351385">
-    <w:abstractNumId w:val="99"/>
+    <w:abstractNumId w:val="110"/>
   </w:num>
   <w:num w:numId="88" w16cid:durableId="1361005725">
-    <w:abstractNumId w:val="143"/>
+    <w:abstractNumId w:val="154"/>
   </w:num>
   <w:num w:numId="89" w16cid:durableId="219681743">
-    <w:abstractNumId w:val="9"/>
+    <w:abstractNumId w:val="10"/>
   </w:num>
   <w:num w:numId="90" w16cid:durableId="194386594">
-    <w:abstractNumId w:val="109"/>
+    <w:abstractNumId w:val="120"/>
   </w:num>
   <w:num w:numId="91" w16cid:durableId="777793346">
-    <w:abstractNumId w:val="78"/>
+    <w:abstractNumId w:val="85"/>
   </w:num>
   <w:num w:numId="92" w16cid:durableId="173346871">
-    <w:abstractNumId w:val="83"/>
+    <w:abstractNumId w:val="90"/>
   </w:num>
   <w:num w:numId="93" w16cid:durableId="948700467">
-    <w:abstractNumId w:val="34"/>
+    <w:abstractNumId w:val="39"/>
   </w:num>
   <w:num w:numId="94" w16cid:durableId="1328363750">
-    <w:abstractNumId w:val="19"/>
+    <w:abstractNumId w:val="22"/>
   </w:num>
   <w:num w:numId="95" w16cid:durableId="541676570">
-    <w:abstractNumId w:val="62"/>
+    <w:abstractNumId w:val="68"/>
   </w:num>
   <w:num w:numId="96" w16cid:durableId="694119229">
-    <w:abstractNumId w:val="81"/>
+    <w:abstractNumId w:val="88"/>
   </w:num>
   <w:num w:numId="97" w16cid:durableId="704327987">
-    <w:abstractNumId w:val="48"/>
+    <w:abstractNumId w:val="54"/>
   </w:num>
   <w:num w:numId="98" w16cid:durableId="1157303613">
-    <w:abstractNumId w:val="21"/>
+    <w:abstractNumId w:val="24"/>
   </w:num>
   <w:num w:numId="99" w16cid:durableId="1706099794">
-    <w:abstractNumId w:val="131"/>
+    <w:abstractNumId w:val="142"/>
   </w:num>
   <w:num w:numId="100" w16cid:durableId="256404901">
-    <w:abstractNumId w:val="130"/>
+    <w:abstractNumId w:val="141"/>
   </w:num>
   <w:num w:numId="101" w16cid:durableId="924923012">
-    <w:abstractNumId w:val="25"/>
+    <w:abstractNumId w:val="28"/>
   </w:num>
   <w:num w:numId="102" w16cid:durableId="536550966">
-    <w:abstractNumId w:val="144"/>
+    <w:abstractNumId w:val="155"/>
   </w:num>
   <w:num w:numId="103" w16cid:durableId="425157302">
-    <w:abstractNumId w:val="64"/>
+    <w:abstractNumId w:val="70"/>
   </w:num>
   <w:num w:numId="104" w16cid:durableId="967664612">
-    <w:abstractNumId w:val="118"/>
+    <w:abstractNumId w:val="129"/>
   </w:num>
   <w:num w:numId="105" w16cid:durableId="361631616">
-    <w:abstractNumId w:val="89"/>
+    <w:abstractNumId w:val="96"/>
   </w:num>
   <w:num w:numId="106" w16cid:durableId="443623616">
-    <w:abstractNumId w:val="122"/>
+    <w:abstractNumId w:val="133"/>
   </w:num>
   <w:num w:numId="107" w16cid:durableId="150101619">
-    <w:abstractNumId w:val="10"/>
+    <w:abstractNumId w:val="12"/>
   </w:num>
   <w:num w:numId="108" w16cid:durableId="1431658174">
-    <w:abstractNumId w:val="52"/>
+    <w:abstractNumId w:val="58"/>
   </w:num>
   <w:num w:numId="109" w16cid:durableId="1050495440">
     <w:abstractNumId w:val="0"/>
   </w:num>
   <w:num w:numId="110" w16cid:durableId="712924661">
-    <w:abstractNumId w:val="105"/>
+    <w:abstractNumId w:val="116"/>
   </w:num>
   <w:num w:numId="111" w16cid:durableId="1917784113">
-    <w:abstractNumId w:val="101"/>
+    <w:abstractNumId w:val="112"/>
   </w:num>
   <w:num w:numId="112" w16cid:durableId="896237065">
-    <w:abstractNumId w:val="110"/>
+    <w:abstractNumId w:val="121"/>
   </w:num>
   <w:num w:numId="113" w16cid:durableId="1171681430">
-    <w:abstractNumId w:val="134"/>
+    <w:abstractNumId w:val="145"/>
   </w:num>
   <w:num w:numId="114" w16cid:durableId="1552573199">
-    <w:abstractNumId w:val="135"/>
+    <w:abstractNumId w:val="146"/>
   </w:num>
   <w:num w:numId="115" w16cid:durableId="1920869674">
-    <w:abstractNumId w:val="120"/>
+    <w:abstractNumId w:val="131"/>
   </w:num>
   <w:num w:numId="116" w16cid:durableId="476724716">
-    <w:abstractNumId w:val="92"/>
+    <w:abstractNumId w:val="99"/>
   </w:num>
   <w:num w:numId="117" w16cid:durableId="658919541">
-    <w:abstractNumId w:val="91"/>
+    <w:abstractNumId w:val="98"/>
   </w:num>
   <w:num w:numId="118" w16cid:durableId="1622418131">
-    <w:abstractNumId w:val="42"/>
+    <w:abstractNumId w:val="47"/>
   </w:num>
   <w:num w:numId="119" w16cid:durableId="1693994672">
     <w:abstractNumId w:val="1"/>
   </w:num>
   <w:num w:numId="120" w16cid:durableId="396828229">
-    <w:abstractNumId w:val="139"/>
+    <w:abstractNumId w:val="150"/>
   </w:num>
   <w:num w:numId="121" w16cid:durableId="986058889">
-    <w:abstractNumId w:val="16"/>
+    <w:abstractNumId w:val="19"/>
   </w:num>
   <w:num w:numId="122" w16cid:durableId="1224410703">
-    <w:abstractNumId w:val="56"/>
+    <w:abstractNumId w:val="62"/>
   </w:num>
   <w:num w:numId="123" w16cid:durableId="1804040304">
-    <w:abstractNumId w:val="77"/>
+    <w:abstractNumId w:val="83"/>
   </w:num>
   <w:num w:numId="124" w16cid:durableId="114181197">
-    <w:abstractNumId w:val="138"/>
+    <w:abstractNumId w:val="149"/>
   </w:num>
   <w:num w:numId="125" w16cid:durableId="772671624">
     <w:abstractNumId w:val="3"/>
   </w:num>
   <w:num w:numId="126" w16cid:durableId="889919055">
-    <w:abstractNumId w:val="6"/>
+    <w:abstractNumId w:val="7"/>
   </w:num>
   <w:num w:numId="127" w16cid:durableId="1818105337">
-    <w:abstractNumId w:val="47"/>
+    <w:abstractNumId w:val="53"/>
   </w:num>
   <w:num w:numId="128" w16cid:durableId="384987847">
-    <w:abstractNumId w:val="26"/>
+    <w:abstractNumId w:val="30"/>
   </w:num>
   <w:num w:numId="129" w16cid:durableId="659895420">
+    <w:abstractNumId w:val="61"/>
+  </w:num>
+  <w:num w:numId="130" w16cid:durableId="1168907903">
+    <w:abstractNumId w:val="134"/>
+  </w:num>
+  <w:num w:numId="131" w16cid:durableId="430206235">
+    <w:abstractNumId w:val="125"/>
+  </w:num>
+  <w:num w:numId="132" w16cid:durableId="1207327089">
+    <w:abstractNumId w:val="27"/>
+  </w:num>
+  <w:num w:numId="133" w16cid:durableId="596404292">
+    <w:abstractNumId w:val="114"/>
+  </w:num>
+  <w:num w:numId="134" w16cid:durableId="2070372549">
+    <w:abstractNumId w:val="44"/>
+  </w:num>
+  <w:num w:numId="135" w16cid:durableId="1841265039">
+    <w:abstractNumId w:val="48"/>
+  </w:num>
+  <w:num w:numId="136" w16cid:durableId="1988632595">
+    <w:abstractNumId w:val="43"/>
+  </w:num>
+  <w:num w:numId="137" w16cid:durableId="1218275126">
+    <w:abstractNumId w:val="73"/>
+  </w:num>
+  <w:num w:numId="138" w16cid:durableId="568660900">
+    <w:abstractNumId w:val="79"/>
+  </w:num>
+  <w:num w:numId="139" w16cid:durableId="967976864">
+    <w:abstractNumId w:val="115"/>
+  </w:num>
+  <w:num w:numId="140" w16cid:durableId="650643288">
+    <w:abstractNumId w:val="130"/>
+  </w:num>
+  <w:num w:numId="141" w16cid:durableId="219370247">
+    <w:abstractNumId w:val="128"/>
+  </w:num>
+  <w:num w:numId="142" w16cid:durableId="323239876">
+    <w:abstractNumId w:val="158"/>
+  </w:num>
+  <w:num w:numId="143" w16cid:durableId="1619793156">
+    <w:abstractNumId w:val="33"/>
+  </w:num>
+  <w:num w:numId="144" w16cid:durableId="1186332867">
+    <w:abstractNumId w:val="138"/>
+  </w:num>
+  <w:num w:numId="145" w16cid:durableId="89937035">
     <w:abstractNumId w:val="55"/>
   </w:num>
-  <w:num w:numId="130" w16cid:durableId="1168907903">
-    <w:abstractNumId w:val="123"/>
+  <w:num w:numId="146" w16cid:durableId="1284070319">
+    <w:abstractNumId w:val="41"/>
   </w:num>
-  <w:num w:numId="131" w16cid:durableId="430206235">
-    <w:abstractNumId w:val="114"/>
+  <w:num w:numId="147" w16cid:durableId="761142609">
+    <w:abstractNumId w:val="69"/>
   </w:num>
-  <w:num w:numId="132" w16cid:durableId="1207327089">
-    <w:abstractNumId w:val="24"/>
+  <w:num w:numId="148" w16cid:durableId="1855614070">
+    <w:abstractNumId w:val="42"/>
   </w:num>
-  <w:num w:numId="133" w16cid:durableId="596404292">
-    <w:abstractNumId w:val="103"/>
+  <w:num w:numId="149" w16cid:durableId="1894997680">
+    <w:abstractNumId w:val="122"/>
   </w:num>
-  <w:num w:numId="134" w16cid:durableId="2070372549">
-    <w:abstractNumId w:val="39"/>
+  <w:num w:numId="150" w16cid:durableId="547911409">
+    <w:abstractNumId w:val="101"/>
   </w:num>
-  <w:num w:numId="135" w16cid:durableId="1841265039">
-    <w:abstractNumId w:val="43"/>
+  <w:num w:numId="151" w16cid:durableId="989215863">
+    <w:abstractNumId w:val="29"/>
   </w:num>
-  <w:num w:numId="136" w16cid:durableId="1988632595">
-    <w:abstractNumId w:val="38"/>
+  <w:num w:numId="152" w16cid:durableId="1631471349">
+    <w:abstractNumId w:val="100"/>
   </w:num>
-  <w:num w:numId="137" w16cid:durableId="1218275126">
-    <w:abstractNumId w:val="67"/>
+  <w:num w:numId="153" w16cid:durableId="216942141">
+    <w:abstractNumId w:val="102"/>
   </w:num>
-  <w:num w:numId="138" w16cid:durableId="568660900">
-    <w:abstractNumId w:val="73"/>
+  <w:num w:numId="154" w16cid:durableId="1076783351">
+    <w:abstractNumId w:val="51"/>
   </w:num>
-  <w:num w:numId="139" w16cid:durableId="967976864">
+  <w:num w:numId="155" w16cid:durableId="1897083592">
+    <w:abstractNumId w:val="15"/>
+  </w:num>
+  <w:num w:numId="156" w16cid:durableId="613555186">
+    <w:abstractNumId w:val="84"/>
+  </w:num>
+  <w:num w:numId="157" w16cid:durableId="2082487333">
     <w:abstractNumId w:val="104"/>
   </w:num>
-  <w:num w:numId="140" w16cid:durableId="650643288">
-    <w:abstractNumId w:val="119"/>
+  <w:num w:numId="158" w16cid:durableId="1172601283">
+    <w:abstractNumId w:val="5"/>
   </w:num>
-  <w:num w:numId="141" w16cid:durableId="219370247">
-    <w:abstractNumId w:val="117"/>
+  <w:num w:numId="159" w16cid:durableId="1812210116">
+    <w:abstractNumId w:val="31"/>
   </w:num>
-  <w:num w:numId="142" w16cid:durableId="323239876">
-    <w:abstractNumId w:val="147"/>
-  </w:num>
-  <w:num w:numId="143" w16cid:durableId="1619793156">
-    <w:abstractNumId w:val="28"/>
-  </w:num>
-  <w:num w:numId="144" w16cid:durableId="1186332867">
-    <w:abstractNumId w:val="127"/>
-  </w:num>
-  <w:num w:numId="145" w16cid:durableId="89937035">
-    <w:abstractNumId w:val="49"/>
-  </w:num>
-  <w:num w:numId="146" w16cid:durableId="1284070319">
-    <w:abstractNumId w:val="36"/>
-  </w:num>
-  <w:num w:numId="147" w16cid:durableId="761142609">
-    <w:abstractNumId w:val="63"/>
-  </w:num>
-  <w:num w:numId="148" w16cid:durableId="1855614070">
-    <w:abstractNumId w:val="37"/>
-  </w:num>
-  <w:num w:numId="149" w16cid:durableId="1894997680">
-    <w:abstractNumId w:val="111"/>
+  <w:num w:numId="160" w16cid:durableId="1410421195">
+    <w:abstractNumId w:val="11"/>
   </w:num>
 </w:numbering>
 </file>

</xml_diff>